<commit_message>
forgot programming pins txd rxd esp32
</commit_message>
<xml_diff>
--- a/3_Technical_Documents/PCB/HW_Testing.docx
+++ b/3_Technical_Documents/PCB/HW_Testing.docx
@@ -183,7 +183,7 @@
     </w:p>
     <w:p>
       <w:pPr>
-        <w:pStyle w:val="Titel"/>
+        <w:pStyle w:val="Title"/>
         <w:rPr>
           <w:lang w:val="en-GB"/>
         </w:rPr>
@@ -203,7 +203,7 @@
     </w:p>
     <w:p>
       <w:pPr>
-        <w:pStyle w:val="Untertitel"/>
+        <w:pStyle w:val="Subtitle"/>
         <w:rPr>
           <w:lang w:val="en-GB"/>
         </w:rPr>
@@ -242,7 +242,7 @@
     </w:p>
     <w:p>
       <w:pPr>
-        <w:pStyle w:val="berschrift1"/>
+        <w:pStyle w:val="Heading1"/>
         <w:numPr>
           <w:ilvl w:val="0"/>
           <w:numId w:val="0"/>
@@ -262,49 +262,18 @@
     </w:p>
     <w:p>
       <w:pPr>
-        <w:rPr>
-          <w:lang w:val="en-GB"/>
-        </w:rPr>
-      </w:pPr>
-      <w:r>
-        <w:rPr>
-          <w:lang w:val="en-GB"/>
-        </w:rPr>
-        <w:t>Testing, and especially documenting tests, is often undervalued. Even if a prototype works in the laboratory this does not guarantee that it works in the field. Designing reproducible test procedures with a good coverage helps to r</w:t>
-      </w:r>
-      <w:r>
-        <w:rPr>
-          <w:lang w:val="en-GB"/>
-        </w:rPr>
-        <w:t>educe the costs of warranty and increase the profit margin</w:t>
-      </w:r>
-      <w:r>
-        <w:rPr>
-          <w:lang w:val="en-GB"/>
-        </w:rPr>
-        <w:t>. This “checklist” tells how to prepare, run and document tests</w:t>
-      </w:r>
-      <w:r>
-        <w:rPr>
-          <w:lang w:val="en-GB"/>
-        </w:rPr>
-        <w:t xml:space="preserve"> on an electronic circuit</w:t>
-      </w:r>
-      <w:r>
-        <w:rPr>
-          <w:lang w:val="en-GB"/>
-        </w:rPr>
-        <w:t>.</w:t>
-      </w:r>
-    </w:p>
-    <w:p>
-      <w:pPr>
         <w:spacing w:before="0" w:after="160" w:line="259" w:lineRule="auto"/>
         <w:jc w:val="left"/>
         <w:rPr>
           <w:lang w:val="en-GB"/>
         </w:rPr>
       </w:pPr>
+      <w:r>
+        <w:rPr>
+          <w:lang w:val="en-GB"/>
+        </w:rPr>
+        <w:t xml:space="preserve">This document serves the purpose of planning, testing and documenting the developed hardware in the project module 3. </w:t>
+      </w:r>
     </w:p>
     <w:p>
       <w:pPr>
@@ -346,7 +315,7 @@
       <w:sdtContent>
         <w:p>
           <w:pPr>
-            <w:pStyle w:val="Inhaltsverzeichnisberschrift"/>
+            <w:pStyle w:val="TOCHeading"/>
             <w:rPr>
               <w:lang w:val="en-GB"/>
             </w:rPr>
@@ -372,7 +341,7 @@
         </w:p>
         <w:p>
           <w:pPr>
-            <w:pStyle w:val="Verzeichnis1"/>
+            <w:pStyle w:val="TOC1"/>
             <w:rPr>
               <w:rFonts w:asciiTheme="minorHAnsi" w:eastAsiaTheme="minorEastAsia" w:hAnsiTheme="minorHAnsi" w:cstheme="minorBidi"/>
               <w:noProof/>
@@ -461,7 +430,7 @@
         </w:p>
         <w:p>
           <w:pPr>
-            <w:pStyle w:val="Verzeichnis1"/>
+            <w:pStyle w:val="TOC1"/>
             <w:rPr>
               <w:rFonts w:asciiTheme="minorHAnsi" w:eastAsiaTheme="minorEastAsia" w:hAnsiTheme="minorHAnsi" w:cstheme="minorBidi"/>
               <w:noProof/>
@@ -551,7 +520,7 @@
         </w:p>
         <w:p>
           <w:pPr>
-            <w:pStyle w:val="Verzeichnis1"/>
+            <w:pStyle w:val="TOC1"/>
             <w:rPr>
               <w:rFonts w:asciiTheme="minorHAnsi" w:eastAsiaTheme="minorEastAsia" w:hAnsiTheme="minorHAnsi" w:cstheme="minorBidi"/>
               <w:noProof/>
@@ -641,7 +610,7 @@
         </w:p>
         <w:p>
           <w:pPr>
-            <w:pStyle w:val="Verzeichnis1"/>
+            <w:pStyle w:val="TOC1"/>
             <w:rPr>
               <w:rFonts w:asciiTheme="minorHAnsi" w:eastAsiaTheme="minorEastAsia" w:hAnsiTheme="minorHAnsi" w:cstheme="minorBidi"/>
               <w:noProof/>
@@ -731,7 +700,7 @@
         </w:p>
         <w:p>
           <w:pPr>
-            <w:pStyle w:val="Verzeichnis1"/>
+            <w:pStyle w:val="TOC1"/>
             <w:rPr>
               <w:rFonts w:asciiTheme="minorHAnsi" w:eastAsiaTheme="minorEastAsia" w:hAnsiTheme="minorHAnsi" w:cstheme="minorBidi"/>
               <w:noProof/>
@@ -821,7 +790,7 @@
         </w:p>
         <w:p>
           <w:pPr>
-            <w:pStyle w:val="Verzeichnis1"/>
+            <w:pStyle w:val="TOC1"/>
             <w:rPr>
               <w:rFonts w:asciiTheme="minorHAnsi" w:eastAsiaTheme="minorEastAsia" w:hAnsiTheme="minorHAnsi" w:cstheme="minorBidi"/>
               <w:noProof/>
@@ -911,7 +880,7 @@
         </w:p>
         <w:p>
           <w:pPr>
-            <w:pStyle w:val="Verzeichnis1"/>
+            <w:pStyle w:val="TOC1"/>
             <w:rPr>
               <w:rFonts w:asciiTheme="minorHAnsi" w:eastAsiaTheme="minorEastAsia" w:hAnsiTheme="minorHAnsi" w:cstheme="minorBidi"/>
               <w:noProof/>
@@ -1001,7 +970,7 @@
         </w:p>
         <w:p>
           <w:pPr>
-            <w:pStyle w:val="Verzeichnis1"/>
+            <w:pStyle w:val="TOC1"/>
             <w:rPr>
               <w:rFonts w:asciiTheme="minorHAnsi" w:eastAsiaTheme="minorEastAsia" w:hAnsiTheme="minorHAnsi" w:cstheme="minorBidi"/>
               <w:noProof/>
@@ -1166,149 +1135,2790 @@
     </w:p>
     <w:p>
       <w:pPr>
-        <w:pStyle w:val="berschrift1"/>
-        <w:rPr>
-          <w:lang w:val="en-GB"/>
-        </w:rPr>
-      </w:pPr>
-      <w:bookmarkStart w:id="2" w:name="_Toc208327537"/>
+        <w:pStyle w:val="Heading1"/>
+        <w:rPr>
+          <w:lang w:val="en-GB"/>
+        </w:rPr>
+      </w:pPr>
       <w:r>
         <w:rPr>
           <w:lang w:val="en-GB"/>
         </w:rPr>
         <w:lastRenderedPageBreak/>
-        <w:t>Purpose of Testing</w:t>
+        <w:t>Test procedure</w:t>
+      </w:r>
+    </w:p>
+    <w:p>
+      <w:pPr>
+        <w:rPr>
+          <w:lang w:val="en-GB"/>
+        </w:rPr>
+      </w:pPr>
+      <w:r>
+        <w:rPr>
+          <w:lang w:val="en-GB"/>
+        </w:rPr>
+        <w:t>After the hardware has been completely soldered and assembled, it is of utmost importance to carefully inspect the solder joints under a microscope. This pre-testing step can help prevent potential damage to the electronics caused by shorts or misplaced components.</w:t>
+      </w:r>
+    </w:p>
+    <w:p>
+      <w:pPr>
+        <w:rPr>
+          <w:lang w:val="en-GB"/>
+        </w:rPr>
+      </w:pPr>
+      <w:r>
+        <w:rPr>
+          <w:lang w:val="en-GB"/>
+        </w:rPr>
+        <w:t>Next, the “life signs” test can begin, where the board is powered on for the first time. During this step, all safety considerations mentioned in the safety chapter must be observed. All internal voltages and current draws should be documented and compared against the expected values. In case of a failure, a structured debugging approach must be followed. If the life signs test passes, it is permissible to proceed to the basic hardware functionality tests.</w:t>
+      </w:r>
+    </w:p>
+    <w:p>
+      <w:pPr>
+        <w:rPr>
+          <w:lang w:val="en-GB"/>
+        </w:rPr>
+      </w:pPr>
+      <w:r>
+        <w:rPr>
+          <w:lang w:val="en-GB"/>
+        </w:rPr>
+        <w:t xml:space="preserve">The basic hardware functionality test aims to verify the operation of </w:t>
+      </w:r>
+      <w:r>
+        <w:rPr>
+          <w:lang w:val="en-GB"/>
+        </w:rPr>
+        <w:t>sub-circuits</w:t>
+      </w:r>
+      <w:r>
+        <w:rPr>
+          <w:lang w:val="en-GB"/>
+        </w:rPr>
+        <w:t xml:space="preserve"> </w:t>
+      </w:r>
+      <w:r>
+        <w:rPr>
+          <w:lang w:val="en-GB"/>
+        </w:rPr>
+        <w:t xml:space="preserve">groups. It follows a systematic approach, starting from the audio input connectors, through the </w:t>
+      </w:r>
+      <w:proofErr w:type="spellStart"/>
+      <w:r>
+        <w:rPr>
+          <w:lang w:val="en-GB"/>
+        </w:rPr>
+        <w:t>analog</w:t>
+      </w:r>
+      <w:proofErr w:type="spellEnd"/>
+      <w:r>
+        <w:rPr>
+          <w:lang w:val="en-GB"/>
+        </w:rPr>
+        <w:t xml:space="preserve"> input circuitry, codec, </w:t>
+      </w:r>
+      <w:proofErr w:type="spellStart"/>
+      <w:r>
+        <w:rPr>
+          <w:lang w:val="en-GB"/>
+        </w:rPr>
+        <w:t>analog</w:t>
+      </w:r>
+      <w:proofErr w:type="spellEnd"/>
+      <w:r>
+        <w:rPr>
+          <w:lang w:val="en-GB"/>
+        </w:rPr>
+        <w:t xml:space="preserve"> output circuitry, and ending at the output connectors.</w:t>
+      </w:r>
+    </w:p>
+    <w:p>
+      <w:pPr>
+        <w:pStyle w:val="Heading1"/>
+        <w:rPr>
+          <w:lang w:val="en-GB"/>
+        </w:rPr>
+      </w:pPr>
+      <w:r>
+        <w:rPr>
+          <w:lang w:val="en-GB"/>
+        </w:rPr>
+        <w:t>Safety</w:t>
+      </w:r>
+    </w:p>
+    <w:p>
+      <w:pPr>
+        <w:rPr>
+          <w:lang w:val="en-GB"/>
+        </w:rPr>
+      </w:pPr>
+      <w:bookmarkStart w:id="2" w:name="_Toc208327538"/>
+      <w:proofErr w:type="spellStart"/>
+      <w:r>
+        <w:rPr>
+          <w:lang w:val="en-GB"/>
+        </w:rPr>
+        <w:t>Although</w:t>
+      </w:r>
+      <w:proofErr w:type="spellEnd"/>
+      <w:r>
+        <w:rPr>
+          <w:lang w:val="en-GB"/>
+        </w:rPr>
+        <w:t xml:space="preserve"> not </w:t>
+      </w:r>
+      <w:proofErr w:type="spellStart"/>
+      <w:r>
+        <w:rPr>
+          <w:lang w:val="en-GB"/>
+        </w:rPr>
+        <w:t>part</w:t>
+      </w:r>
+      <w:proofErr w:type="spellEnd"/>
+      <w:r>
+        <w:rPr>
+          <w:lang w:val="en-GB"/>
+        </w:rPr>
+        <w:t xml:space="preserve"> </w:t>
+      </w:r>
+      <w:proofErr w:type="spellStart"/>
+      <w:r>
+        <w:rPr>
+          <w:lang w:val="en-GB"/>
+        </w:rPr>
+        <w:t>of</w:t>
+      </w:r>
+      <w:proofErr w:type="spellEnd"/>
+      <w:r>
+        <w:rPr>
+          <w:lang w:val="en-GB"/>
+        </w:rPr>
+        <w:t xml:space="preserve"> </w:t>
+      </w:r>
+      <w:proofErr w:type="spellStart"/>
+      <w:r>
+        <w:rPr>
+          <w:lang w:val="en-GB"/>
+        </w:rPr>
+        <w:t>the</w:t>
+      </w:r>
+      <w:proofErr w:type="spellEnd"/>
+      <w:r>
+        <w:rPr>
+          <w:lang w:val="en-GB"/>
+        </w:rPr>
+        <w:t xml:space="preserve"> </w:t>
+      </w:r>
+      <w:proofErr w:type="spellStart"/>
+      <w:r>
+        <w:rPr>
+          <w:lang w:val="en-GB"/>
+        </w:rPr>
+        <w:t>testing</w:t>
+      </w:r>
+      <w:proofErr w:type="spellEnd"/>
+      <w:r>
+        <w:rPr>
+          <w:lang w:val="en-GB"/>
+        </w:rPr>
+        <w:t xml:space="preserve">, care </w:t>
+      </w:r>
+      <w:proofErr w:type="spellStart"/>
+      <w:r>
+        <w:rPr>
+          <w:lang w:val="en-GB"/>
+        </w:rPr>
+        <w:t>must</w:t>
+      </w:r>
+      <w:proofErr w:type="spellEnd"/>
+      <w:r>
+        <w:rPr>
+          <w:lang w:val="en-GB"/>
+        </w:rPr>
+        <w:t xml:space="preserve"> </w:t>
+      </w:r>
+      <w:proofErr w:type="spellStart"/>
+      <w:r>
+        <w:rPr>
+          <w:lang w:val="en-GB"/>
+        </w:rPr>
+        <w:t>be</w:t>
+      </w:r>
+      <w:proofErr w:type="spellEnd"/>
+      <w:r>
+        <w:rPr>
+          <w:lang w:val="en-GB"/>
+        </w:rPr>
+        <w:t xml:space="preserve"> </w:t>
+      </w:r>
+      <w:proofErr w:type="spellStart"/>
+      <w:r>
+        <w:rPr>
+          <w:lang w:val="en-GB"/>
+        </w:rPr>
+        <w:t>taken</w:t>
+      </w:r>
+      <w:proofErr w:type="spellEnd"/>
+      <w:r>
+        <w:rPr>
+          <w:lang w:val="en-GB"/>
+        </w:rPr>
+        <w:t xml:space="preserve"> </w:t>
+      </w:r>
+      <w:proofErr w:type="spellStart"/>
+      <w:r>
+        <w:rPr>
+          <w:lang w:val="en-GB"/>
+        </w:rPr>
+        <w:t>when</w:t>
+      </w:r>
+      <w:proofErr w:type="spellEnd"/>
+      <w:r>
+        <w:rPr>
+          <w:lang w:val="en-GB"/>
+        </w:rPr>
+        <w:t xml:space="preserve"> </w:t>
+      </w:r>
+      <w:proofErr w:type="spellStart"/>
+      <w:r>
+        <w:rPr>
+          <w:lang w:val="en-GB"/>
+        </w:rPr>
+        <w:t>soldering</w:t>
+      </w:r>
+      <w:proofErr w:type="spellEnd"/>
+      <w:r>
+        <w:rPr>
+          <w:lang w:val="en-GB"/>
+        </w:rPr>
+        <w:t xml:space="preserve"> and </w:t>
+      </w:r>
+      <w:proofErr w:type="spellStart"/>
+      <w:r>
+        <w:rPr>
+          <w:lang w:val="en-GB"/>
+        </w:rPr>
+        <w:t>handling</w:t>
+      </w:r>
+      <w:proofErr w:type="spellEnd"/>
+      <w:r>
+        <w:rPr>
+          <w:lang w:val="en-GB"/>
+        </w:rPr>
+        <w:t xml:space="preserve"> </w:t>
+      </w:r>
+      <w:proofErr w:type="spellStart"/>
+      <w:r>
+        <w:rPr>
+          <w:lang w:val="en-GB"/>
+        </w:rPr>
+        <w:t>the</w:t>
+      </w:r>
+      <w:proofErr w:type="spellEnd"/>
+      <w:r>
+        <w:rPr>
+          <w:lang w:val="en-GB"/>
+        </w:rPr>
+        <w:t xml:space="preserve"> </w:t>
+      </w:r>
+      <w:proofErr w:type="spellStart"/>
+      <w:r>
+        <w:rPr>
+          <w:lang w:val="en-GB"/>
+        </w:rPr>
+        <w:t>soldering</w:t>
+      </w:r>
+      <w:proofErr w:type="spellEnd"/>
+      <w:r>
+        <w:rPr>
+          <w:lang w:val="en-GB"/>
+        </w:rPr>
+        <w:t xml:space="preserve"> iron. </w:t>
+      </w:r>
+      <w:proofErr w:type="spellStart"/>
+      <w:r>
+        <w:rPr>
+          <w:lang w:val="en-GB"/>
+        </w:rPr>
+        <w:t>Soldering</w:t>
+      </w:r>
+      <w:proofErr w:type="spellEnd"/>
+      <w:r>
+        <w:rPr>
+          <w:lang w:val="en-GB"/>
+        </w:rPr>
+        <w:t xml:space="preserve"> </w:t>
+      </w:r>
+      <w:proofErr w:type="spellStart"/>
+      <w:r>
+        <w:rPr>
+          <w:lang w:val="en-GB"/>
+        </w:rPr>
+        <w:t>temperatures</w:t>
+      </w:r>
+      <w:proofErr w:type="spellEnd"/>
+      <w:r>
+        <w:rPr>
+          <w:lang w:val="en-GB"/>
+        </w:rPr>
+        <w:t xml:space="preserve"> </w:t>
+      </w:r>
+      <w:proofErr w:type="spellStart"/>
+      <w:r>
+        <w:rPr>
+          <w:lang w:val="en-GB"/>
+        </w:rPr>
+        <w:t>range</w:t>
+      </w:r>
+      <w:proofErr w:type="spellEnd"/>
+      <w:r>
+        <w:rPr>
+          <w:lang w:val="en-GB"/>
+        </w:rPr>
+        <w:t xml:space="preserve"> </w:t>
+      </w:r>
+      <w:proofErr w:type="spellStart"/>
+      <w:r>
+        <w:rPr>
+          <w:lang w:val="en-GB"/>
+        </w:rPr>
+        <w:t>from</w:t>
+      </w:r>
+      <w:proofErr w:type="spellEnd"/>
+      <w:r>
+        <w:rPr>
+          <w:lang w:val="en-GB"/>
+        </w:rPr>
+        <w:t xml:space="preserve"> 300 °C </w:t>
+      </w:r>
+      <w:proofErr w:type="spellStart"/>
+      <w:r>
+        <w:rPr>
+          <w:lang w:val="en-GB"/>
+        </w:rPr>
+        <w:t>to</w:t>
+      </w:r>
+      <w:proofErr w:type="spellEnd"/>
+      <w:r>
+        <w:rPr>
+          <w:lang w:val="en-GB"/>
+        </w:rPr>
+        <w:t xml:space="preserve"> 400 °C and </w:t>
+      </w:r>
+      <w:proofErr w:type="spellStart"/>
+      <w:r>
+        <w:rPr>
+          <w:lang w:val="en-GB"/>
+        </w:rPr>
+        <w:t>can</w:t>
+      </w:r>
+      <w:proofErr w:type="spellEnd"/>
+      <w:r>
+        <w:rPr>
+          <w:lang w:val="en-GB"/>
+        </w:rPr>
+        <w:t xml:space="preserve"> </w:t>
+      </w:r>
+      <w:proofErr w:type="spellStart"/>
+      <w:r>
+        <w:rPr>
+          <w:lang w:val="en-GB"/>
+        </w:rPr>
+        <w:t>cause</w:t>
+      </w:r>
+      <w:proofErr w:type="spellEnd"/>
+      <w:r>
+        <w:rPr>
+          <w:lang w:val="en-GB"/>
+        </w:rPr>
+        <w:t xml:space="preserve"> </w:t>
+      </w:r>
+      <w:proofErr w:type="spellStart"/>
+      <w:r>
+        <w:rPr>
+          <w:lang w:val="en-GB"/>
+        </w:rPr>
+        <w:t>serious</w:t>
+      </w:r>
+      <w:proofErr w:type="spellEnd"/>
+      <w:r>
+        <w:rPr>
+          <w:lang w:val="en-GB"/>
+        </w:rPr>
+        <w:t xml:space="preserve"> </w:t>
+      </w:r>
+      <w:proofErr w:type="spellStart"/>
+      <w:r>
+        <w:rPr>
+          <w:lang w:val="en-GB"/>
+        </w:rPr>
+        <w:t>burns</w:t>
+      </w:r>
+      <w:proofErr w:type="spellEnd"/>
+      <w:r>
+        <w:rPr>
+          <w:lang w:val="en-GB"/>
+        </w:rPr>
+        <w:t xml:space="preserve"> </w:t>
+      </w:r>
+      <w:proofErr w:type="spellStart"/>
+      <w:r>
+        <w:rPr>
+          <w:lang w:val="en-GB"/>
+        </w:rPr>
+        <w:t>if</w:t>
+      </w:r>
+      <w:proofErr w:type="spellEnd"/>
+      <w:r>
+        <w:rPr>
+          <w:lang w:val="en-GB"/>
+        </w:rPr>
+        <w:t xml:space="preserve"> not </w:t>
+      </w:r>
+      <w:proofErr w:type="spellStart"/>
+      <w:r>
+        <w:rPr>
+          <w:lang w:val="en-GB"/>
+        </w:rPr>
+        <w:t>handled</w:t>
+      </w:r>
+      <w:proofErr w:type="spellEnd"/>
+      <w:r>
+        <w:rPr>
+          <w:lang w:val="en-GB"/>
+        </w:rPr>
+        <w:t xml:space="preserve"> </w:t>
+      </w:r>
+      <w:proofErr w:type="spellStart"/>
+      <w:r>
+        <w:rPr>
+          <w:lang w:val="en-GB"/>
+        </w:rPr>
+        <w:t>properly</w:t>
+      </w:r>
+      <w:proofErr w:type="spellEnd"/>
+      <w:r>
+        <w:rPr>
+          <w:lang w:val="en-GB"/>
+        </w:rPr>
+        <w:t>.</w:t>
+      </w:r>
+    </w:p>
+    <w:p>
+      <w:pPr>
+        <w:rPr>
+          <w:lang w:val="en-GB"/>
+        </w:rPr>
+      </w:pPr>
+      <w:proofErr w:type="spellStart"/>
+      <w:r>
+        <w:rPr>
+          <w:lang w:val="en-GB"/>
+        </w:rPr>
+        <w:t>When</w:t>
+      </w:r>
+      <w:proofErr w:type="spellEnd"/>
+      <w:r>
+        <w:rPr>
+          <w:lang w:val="en-GB"/>
+        </w:rPr>
+        <w:t xml:space="preserve"> </w:t>
+      </w:r>
+      <w:proofErr w:type="spellStart"/>
+      <w:r>
+        <w:rPr>
+          <w:lang w:val="en-GB"/>
+        </w:rPr>
+        <w:t>powering</w:t>
+      </w:r>
+      <w:proofErr w:type="spellEnd"/>
+      <w:r>
+        <w:rPr>
+          <w:lang w:val="en-GB"/>
+        </w:rPr>
+        <w:t xml:space="preserve"> </w:t>
+      </w:r>
+      <w:proofErr w:type="spellStart"/>
+      <w:r>
+        <w:rPr>
+          <w:lang w:val="en-GB"/>
+        </w:rPr>
+        <w:t>the</w:t>
+      </w:r>
+      <w:proofErr w:type="spellEnd"/>
+      <w:r>
+        <w:rPr>
+          <w:lang w:val="en-GB"/>
+        </w:rPr>
+        <w:t xml:space="preserve"> </w:t>
+      </w:r>
+      <w:proofErr w:type="spellStart"/>
+      <w:r>
+        <w:rPr>
+          <w:lang w:val="en-GB"/>
+        </w:rPr>
+        <w:t>board</w:t>
+      </w:r>
+      <w:proofErr w:type="spellEnd"/>
+      <w:r>
+        <w:rPr>
+          <w:lang w:val="en-GB"/>
+        </w:rPr>
+        <w:t xml:space="preserve"> </w:t>
+      </w:r>
+      <w:proofErr w:type="spellStart"/>
+      <w:r>
+        <w:rPr>
+          <w:lang w:val="en-GB"/>
+        </w:rPr>
+        <w:t>for</w:t>
+      </w:r>
+      <w:proofErr w:type="spellEnd"/>
+      <w:r>
+        <w:rPr>
+          <w:lang w:val="en-GB"/>
+        </w:rPr>
+        <w:t xml:space="preserve"> </w:t>
+      </w:r>
+      <w:proofErr w:type="spellStart"/>
+      <w:r>
+        <w:rPr>
+          <w:lang w:val="en-GB"/>
+        </w:rPr>
+        <w:t>the</w:t>
+      </w:r>
+      <w:proofErr w:type="spellEnd"/>
+      <w:r>
+        <w:rPr>
+          <w:lang w:val="en-GB"/>
+        </w:rPr>
+        <w:t xml:space="preserve"> </w:t>
+      </w:r>
+      <w:proofErr w:type="spellStart"/>
+      <w:r>
+        <w:rPr>
+          <w:lang w:val="en-GB"/>
+        </w:rPr>
+        <w:t>first</w:t>
+      </w:r>
+      <w:proofErr w:type="spellEnd"/>
+      <w:r>
+        <w:rPr>
+          <w:lang w:val="en-GB"/>
+        </w:rPr>
+        <w:t xml:space="preserve"> time, </w:t>
+      </w:r>
+      <w:proofErr w:type="spellStart"/>
+      <w:r>
+        <w:rPr>
+          <w:lang w:val="en-GB"/>
+        </w:rPr>
+        <w:t>it</w:t>
+      </w:r>
+      <w:proofErr w:type="spellEnd"/>
+      <w:r>
+        <w:rPr>
+          <w:lang w:val="en-GB"/>
+        </w:rPr>
+        <w:t xml:space="preserve"> </w:t>
+      </w:r>
+      <w:proofErr w:type="spellStart"/>
+      <w:r>
+        <w:rPr>
+          <w:lang w:val="en-GB"/>
+        </w:rPr>
+        <w:t>is</w:t>
+      </w:r>
+      <w:proofErr w:type="spellEnd"/>
+      <w:r>
+        <w:rPr>
+          <w:lang w:val="en-GB"/>
+        </w:rPr>
+        <w:t xml:space="preserve"> </w:t>
+      </w:r>
+      <w:proofErr w:type="spellStart"/>
+      <w:r>
+        <w:rPr>
+          <w:lang w:val="en-GB"/>
+        </w:rPr>
+        <w:t>good</w:t>
+      </w:r>
+      <w:proofErr w:type="spellEnd"/>
+      <w:r>
+        <w:rPr>
+          <w:lang w:val="en-GB"/>
+        </w:rPr>
+        <w:t xml:space="preserve"> </w:t>
+      </w:r>
+      <w:proofErr w:type="spellStart"/>
+      <w:r>
+        <w:rPr>
+          <w:lang w:val="en-GB"/>
+        </w:rPr>
+        <w:t>practice</w:t>
+      </w:r>
+      <w:proofErr w:type="spellEnd"/>
+      <w:r>
+        <w:rPr>
+          <w:lang w:val="en-GB"/>
+        </w:rPr>
+        <w:t xml:space="preserve"> </w:t>
+      </w:r>
+      <w:proofErr w:type="spellStart"/>
+      <w:r>
+        <w:rPr>
+          <w:lang w:val="en-GB"/>
+        </w:rPr>
+        <w:t>to</w:t>
+      </w:r>
+      <w:proofErr w:type="spellEnd"/>
+      <w:r>
+        <w:rPr>
+          <w:lang w:val="en-GB"/>
+        </w:rPr>
+        <w:t xml:space="preserve"> </w:t>
+      </w:r>
+      <w:proofErr w:type="spellStart"/>
+      <w:r>
+        <w:rPr>
+          <w:lang w:val="en-GB"/>
+        </w:rPr>
+        <w:t>use</w:t>
+      </w:r>
+      <w:proofErr w:type="spellEnd"/>
+      <w:r>
+        <w:rPr>
+          <w:lang w:val="en-GB"/>
+        </w:rPr>
+        <w:t xml:space="preserve"> a </w:t>
+      </w:r>
+      <w:proofErr w:type="spellStart"/>
+      <w:r>
+        <w:rPr>
+          <w:lang w:val="en-GB"/>
+        </w:rPr>
+        <w:t>laboratory</w:t>
+      </w:r>
+      <w:proofErr w:type="spellEnd"/>
+      <w:r>
+        <w:rPr>
+          <w:lang w:val="en-GB"/>
+        </w:rPr>
+        <w:t xml:space="preserve"> power </w:t>
+      </w:r>
+      <w:proofErr w:type="spellStart"/>
+      <w:r>
+        <w:rPr>
+          <w:lang w:val="en-GB"/>
+        </w:rPr>
+        <w:t>supply</w:t>
+      </w:r>
+      <w:proofErr w:type="spellEnd"/>
+      <w:r>
+        <w:rPr>
+          <w:lang w:val="en-GB"/>
+        </w:rPr>
+        <w:t xml:space="preserve"> </w:t>
+      </w:r>
+      <w:proofErr w:type="spellStart"/>
+      <w:r>
+        <w:rPr>
+          <w:lang w:val="en-GB"/>
+        </w:rPr>
+        <w:t>with</w:t>
+      </w:r>
+      <w:proofErr w:type="spellEnd"/>
+      <w:r>
+        <w:rPr>
+          <w:lang w:val="en-GB"/>
+        </w:rPr>
+        <w:t xml:space="preserve"> a </w:t>
+      </w:r>
+      <w:proofErr w:type="spellStart"/>
+      <w:r>
+        <w:rPr>
+          <w:lang w:val="en-GB"/>
+        </w:rPr>
+        <w:t>current</w:t>
+      </w:r>
+      <w:proofErr w:type="spellEnd"/>
+      <w:r>
+        <w:rPr>
+          <w:lang w:val="en-GB"/>
+        </w:rPr>
+        <w:t xml:space="preserve">-limit feature </w:t>
+      </w:r>
+      <w:proofErr w:type="spellStart"/>
+      <w:r>
+        <w:rPr>
+          <w:lang w:val="en-GB"/>
+        </w:rPr>
+        <w:t>to</w:t>
+      </w:r>
+      <w:proofErr w:type="spellEnd"/>
+      <w:r>
+        <w:rPr>
+          <w:lang w:val="en-GB"/>
+        </w:rPr>
+        <w:t xml:space="preserve"> </w:t>
+      </w:r>
+      <w:proofErr w:type="spellStart"/>
+      <w:r>
+        <w:rPr>
+          <w:lang w:val="en-GB"/>
+        </w:rPr>
+        <w:t>prevent</w:t>
+      </w:r>
+      <w:proofErr w:type="spellEnd"/>
+      <w:r>
+        <w:rPr>
+          <w:lang w:val="en-GB"/>
+        </w:rPr>
+        <w:t xml:space="preserve"> </w:t>
+      </w:r>
+      <w:proofErr w:type="spellStart"/>
+      <w:r>
+        <w:rPr>
+          <w:lang w:val="en-GB"/>
+        </w:rPr>
+        <w:t>severe</w:t>
+      </w:r>
+      <w:proofErr w:type="spellEnd"/>
+      <w:r>
+        <w:rPr>
+          <w:lang w:val="en-GB"/>
+        </w:rPr>
+        <w:t xml:space="preserve"> </w:t>
+      </w:r>
+      <w:proofErr w:type="spellStart"/>
+      <w:r>
+        <w:rPr>
+          <w:lang w:val="en-GB"/>
+        </w:rPr>
+        <w:t>damage</w:t>
+      </w:r>
+      <w:proofErr w:type="spellEnd"/>
+      <w:r>
+        <w:rPr>
+          <w:lang w:val="en-GB"/>
+        </w:rPr>
+        <w:t xml:space="preserve"> in </w:t>
+      </w:r>
+      <w:proofErr w:type="spellStart"/>
+      <w:r>
+        <w:rPr>
+          <w:lang w:val="en-GB"/>
+        </w:rPr>
+        <w:t>case</w:t>
+      </w:r>
+      <w:proofErr w:type="spellEnd"/>
+      <w:r>
+        <w:rPr>
+          <w:lang w:val="en-GB"/>
+        </w:rPr>
+        <w:t xml:space="preserve"> </w:t>
+      </w:r>
+      <w:proofErr w:type="spellStart"/>
+      <w:r>
+        <w:rPr>
+          <w:lang w:val="en-GB"/>
+        </w:rPr>
+        <w:t>of</w:t>
+      </w:r>
+      <w:proofErr w:type="spellEnd"/>
+      <w:r>
+        <w:rPr>
+          <w:lang w:val="en-GB"/>
+        </w:rPr>
+        <w:t xml:space="preserve"> a </w:t>
+      </w:r>
+      <w:proofErr w:type="spellStart"/>
+      <w:r>
+        <w:rPr>
+          <w:lang w:val="en-GB"/>
+        </w:rPr>
+        <w:t>short</w:t>
+      </w:r>
+      <w:proofErr w:type="spellEnd"/>
+      <w:r>
+        <w:rPr>
+          <w:lang w:val="en-GB"/>
+        </w:rPr>
+        <w:t xml:space="preserve"> </w:t>
+      </w:r>
+      <w:proofErr w:type="spellStart"/>
+      <w:r>
+        <w:rPr>
+          <w:lang w:val="en-GB"/>
+        </w:rPr>
+        <w:t>circuit</w:t>
+      </w:r>
+      <w:proofErr w:type="spellEnd"/>
+      <w:r>
+        <w:rPr>
+          <w:lang w:val="en-GB"/>
+        </w:rPr>
+        <w:t xml:space="preserve">. Even </w:t>
+      </w:r>
+      <w:proofErr w:type="spellStart"/>
+      <w:r>
+        <w:rPr>
+          <w:lang w:val="en-GB"/>
+        </w:rPr>
+        <w:t>better</w:t>
+      </w:r>
+      <w:proofErr w:type="spellEnd"/>
+      <w:r>
+        <w:rPr>
+          <w:lang w:val="en-GB"/>
+        </w:rPr>
+        <w:t xml:space="preserve"> </w:t>
+      </w:r>
+      <w:proofErr w:type="spellStart"/>
+      <w:r>
+        <w:rPr>
+          <w:lang w:val="en-GB"/>
+        </w:rPr>
+        <w:t>results</w:t>
+      </w:r>
+      <w:proofErr w:type="spellEnd"/>
+      <w:r>
+        <w:rPr>
+          <w:lang w:val="en-GB"/>
+        </w:rPr>
+        <w:t xml:space="preserve"> </w:t>
+      </w:r>
+      <w:proofErr w:type="spellStart"/>
+      <w:r>
+        <w:rPr>
+          <w:lang w:val="en-GB"/>
+        </w:rPr>
+        <w:t>can</w:t>
+      </w:r>
+      <w:proofErr w:type="spellEnd"/>
+      <w:r>
+        <w:rPr>
+          <w:lang w:val="en-GB"/>
+        </w:rPr>
+        <w:t xml:space="preserve"> </w:t>
+      </w:r>
+      <w:proofErr w:type="spellStart"/>
+      <w:r>
+        <w:rPr>
+          <w:lang w:val="en-GB"/>
+        </w:rPr>
+        <w:t>be</w:t>
+      </w:r>
+      <w:proofErr w:type="spellEnd"/>
+      <w:r>
+        <w:rPr>
+          <w:lang w:val="en-GB"/>
+        </w:rPr>
+        <w:t xml:space="preserve"> </w:t>
+      </w:r>
+      <w:proofErr w:type="spellStart"/>
+      <w:r>
+        <w:rPr>
+          <w:lang w:val="en-GB"/>
+        </w:rPr>
+        <w:t>achieved</w:t>
+      </w:r>
+      <w:proofErr w:type="spellEnd"/>
+      <w:r>
+        <w:rPr>
+          <w:lang w:val="en-GB"/>
+        </w:rPr>
+        <w:t xml:space="preserve"> </w:t>
+      </w:r>
+      <w:proofErr w:type="spellStart"/>
+      <w:r>
+        <w:rPr>
+          <w:lang w:val="en-GB"/>
+        </w:rPr>
+        <w:t>by</w:t>
+      </w:r>
+      <w:proofErr w:type="spellEnd"/>
+      <w:r>
+        <w:rPr>
+          <w:lang w:val="en-GB"/>
+        </w:rPr>
+        <w:t xml:space="preserve"> </w:t>
+      </w:r>
+      <w:proofErr w:type="spellStart"/>
+      <w:r>
+        <w:rPr>
+          <w:lang w:val="en-GB"/>
+        </w:rPr>
+        <w:t>powering</w:t>
+      </w:r>
+      <w:proofErr w:type="spellEnd"/>
+      <w:r>
+        <w:rPr>
+          <w:lang w:val="en-GB"/>
+        </w:rPr>
+        <w:t xml:space="preserve"> </w:t>
+      </w:r>
+      <w:proofErr w:type="spellStart"/>
+      <w:r>
+        <w:rPr>
+          <w:lang w:val="en-GB"/>
+        </w:rPr>
+        <w:t>the</w:t>
+      </w:r>
+      <w:proofErr w:type="spellEnd"/>
+      <w:r>
+        <w:rPr>
+          <w:lang w:val="en-GB"/>
+        </w:rPr>
+        <w:t xml:space="preserve"> </w:t>
+      </w:r>
+      <w:proofErr w:type="spellStart"/>
+      <w:r>
+        <w:rPr>
+          <w:lang w:val="en-GB"/>
+        </w:rPr>
+        <w:t>board</w:t>
+      </w:r>
+      <w:proofErr w:type="spellEnd"/>
+      <w:r>
+        <w:rPr>
+          <w:lang w:val="en-GB"/>
+        </w:rPr>
+        <w:t xml:space="preserve"> at a </w:t>
+      </w:r>
+      <w:proofErr w:type="spellStart"/>
+      <w:r>
+        <w:rPr>
+          <w:lang w:val="en-GB"/>
+        </w:rPr>
+        <w:t>slightly</w:t>
+      </w:r>
+      <w:proofErr w:type="spellEnd"/>
+      <w:r>
+        <w:rPr>
+          <w:lang w:val="en-GB"/>
+        </w:rPr>
+        <w:t xml:space="preserve"> </w:t>
+      </w:r>
+      <w:proofErr w:type="spellStart"/>
+      <w:r>
+        <w:rPr>
+          <w:lang w:val="en-GB"/>
+        </w:rPr>
+        <w:t>lower</w:t>
+      </w:r>
+      <w:proofErr w:type="spellEnd"/>
+      <w:r>
+        <w:rPr>
+          <w:lang w:val="en-GB"/>
+        </w:rPr>
+        <w:t xml:space="preserve"> </w:t>
+      </w:r>
+      <w:proofErr w:type="spellStart"/>
+      <w:r>
+        <w:rPr>
+          <w:lang w:val="en-GB"/>
+        </w:rPr>
+        <w:t>voltage</w:t>
+      </w:r>
+      <w:proofErr w:type="spellEnd"/>
+      <w:r>
+        <w:rPr>
+          <w:lang w:val="en-GB"/>
+        </w:rPr>
+        <w:t xml:space="preserve"> </w:t>
+      </w:r>
+      <w:proofErr w:type="spellStart"/>
+      <w:r>
+        <w:rPr>
+          <w:lang w:val="en-GB"/>
+        </w:rPr>
+        <w:t>initially</w:t>
+      </w:r>
+      <w:proofErr w:type="spellEnd"/>
+      <w:r>
+        <w:rPr>
+          <w:lang w:val="en-GB"/>
+        </w:rPr>
+        <w:t xml:space="preserve"> </w:t>
+      </w:r>
+      <w:proofErr w:type="spellStart"/>
+      <w:r>
+        <w:rPr>
+          <w:lang w:val="en-GB"/>
+        </w:rPr>
+        <w:t>to</w:t>
+      </w:r>
+      <w:proofErr w:type="spellEnd"/>
+      <w:r>
+        <w:rPr>
+          <w:lang w:val="en-GB"/>
+        </w:rPr>
+        <w:t xml:space="preserve"> </w:t>
+      </w:r>
+      <w:proofErr w:type="spellStart"/>
+      <w:r>
+        <w:rPr>
+          <w:lang w:val="en-GB"/>
+        </w:rPr>
+        <w:t>further</w:t>
+      </w:r>
+      <w:proofErr w:type="spellEnd"/>
+      <w:r>
+        <w:rPr>
+          <w:lang w:val="en-GB"/>
+        </w:rPr>
+        <w:t xml:space="preserve"> </w:t>
+      </w:r>
+      <w:proofErr w:type="spellStart"/>
+      <w:r>
+        <w:rPr>
+          <w:lang w:val="en-GB"/>
+        </w:rPr>
+        <w:t>limit</w:t>
+      </w:r>
+      <w:proofErr w:type="spellEnd"/>
+      <w:r>
+        <w:rPr>
+          <w:lang w:val="en-GB"/>
+        </w:rPr>
+        <w:t xml:space="preserve"> power in case of a fault.</w:t>
+      </w:r>
+      <w:r>
+        <w:rPr>
+          <w:lang w:val="en-GB"/>
+        </w:rPr>
+        <w:t xml:space="preserve"> </w:t>
+      </w:r>
+    </w:p>
+    <w:p>
+      <w:pPr>
+        <w:rPr>
+          <w:lang w:val="en-GB"/>
+        </w:rPr>
+      </w:pPr>
+      <w:r>
+        <w:rPr>
+          <w:lang w:val="en-GB"/>
+        </w:rPr>
+        <w:t xml:space="preserve">If abnormal </w:t>
+      </w:r>
+      <w:proofErr w:type="spellStart"/>
+      <w:r>
+        <w:rPr>
+          <w:lang w:val="en-GB"/>
+        </w:rPr>
+        <w:t>behavior</w:t>
+      </w:r>
+      <w:proofErr w:type="spellEnd"/>
+      <w:r>
+        <w:rPr>
+          <w:lang w:val="en-GB"/>
+        </w:rPr>
+        <w:t xml:space="preserve"> such </w:t>
+      </w:r>
+      <w:proofErr w:type="spellStart"/>
+      <w:r>
+        <w:rPr>
+          <w:lang w:val="en-GB"/>
+        </w:rPr>
+        <w:t>as</w:t>
+      </w:r>
+      <w:proofErr w:type="spellEnd"/>
+      <w:r>
+        <w:rPr>
+          <w:lang w:val="en-GB"/>
+        </w:rPr>
+        <w:t xml:space="preserve"> smoke, </w:t>
+      </w:r>
+      <w:proofErr w:type="spellStart"/>
+      <w:r>
+        <w:rPr>
+          <w:lang w:val="en-GB"/>
+        </w:rPr>
+        <w:t>overheating</w:t>
+      </w:r>
+      <w:proofErr w:type="spellEnd"/>
+      <w:r>
+        <w:rPr>
+          <w:lang w:val="en-GB"/>
+        </w:rPr>
+        <w:t xml:space="preserve">, </w:t>
+      </w:r>
+      <w:proofErr w:type="spellStart"/>
+      <w:r>
+        <w:rPr>
+          <w:lang w:val="en-GB"/>
+        </w:rPr>
+        <w:t>or</w:t>
+      </w:r>
+      <w:proofErr w:type="spellEnd"/>
+      <w:r>
+        <w:rPr>
+          <w:lang w:val="en-GB"/>
+        </w:rPr>
+        <w:t xml:space="preserve"> </w:t>
+      </w:r>
+      <w:proofErr w:type="spellStart"/>
+      <w:r>
+        <w:rPr>
+          <w:lang w:val="en-GB"/>
+        </w:rPr>
+        <w:t>excessive</w:t>
+      </w:r>
+      <w:proofErr w:type="spellEnd"/>
+      <w:r>
+        <w:rPr>
+          <w:lang w:val="en-GB"/>
+        </w:rPr>
+        <w:t xml:space="preserve"> </w:t>
+      </w:r>
+      <w:proofErr w:type="spellStart"/>
+      <w:r>
+        <w:rPr>
+          <w:lang w:val="en-GB"/>
+        </w:rPr>
+        <w:t>current</w:t>
+      </w:r>
+      <w:proofErr w:type="spellEnd"/>
+      <w:r>
+        <w:rPr>
+          <w:lang w:val="en-GB"/>
+        </w:rPr>
+        <w:t xml:space="preserve"> </w:t>
+      </w:r>
+      <w:proofErr w:type="spellStart"/>
+      <w:r>
+        <w:rPr>
+          <w:lang w:val="en-GB"/>
+        </w:rPr>
+        <w:t>draw</w:t>
+      </w:r>
+      <w:proofErr w:type="spellEnd"/>
+      <w:r>
+        <w:rPr>
+          <w:lang w:val="en-GB"/>
+        </w:rPr>
+        <w:t xml:space="preserve"> </w:t>
+      </w:r>
+      <w:proofErr w:type="spellStart"/>
+      <w:r>
+        <w:rPr>
+          <w:lang w:val="en-GB"/>
+        </w:rPr>
+        <w:t>is</w:t>
+      </w:r>
+      <w:proofErr w:type="spellEnd"/>
+      <w:r>
+        <w:rPr>
+          <w:lang w:val="en-GB"/>
+        </w:rPr>
+        <w:t xml:space="preserve"> </w:t>
+      </w:r>
+      <w:proofErr w:type="spellStart"/>
+      <w:r>
+        <w:rPr>
+          <w:lang w:val="en-GB"/>
+        </w:rPr>
+        <w:t>observed</w:t>
+      </w:r>
+      <w:proofErr w:type="spellEnd"/>
+      <w:r>
+        <w:rPr>
+          <w:lang w:val="en-GB"/>
+        </w:rPr>
+        <w:t xml:space="preserve">, </w:t>
+      </w:r>
+      <w:proofErr w:type="spellStart"/>
+      <w:r>
+        <w:rPr>
+          <w:lang w:val="en-GB"/>
+        </w:rPr>
+        <w:t>disconnect</w:t>
+      </w:r>
+      <w:proofErr w:type="spellEnd"/>
+      <w:r>
+        <w:rPr>
+          <w:lang w:val="en-GB"/>
+        </w:rPr>
+        <w:t xml:space="preserve"> power </w:t>
+      </w:r>
+      <w:proofErr w:type="spellStart"/>
+      <w:r>
+        <w:rPr>
+          <w:lang w:val="en-GB"/>
+        </w:rPr>
+        <w:t>immediately</w:t>
+      </w:r>
+      <w:proofErr w:type="spellEnd"/>
+      <w:r>
+        <w:rPr>
+          <w:lang w:val="en-GB"/>
+        </w:rPr>
+        <w:t xml:space="preserve"> and </w:t>
+      </w:r>
+      <w:proofErr w:type="spellStart"/>
+      <w:r>
+        <w:rPr>
+          <w:lang w:val="en-GB"/>
+        </w:rPr>
+        <w:t>inspect</w:t>
+      </w:r>
+      <w:proofErr w:type="spellEnd"/>
+      <w:r>
+        <w:rPr>
+          <w:lang w:val="en-GB"/>
+        </w:rPr>
+        <w:t xml:space="preserve"> the hardware before continuing.</w:t>
+      </w:r>
+    </w:p>
+    <w:p>
+      <w:pPr>
+        <w:rPr>
+          <w:lang w:val="en-GB"/>
+        </w:rPr>
+      </w:pPr>
+      <w:r>
+        <w:rPr>
+          <w:lang w:val="en-GB"/>
+        </w:rPr>
+        <w:t>Work on a ESD protected surface to prevent ESD damage to components.</w:t>
+      </w:r>
+    </w:p>
+    <w:p>
+      <w:pPr>
+        <w:spacing w:before="0" w:after="160" w:line="259" w:lineRule="auto"/>
+        <w:jc w:val="left"/>
+        <w:rPr>
+          <w:lang w:val="en-GB"/>
+        </w:rPr>
+      </w:pPr>
+      <w:r>
+        <w:rPr>
+          <w:lang w:val="en-GB"/>
+        </w:rPr>
+        <w:br w:type="page"/>
+      </w:r>
+    </w:p>
+    <w:p>
+      <w:pPr>
+        <w:pStyle w:val="Heading1"/>
+        <w:rPr>
+          <w:lang w:val="en-GB"/>
+        </w:rPr>
+      </w:pPr>
+      <w:r>
+        <w:rPr>
+          <w:lang w:val="en-GB"/>
+        </w:rPr>
+        <w:lastRenderedPageBreak/>
+        <w:t>Test Plan</w:t>
+      </w:r>
+    </w:p>
+    <w:tbl>
+      <w:tblPr>
+        <w:tblStyle w:val="TableGrid"/>
+        <w:tblW w:w="0" w:type="auto"/>
+        <w:tblLook w:val="04A0" w:firstRow="1" w:lastRow="0" w:firstColumn="1" w:lastColumn="0" w:noHBand="0" w:noVBand="1"/>
+      </w:tblPr>
+      <w:tblGrid>
+        <w:gridCol w:w="1599"/>
+        <w:gridCol w:w="1470"/>
+        <w:gridCol w:w="1529"/>
+        <w:gridCol w:w="1186"/>
+        <w:gridCol w:w="1443"/>
+        <w:gridCol w:w="1835"/>
+      </w:tblGrid>
+      <w:tr>
+        <w:tc>
+          <w:tcPr>
+            <w:tcW w:w="0" w:type="auto"/>
+          </w:tcPr>
+          <w:p>
+            <w:pPr>
+              <w:rPr>
+                <w:b/>
+                <w:sz w:val="16"/>
+                <w:lang w:val="en-GB"/>
+              </w:rPr>
+            </w:pPr>
+            <w:r>
+              <w:rPr>
+                <w:b/>
+                <w:sz w:val="16"/>
+                <w:lang w:val="en-GB"/>
+              </w:rPr>
+              <w:t>Test item</w:t>
+            </w:r>
+            <w:r>
+              <w:rPr>
+                <w:b/>
+                <w:sz w:val="16"/>
+                <w:lang w:val="en-GB"/>
+              </w:rPr>
+              <w:t>,</w:t>
+            </w:r>
+            <w:r>
+              <w:rPr>
+                <w:b/>
+                <w:sz w:val="16"/>
+                <w:lang w:val="en-GB"/>
+              </w:rPr>
+              <w:br/>
+            </w:r>
+            <w:r>
+              <w:rPr>
+                <w:b/>
+                <w:sz w:val="16"/>
+                <w:lang w:val="en-GB"/>
+              </w:rPr>
+              <w:t>Description</w:t>
+            </w:r>
+          </w:p>
+        </w:tc>
+        <w:tc>
+          <w:tcPr>
+            <w:tcW w:w="0" w:type="auto"/>
+          </w:tcPr>
+          <w:p>
+            <w:pPr>
+              <w:rPr>
+                <w:b/>
+                <w:sz w:val="16"/>
+                <w:lang w:val="en-GB"/>
+              </w:rPr>
+            </w:pPr>
+            <w:r>
+              <w:rPr>
+                <w:b/>
+                <w:sz w:val="16"/>
+                <w:lang w:val="en-GB"/>
+              </w:rPr>
+              <w:t>Test conditions</w:t>
+            </w:r>
+          </w:p>
+        </w:tc>
+        <w:tc>
+          <w:tcPr>
+            <w:tcW w:w="0" w:type="auto"/>
+          </w:tcPr>
+          <w:p>
+            <w:pPr>
+              <w:rPr>
+                <w:b/>
+                <w:sz w:val="16"/>
+                <w:lang w:val="en-GB"/>
+              </w:rPr>
+            </w:pPr>
+            <w:r>
+              <w:rPr>
+                <w:b/>
+                <w:sz w:val="16"/>
+                <w:lang w:val="en-GB"/>
+              </w:rPr>
+              <w:t>Expected, Tolerance</w:t>
+            </w:r>
+          </w:p>
+        </w:tc>
+        <w:tc>
+          <w:tcPr>
+            <w:tcW w:w="0" w:type="auto"/>
+          </w:tcPr>
+          <w:p>
+            <w:pPr>
+              <w:rPr>
+                <w:b/>
+                <w:sz w:val="16"/>
+                <w:lang w:val="en-GB"/>
+              </w:rPr>
+            </w:pPr>
+            <w:r>
+              <w:rPr>
+                <w:b/>
+                <w:sz w:val="16"/>
+                <w:lang w:val="en-GB"/>
+              </w:rPr>
+              <w:t>Measured result</w:t>
+            </w:r>
+          </w:p>
+        </w:tc>
+        <w:tc>
+          <w:tcPr>
+            <w:tcW w:w="0" w:type="auto"/>
+          </w:tcPr>
+          <w:p>
+            <w:pPr>
+              <w:rPr>
+                <w:b/>
+                <w:sz w:val="16"/>
+                <w:lang w:val="en-GB"/>
+              </w:rPr>
+            </w:pPr>
+            <w:r>
+              <w:rPr>
+                <w:b/>
+                <w:sz w:val="16"/>
+                <w:lang w:val="en-GB"/>
+              </w:rPr>
+              <w:t>Comparison</w:t>
+            </w:r>
+            <w:r>
+              <w:rPr>
+                <w:b/>
+                <w:sz w:val="16"/>
+                <w:lang w:val="en-GB"/>
+              </w:rPr>
+              <w:t>,</w:t>
+            </w:r>
+            <w:r>
+              <w:rPr>
+                <w:b/>
+                <w:sz w:val="16"/>
+                <w:lang w:val="en-GB"/>
+              </w:rPr>
+              <w:br/>
+            </w:r>
+            <w:r>
+              <w:rPr>
+                <w:b/>
+                <w:sz w:val="16"/>
+                <w:lang w:val="en-GB"/>
+              </w:rPr>
+              <w:t>verdict</w:t>
+            </w:r>
+          </w:p>
+        </w:tc>
+        <w:tc>
+          <w:tcPr>
+            <w:tcW w:w="0" w:type="auto"/>
+          </w:tcPr>
+          <w:p>
+            <w:pPr>
+              <w:rPr>
+                <w:b/>
+                <w:sz w:val="16"/>
+                <w:lang w:val="en-GB"/>
+              </w:rPr>
+            </w:pPr>
+            <w:r>
+              <w:rPr>
+                <w:b/>
+                <w:sz w:val="16"/>
+                <w:lang w:val="en-GB"/>
+              </w:rPr>
+              <w:t>Remark</w:t>
+            </w:r>
+            <w:r>
+              <w:rPr>
+                <w:b/>
+                <w:sz w:val="16"/>
+                <w:lang w:val="en-GB"/>
+              </w:rPr>
+              <w:t>s,</w:t>
+            </w:r>
+            <w:r>
+              <w:rPr>
+                <w:b/>
+                <w:sz w:val="16"/>
+                <w:lang w:val="en-GB"/>
+              </w:rPr>
+              <w:br/>
+              <w:t>Discussion</w:t>
+            </w:r>
+          </w:p>
+        </w:tc>
+      </w:tr>
+      <w:tr>
+        <w:tc>
+          <w:tcPr>
+            <w:tcW w:w="0" w:type="auto"/>
+          </w:tcPr>
+          <w:p>
+            <w:pPr>
+              <w:rPr>
+                <w:b/>
+                <w:sz w:val="16"/>
+                <w:lang w:val="en-GB"/>
+              </w:rPr>
+            </w:pPr>
+            <w:r>
+              <w:rPr>
+                <w:b/>
+                <w:sz w:val="16"/>
+                <w:lang w:val="en-GB"/>
+              </w:rPr>
+              <w:t>Idle current consumption</w:t>
+            </w:r>
+          </w:p>
+        </w:tc>
+        <w:tc>
+          <w:tcPr>
+            <w:tcW w:w="0" w:type="auto"/>
+          </w:tcPr>
+          <w:p>
+            <w:pPr>
+              <w:rPr>
+                <w:b/>
+                <w:sz w:val="16"/>
+                <w:lang w:val="en-GB"/>
+              </w:rPr>
+            </w:pPr>
+            <w:r>
+              <w:rPr>
+                <w:b/>
+                <w:sz w:val="16"/>
+                <w:lang w:val="en-GB"/>
+              </w:rPr>
+              <w:t>No input signal</w:t>
+            </w:r>
+          </w:p>
+          <w:p>
+            <w:pPr>
+              <w:rPr>
+                <w:b/>
+                <w:sz w:val="16"/>
+                <w:lang w:val="en-GB"/>
+              </w:rPr>
+            </w:pPr>
+          </w:p>
+        </w:tc>
+        <w:tc>
+          <w:tcPr>
+            <w:tcW w:w="0" w:type="auto"/>
+          </w:tcPr>
+          <w:p>
+            <w:pPr>
+              <w:rPr>
+                <w:b/>
+                <w:sz w:val="16"/>
+                <w:lang w:val="en-GB"/>
+              </w:rPr>
+            </w:pPr>
+          </w:p>
+        </w:tc>
+        <w:tc>
+          <w:tcPr>
+            <w:tcW w:w="0" w:type="auto"/>
+          </w:tcPr>
+          <w:p>
+            <w:pPr>
+              <w:rPr>
+                <w:b/>
+                <w:sz w:val="16"/>
+                <w:lang w:val="en-GB"/>
+              </w:rPr>
+            </w:pPr>
+          </w:p>
+        </w:tc>
+        <w:tc>
+          <w:tcPr>
+            <w:tcW w:w="0" w:type="auto"/>
+          </w:tcPr>
+          <w:p>
+            <w:pPr>
+              <w:rPr>
+                <w:b/>
+                <w:sz w:val="16"/>
+                <w:lang w:val="en-GB"/>
+              </w:rPr>
+            </w:pPr>
+          </w:p>
+        </w:tc>
+        <w:tc>
+          <w:tcPr>
+            <w:tcW w:w="0" w:type="auto"/>
+          </w:tcPr>
+          <w:p>
+            <w:pPr>
+              <w:rPr>
+                <w:b/>
+                <w:sz w:val="16"/>
+                <w:lang w:val="en-GB"/>
+              </w:rPr>
+            </w:pPr>
+          </w:p>
+        </w:tc>
+      </w:tr>
+      <w:tr>
+        <w:tc>
+          <w:tcPr>
+            <w:tcW w:w="0" w:type="auto"/>
+          </w:tcPr>
+          <w:p>
+            <w:pPr>
+              <w:rPr>
+                <w:b/>
+                <w:sz w:val="16"/>
+                <w:lang w:val="en-GB"/>
+              </w:rPr>
+            </w:pPr>
+            <w:r>
+              <w:rPr>
+                <w:b/>
+                <w:sz w:val="16"/>
+                <w:lang w:val="en-GB"/>
+              </w:rPr>
+              <w:t>+5V USB power</w:t>
+            </w:r>
+          </w:p>
+        </w:tc>
+        <w:tc>
+          <w:tcPr>
+            <w:tcW w:w="0" w:type="auto"/>
+          </w:tcPr>
+          <w:p>
+            <w:pPr>
+              <w:rPr>
+                <w:b/>
+                <w:sz w:val="16"/>
+                <w:lang w:val="en-GB"/>
+              </w:rPr>
+            </w:pPr>
+            <w:r>
+              <w:rPr>
+                <w:b/>
+                <w:sz w:val="16"/>
+                <w:lang w:val="en-GB"/>
+              </w:rPr>
+              <w:t>No input signal</w:t>
+            </w:r>
+          </w:p>
+        </w:tc>
+        <w:tc>
+          <w:tcPr>
+            <w:tcW w:w="0" w:type="auto"/>
+          </w:tcPr>
+          <w:p>
+            <w:pPr>
+              <w:rPr>
+                <w:b/>
+                <w:sz w:val="16"/>
+                <w:lang w:val="en-GB"/>
+              </w:rPr>
+            </w:pPr>
+          </w:p>
+        </w:tc>
+        <w:tc>
+          <w:tcPr>
+            <w:tcW w:w="0" w:type="auto"/>
+          </w:tcPr>
+          <w:p>
+            <w:pPr>
+              <w:rPr>
+                <w:b/>
+                <w:sz w:val="16"/>
+                <w:lang w:val="en-GB"/>
+              </w:rPr>
+            </w:pPr>
+          </w:p>
+        </w:tc>
+        <w:tc>
+          <w:tcPr>
+            <w:tcW w:w="0" w:type="auto"/>
+          </w:tcPr>
+          <w:p>
+            <w:pPr>
+              <w:rPr>
+                <w:b/>
+                <w:sz w:val="16"/>
+                <w:lang w:val="en-GB"/>
+              </w:rPr>
+            </w:pPr>
+          </w:p>
+        </w:tc>
+        <w:tc>
+          <w:tcPr>
+            <w:tcW w:w="0" w:type="auto"/>
+          </w:tcPr>
+          <w:p>
+            <w:pPr>
+              <w:rPr>
+                <w:b/>
+                <w:sz w:val="16"/>
+                <w:lang w:val="en-GB"/>
+              </w:rPr>
+            </w:pPr>
+          </w:p>
+        </w:tc>
+      </w:tr>
+      <w:tr>
+        <w:tc>
+          <w:tcPr>
+            <w:tcW w:w="0" w:type="auto"/>
+          </w:tcPr>
+          <w:p>
+            <w:pPr>
+              <w:rPr>
+                <w:b/>
+                <w:sz w:val="16"/>
+                <w:lang w:val="en-GB"/>
+              </w:rPr>
+            </w:pPr>
+            <w:r>
+              <w:rPr>
+                <w:b/>
+                <w:sz w:val="16"/>
+                <w:lang w:val="en-GB"/>
+              </w:rPr>
+              <w:t>+5VA low noise supply</w:t>
+            </w:r>
+          </w:p>
+        </w:tc>
+        <w:tc>
+          <w:tcPr>
+            <w:tcW w:w="0" w:type="auto"/>
+          </w:tcPr>
+          <w:p>
+            <w:pPr>
+              <w:rPr>
+                <w:b/>
+                <w:sz w:val="16"/>
+                <w:lang w:val="en-GB"/>
+              </w:rPr>
+            </w:pPr>
+            <w:r>
+              <w:rPr>
+                <w:b/>
+                <w:sz w:val="16"/>
+                <w:lang w:val="en-GB"/>
+              </w:rPr>
+              <w:t>No input signal</w:t>
+            </w:r>
+          </w:p>
+        </w:tc>
+        <w:tc>
+          <w:tcPr>
+            <w:tcW w:w="0" w:type="auto"/>
+          </w:tcPr>
+          <w:p>
+            <w:pPr>
+              <w:rPr>
+                <w:b/>
+                <w:sz w:val="16"/>
+                <w:lang w:val="en-GB"/>
+              </w:rPr>
+            </w:pPr>
+          </w:p>
+        </w:tc>
+        <w:tc>
+          <w:tcPr>
+            <w:tcW w:w="0" w:type="auto"/>
+          </w:tcPr>
+          <w:p>
+            <w:pPr>
+              <w:rPr>
+                <w:b/>
+                <w:sz w:val="16"/>
+                <w:lang w:val="en-GB"/>
+              </w:rPr>
+            </w:pPr>
+          </w:p>
+        </w:tc>
+        <w:tc>
+          <w:tcPr>
+            <w:tcW w:w="0" w:type="auto"/>
+          </w:tcPr>
+          <w:p>
+            <w:pPr>
+              <w:rPr>
+                <w:b/>
+                <w:sz w:val="16"/>
+                <w:lang w:val="en-GB"/>
+              </w:rPr>
+            </w:pPr>
+          </w:p>
+        </w:tc>
+        <w:tc>
+          <w:tcPr>
+            <w:tcW w:w="0" w:type="auto"/>
+          </w:tcPr>
+          <w:p>
+            <w:pPr>
+              <w:rPr>
+                <w:b/>
+                <w:sz w:val="16"/>
+                <w:lang w:val="en-GB"/>
+              </w:rPr>
+            </w:pPr>
+          </w:p>
+        </w:tc>
+      </w:tr>
+      <w:tr>
+        <w:tc>
+          <w:tcPr>
+            <w:tcW w:w="0" w:type="auto"/>
+          </w:tcPr>
+          <w:p>
+            <w:pPr>
+              <w:rPr>
+                <w:b/>
+                <w:sz w:val="16"/>
+                <w:lang w:val="en-GB"/>
+              </w:rPr>
+            </w:pPr>
+            <w:r>
+              <w:rPr>
+                <w:b/>
+                <w:sz w:val="16"/>
+                <w:lang w:val="en-GB"/>
+              </w:rPr>
+              <w:t>+3V3 digital supply</w:t>
+            </w:r>
+          </w:p>
+        </w:tc>
+        <w:tc>
+          <w:tcPr>
+            <w:tcW w:w="0" w:type="auto"/>
+          </w:tcPr>
+          <w:p>
+            <w:pPr>
+              <w:rPr>
+                <w:b/>
+                <w:sz w:val="16"/>
+                <w:lang w:val="en-GB"/>
+              </w:rPr>
+            </w:pPr>
+            <w:r>
+              <w:rPr>
+                <w:b/>
+                <w:sz w:val="16"/>
+                <w:lang w:val="en-GB"/>
+              </w:rPr>
+              <w:t>No input signal</w:t>
+            </w:r>
+          </w:p>
+        </w:tc>
+        <w:tc>
+          <w:tcPr>
+            <w:tcW w:w="0" w:type="auto"/>
+          </w:tcPr>
+          <w:p>
+            <w:pPr>
+              <w:rPr>
+                <w:b/>
+                <w:sz w:val="16"/>
+                <w:lang w:val="en-GB"/>
+              </w:rPr>
+            </w:pPr>
+          </w:p>
+        </w:tc>
+        <w:tc>
+          <w:tcPr>
+            <w:tcW w:w="0" w:type="auto"/>
+          </w:tcPr>
+          <w:p>
+            <w:pPr>
+              <w:rPr>
+                <w:b/>
+                <w:sz w:val="16"/>
+                <w:lang w:val="en-GB"/>
+              </w:rPr>
+            </w:pPr>
+          </w:p>
+        </w:tc>
+        <w:tc>
+          <w:tcPr>
+            <w:tcW w:w="0" w:type="auto"/>
+          </w:tcPr>
+          <w:p>
+            <w:pPr>
+              <w:rPr>
+                <w:b/>
+                <w:sz w:val="16"/>
+                <w:lang w:val="en-GB"/>
+              </w:rPr>
+            </w:pPr>
+          </w:p>
+        </w:tc>
+        <w:tc>
+          <w:tcPr>
+            <w:tcW w:w="0" w:type="auto"/>
+          </w:tcPr>
+          <w:p>
+            <w:pPr>
+              <w:rPr>
+                <w:b/>
+                <w:sz w:val="16"/>
+                <w:lang w:val="en-GB"/>
+              </w:rPr>
+            </w:pPr>
+          </w:p>
+        </w:tc>
+      </w:tr>
+      <w:tr>
+        <w:tc>
+          <w:tcPr>
+            <w:tcW w:w="0" w:type="auto"/>
+          </w:tcPr>
+          <w:p>
+            <w:pPr>
+              <w:rPr>
+                <w:b/>
+                <w:sz w:val="16"/>
+                <w:lang w:val="en-GB"/>
+              </w:rPr>
+            </w:pPr>
+            <w:r>
+              <w:rPr>
+                <w:b/>
+                <w:sz w:val="16"/>
+                <w:lang w:val="en-GB"/>
+              </w:rPr>
+              <w:t>+3V3 ESP32 supply</w:t>
+            </w:r>
+          </w:p>
+        </w:tc>
+        <w:tc>
+          <w:tcPr>
+            <w:tcW w:w="0" w:type="auto"/>
+          </w:tcPr>
+          <w:p>
+            <w:pPr>
+              <w:rPr>
+                <w:b/>
+                <w:sz w:val="16"/>
+                <w:lang w:val="en-GB"/>
+              </w:rPr>
+            </w:pPr>
+            <w:r>
+              <w:rPr>
+                <w:b/>
+                <w:sz w:val="16"/>
+                <w:lang w:val="en-GB"/>
+              </w:rPr>
+              <w:t>No input signal</w:t>
+            </w:r>
+          </w:p>
+        </w:tc>
+        <w:tc>
+          <w:tcPr>
+            <w:tcW w:w="0" w:type="auto"/>
+          </w:tcPr>
+          <w:p>
+            <w:pPr>
+              <w:rPr>
+                <w:b/>
+                <w:sz w:val="16"/>
+                <w:lang w:val="en-GB"/>
+              </w:rPr>
+            </w:pPr>
+          </w:p>
+        </w:tc>
+        <w:tc>
+          <w:tcPr>
+            <w:tcW w:w="0" w:type="auto"/>
+          </w:tcPr>
+          <w:p>
+            <w:pPr>
+              <w:rPr>
+                <w:b/>
+                <w:sz w:val="16"/>
+                <w:lang w:val="en-GB"/>
+              </w:rPr>
+            </w:pPr>
+          </w:p>
+        </w:tc>
+        <w:tc>
+          <w:tcPr>
+            <w:tcW w:w="0" w:type="auto"/>
+          </w:tcPr>
+          <w:p>
+            <w:pPr>
+              <w:rPr>
+                <w:b/>
+                <w:sz w:val="16"/>
+                <w:lang w:val="en-GB"/>
+              </w:rPr>
+            </w:pPr>
+          </w:p>
+        </w:tc>
+        <w:tc>
+          <w:tcPr>
+            <w:tcW w:w="0" w:type="auto"/>
+          </w:tcPr>
+          <w:p>
+            <w:pPr>
+              <w:rPr>
+                <w:b/>
+                <w:sz w:val="16"/>
+                <w:lang w:val="en-GB"/>
+              </w:rPr>
+            </w:pPr>
+          </w:p>
+        </w:tc>
+      </w:tr>
+      <w:tr>
+        <w:tc>
+          <w:tcPr>
+            <w:tcW w:w="0" w:type="auto"/>
+          </w:tcPr>
+          <w:p>
+            <w:pPr>
+              <w:rPr>
+                <w:b/>
+                <w:sz w:val="16"/>
+                <w:lang w:val="en-GB"/>
+              </w:rPr>
+            </w:pPr>
+            <w:r>
+              <w:rPr>
+                <w:b/>
+                <w:sz w:val="16"/>
+                <w:lang w:val="en-GB"/>
+              </w:rPr>
+              <w:t>DC level</w:t>
+            </w:r>
+            <w:r>
+              <w:rPr>
+                <w:b/>
+                <w:sz w:val="16"/>
+                <w:lang w:val="en-GB"/>
+              </w:rPr>
+              <w:br/>
+              <w:t>of output</w:t>
+            </w:r>
+          </w:p>
+        </w:tc>
+        <w:tc>
+          <w:tcPr>
+            <w:tcW w:w="0" w:type="auto"/>
+          </w:tcPr>
+          <w:p>
+            <w:pPr>
+              <w:rPr>
+                <w:sz w:val="16"/>
+                <w:lang w:val="en-GB"/>
+              </w:rPr>
+            </w:pPr>
+            <w:r>
+              <w:rPr>
+                <w:sz w:val="16"/>
+                <w:lang w:val="en-GB"/>
+              </w:rPr>
+              <w:t>No input signal</w:t>
+            </w:r>
+            <w:r>
+              <w:rPr>
+                <w:sz w:val="16"/>
+                <w:lang w:val="en-GB"/>
+              </w:rPr>
+              <w:br/>
+              <w:t>VCC = 3.3V</w:t>
+            </w:r>
+          </w:p>
+        </w:tc>
+        <w:tc>
+          <w:tcPr>
+            <w:tcW w:w="0" w:type="auto"/>
+          </w:tcPr>
+          <w:p>
+            <w:pPr>
+              <w:rPr>
+                <w:sz w:val="16"/>
+                <w:lang w:val="en-GB"/>
+              </w:rPr>
+            </w:pPr>
+            <w:r>
+              <w:rPr>
+                <w:sz w:val="16"/>
+                <w:lang w:val="en-GB"/>
+              </w:rPr>
+              <w:t>Output signal:</w:t>
+            </w:r>
+            <w:r>
+              <w:rPr>
+                <w:sz w:val="16"/>
+                <w:lang w:val="en-GB"/>
+              </w:rPr>
+              <w:br/>
+              <w:t>1.250V</w:t>
+            </w:r>
+            <w:r>
+              <w:rPr>
+                <w:sz w:val="16"/>
+                <w:lang w:val="en-GB"/>
+              </w:rPr>
+              <w:br/>
+            </w:r>
+            <w:r>
+              <w:rPr>
+                <w:rFonts w:cs="Arial"/>
+                <w:sz w:val="16"/>
+                <w:lang w:val="en-GB"/>
+              </w:rPr>
+              <w:t>±</w:t>
+            </w:r>
+            <w:r>
+              <w:rPr>
+                <w:sz w:val="16"/>
+                <w:lang w:val="en-GB"/>
+              </w:rPr>
+              <w:t>5mV</w:t>
+            </w:r>
+          </w:p>
+        </w:tc>
+        <w:tc>
+          <w:tcPr>
+            <w:tcW w:w="0" w:type="auto"/>
+          </w:tcPr>
+          <w:p>
+            <w:pPr>
+              <w:rPr>
+                <w:sz w:val="16"/>
+                <w:lang w:val="en-GB"/>
+              </w:rPr>
+            </w:pPr>
+            <w:r>
+              <w:rPr>
+                <w:sz w:val="16"/>
+                <w:lang w:val="en-GB"/>
+              </w:rPr>
+              <w:br/>
+              <w:t>1.252V</w:t>
+            </w:r>
+          </w:p>
+        </w:tc>
+        <w:tc>
+          <w:tcPr>
+            <w:tcW w:w="0" w:type="auto"/>
+          </w:tcPr>
+          <w:p>
+            <w:pPr>
+              <w:rPr>
+                <w:sz w:val="16"/>
+                <w:lang w:val="en-GB"/>
+              </w:rPr>
+            </w:pPr>
+            <w:r>
+              <w:rPr>
+                <w:sz w:val="16"/>
+                <w:lang w:val="en-GB"/>
+              </w:rPr>
+              <w:br/>
+              <w:t>deviation +2mV</w:t>
+            </w:r>
+            <w:r>
+              <w:rPr>
+                <w:sz w:val="16"/>
+                <w:lang w:val="en-GB"/>
+              </w:rPr>
+              <w:br/>
+              <w:t>passed</w:t>
+            </w:r>
+          </w:p>
+        </w:tc>
+        <w:tc>
+          <w:tcPr>
+            <w:tcW w:w="0" w:type="auto"/>
+          </w:tcPr>
+          <w:p>
+            <w:pPr>
+              <w:rPr>
+                <w:sz w:val="16"/>
+                <w:lang w:val="en-GB"/>
+              </w:rPr>
+            </w:pPr>
+          </w:p>
+        </w:tc>
+      </w:tr>
+      <w:tr>
+        <w:tc>
+          <w:tcPr>
+            <w:tcW w:w="0" w:type="auto"/>
+          </w:tcPr>
+          <w:p>
+            <w:pPr>
+              <w:rPr>
+                <w:b/>
+                <w:sz w:val="16"/>
+                <w:lang w:val="en-GB"/>
+              </w:rPr>
+            </w:pPr>
+            <w:r>
+              <w:rPr>
+                <w:b/>
+                <w:sz w:val="16"/>
+                <w:lang w:val="en-GB"/>
+              </w:rPr>
+              <w:t>Gain</w:t>
+            </w:r>
+          </w:p>
+        </w:tc>
+        <w:tc>
+          <w:tcPr>
+            <w:tcW w:w="0" w:type="auto"/>
+          </w:tcPr>
+          <w:p>
+            <w:pPr>
+              <w:rPr>
+                <w:sz w:val="16"/>
+                <w:lang w:val="en-GB"/>
+              </w:rPr>
+            </w:pPr>
+            <w:r>
+              <w:rPr>
+                <w:sz w:val="16"/>
+                <w:lang w:val="en-GB"/>
+              </w:rPr>
+              <w:t>Input signal:</w:t>
+            </w:r>
+            <w:r>
+              <w:rPr>
+                <w:sz w:val="16"/>
+                <w:lang w:val="en-GB"/>
+              </w:rPr>
+              <w:br/>
+              <w:t>1mVpp 1kHz sine</w:t>
+            </w:r>
+          </w:p>
+        </w:tc>
+        <w:tc>
+          <w:tcPr>
+            <w:tcW w:w="0" w:type="auto"/>
+          </w:tcPr>
+          <w:p>
+            <w:pPr>
+              <w:rPr>
+                <w:sz w:val="16"/>
+                <w:lang w:val="en-GB"/>
+              </w:rPr>
+            </w:pPr>
+            <w:r>
+              <w:rPr>
+                <w:sz w:val="16"/>
+                <w:lang w:val="en-GB"/>
+              </w:rPr>
+              <w:t xml:space="preserve">Output signal: </w:t>
+            </w:r>
+            <w:r>
+              <w:rPr>
+                <w:sz w:val="16"/>
+                <w:lang w:val="en-GB"/>
+              </w:rPr>
+              <w:br/>
+              <w:t>250mVpp</w:t>
+            </w:r>
+            <w:r>
+              <w:rPr>
+                <w:sz w:val="16"/>
+                <w:lang w:val="en-GB"/>
+              </w:rPr>
+              <w:br/>
+              <w:t>Gain: 240..270</w:t>
+            </w:r>
+          </w:p>
+        </w:tc>
+        <w:tc>
+          <w:tcPr>
+            <w:tcW w:w="0" w:type="auto"/>
+          </w:tcPr>
+          <w:p>
+            <w:pPr>
+              <w:rPr>
+                <w:sz w:val="16"/>
+                <w:lang w:val="en-GB"/>
+              </w:rPr>
+            </w:pPr>
+            <w:r>
+              <w:rPr>
+                <w:sz w:val="16"/>
+                <w:lang w:val="en-GB"/>
+              </w:rPr>
+              <w:br/>
+              <w:t>234mVpp</w:t>
+            </w:r>
+            <w:r>
+              <w:rPr>
+                <w:sz w:val="16"/>
+                <w:lang w:val="en-GB"/>
+              </w:rPr>
+              <w:br/>
+              <w:t>Gain = 234</w:t>
+            </w:r>
+          </w:p>
+        </w:tc>
+        <w:tc>
+          <w:tcPr>
+            <w:tcW w:w="0" w:type="auto"/>
+          </w:tcPr>
+          <w:p>
+            <w:pPr>
+              <w:rPr>
+                <w:sz w:val="16"/>
+                <w:lang w:val="en-GB"/>
+              </w:rPr>
+            </w:pPr>
+            <w:r>
+              <w:rPr>
+                <w:sz w:val="16"/>
+                <w:lang w:val="en-GB"/>
+              </w:rPr>
+              <w:t>Circuit works, but</w:t>
+            </w:r>
+            <w:r>
+              <w:rPr>
+                <w:sz w:val="16"/>
+                <w:lang w:val="en-GB"/>
+              </w:rPr>
+              <w:br/>
+              <w:t>out of tolerance</w:t>
+            </w:r>
+            <w:r>
+              <w:rPr>
+                <w:sz w:val="16"/>
+                <w:lang w:val="en-GB"/>
+              </w:rPr>
+              <w:br/>
+            </w:r>
+            <w:r>
+              <w:rPr>
+                <w:b/>
+                <w:sz w:val="16"/>
+                <w:lang w:val="en-GB"/>
+              </w:rPr>
+              <w:t>failed</w:t>
+            </w:r>
+          </w:p>
+        </w:tc>
+        <w:tc>
+          <w:tcPr>
+            <w:tcW w:w="0" w:type="auto"/>
+          </w:tcPr>
+          <w:p>
+            <w:pPr>
+              <w:rPr>
+                <w:b/>
+                <w:sz w:val="16"/>
+                <w:lang w:val="en-GB"/>
+              </w:rPr>
+            </w:pPr>
+            <w:r>
+              <w:rPr>
+                <w:b/>
+                <w:sz w:val="16"/>
+                <w:lang w:val="en-GB"/>
+              </w:rPr>
+              <w:t>Check resistor </w:t>
+            </w:r>
+            <w:proofErr w:type="spellStart"/>
+            <w:r>
+              <w:rPr>
+                <w:b/>
+                <w:sz w:val="16"/>
+                <w:lang w:val="en-GB"/>
+              </w:rPr>
+              <w:t>tol</w:t>
+            </w:r>
+            <w:proofErr w:type="spellEnd"/>
+            <w:r>
+              <w:rPr>
+                <w:b/>
+                <w:sz w:val="16"/>
+                <w:lang w:val="en-GB"/>
+              </w:rPr>
+              <w:t>.</w:t>
+            </w:r>
+            <w:r>
+              <w:rPr>
+                <w:b/>
+                <w:sz w:val="16"/>
+                <w:lang w:val="en-GB"/>
+              </w:rPr>
+              <w:br/>
+            </w:r>
+            <w:r>
+              <w:rPr>
+                <w:b/>
+                <w:sz w:val="16"/>
+                <w:lang w:val="en-GB"/>
+              </w:rPr>
+              <w:br/>
+              <w:t>Continue with tests</w:t>
+            </w:r>
+          </w:p>
+        </w:tc>
+      </w:tr>
+      <w:tr>
+        <w:tc>
+          <w:tcPr>
+            <w:tcW w:w="0" w:type="auto"/>
+          </w:tcPr>
+          <w:p>
+            <w:pPr>
+              <w:rPr>
+                <w:b/>
+                <w:sz w:val="16"/>
+                <w:lang w:val="en-GB"/>
+              </w:rPr>
+            </w:pPr>
+            <w:r>
+              <w:rPr>
+                <w:b/>
+                <w:sz w:val="16"/>
+                <w:lang w:val="en-GB"/>
+              </w:rPr>
+              <w:t>Linearity</w:t>
+            </w:r>
+            <w:r>
+              <w:rPr>
+                <w:b/>
+                <w:sz w:val="16"/>
+                <w:lang w:val="en-GB"/>
+              </w:rPr>
+              <w:br/>
+              <w:t>and noise</w:t>
+            </w:r>
+          </w:p>
+        </w:tc>
+        <w:tc>
+          <w:tcPr>
+            <w:tcW w:w="0" w:type="auto"/>
+          </w:tcPr>
+          <w:p>
+            <w:pPr>
+              <w:rPr>
+                <w:sz w:val="16"/>
+                <w:lang w:val="en-GB"/>
+              </w:rPr>
+            </w:pPr>
+            <w:r>
+              <w:rPr>
+                <w:sz w:val="16"/>
+                <w:lang w:val="en-GB"/>
+              </w:rPr>
+              <w:t>Input signal:</w:t>
+            </w:r>
+            <w:r>
+              <w:rPr>
+                <w:sz w:val="16"/>
+                <w:lang w:val="en-GB"/>
+              </w:rPr>
+              <w:br/>
+              <w:t>1mVpp 1kHz sine</w:t>
+            </w:r>
+          </w:p>
+        </w:tc>
+        <w:tc>
+          <w:tcPr>
+            <w:tcW w:w="0" w:type="auto"/>
+          </w:tcPr>
+          <w:p>
+            <w:pPr>
+              <w:rPr>
+                <w:sz w:val="16"/>
+                <w:lang w:val="en-GB"/>
+              </w:rPr>
+            </w:pPr>
+            <w:r>
+              <w:rPr>
+                <w:sz w:val="16"/>
+                <w:lang w:val="en-GB"/>
+              </w:rPr>
+              <w:t>THND &lt; 2%</w:t>
+            </w:r>
+          </w:p>
+        </w:tc>
+        <w:tc>
+          <w:tcPr>
+            <w:tcW w:w="0" w:type="auto"/>
+          </w:tcPr>
+          <w:p>
+            <w:pPr>
+              <w:rPr>
+                <w:sz w:val="16"/>
+                <w:lang w:val="en-GB"/>
+              </w:rPr>
+            </w:pPr>
+            <w:r>
+              <w:rPr>
+                <w:sz w:val="16"/>
+                <w:lang w:val="en-GB"/>
+              </w:rPr>
+              <w:t>THND = 3%</w:t>
+            </w:r>
+          </w:p>
+        </w:tc>
+        <w:tc>
+          <w:tcPr>
+            <w:tcW w:w="0" w:type="auto"/>
+          </w:tcPr>
+          <w:p>
+            <w:pPr>
+              <w:rPr>
+                <w:b/>
+                <w:sz w:val="16"/>
+                <w:lang w:val="en-GB"/>
+              </w:rPr>
+            </w:pPr>
+            <w:r>
+              <w:rPr>
+                <w:b/>
+                <w:sz w:val="16"/>
+                <w:lang w:val="en-GB"/>
+              </w:rPr>
+              <w:t>failed</w:t>
+            </w:r>
+          </w:p>
+        </w:tc>
+        <w:tc>
+          <w:tcPr>
+            <w:tcW w:w="0" w:type="auto"/>
+          </w:tcPr>
+          <w:p>
+            <w:pPr>
+              <w:rPr>
+                <w:b/>
+                <w:sz w:val="16"/>
+                <w:lang w:val="en-GB"/>
+              </w:rPr>
+            </w:pPr>
+            <w:r>
+              <w:rPr>
+                <w:b/>
+                <w:sz w:val="16"/>
+                <w:lang w:val="en-GB"/>
+              </w:rPr>
+              <w:t xml:space="preserve">Cause unknown: </w:t>
+            </w:r>
+            <w:r>
+              <w:rPr>
+                <w:b/>
+                <w:sz w:val="16"/>
+                <w:lang w:val="en-GB"/>
+              </w:rPr>
+              <w:br/>
+              <w:t xml:space="preserve">Check PCB layout, </w:t>
+            </w:r>
+            <w:r>
+              <w:rPr>
+                <w:b/>
+                <w:sz w:val="16"/>
+                <w:lang w:val="en-GB"/>
+              </w:rPr>
+              <w:br/>
+              <w:t>Capacitor type: NP0?</w:t>
+            </w:r>
+            <w:r>
+              <w:rPr>
+                <w:b/>
+                <w:sz w:val="16"/>
+                <w:lang w:val="en-GB"/>
+              </w:rPr>
+              <w:br/>
+              <w:t>Abort test</w:t>
+            </w:r>
+          </w:p>
+        </w:tc>
+      </w:tr>
+      <w:tr>
+        <w:tc>
+          <w:tcPr>
+            <w:tcW w:w="0" w:type="auto"/>
+          </w:tcPr>
+          <w:p>
+            <w:pPr>
+              <w:rPr>
+                <w:b/>
+                <w:sz w:val="16"/>
+                <w:lang w:val="en-GB"/>
+              </w:rPr>
+            </w:pPr>
+            <w:r>
+              <w:rPr>
+                <w:b/>
+                <w:sz w:val="16"/>
+                <w:lang w:val="en-GB"/>
+              </w:rPr>
+              <w:t>Stability</w:t>
+            </w:r>
+            <w:r>
+              <w:rPr>
+                <w:b/>
+                <w:sz w:val="16"/>
+                <w:lang w:val="en-GB"/>
+              </w:rPr>
+              <w:t> with</w:t>
+            </w:r>
+            <w:r>
+              <w:rPr>
+                <w:b/>
+                <w:sz w:val="16"/>
+                <w:lang w:val="en-GB"/>
+              </w:rPr>
+              <w:br/>
+              <w:t>cap</w:t>
+            </w:r>
+            <w:r>
+              <w:rPr>
+                <w:b/>
+                <w:sz w:val="16"/>
+                <w:lang w:val="en-GB"/>
+              </w:rPr>
+              <w:t>acitive</w:t>
+            </w:r>
+            <w:r>
+              <w:rPr>
+                <w:b/>
+                <w:sz w:val="16"/>
+                <w:lang w:val="en-GB"/>
+              </w:rPr>
+              <w:t> load</w:t>
+            </w:r>
+          </w:p>
+        </w:tc>
+        <w:tc>
+          <w:tcPr>
+            <w:tcW w:w="0" w:type="auto"/>
+          </w:tcPr>
+          <w:p>
+            <w:pPr>
+              <w:rPr>
+                <w:sz w:val="16"/>
+                <w:lang w:val="en-GB"/>
+              </w:rPr>
+            </w:pPr>
+            <w:r>
+              <w:rPr>
+                <w:sz w:val="16"/>
+                <w:lang w:val="en-GB"/>
+              </w:rPr>
+              <w:t>Input signal:</w:t>
+            </w:r>
+            <w:r>
+              <w:rPr>
+                <w:sz w:val="16"/>
+                <w:lang w:val="en-GB"/>
+              </w:rPr>
+              <w:br/>
+              <w:t>1mVpp 1kHz </w:t>
+            </w:r>
+            <w:proofErr w:type="spellStart"/>
+            <w:r>
+              <w:rPr>
+                <w:sz w:val="16"/>
+                <w:lang w:val="en-GB"/>
+              </w:rPr>
+              <w:t>rect</w:t>
+            </w:r>
+            <w:proofErr w:type="spellEnd"/>
+            <w:r>
+              <w:rPr>
+                <w:sz w:val="16"/>
+                <w:lang w:val="en-GB"/>
+              </w:rPr>
+              <w:br/>
+              <w:t>100pF on output</w:t>
+            </w:r>
+          </w:p>
+        </w:tc>
+        <w:tc>
+          <w:tcPr>
+            <w:tcW w:w="0" w:type="auto"/>
+          </w:tcPr>
+          <w:p>
+            <w:pPr>
+              <w:rPr>
+                <w:sz w:val="16"/>
+                <w:lang w:val="en-GB"/>
+              </w:rPr>
+            </w:pPr>
+            <w:r>
+              <w:rPr>
+                <w:sz w:val="16"/>
+                <w:lang w:val="en-GB"/>
+              </w:rPr>
+              <w:t>Output signal</w:t>
+            </w:r>
+            <w:r>
+              <w:rPr>
+                <w:sz w:val="16"/>
+                <w:lang w:val="en-GB"/>
+              </w:rPr>
+              <w:br/>
+              <w:t>overshoot &lt; 10%</w:t>
+            </w:r>
+          </w:p>
+        </w:tc>
+        <w:tc>
+          <w:tcPr>
+            <w:tcW w:w="0" w:type="auto"/>
+          </w:tcPr>
+          <w:p>
+            <w:pPr>
+              <w:rPr>
+                <w:sz w:val="16"/>
+                <w:lang w:val="en-GB"/>
+              </w:rPr>
+            </w:pPr>
+          </w:p>
+        </w:tc>
+        <w:tc>
+          <w:tcPr>
+            <w:tcW w:w="0" w:type="auto"/>
+          </w:tcPr>
+          <w:p>
+            <w:pPr>
+              <w:rPr>
+                <w:sz w:val="16"/>
+                <w:lang w:val="en-GB"/>
+              </w:rPr>
+            </w:pPr>
+          </w:p>
+        </w:tc>
+        <w:tc>
+          <w:tcPr>
+            <w:tcW w:w="0" w:type="auto"/>
+          </w:tcPr>
+          <w:p>
+            <w:pPr>
+              <w:rPr>
+                <w:sz w:val="16"/>
+                <w:lang w:val="en-GB"/>
+              </w:rPr>
+            </w:pPr>
+          </w:p>
+        </w:tc>
+      </w:tr>
+    </w:tbl>
+    <w:p>
+      <w:pPr>
+        <w:rPr>
+          <w:lang w:val="en-GB"/>
+        </w:rPr>
+      </w:pPr>
+    </w:p>
+    <w:p>
+      <w:pPr>
+        <w:pStyle w:val="Heading1"/>
+        <w:rPr>
+          <w:lang w:val="en-GB"/>
+        </w:rPr>
+      </w:pPr>
+      <w:r>
+        <w:rPr>
+          <w:lang w:val="en-GB"/>
+        </w:rPr>
+        <w:t>Design for Test</w:t>
       </w:r>
       <w:bookmarkEnd w:id="2"/>
     </w:p>
     <w:p>
       <w:pPr>
-        <w:pStyle w:val="Listenabsatz"/>
-        <w:numPr>
-          <w:ilvl w:val="0"/>
-          <w:numId w:val="12"/>
-        </w:numPr>
-        <w:rPr>
-          <w:lang w:val="en-GB"/>
-        </w:rPr>
-      </w:pPr>
-      <w:r>
-        <w:rPr>
-          <w:lang w:val="en-GB"/>
-        </w:rPr>
-        <w:t>Verify or proof that the requirements and expectations on the Device Un</w:t>
-      </w:r>
-      <w:r>
-        <w:rPr>
-          <w:lang w:val="en-GB"/>
-        </w:rPr>
-        <w:t>der Test (DUT) are reliably met</w:t>
+        <w:rPr>
+          <w:lang w:val="en-GB"/>
+        </w:rPr>
+      </w:pPr>
+      <w:r>
+        <w:rPr>
+          <w:lang w:val="en-GB"/>
+        </w:rPr>
+        <w:t>Testing starts with the hardware design!</w:t>
       </w:r>
     </w:p>
     <w:p>
       <w:pPr>
-        <w:pStyle w:val="Listenabsatz"/>
-        <w:numPr>
-          <w:ilvl w:val="0"/>
-          <w:numId w:val="12"/>
-        </w:numPr>
-        <w:rPr>
-          <w:lang w:val="en-GB"/>
-        </w:rPr>
-      </w:pPr>
-      <w:r>
-        <w:rPr>
-          <w:lang w:val="en-GB"/>
-        </w:rPr>
-        <w:t>Reduce th</w:t>
-      </w:r>
-      <w:r>
-        <w:rPr>
-          <w:lang w:val="en-GB"/>
-        </w:rPr>
-        <w:t>e risk of failures</w:t>
-      </w:r>
-    </w:p>
-    <w:p>
-      <w:pPr>
-        <w:pStyle w:val="Listenabsatz"/>
-        <w:numPr>
-          <w:ilvl w:val="0"/>
-          <w:numId w:val="12"/>
-        </w:numPr>
-        <w:rPr>
-          <w:lang w:val="en-GB"/>
-        </w:rPr>
-      </w:pPr>
-      <w:r>
-        <w:rPr>
-          <w:lang w:val="en-GB"/>
-        </w:rPr>
-        <w:t xml:space="preserve">Reduce the </w:t>
-      </w:r>
-      <w:r>
-        <w:rPr>
-          <w:lang w:val="en-GB"/>
-        </w:rPr>
-        <w:t>costs of warranty and</w:t>
-      </w:r>
-      <w:r>
-        <w:rPr>
-          <w:lang w:val="en-GB"/>
-        </w:rPr>
-        <w:t xml:space="preserve"> increase the profit margin</w:t>
-      </w:r>
-    </w:p>
-    <w:p>
-      <w:pPr>
-        <w:pStyle w:val="Listenabsatz"/>
-        <w:numPr>
-          <w:ilvl w:val="0"/>
-          <w:numId w:val="12"/>
-        </w:numPr>
-        <w:rPr>
-          <w:lang w:val="en-GB"/>
-        </w:rPr>
-      </w:pPr>
-      <w:r>
-        <w:rPr>
-          <w:lang w:val="en-GB"/>
-        </w:rPr>
-        <w:t>For a prototype: Make sure that the DUT is ready to be integrated into a bigger system</w:t>
-      </w:r>
-    </w:p>
-    <w:p>
-      <w:pPr>
-        <w:pStyle w:val="berschrift1"/>
-        <w:rPr>
-          <w:lang w:val="en-GB"/>
-        </w:rPr>
-      </w:pPr>
-      <w:bookmarkStart w:id="3" w:name="_Toc208327538"/>
-      <w:r>
-        <w:rPr>
-          <w:lang w:val="en-GB"/>
-        </w:rPr>
-        <w:t>Design for Test</w:t>
-      </w:r>
-      <w:bookmarkEnd w:id="3"/>
-    </w:p>
-    <w:p>
-      <w:pPr>
-        <w:rPr>
-          <w:lang w:val="en-GB"/>
-        </w:rPr>
-      </w:pPr>
-      <w:r>
-        <w:rPr>
-          <w:lang w:val="en-GB"/>
-        </w:rPr>
-        <w:t>Testing starts with the hardware design!</w:t>
-      </w:r>
-    </w:p>
-    <w:p>
-      <w:pPr>
-        <w:pStyle w:val="Listenabsatz"/>
+        <w:pStyle w:val="ListParagraph"/>
         <w:numPr>
           <w:ilvl w:val="0"/>
           <w:numId w:val="13"/>
@@ -1350,7 +3960,7 @@
     </w:p>
     <w:p>
       <w:pPr>
-        <w:pStyle w:val="Listenabsatz"/>
+        <w:pStyle w:val="ListParagraph"/>
         <w:numPr>
           <w:ilvl w:val="0"/>
           <w:numId w:val="13"/>
@@ -1380,7 +3990,7 @@
     </w:p>
     <w:p>
       <w:pPr>
-        <w:pStyle w:val="Listenabsatz"/>
+        <w:pStyle w:val="ListParagraph"/>
         <w:numPr>
           <w:ilvl w:val="0"/>
           <w:numId w:val="13"/>
@@ -1434,7 +4044,7 @@
     </w:p>
     <w:p>
       <w:pPr>
-        <w:pStyle w:val="Listenabsatz"/>
+        <w:pStyle w:val="ListParagraph"/>
         <w:numPr>
           <w:ilvl w:val="1"/>
           <w:numId w:val="13"/>
@@ -1458,7 +4068,7 @@
     </w:p>
     <w:p>
       <w:pPr>
-        <w:pStyle w:val="Listenabsatz"/>
+        <w:pStyle w:val="ListParagraph"/>
         <w:numPr>
           <w:ilvl w:val="1"/>
           <w:numId w:val="13"/>
@@ -1518,7 +4128,7 @@
     </w:p>
     <w:p>
       <w:pPr>
-        <w:pStyle w:val="Listenabsatz"/>
+        <w:pStyle w:val="ListParagraph"/>
         <w:numPr>
           <w:ilvl w:val="1"/>
           <w:numId w:val="13"/>
@@ -1560,7 +4170,7 @@
     </w:p>
     <w:p>
       <w:pPr>
-        <w:pStyle w:val="Listenabsatz"/>
+        <w:pStyle w:val="ListParagraph"/>
         <w:numPr>
           <w:ilvl w:val="1"/>
           <w:numId w:val="13"/>
@@ -1596,7 +4206,7 @@
     </w:p>
     <w:p>
       <w:pPr>
-        <w:pStyle w:val="Listenabsatz"/>
+        <w:pStyle w:val="ListParagraph"/>
         <w:numPr>
           <w:ilvl w:val="0"/>
           <w:numId w:val="13"/>
@@ -1609,12 +4219,13 @@
         <w:rPr>
           <w:lang w:val="en-GB"/>
         </w:rPr>
+        <w:lastRenderedPageBreak/>
         <w:t>Design the PCB to support testability:</w:t>
       </w:r>
     </w:p>
     <w:p>
       <w:pPr>
-        <w:pStyle w:val="Listenabsatz"/>
+        <w:pStyle w:val="ListParagraph"/>
         <w:numPr>
           <w:ilvl w:val="1"/>
           <w:numId w:val="13"/>
@@ -1644,7 +4255,7 @@
     </w:p>
     <w:p>
       <w:pPr>
-        <w:pStyle w:val="Listenabsatz"/>
+        <w:pStyle w:val="ListParagraph"/>
         <w:numPr>
           <w:ilvl w:val="1"/>
           <w:numId w:val="13"/>
@@ -1674,7 +4285,7 @@
     </w:p>
     <w:p>
       <w:pPr>
-        <w:pStyle w:val="Listenabsatz"/>
+        <w:pStyle w:val="ListParagraph"/>
         <w:numPr>
           <w:ilvl w:val="1"/>
           <w:numId w:val="13"/>
@@ -1704,7 +4315,7 @@
     </w:p>
     <w:p>
       <w:pPr>
-        <w:pStyle w:val="Listenabsatz"/>
+        <w:pStyle w:val="ListParagraph"/>
         <w:numPr>
           <w:ilvl w:val="1"/>
           <w:numId w:val="13"/>
@@ -1764,19 +4375,19 @@
     </w:p>
     <w:p>
       <w:pPr>
-        <w:pStyle w:val="berschrift1"/>
-        <w:rPr>
-          <w:lang w:val="en-GB"/>
-        </w:rPr>
-      </w:pPr>
-      <w:bookmarkStart w:id="4" w:name="_Toc208327539"/>
+        <w:pStyle w:val="Heading1"/>
+        <w:rPr>
+          <w:lang w:val="en-GB"/>
+        </w:rPr>
+      </w:pPr>
+      <w:bookmarkStart w:id="3" w:name="_Toc208327539"/>
       <w:r>
         <w:rPr>
           <w:lang w:val="en-GB"/>
         </w:rPr>
         <w:t>Test Plan</w:t>
       </w:r>
-      <w:bookmarkEnd w:id="4"/>
+      <w:bookmarkEnd w:id="3"/>
     </w:p>
     <w:p>
       <w:pPr>
@@ -1837,7 +4448,7 @@
     </w:p>
     <w:p>
       <w:pPr>
-        <w:pStyle w:val="Listenabsatz"/>
+        <w:pStyle w:val="ListParagraph"/>
         <w:numPr>
           <w:ilvl w:val="0"/>
           <w:numId w:val="14"/>
@@ -1921,7 +4532,7 @@
     </w:p>
     <w:p>
       <w:pPr>
-        <w:pStyle w:val="Listenabsatz"/>
+        <w:pStyle w:val="ListParagraph"/>
         <w:numPr>
           <w:ilvl w:val="0"/>
           <w:numId w:val="14"/>
@@ -1934,13 +4545,12 @@
         <w:rPr>
           <w:lang w:val="en-GB"/>
         </w:rPr>
-        <w:lastRenderedPageBreak/>
         <w:t>The test depth should be adapted accordingly and well balanced.</w:t>
       </w:r>
     </w:p>
     <w:p>
       <w:pPr>
-        <w:pStyle w:val="Listenabsatz"/>
+        <w:pStyle w:val="ListParagraph"/>
         <w:numPr>
           <w:ilvl w:val="0"/>
           <w:numId w:val="14"/>
@@ -1994,7 +4604,7 @@
     </w:p>
     <w:p>
       <w:pPr>
-        <w:pStyle w:val="Listenabsatz"/>
+        <w:pStyle w:val="ListParagraph"/>
         <w:numPr>
           <w:ilvl w:val="0"/>
           <w:numId w:val="14"/>
@@ -2036,7 +4646,7 @@
     </w:p>
     <w:p>
       <w:pPr>
-        <w:pStyle w:val="Listenabsatz"/>
+        <w:pStyle w:val="ListParagraph"/>
         <w:numPr>
           <w:ilvl w:val="0"/>
           <w:numId w:val="14"/>
@@ -2102,7 +4712,7 @@
     </w:p>
     <w:p>
       <w:pPr>
-        <w:pStyle w:val="Listenabsatz"/>
+        <w:pStyle w:val="ListParagraph"/>
         <w:numPr>
           <w:ilvl w:val="0"/>
           <w:numId w:val="14"/>
@@ -2261,7 +4871,7 @@
     </w:p>
     <w:tbl>
       <w:tblPr>
-        <w:tblStyle w:val="Tabellenraster"/>
+        <w:tblStyle w:val="TableGrid"/>
         <w:tblW w:w="0" w:type="auto"/>
         <w:tblLook w:val="04A0" w:firstRow="1" w:lastRow="0" w:firstColumn="1" w:lastColumn="0" w:noHBand="0" w:noVBand="1"/>
       </w:tblPr>
@@ -2819,21 +5429,12 @@
               </w:rPr>
               <w:t>Gain: </w:t>
             </w:r>
-            <w:proofErr w:type="gramStart"/>
-            <w:r>
-              <w:rPr>
-                <w:sz w:val="16"/>
-                <w:lang w:val="en-GB"/>
-              </w:rPr>
-              <w:t>240..</w:t>
-            </w:r>
-            <w:proofErr w:type="gramEnd"/>
-            <w:r>
-              <w:rPr>
-                <w:sz w:val="16"/>
-                <w:lang w:val="en-GB"/>
-              </w:rPr>
-              <w:t>2</w:t>
+            <w:r>
+              <w:rPr>
+                <w:sz w:val="16"/>
+                <w:lang w:val="en-GB"/>
+              </w:rPr>
+              <w:t>240..2</w:t>
             </w:r>
             <w:r>
               <w:rPr>
@@ -3501,17 +6102,18 @@
         <w:rPr>
           <w:lang w:val="en-GB"/>
         </w:rPr>
+        <w:lastRenderedPageBreak/>
         <w:t>As can be seen, this table is also helpful for documenting the test procedure.</w:t>
       </w:r>
     </w:p>
     <w:p>
       <w:pPr>
-        <w:pStyle w:val="berschrift1"/>
-        <w:rPr>
-          <w:lang w:val="en-GB"/>
-        </w:rPr>
-      </w:pPr>
-      <w:bookmarkStart w:id="5" w:name="_Toc208327540"/>
+        <w:pStyle w:val="Heading1"/>
+        <w:rPr>
+          <w:lang w:val="en-GB"/>
+        </w:rPr>
+      </w:pPr>
+      <w:bookmarkStart w:id="4" w:name="_Toc208327540"/>
       <w:r>
         <w:rPr>
           <w:lang w:val="en-GB"/>
@@ -3529,6 +6131,319 @@
           <w:lang w:val="en-GB"/>
         </w:rPr>
         <w:t>irst</w:t>
+      </w:r>
+      <w:bookmarkEnd w:id="4"/>
+    </w:p>
+    <w:p>
+      <w:pPr>
+        <w:rPr>
+          <w:lang w:val="en-GB"/>
+        </w:rPr>
+      </w:pPr>
+      <w:r>
+        <w:rPr>
+          <w:lang w:val="en-GB"/>
+        </w:rPr>
+        <w:t xml:space="preserve">Always follow </w:t>
+      </w:r>
+      <w:r>
+        <w:rPr>
+          <w:lang w:val="en-GB"/>
+        </w:rPr>
+        <w:t>the principle: Safety First!</w:t>
+      </w:r>
+    </w:p>
+    <w:p>
+      <w:pPr>
+        <w:rPr>
+          <w:lang w:val="en-GB"/>
+        </w:rPr>
+      </w:pPr>
+      <w:r>
+        <w:rPr>
+          <w:lang w:val="en-GB"/>
+        </w:rPr>
+        <w:t>Personal safety: Prevent risk of electric shock or any other danger due to high voltages or high currents, heat, intensive light</w:t>
+      </w:r>
+      <w:r>
+        <w:rPr>
+          <w:lang w:val="en-GB"/>
+        </w:rPr>
+        <w:t xml:space="preserve">, sound, </w:t>
+      </w:r>
+      <w:r>
+        <w:rPr>
+          <w:lang w:val="en-GB"/>
+        </w:rPr>
+        <w:t>…</w:t>
+      </w:r>
+    </w:p>
+    <w:p>
+      <w:pPr>
+        <w:rPr>
+          <w:lang w:val="en-GB"/>
+        </w:rPr>
+      </w:pPr>
+      <w:r>
+        <w:rPr>
+          <w:lang w:val="en-GB"/>
+        </w:rPr>
+        <w:t>Prevent risk of damage of the DUT or the test equipment.</w:t>
+      </w:r>
+    </w:p>
+    <w:p>
+      <w:pPr>
+        <w:rPr>
+          <w:lang w:val="en-GB"/>
+        </w:rPr>
+      </w:pPr>
+      <w:r>
+        <w:rPr>
+          <w:lang w:val="en-GB"/>
+        </w:rPr>
+        <w:t>Before</w:t>
+      </w:r>
+      <w:r>
+        <w:rPr>
+          <w:lang w:val="en-GB"/>
+        </w:rPr>
+        <w:t xml:space="preserve"> switching on the power supply d</w:t>
+      </w:r>
+      <w:r>
+        <w:rPr>
+          <w:lang w:val="en-GB"/>
+        </w:rPr>
+        <w:t xml:space="preserve">o a visual inspection of the PCB: </w:t>
+      </w:r>
+      <w:r>
+        <w:rPr>
+          <w:lang w:val="en-GB"/>
+        </w:rPr>
+        <w:t>Soldering</w:t>
+      </w:r>
+      <w:r>
+        <w:rPr>
+          <w:lang w:val="en-GB"/>
+        </w:rPr>
+        <w:t>, no short circuits, correct orientation of the components</w:t>
+      </w:r>
+      <w:r>
+        <w:rPr>
+          <w:lang w:val="en-GB"/>
+        </w:rPr>
+        <w:t xml:space="preserve"> (electrolytic capacitors can explode with wrong polarisation)</w:t>
+      </w:r>
+      <w:r>
+        <w:rPr>
+          <w:lang w:val="en-GB"/>
+        </w:rPr>
+        <w:t>, no missing components, correct values …</w:t>
+      </w:r>
+    </w:p>
+    <w:p>
+      <w:pPr>
+        <w:rPr>
+          <w:lang w:val="en-GB"/>
+        </w:rPr>
+      </w:pPr>
+      <w:r>
+        <w:rPr>
+          <w:lang w:val="en-GB"/>
+        </w:rPr>
+        <w:t>Verify the test setup: Correct power supply (volta</w:t>
+      </w:r>
+      <w:r>
+        <w:rPr>
+          <w:lang w:val="en-GB"/>
+        </w:rPr>
+        <w:t>ge, current limits, polarity), instrument connection and configuration, ...</w:t>
+      </w:r>
+    </w:p>
+    <w:p>
+      <w:pPr>
+        <w:rPr>
+          <w:lang w:val="en-GB"/>
+        </w:rPr>
+      </w:pPr>
+      <w:r>
+        <w:rPr>
+          <w:lang w:val="en-GB"/>
+        </w:rPr>
+        <w:t xml:space="preserve">Start with safe measurements. </w:t>
+      </w:r>
+      <w:r>
+        <w:rPr>
+          <w:b/>
+          <w:bCs/>
+          <w:lang w:val="en-GB"/>
+        </w:rPr>
+        <w:t>Start</w:t>
+      </w:r>
+      <w:r>
+        <w:rPr>
+          <w:b/>
+          <w:bCs/>
+          <w:lang w:val="en-GB"/>
+        </w:rPr>
+        <w:t xml:space="preserve"> with </w:t>
+      </w:r>
+      <w:r>
+        <w:rPr>
+          <w:b/>
+          <w:bCs/>
+          <w:lang w:val="en-GB"/>
+        </w:rPr>
+        <w:t xml:space="preserve">voltage, </w:t>
+      </w:r>
+      <w:r>
+        <w:rPr>
+          <w:b/>
+          <w:bCs/>
+          <w:lang w:val="en-GB"/>
+        </w:rPr>
+        <w:t xml:space="preserve">current </w:t>
+      </w:r>
+      <w:r>
+        <w:rPr>
+          <w:b/>
+          <w:bCs/>
+          <w:lang w:val="en-GB"/>
+        </w:rPr>
+        <w:t xml:space="preserve">and power </w:t>
+      </w:r>
+      <w:r>
+        <w:rPr>
+          <w:b/>
+          <w:bCs/>
+          <w:lang w:val="en-GB"/>
+        </w:rPr>
+        <w:t xml:space="preserve">limited to </w:t>
+      </w:r>
+      <w:r>
+        <w:rPr>
+          <w:b/>
+          <w:bCs/>
+          <w:lang w:val="en-GB"/>
+        </w:rPr>
+        <w:t>the lowest possible values.</w:t>
+      </w:r>
+      <w:r>
+        <w:rPr>
+          <w:lang w:val="en-GB"/>
+        </w:rPr>
+        <w:t xml:space="preserve"> Use</w:t>
+      </w:r>
+      <w:r>
+        <w:rPr>
+          <w:lang w:val="en-GB"/>
+        </w:rPr>
+        <w:t xml:space="preserve"> non</w:t>
+      </w:r>
+      <w:r>
+        <w:rPr>
+          <w:lang w:val="en-GB"/>
+        </w:rPr>
+        <w:t>-</w:t>
+      </w:r>
+      <w:r>
+        <w:rPr>
+          <w:lang w:val="en-GB"/>
+        </w:rPr>
+        <w:t>critical load</w:t>
+      </w:r>
+      <w:r>
+        <w:rPr>
+          <w:lang w:val="en-GB"/>
+        </w:rPr>
+        <w:t>s</w:t>
+      </w:r>
+      <w:r>
+        <w:rPr>
+          <w:lang w:val="en-GB"/>
+        </w:rPr>
+        <w:t xml:space="preserve"> </w:t>
+      </w:r>
+      <w:r>
+        <w:rPr>
+          <w:lang w:val="en-GB"/>
+        </w:rPr>
+        <w:t xml:space="preserve">such as </w:t>
+      </w:r>
+      <w:r>
+        <w:rPr>
+          <w:lang w:val="en-GB"/>
+        </w:rPr>
+        <w:t xml:space="preserve">power </w:t>
+      </w:r>
+      <w:r>
+        <w:rPr>
+          <w:lang w:val="en-GB"/>
+        </w:rPr>
+        <w:t>resistors</w:t>
+      </w:r>
+      <w:r>
+        <w:rPr>
+          <w:lang w:val="en-GB"/>
+        </w:rPr>
+        <w:t>.</w:t>
+      </w:r>
+      <w:r>
+        <w:rPr>
+          <w:lang w:val="en-GB"/>
+        </w:rPr>
+        <w:t xml:space="preserve"> </w:t>
+      </w:r>
+      <w:r>
+        <w:rPr>
+          <w:lang w:val="en-GB"/>
+        </w:rPr>
+        <w:t>Do the more critical measurements after having gained enough confidence.</w:t>
+      </w:r>
+    </w:p>
+    <w:p>
+      <w:pPr>
+        <w:rPr>
+          <w:lang w:val="en-GB"/>
+        </w:rPr>
+      </w:pPr>
+      <w:r>
+        <w:rPr>
+          <w:lang w:val="en-GB"/>
+        </w:rPr>
+        <w:t>If possible, divide the whole circuit into sections (sub-circuits), operate and test them separately before doing the overall test. Start with the low power sections.</w:t>
+      </w:r>
+    </w:p>
+    <w:p>
+      <w:pPr>
+        <w:pStyle w:val="Heading1"/>
+        <w:rPr>
+          <w:lang w:val="en-GB"/>
+        </w:rPr>
+      </w:pPr>
+      <w:bookmarkStart w:id="5" w:name="_Toc208327541"/>
+      <w:r>
+        <w:rPr>
+          <w:lang w:val="en-GB"/>
+        </w:rPr>
+        <w:t>Run</w:t>
+      </w:r>
+      <w:r>
+        <w:rPr>
+          <w:lang w:val="en-GB"/>
+        </w:rPr>
+        <w:t xml:space="preserve"> the T</w:t>
+      </w:r>
+      <w:r>
+        <w:rPr>
+          <w:lang w:val="en-GB"/>
+        </w:rPr>
+        <w:t>est</w:t>
+      </w:r>
+      <w:r>
+        <w:rPr>
+          <w:lang w:val="en-GB"/>
+        </w:rPr>
+        <w:t>s</w:t>
       </w:r>
       <w:bookmarkEnd w:id="5"/>
     </w:p>
@@ -3542,13 +6457,19 @@
         <w:rPr>
           <w:lang w:val="en-GB"/>
         </w:rPr>
-        <w:t xml:space="preserve">Always follow </w:t>
-      </w:r>
-      <w:r>
-        <w:rPr>
-          <w:lang w:val="en-GB"/>
-        </w:rPr>
-        <w:t>the principle: Safety First!</w:t>
+        <w:t>Execute the tests as define</w:t>
+      </w:r>
+      <w:r>
+        <w:rPr>
+          <w:lang w:val="en-GB"/>
+        </w:rPr>
+        <w:t xml:space="preserve">d in the test plan. </w:t>
+      </w:r>
+      <w:r>
+        <w:rPr>
+          <w:lang w:val="en-GB"/>
+        </w:rPr>
+        <w:t>It should therefore always be clear what results you would expect.</w:t>
       </w:r>
     </w:p>
     <w:p>
@@ -3561,332 +6482,12 @@
         <w:rPr>
           <w:lang w:val="en-GB"/>
         </w:rPr>
-        <w:t>Personal safety: Prevent risk of electric shock or any other danger due to high voltages or high currents, heat, intensive light</w:t>
-      </w:r>
-      <w:r>
-        <w:rPr>
-          <w:lang w:val="en-GB"/>
-        </w:rPr>
-        <w:t xml:space="preserve">, sound, </w:t>
-      </w:r>
-      <w:r>
-        <w:rPr>
-          <w:lang w:val="en-GB"/>
-        </w:rPr>
-        <w:t>…</w:t>
+        <w:t>Write a test protocol while doing the tests. It should include:</w:t>
       </w:r>
     </w:p>
     <w:p>
       <w:pPr>
-        <w:rPr>
-          <w:lang w:val="en-GB"/>
-        </w:rPr>
-      </w:pPr>
-      <w:r>
-        <w:rPr>
-          <w:lang w:val="en-GB"/>
-        </w:rPr>
-        <w:t>Prevent risk of damage of the DUT or the test equipment.</w:t>
-      </w:r>
-    </w:p>
-    <w:p>
-      <w:pPr>
-        <w:rPr>
-          <w:lang w:val="en-GB"/>
-        </w:rPr>
-      </w:pPr>
-      <w:r>
-        <w:rPr>
-          <w:lang w:val="en-GB"/>
-        </w:rPr>
-        <w:t>Before</w:t>
-      </w:r>
-      <w:r>
-        <w:rPr>
-          <w:lang w:val="en-GB"/>
-        </w:rPr>
-        <w:t xml:space="preserve"> switching on the power supply d</w:t>
-      </w:r>
-      <w:r>
-        <w:rPr>
-          <w:lang w:val="en-GB"/>
-        </w:rPr>
-        <w:t xml:space="preserve">o a visual inspection of the PCB: </w:t>
-      </w:r>
-      <w:r>
-        <w:rPr>
-          <w:lang w:val="en-GB"/>
-        </w:rPr>
-        <w:t>Soldering</w:t>
-      </w:r>
-      <w:r>
-        <w:rPr>
-          <w:lang w:val="en-GB"/>
-        </w:rPr>
-        <w:t>, no short circuits, correct orientation of the components</w:t>
-      </w:r>
-      <w:r>
-        <w:rPr>
-          <w:lang w:val="en-GB"/>
-        </w:rPr>
-        <w:t xml:space="preserve"> (electrolytic capacitors can explode with wrong polarisation)</w:t>
-      </w:r>
-      <w:r>
-        <w:rPr>
-          <w:lang w:val="en-GB"/>
-        </w:rPr>
-        <w:t>, no missing components, correct values …</w:t>
-      </w:r>
-    </w:p>
-    <w:p>
-      <w:pPr>
-        <w:rPr>
-          <w:lang w:val="en-GB"/>
-        </w:rPr>
-      </w:pPr>
-      <w:r>
-        <w:rPr>
-          <w:lang w:val="en-GB"/>
-        </w:rPr>
-        <w:t>Verify the test setup: Correct power supply (volta</w:t>
-      </w:r>
-      <w:r>
-        <w:rPr>
-          <w:lang w:val="en-GB"/>
-        </w:rPr>
-        <w:t>ge, current limits, polarity), instrument connection and configuration, ...</w:t>
-      </w:r>
-    </w:p>
-    <w:p>
-      <w:pPr>
-        <w:rPr>
-          <w:lang w:val="en-GB"/>
-        </w:rPr>
-      </w:pPr>
-      <w:r>
-        <w:rPr>
-          <w:lang w:val="en-GB"/>
-        </w:rPr>
-        <w:lastRenderedPageBreak/>
-        <w:t xml:space="preserve">Start with safe measurements. </w:t>
-      </w:r>
-      <w:r>
-        <w:rPr>
-          <w:b/>
-          <w:bCs/>
-          <w:lang w:val="en-GB"/>
-        </w:rPr>
-        <w:t>Start</w:t>
-      </w:r>
-      <w:r>
-        <w:rPr>
-          <w:b/>
-          <w:bCs/>
-          <w:lang w:val="en-GB"/>
-        </w:rPr>
-        <w:t xml:space="preserve"> with </w:t>
-      </w:r>
-      <w:r>
-        <w:rPr>
-          <w:b/>
-          <w:bCs/>
-          <w:lang w:val="en-GB"/>
-        </w:rPr>
-        <w:t xml:space="preserve">voltage, </w:t>
-      </w:r>
-      <w:r>
-        <w:rPr>
-          <w:b/>
-          <w:bCs/>
-          <w:lang w:val="en-GB"/>
-        </w:rPr>
-        <w:t xml:space="preserve">current </w:t>
-      </w:r>
-      <w:r>
-        <w:rPr>
-          <w:b/>
-          <w:bCs/>
-          <w:lang w:val="en-GB"/>
-        </w:rPr>
-        <w:t xml:space="preserve">and power </w:t>
-      </w:r>
-      <w:r>
-        <w:rPr>
-          <w:b/>
-          <w:bCs/>
-          <w:lang w:val="en-GB"/>
-        </w:rPr>
-        <w:t xml:space="preserve">limited to </w:t>
-      </w:r>
-      <w:r>
-        <w:rPr>
-          <w:b/>
-          <w:bCs/>
-          <w:lang w:val="en-GB"/>
-        </w:rPr>
-        <w:t>the lowest possible values.</w:t>
-      </w:r>
-      <w:r>
-        <w:rPr>
-          <w:lang w:val="en-GB"/>
-        </w:rPr>
-        <w:t xml:space="preserve"> Use</w:t>
-      </w:r>
-      <w:r>
-        <w:rPr>
-          <w:lang w:val="en-GB"/>
-        </w:rPr>
-        <w:t xml:space="preserve"> non</w:t>
-      </w:r>
-      <w:r>
-        <w:rPr>
-          <w:lang w:val="en-GB"/>
-        </w:rPr>
-        <w:t>-</w:t>
-      </w:r>
-      <w:r>
-        <w:rPr>
-          <w:lang w:val="en-GB"/>
-        </w:rPr>
-        <w:t>critical load</w:t>
-      </w:r>
-      <w:r>
-        <w:rPr>
-          <w:lang w:val="en-GB"/>
-        </w:rPr>
-        <w:t>s</w:t>
-      </w:r>
-      <w:r>
-        <w:rPr>
-          <w:lang w:val="en-GB"/>
-        </w:rPr>
-        <w:t xml:space="preserve"> </w:t>
-      </w:r>
-      <w:r>
-        <w:rPr>
-          <w:lang w:val="en-GB"/>
-        </w:rPr>
-        <w:t xml:space="preserve">such as </w:t>
-      </w:r>
-      <w:r>
-        <w:rPr>
-          <w:lang w:val="en-GB"/>
-        </w:rPr>
-        <w:t xml:space="preserve">power </w:t>
-      </w:r>
-      <w:r>
-        <w:rPr>
-          <w:lang w:val="en-GB"/>
-        </w:rPr>
-        <w:t>resistors</w:t>
-      </w:r>
-      <w:r>
-        <w:rPr>
-          <w:lang w:val="en-GB"/>
-        </w:rPr>
-        <w:t>.</w:t>
-      </w:r>
-      <w:r>
-        <w:rPr>
-          <w:lang w:val="en-GB"/>
-        </w:rPr>
-        <w:t xml:space="preserve"> </w:t>
-      </w:r>
-      <w:r>
-        <w:rPr>
-          <w:lang w:val="en-GB"/>
-        </w:rPr>
-        <w:t>Do the more critical measurements after having gained enough confidence.</w:t>
-      </w:r>
-    </w:p>
-    <w:p>
-      <w:pPr>
-        <w:rPr>
-          <w:lang w:val="en-GB"/>
-        </w:rPr>
-      </w:pPr>
-      <w:r>
-        <w:rPr>
-          <w:lang w:val="en-GB"/>
-        </w:rPr>
-        <w:t>If possible, divide the whole circuit into sections (sub-circuits), operate and test them separately before doing the overall test. Start with the low power sections.</w:t>
-      </w:r>
-    </w:p>
-    <w:p>
-      <w:pPr>
-        <w:pStyle w:val="berschrift1"/>
-        <w:rPr>
-          <w:lang w:val="en-GB"/>
-        </w:rPr>
-      </w:pPr>
-      <w:bookmarkStart w:id="6" w:name="_Toc208327541"/>
-      <w:r>
-        <w:rPr>
-          <w:lang w:val="en-GB"/>
-        </w:rPr>
-        <w:t>Run</w:t>
-      </w:r>
-      <w:r>
-        <w:rPr>
-          <w:lang w:val="en-GB"/>
-        </w:rPr>
-        <w:t xml:space="preserve"> the T</w:t>
-      </w:r>
-      <w:r>
-        <w:rPr>
-          <w:lang w:val="en-GB"/>
-        </w:rPr>
-        <w:t>est</w:t>
-      </w:r>
-      <w:r>
-        <w:rPr>
-          <w:lang w:val="en-GB"/>
-        </w:rPr>
-        <w:t>s</w:t>
-      </w:r>
-      <w:bookmarkEnd w:id="6"/>
-    </w:p>
-    <w:p>
-      <w:pPr>
-        <w:rPr>
-          <w:lang w:val="en-GB"/>
-        </w:rPr>
-      </w:pPr>
-      <w:r>
-        <w:rPr>
-          <w:lang w:val="en-GB"/>
-        </w:rPr>
-        <w:t>Execute the tests as define</w:t>
-      </w:r>
-      <w:r>
-        <w:rPr>
-          <w:lang w:val="en-GB"/>
-        </w:rPr>
-        <w:t xml:space="preserve">d in the test plan. </w:t>
-      </w:r>
-      <w:r>
-        <w:rPr>
-          <w:lang w:val="en-GB"/>
-        </w:rPr>
-        <w:t>It should therefore always be clear what results you would expect.</w:t>
-      </w:r>
-    </w:p>
-    <w:p>
-      <w:pPr>
-        <w:rPr>
-          <w:lang w:val="en-GB"/>
-        </w:rPr>
-      </w:pPr>
-      <w:r>
-        <w:rPr>
-          <w:lang w:val="en-GB"/>
-        </w:rPr>
-        <w:t>Write a test protocol while doing the tests. It should include:</w:t>
-      </w:r>
-    </w:p>
-    <w:p>
-      <w:pPr>
-        <w:pStyle w:val="Listenabsatz"/>
+        <w:pStyle w:val="ListParagraph"/>
         <w:numPr>
           <w:ilvl w:val="0"/>
           <w:numId w:val="15"/>
@@ -3917,7 +6518,7 @@
     </w:p>
     <w:p>
       <w:pPr>
-        <w:pStyle w:val="Listenabsatz"/>
+        <w:pStyle w:val="ListParagraph"/>
         <w:numPr>
           <w:ilvl w:val="0"/>
           <w:numId w:val="15"/>
@@ -3935,7 +6536,7 @@
     </w:p>
     <w:p>
       <w:pPr>
-        <w:pStyle w:val="Listenabsatz"/>
+        <w:pStyle w:val="ListParagraph"/>
         <w:numPr>
           <w:ilvl w:val="0"/>
           <w:numId w:val="15"/>
@@ -4053,21 +6654,7 @@
         <w:rPr>
           <w:lang w:val="en-GB"/>
         </w:rPr>
-        <w:t xml:space="preserve"> </w:t>
-      </w:r>
-      <w:proofErr w:type="gramStart"/>
-      <w:r>
-        <w:rPr>
-          <w:lang w:val="en-GB"/>
-        </w:rPr>
-        <w:t>has to</w:t>
-      </w:r>
-      <w:proofErr w:type="gramEnd"/>
-      <w:r>
-        <w:rPr>
-          <w:lang w:val="en-GB"/>
-        </w:rPr>
-        <w:t xml:space="preserve"> be aborted.</w:t>
+        <w:t xml:space="preserve"> has to be aborted.</w:t>
       </w:r>
     </w:p>
     <w:p>
@@ -4080,24 +6667,25 @@
         <w:rPr>
           <w:lang w:val="en-GB"/>
         </w:rPr>
+        <w:lastRenderedPageBreak/>
         <w:t>After correcting an error, all the tests depending on the affected part, must be redone and the tests documented again.</w:t>
       </w:r>
     </w:p>
     <w:p>
       <w:pPr>
-        <w:pStyle w:val="berschrift1"/>
-        <w:rPr>
-          <w:lang w:val="en-GB"/>
-        </w:rPr>
-      </w:pPr>
-      <w:bookmarkStart w:id="7" w:name="_Toc208327542"/>
+        <w:pStyle w:val="Heading1"/>
+        <w:rPr>
+          <w:lang w:val="en-GB"/>
+        </w:rPr>
+      </w:pPr>
+      <w:bookmarkStart w:id="6" w:name="_Toc208327542"/>
       <w:r>
         <w:rPr>
           <w:lang w:val="en-GB"/>
         </w:rPr>
         <w:t>Test Analysis</w:t>
       </w:r>
-      <w:bookmarkEnd w:id="7"/>
+      <w:bookmarkEnd w:id="6"/>
     </w:p>
     <w:p>
       <w:pPr>
@@ -4132,7 +6720,7 @@
     </w:p>
     <w:p>
       <w:pPr>
-        <w:pStyle w:val="Listenabsatz"/>
+        <w:pStyle w:val="ListParagraph"/>
         <w:numPr>
           <w:ilvl w:val="0"/>
           <w:numId w:val="16"/>
@@ -4150,7 +6738,7 @@
     </w:p>
     <w:p>
       <w:pPr>
-        <w:pStyle w:val="Listenabsatz"/>
+        <w:pStyle w:val="ListParagraph"/>
         <w:numPr>
           <w:ilvl w:val="0"/>
           <w:numId w:val="16"/>
@@ -4174,7 +6762,7 @@
     </w:p>
     <w:p>
       <w:pPr>
-        <w:pStyle w:val="Listenabsatz"/>
+        <w:pStyle w:val="ListParagraph"/>
         <w:numPr>
           <w:ilvl w:val="0"/>
           <w:numId w:val="16"/>
@@ -4204,7 +6792,7 @@
     </w:p>
     <w:p>
       <w:pPr>
-        <w:pStyle w:val="Listenabsatz"/>
+        <w:pStyle w:val="ListParagraph"/>
         <w:numPr>
           <w:ilvl w:val="0"/>
           <w:numId w:val="16"/>
@@ -4213,24 +6801,16 @@
           <w:lang w:val="en-GB"/>
         </w:rPr>
       </w:pPr>
-      <w:proofErr w:type="gramStart"/>
-      <w:r>
-        <w:rPr>
-          <w:lang w:val="en-GB"/>
-        </w:rPr>
-        <w:t>Finding  reasons</w:t>
-      </w:r>
-      <w:proofErr w:type="gramEnd"/>
-      <w:r>
-        <w:rPr>
-          <w:lang w:val="en-GB"/>
-        </w:rPr>
-        <w:t xml:space="preserve"> for deviations and errors</w:t>
+      <w:r>
+        <w:rPr>
+          <w:lang w:val="en-GB"/>
+        </w:rPr>
+        <w:t>Finding  reasons for deviations and errors</w:t>
       </w:r>
     </w:p>
     <w:p>
       <w:pPr>
-        <w:pStyle w:val="Listenabsatz"/>
+        <w:pStyle w:val="ListParagraph"/>
         <w:numPr>
           <w:ilvl w:val="0"/>
           <w:numId w:val="16"/>
@@ -4260,7 +6840,7 @@
     </w:p>
     <w:p>
       <w:pPr>
-        <w:pStyle w:val="Listenabsatz"/>
+        <w:pStyle w:val="ListParagraph"/>
         <w:numPr>
           <w:ilvl w:val="0"/>
           <w:numId w:val="16"/>
@@ -4308,20 +6888,19 @@
     </w:p>
     <w:p>
       <w:pPr>
-        <w:pStyle w:val="berschrift1"/>
-        <w:rPr>
-          <w:lang w:val="en-GB"/>
-        </w:rPr>
-      </w:pPr>
-      <w:bookmarkStart w:id="8" w:name="_Toc208327543"/>
-      <w:r>
-        <w:rPr>
-          <w:lang w:val="en-GB"/>
-        </w:rPr>
-        <w:lastRenderedPageBreak/>
+        <w:pStyle w:val="Heading1"/>
+        <w:rPr>
+          <w:lang w:val="en-GB"/>
+        </w:rPr>
+      </w:pPr>
+      <w:bookmarkStart w:id="7" w:name="_Toc208327543"/>
+      <w:r>
+        <w:rPr>
+          <w:lang w:val="en-GB"/>
+        </w:rPr>
         <w:t>Test Documentation</w:t>
       </w:r>
-      <w:bookmarkEnd w:id="8"/>
+      <w:bookmarkEnd w:id="7"/>
     </w:p>
     <w:p>
       <w:pPr>
@@ -4413,7 +6992,7 @@
 <w:ftr xmlns:wpc="http://schemas.microsoft.com/office/word/2010/wordprocessingCanvas" xmlns:cx="http://schemas.microsoft.com/office/drawing/2014/chartex" xmlns:cx1="http://schemas.microsoft.com/office/drawing/2015/9/8/chartex" xmlns:cx2="http://schemas.microsoft.com/office/drawing/2015/10/21/chartex" xmlns:cx3="http://schemas.microsoft.com/office/drawing/2016/5/9/chartex" xmlns:cx4="http://schemas.microsoft.com/office/drawing/2016/5/10/chartex" xmlns:cx5="http://schemas.microsoft.com/office/drawing/2016/5/11/chartex" xmlns:cx6="http://schemas.microsoft.com/office/drawing/2016/5/12/chartex" xmlns:cx7="http://schemas.microsoft.com/office/drawing/2016/5/13/chartex" xmlns:cx8="http://schemas.microsoft.com/office/drawing/2016/5/14/chartex" xmlns:mc="http://schemas.openxmlformats.org/markup-compatibility/2006" xmlns:aink="http://schemas.microsoft.com/office/drawing/2016/ink" xmlns:am3d="http://schemas.microsoft.com/office/drawing/2017/model3d" xmlns:o="urn:schemas-microsoft-com:office:office" xmlns:oel="http://schemas.microsoft.com/office/2019/extlst" xmlns:r="http://schemas.openxmlformats.org/officeDocument/2006/relationships" xmlns:m="http://schemas.openxmlformats.org/officeDocument/2006/math" xmlns:v="urn:schemas-microsoft-com:vml" xmlns:wp14="http://schemas.microsoft.com/office/word/2010/wordprocessingDrawing" xmlns:wp="http://schemas.openxmlformats.org/drawingml/2006/wordprocessingDrawing" xmlns:w10="urn:schemas-microsoft-com:office:word" xmlns:w="http://schemas.openxmlformats.org/wordprocessingml/2006/main" xmlns:w14="http://schemas.microsoft.com/office/word/2010/wordml" xmlns:w15="http://schemas.microsoft.com/office/word/2012/wordml" xmlns:w16cex="http://schemas.microsoft.com/office/word/2018/wordml/cex" xmlns:w16cid="http://schemas.microsoft.com/office/word/2016/wordml/cid" xmlns:w16="http://schemas.microsoft.com/office/word/2018/wordml" xmlns:w16du="http://schemas.microsoft.com/office/word/2023/wordml/word16du" xmlns:w16sdtdh="http://schemas.microsoft.com/office/word/2020/wordml/sdtdatahash" xmlns:w16sdtfl="http://schemas.microsoft.com/office/word/2024/wordml/sdtformatlock" xmlns:w16se="http://schemas.microsoft.com/office/word/2015/wordml/symex" xmlns:wpg="http://schemas.microsoft.com/office/word/2010/wordprocessingGroup" xmlns:wpi="http://schemas.microsoft.com/office/word/2010/wordprocessingInk" xmlns:wne="http://schemas.microsoft.com/office/word/2006/wordml" xmlns:wps="http://schemas.microsoft.com/office/word/2010/wordprocessingShape" mc:Ignorable="w14 w15 w16se w16cid w16 w16cex w16sdtdh w16sdtfl w16du wp14">
   <w:p>
     <w:pPr>
-      <w:pStyle w:val="Fuzeile"/>
+      <w:pStyle w:val="Footer"/>
       <w:jc w:val="right"/>
       <w:rPr>
         <w:lang w:val="en-GB"/>
@@ -4599,7 +7178,7 @@
   </w:p>
   <w:p>
     <w:pPr>
-      <w:pStyle w:val="Fuzeile"/>
+      <w:pStyle w:val="Footer"/>
       <w:jc w:val="right"/>
     </w:pPr>
     <w:r>
@@ -5776,7 +8355,7 @@
     <w:lvl w:ilvl="0">
       <w:start w:val="1"/>
       <w:numFmt w:val="decimal"/>
-      <w:pStyle w:val="berschrift1"/>
+      <w:pStyle w:val="Heading1"/>
       <w:isLgl/>
       <w:lvlText w:val="%1."/>
       <w:lvlJc w:val="left"/>
@@ -5793,7 +8372,7 @@
     <w:lvl w:ilvl="1">
       <w:start w:val="1"/>
       <w:numFmt w:val="decimal"/>
-      <w:pStyle w:val="berschrift2"/>
+      <w:pStyle w:val="Heading2"/>
       <w:isLgl/>
       <w:lvlText w:val="%1.%2."/>
       <w:lvlJc w:val="left"/>
@@ -5810,7 +8389,7 @@
     <w:lvl w:ilvl="2">
       <w:start w:val="1"/>
       <w:numFmt w:val="decimal"/>
-      <w:pStyle w:val="berschrift3"/>
+      <w:pStyle w:val="Heading3"/>
       <w:isLgl/>
       <w:lvlText w:val="%1.%2.%3."/>
       <w:lvlJc w:val="left"/>
@@ -5827,7 +8406,7 @@
     <w:lvl w:ilvl="3">
       <w:start w:val="1"/>
       <w:numFmt w:val="decimal"/>
-      <w:pStyle w:val="berschrift4"/>
+      <w:pStyle w:val="Heading4"/>
       <w:isLgl/>
       <w:lvlText w:val="%1.%2.%3.%4."/>
       <w:lvlJc w:val="left"/>
@@ -6564,10 +9143,10 @@
     <w:lsdException w:name="Unresolved Mention" w:semiHidden="1" w:unhideWhenUsed="1"/>
     <w:lsdException w:name="Smart Link" w:semiHidden="1" w:unhideWhenUsed="1"/>
   </w:latentStyles>
-  <w:style w:type="paragraph" w:default="1" w:styleId="Standard">
+  <w:style w:type="paragraph" w:default="1" w:styleId="Normal">
     <w:name w:val="Normal"/>
     <w:qFormat/>
-    <w:rsid w:val="00DA5990"/>
+    <w:rsid w:val="00787CB5"/>
     <w:pPr>
       <w:spacing w:before="120" w:after="0" w:line="312" w:lineRule="auto"/>
       <w:jc w:val="both"/>
@@ -6578,11 +9157,11 @@
       <w:lang w:eastAsia="de-DE"/>
     </w:rPr>
   </w:style>
-  <w:style w:type="paragraph" w:styleId="berschrift1">
+  <w:style w:type="paragraph" w:styleId="Heading1">
     <w:name w:val="heading 1"/>
-    <w:basedOn w:val="Standard"/>
-    <w:next w:val="Standard"/>
-    <w:link w:val="berschrift1Zchn"/>
+    <w:basedOn w:val="Normal"/>
+    <w:next w:val="Normal"/>
+    <w:link w:val="Heading1Char"/>
     <w:qFormat/>
     <w:rsid w:val="0066609C"/>
     <w:pPr>
@@ -6602,11 +9181,11 @@
       <w:szCs w:val="32"/>
     </w:rPr>
   </w:style>
-  <w:style w:type="paragraph" w:styleId="berschrift2">
+  <w:style w:type="paragraph" w:styleId="Heading2">
     <w:name w:val="heading 2"/>
-    <w:basedOn w:val="Standard"/>
-    <w:next w:val="Standard"/>
-    <w:link w:val="berschrift2Zchn"/>
+    <w:basedOn w:val="Normal"/>
+    <w:next w:val="Normal"/>
+    <w:link w:val="Heading2Char"/>
     <w:qFormat/>
     <w:rsid w:val="0066609C"/>
     <w:pPr>
@@ -6627,11 +9206,11 @@
       <w:szCs w:val="28"/>
     </w:rPr>
   </w:style>
-  <w:style w:type="paragraph" w:styleId="berschrift3">
+  <w:style w:type="paragraph" w:styleId="Heading3">
     <w:name w:val="heading 3"/>
-    <w:basedOn w:val="Standard"/>
-    <w:next w:val="Standard"/>
-    <w:link w:val="berschrift3Zchn"/>
+    <w:basedOn w:val="Normal"/>
+    <w:next w:val="Normal"/>
+    <w:link w:val="Heading3Char"/>
     <w:qFormat/>
     <w:rsid w:val="0066609C"/>
     <w:pPr>
@@ -6651,11 +9230,11 @@
       <w:szCs w:val="26"/>
     </w:rPr>
   </w:style>
-  <w:style w:type="paragraph" w:styleId="berschrift4">
+  <w:style w:type="paragraph" w:styleId="Heading4">
     <w:name w:val="heading 4"/>
-    <w:basedOn w:val="Standard"/>
-    <w:next w:val="Standard"/>
-    <w:link w:val="berschrift4Zchn"/>
+    <w:basedOn w:val="Normal"/>
+    <w:next w:val="Normal"/>
+    <w:link w:val="Heading4Char"/>
     <w:qFormat/>
     <w:rsid w:val="0066609C"/>
     <w:pPr>
@@ -6674,13 +9253,13 @@
       <w:szCs w:val="28"/>
     </w:rPr>
   </w:style>
-  <w:style w:type="character" w:default="1" w:styleId="Absatz-Standardschriftart">
+  <w:style w:type="character" w:default="1" w:styleId="DefaultParagraphFont">
     <w:name w:val="Default Paragraph Font"/>
     <w:uiPriority w:val="1"/>
     <w:semiHidden/>
     <w:unhideWhenUsed/>
   </w:style>
-  <w:style w:type="table" w:default="1" w:styleId="NormaleTabelle">
+  <w:style w:type="table" w:default="1" w:styleId="TableNormal">
     <w:name w:val="Normal Table"/>
     <w:uiPriority w:val="99"/>
     <w:semiHidden/>
@@ -6695,16 +9274,16 @@
       </w:tblCellMar>
     </w:tblPr>
   </w:style>
-  <w:style w:type="numbering" w:default="1" w:styleId="KeineListe">
+  <w:style w:type="numbering" w:default="1" w:styleId="NoList">
     <w:name w:val="No List"/>
     <w:uiPriority w:val="99"/>
     <w:semiHidden/>
     <w:unhideWhenUsed/>
   </w:style>
-  <w:style w:type="character" w:customStyle="1" w:styleId="berschrift1Zchn">
-    <w:name w:val="Überschrift 1 Zchn"/>
-    <w:basedOn w:val="Absatz-Standardschriftart"/>
-    <w:link w:val="berschrift1"/>
+  <w:style w:type="character" w:customStyle="1" w:styleId="Heading1Char">
+    <w:name w:val="Heading 1 Char"/>
+    <w:basedOn w:val="DefaultParagraphFont"/>
+    <w:link w:val="Heading1"/>
     <w:rsid w:val="0066609C"/>
     <w:rPr>
       <w:rFonts w:ascii="Arial" w:eastAsia="Times New Roman" w:hAnsi="Arial" w:cs="Arial"/>
@@ -6716,10 +9295,10 @@
       <w:lang w:eastAsia="de-DE"/>
     </w:rPr>
   </w:style>
-  <w:style w:type="character" w:customStyle="1" w:styleId="berschrift2Zchn">
-    <w:name w:val="Überschrift 2 Zchn"/>
-    <w:basedOn w:val="Absatz-Standardschriftart"/>
-    <w:link w:val="berschrift2"/>
+  <w:style w:type="character" w:customStyle="1" w:styleId="Heading2Char">
+    <w:name w:val="Heading 2 Char"/>
+    <w:basedOn w:val="DefaultParagraphFont"/>
+    <w:link w:val="Heading2"/>
     <w:rsid w:val="0066609C"/>
     <w:rPr>
       <w:rFonts w:ascii="Arial" w:eastAsia="Times New Roman" w:hAnsi="Arial" w:cs="Arial"/>
@@ -6731,10 +9310,10 @@
       <w:lang w:eastAsia="de-DE"/>
     </w:rPr>
   </w:style>
-  <w:style w:type="character" w:customStyle="1" w:styleId="berschrift3Zchn">
-    <w:name w:val="Überschrift 3 Zchn"/>
-    <w:basedOn w:val="Absatz-Standardschriftart"/>
-    <w:link w:val="berschrift3"/>
+  <w:style w:type="character" w:customStyle="1" w:styleId="Heading3Char">
+    <w:name w:val="Heading 3 Char"/>
+    <w:basedOn w:val="DefaultParagraphFont"/>
+    <w:link w:val="Heading3"/>
     <w:rsid w:val="0066609C"/>
     <w:rPr>
       <w:rFonts w:ascii="Arial" w:eastAsia="Times New Roman" w:hAnsi="Arial" w:cs="Arial"/>
@@ -6745,10 +9324,10 @@
       <w:lang w:eastAsia="de-DE"/>
     </w:rPr>
   </w:style>
-  <w:style w:type="character" w:customStyle="1" w:styleId="berschrift4Zchn">
-    <w:name w:val="Überschrift 4 Zchn"/>
-    <w:basedOn w:val="Absatz-Standardschriftart"/>
-    <w:link w:val="berschrift4"/>
+  <w:style w:type="character" w:customStyle="1" w:styleId="Heading4Char">
+    <w:name w:val="Heading 4 Char"/>
+    <w:basedOn w:val="DefaultParagraphFont"/>
+    <w:link w:val="Heading4"/>
     <w:rsid w:val="0066609C"/>
     <w:rPr>
       <w:rFonts w:ascii="Arial" w:eastAsia="Times New Roman" w:hAnsi="Arial" w:cs="Times New Roman"/>
@@ -6759,10 +9338,10 @@
       <w:lang w:eastAsia="de-DE"/>
     </w:rPr>
   </w:style>
-  <w:style w:type="paragraph" w:styleId="Verzeichnis1">
+  <w:style w:type="paragraph" w:styleId="TOC1">
     <w:name w:val="toc 1"/>
-    <w:basedOn w:val="Standard"/>
-    <w:next w:val="Standard"/>
+    <w:basedOn w:val="Normal"/>
+    <w:next w:val="Normal"/>
     <w:autoRedefine/>
     <w:uiPriority w:val="39"/>
     <w:rsid w:val="0066609C"/>
@@ -6773,10 +9352,10 @@
       </w:tabs>
     </w:pPr>
   </w:style>
-  <w:style w:type="paragraph" w:styleId="Verzeichnis2">
+  <w:style w:type="paragraph" w:styleId="TOC2">
     <w:name w:val="toc 2"/>
-    <w:basedOn w:val="Standard"/>
-    <w:next w:val="Standard"/>
+    <w:basedOn w:val="Normal"/>
+    <w:next w:val="Normal"/>
     <w:autoRedefine/>
     <w:uiPriority w:val="39"/>
     <w:rsid w:val="0066609C"/>
@@ -6784,10 +9363,10 @@
       <w:ind w:left="227"/>
     </w:pPr>
   </w:style>
-  <w:style w:type="paragraph" w:styleId="Verzeichnis3">
+  <w:style w:type="paragraph" w:styleId="TOC3">
     <w:name w:val="toc 3"/>
-    <w:basedOn w:val="Standard"/>
-    <w:next w:val="Standard"/>
+    <w:basedOn w:val="Normal"/>
+    <w:next w:val="Normal"/>
     <w:autoRedefine/>
     <w:uiPriority w:val="39"/>
     <w:rsid w:val="0066609C"/>
@@ -6795,10 +9374,10 @@
       <w:ind w:left="454"/>
     </w:pPr>
   </w:style>
-  <w:style w:type="paragraph" w:styleId="Verzeichnis4">
+  <w:style w:type="paragraph" w:styleId="TOC4">
     <w:name w:val="toc 4"/>
-    <w:basedOn w:val="Standard"/>
-    <w:next w:val="Standard"/>
+    <w:basedOn w:val="Normal"/>
+    <w:next w:val="Normal"/>
     <w:autoRedefine/>
     <w:semiHidden/>
     <w:rsid w:val="0066609C"/>
@@ -6806,11 +9385,11 @@
       <w:ind w:left="680"/>
     </w:pPr>
   </w:style>
-  <w:style w:type="paragraph" w:styleId="Titel">
+  <w:style w:type="paragraph" w:styleId="Title">
     <w:name w:val="Title"/>
-    <w:basedOn w:val="Standard"/>
-    <w:next w:val="Standard"/>
-    <w:link w:val="TitelZchn"/>
+    <w:basedOn w:val="Normal"/>
+    <w:next w:val="Normal"/>
+    <w:link w:val="TitleChar"/>
     <w:uiPriority w:val="10"/>
     <w:qFormat/>
     <w:rsid w:val="00B803B2"/>
@@ -6827,10 +9406,10 @@
       <w:szCs w:val="56"/>
     </w:rPr>
   </w:style>
-  <w:style w:type="character" w:customStyle="1" w:styleId="TitelZchn">
-    <w:name w:val="Titel Zchn"/>
-    <w:basedOn w:val="Absatz-Standardschriftart"/>
-    <w:link w:val="Titel"/>
+  <w:style w:type="character" w:customStyle="1" w:styleId="TitleChar">
+    <w:name w:val="Title Char"/>
+    <w:basedOn w:val="DefaultParagraphFont"/>
+    <w:link w:val="Title"/>
     <w:uiPriority w:val="10"/>
     <w:rsid w:val="00B803B2"/>
     <w:rPr>
@@ -6843,11 +9422,11 @@
       <w:lang w:eastAsia="de-DE"/>
     </w:rPr>
   </w:style>
-  <w:style w:type="paragraph" w:styleId="Untertitel">
+  <w:style w:type="paragraph" w:styleId="Subtitle">
     <w:name w:val="Subtitle"/>
-    <w:basedOn w:val="Standard"/>
-    <w:next w:val="Standard"/>
-    <w:link w:val="UntertitelZchn"/>
+    <w:basedOn w:val="Normal"/>
+    <w:next w:val="Normal"/>
+    <w:link w:val="SubtitleChar"/>
     <w:uiPriority w:val="11"/>
     <w:qFormat/>
     <w:rsid w:val="00B803B2"/>
@@ -6865,10 +9444,10 @@
       <w:szCs w:val="22"/>
     </w:rPr>
   </w:style>
-  <w:style w:type="character" w:customStyle="1" w:styleId="UntertitelZchn">
-    <w:name w:val="Untertitel Zchn"/>
-    <w:basedOn w:val="Absatz-Standardschriftart"/>
-    <w:link w:val="Untertitel"/>
+  <w:style w:type="character" w:customStyle="1" w:styleId="SubtitleChar">
+    <w:name w:val="Subtitle Char"/>
+    <w:basedOn w:val="DefaultParagraphFont"/>
+    <w:link w:val="Subtitle"/>
     <w:uiPriority w:val="11"/>
     <w:rsid w:val="00B803B2"/>
     <w:rPr>
@@ -6879,10 +9458,10 @@
       <w:lang w:eastAsia="de-DE"/>
     </w:rPr>
   </w:style>
-  <w:style w:type="paragraph" w:styleId="Inhaltsverzeichnisberschrift">
+  <w:style w:type="paragraph" w:styleId="TOCHeading">
     <w:name w:val="TOC Heading"/>
-    <w:basedOn w:val="berschrift1"/>
-    <w:next w:val="Standard"/>
+    <w:basedOn w:val="Heading1"/>
+    <w:next w:val="Normal"/>
     <w:uiPriority w:val="39"/>
     <w:unhideWhenUsed/>
     <w:qFormat/>
@@ -6907,7 +9486,7 @@
   </w:style>
   <w:style w:type="character" w:styleId="Hyperlink">
     <w:name w:val="Hyperlink"/>
-    <w:basedOn w:val="Absatz-Standardschriftart"/>
+    <w:basedOn w:val="DefaultParagraphFont"/>
     <w:uiPriority w:val="99"/>
     <w:unhideWhenUsed/>
     <w:rsid w:val="001F2BA2"/>
@@ -6916,10 +9495,10 @@
       <w:u w:val="single"/>
     </w:rPr>
   </w:style>
-  <w:style w:type="paragraph" w:styleId="Kopfzeile">
+  <w:style w:type="paragraph" w:styleId="Header">
     <w:name w:val="header"/>
-    <w:basedOn w:val="Standard"/>
-    <w:link w:val="KopfzeileZchn"/>
+    <w:basedOn w:val="Normal"/>
+    <w:link w:val="HeaderChar"/>
     <w:uiPriority w:val="99"/>
     <w:unhideWhenUsed/>
     <w:rsid w:val="00800B97"/>
@@ -6931,10 +9510,10 @@
       <w:spacing w:before="0"/>
     </w:pPr>
   </w:style>
-  <w:style w:type="character" w:customStyle="1" w:styleId="KopfzeileZchn">
-    <w:name w:val="Kopfzeile Zchn"/>
-    <w:basedOn w:val="Absatz-Standardschriftart"/>
-    <w:link w:val="Kopfzeile"/>
+  <w:style w:type="character" w:customStyle="1" w:styleId="HeaderChar">
+    <w:name w:val="Header Char"/>
+    <w:basedOn w:val="DefaultParagraphFont"/>
+    <w:link w:val="Header"/>
     <w:uiPriority w:val="99"/>
     <w:rsid w:val="00800B97"/>
     <w:rPr>
@@ -6943,10 +9522,10 @@
       <w:lang w:eastAsia="de-DE"/>
     </w:rPr>
   </w:style>
-  <w:style w:type="paragraph" w:styleId="Fuzeile">
+  <w:style w:type="paragraph" w:styleId="Footer">
     <w:name w:val="footer"/>
-    <w:basedOn w:val="Standard"/>
-    <w:link w:val="FuzeileZchn"/>
+    <w:basedOn w:val="Normal"/>
+    <w:link w:val="FooterChar"/>
     <w:uiPriority w:val="99"/>
     <w:unhideWhenUsed/>
     <w:rsid w:val="00800B97"/>
@@ -6958,10 +9537,10 @@
       <w:spacing w:before="0"/>
     </w:pPr>
   </w:style>
-  <w:style w:type="character" w:customStyle="1" w:styleId="FuzeileZchn">
-    <w:name w:val="Fußzeile Zchn"/>
-    <w:basedOn w:val="Absatz-Standardschriftart"/>
-    <w:link w:val="Fuzeile"/>
+  <w:style w:type="character" w:customStyle="1" w:styleId="FooterChar">
+    <w:name w:val="Footer Char"/>
+    <w:basedOn w:val="DefaultParagraphFont"/>
+    <w:link w:val="Footer"/>
     <w:uiPriority w:val="99"/>
     <w:qFormat/>
     <w:rsid w:val="00800B97"/>
@@ -6971,9 +9550,9 @@
       <w:lang w:eastAsia="de-DE"/>
     </w:rPr>
   </w:style>
-  <w:style w:type="character" w:styleId="Platzhaltertext">
+  <w:style w:type="character" w:styleId="PlaceholderText">
     <w:name w:val="Placeholder Text"/>
-    <w:basedOn w:val="Absatz-Standardschriftart"/>
+    <w:basedOn w:val="DefaultParagraphFont"/>
     <w:uiPriority w:val="99"/>
     <w:semiHidden/>
     <w:rsid w:val="00800B97"/>
@@ -6981,9 +9560,9 @@
       <w:color w:val="808080"/>
     </w:rPr>
   </w:style>
-  <w:style w:type="character" w:styleId="Fett">
+  <w:style w:type="character" w:styleId="Strong">
     <w:name w:val="Strong"/>
-    <w:basedOn w:val="Absatz-Standardschriftart"/>
+    <w:basedOn w:val="DefaultParagraphFont"/>
     <w:uiPriority w:val="22"/>
     <w:qFormat/>
     <w:rsid w:val="00962A8B"/>
@@ -6992,9 +9571,9 @@
       <w:bCs/>
     </w:rPr>
   </w:style>
-  <w:style w:type="character" w:styleId="BesuchterLink">
+  <w:style w:type="character" w:styleId="FollowedHyperlink">
     <w:name w:val="FollowedHyperlink"/>
-    <w:basedOn w:val="Absatz-Standardschriftart"/>
+    <w:basedOn w:val="DefaultParagraphFont"/>
     <w:uiPriority w:val="99"/>
     <w:semiHidden/>
     <w:unhideWhenUsed/>
@@ -7006,7 +9585,7 @@
   </w:style>
   <w:style w:type="character" w:customStyle="1" w:styleId="NichtaufgelsteErwhnung1">
     <w:name w:val="Nicht aufgelöste Erwähnung1"/>
-    <w:basedOn w:val="Absatz-Standardschriftart"/>
+    <w:basedOn w:val="DefaultParagraphFont"/>
     <w:uiPriority w:val="99"/>
     <w:semiHidden/>
     <w:unhideWhenUsed/>
@@ -7016,10 +9595,10 @@
       <w:shd w:val="clear" w:color="auto" w:fill="E1DFDD"/>
     </w:rPr>
   </w:style>
-  <w:style w:type="paragraph" w:styleId="Beschriftung">
+  <w:style w:type="paragraph" w:styleId="Caption">
     <w:name w:val="caption"/>
-    <w:basedOn w:val="Standard"/>
-    <w:next w:val="Standard"/>
+    <w:basedOn w:val="Normal"/>
+    <w:next w:val="Normal"/>
     <w:uiPriority w:val="35"/>
     <w:unhideWhenUsed/>
     <w:qFormat/>
@@ -7035,9 +9614,9 @@
       <w:szCs w:val="18"/>
     </w:rPr>
   </w:style>
-  <w:style w:type="paragraph" w:styleId="Listenabsatz">
+  <w:style w:type="paragraph" w:styleId="ListParagraph">
     <w:name w:val="List Paragraph"/>
-    <w:basedOn w:val="Standard"/>
+    <w:basedOn w:val="Normal"/>
     <w:uiPriority w:val="34"/>
     <w:qFormat/>
     <w:rsid w:val="00B07153"/>
@@ -7046,9 +9625,9 @@
       <w:contextualSpacing/>
     </w:pPr>
   </w:style>
-  <w:style w:type="paragraph" w:styleId="StandardWeb">
+  <w:style w:type="paragraph" w:styleId="NormalWeb">
     <w:name w:val="Normal (Web)"/>
-    <w:basedOn w:val="Standard"/>
+    <w:basedOn w:val="Normal"/>
     <w:uiPriority w:val="99"/>
     <w:semiHidden/>
     <w:unhideWhenUsed/>
@@ -7063,9 +9642,9 @@
       <w:lang w:eastAsia="de-CH"/>
     </w:rPr>
   </w:style>
-  <w:style w:type="table" w:styleId="Tabellenraster">
+  <w:style w:type="table" w:styleId="TableGrid">
     <w:name w:val="Table Grid"/>
-    <w:basedOn w:val="NormaleTabelle"/>
+    <w:basedOn w:val="TableNormal"/>
     <w:uiPriority w:val="39"/>
     <w:rsid w:val="00DF4670"/>
     <w:pPr>

</xml_diff>

<commit_message>
worked on test cases and added current consumption sheet
</commit_message>
<xml_diff>
--- a/3_Technical_Documents/PCB/HW_Testing.docx
+++ b/3_Technical_Documents/PCB/HW_Testing.docx
@@ -1202,35 +1202,7 @@
         <w:rPr>
           <w:lang w:val="en-GB"/>
         </w:rPr>
-        <w:t xml:space="preserve">groups. It follows a systematic approach, starting from the audio input connectors, through the </w:t>
-      </w:r>
-      <w:proofErr w:type="spellStart"/>
-      <w:r>
-        <w:rPr>
-          <w:lang w:val="en-GB"/>
-        </w:rPr>
-        <w:t>analog</w:t>
-      </w:r>
-      <w:proofErr w:type="spellEnd"/>
-      <w:r>
-        <w:rPr>
-          <w:lang w:val="en-GB"/>
-        </w:rPr>
-        <w:t xml:space="preserve"> input circuitry, codec, </w:t>
-      </w:r>
-      <w:proofErr w:type="spellStart"/>
-      <w:r>
-        <w:rPr>
-          <w:lang w:val="en-GB"/>
-        </w:rPr>
-        <w:t>analog</w:t>
-      </w:r>
-      <w:proofErr w:type="spellEnd"/>
-      <w:r>
-        <w:rPr>
-          <w:lang w:val="en-GB"/>
-        </w:rPr>
-        <w:t xml:space="preserve"> output circuitry, and ending at the output connectors.</w:t>
+        <w:t>groups. It follows a systematic approach, starting from the audio input connectors, through the analog input circuitry, codec, analog output circuitry, and ending at the output connectors.</w:t>
       </w:r>
     </w:p>
     <w:p>
@@ -1254,355 +1226,11 @@
         </w:rPr>
       </w:pPr>
       <w:bookmarkStart w:id="2" w:name="_Toc208327538"/>
-      <w:proofErr w:type="spellStart"/>
-      <w:r>
-        <w:rPr>
-          <w:lang w:val="en-GB"/>
-        </w:rPr>
-        <w:t>Although</w:t>
-      </w:r>
-      <w:proofErr w:type="spellEnd"/>
-      <w:r>
-        <w:rPr>
-          <w:lang w:val="en-GB"/>
-        </w:rPr>
-        <w:t xml:space="preserve"> not </w:t>
-      </w:r>
-      <w:proofErr w:type="spellStart"/>
-      <w:r>
-        <w:rPr>
-          <w:lang w:val="en-GB"/>
-        </w:rPr>
-        <w:t>part</w:t>
-      </w:r>
-      <w:proofErr w:type="spellEnd"/>
-      <w:r>
-        <w:rPr>
-          <w:lang w:val="en-GB"/>
-        </w:rPr>
-        <w:t xml:space="preserve"> </w:t>
-      </w:r>
-      <w:proofErr w:type="spellStart"/>
-      <w:r>
-        <w:rPr>
-          <w:lang w:val="en-GB"/>
-        </w:rPr>
-        <w:t>of</w:t>
-      </w:r>
-      <w:proofErr w:type="spellEnd"/>
-      <w:r>
-        <w:rPr>
-          <w:lang w:val="en-GB"/>
-        </w:rPr>
-        <w:t xml:space="preserve"> </w:t>
-      </w:r>
-      <w:proofErr w:type="spellStart"/>
-      <w:r>
-        <w:rPr>
-          <w:lang w:val="en-GB"/>
-        </w:rPr>
-        <w:t>the</w:t>
-      </w:r>
-      <w:proofErr w:type="spellEnd"/>
-      <w:r>
-        <w:rPr>
-          <w:lang w:val="en-GB"/>
-        </w:rPr>
-        <w:t xml:space="preserve"> </w:t>
-      </w:r>
-      <w:proofErr w:type="spellStart"/>
-      <w:r>
-        <w:rPr>
-          <w:lang w:val="en-GB"/>
-        </w:rPr>
-        <w:t>testing</w:t>
-      </w:r>
-      <w:proofErr w:type="spellEnd"/>
-      <w:r>
-        <w:rPr>
-          <w:lang w:val="en-GB"/>
-        </w:rPr>
-        <w:t xml:space="preserve">, care </w:t>
-      </w:r>
-      <w:proofErr w:type="spellStart"/>
-      <w:r>
-        <w:rPr>
-          <w:lang w:val="en-GB"/>
-        </w:rPr>
-        <w:t>must</w:t>
-      </w:r>
-      <w:proofErr w:type="spellEnd"/>
-      <w:r>
-        <w:rPr>
-          <w:lang w:val="en-GB"/>
-        </w:rPr>
-        <w:t xml:space="preserve"> </w:t>
-      </w:r>
-      <w:proofErr w:type="spellStart"/>
-      <w:r>
-        <w:rPr>
-          <w:lang w:val="en-GB"/>
-        </w:rPr>
-        <w:t>be</w:t>
-      </w:r>
-      <w:proofErr w:type="spellEnd"/>
-      <w:r>
-        <w:rPr>
-          <w:lang w:val="en-GB"/>
-        </w:rPr>
-        <w:t xml:space="preserve"> </w:t>
-      </w:r>
-      <w:proofErr w:type="spellStart"/>
-      <w:r>
-        <w:rPr>
-          <w:lang w:val="en-GB"/>
-        </w:rPr>
-        <w:t>taken</w:t>
-      </w:r>
-      <w:proofErr w:type="spellEnd"/>
-      <w:r>
-        <w:rPr>
-          <w:lang w:val="en-GB"/>
-        </w:rPr>
-        <w:t xml:space="preserve"> </w:t>
-      </w:r>
-      <w:proofErr w:type="spellStart"/>
-      <w:r>
-        <w:rPr>
-          <w:lang w:val="en-GB"/>
-        </w:rPr>
-        <w:t>when</w:t>
-      </w:r>
-      <w:proofErr w:type="spellEnd"/>
-      <w:r>
-        <w:rPr>
-          <w:lang w:val="en-GB"/>
-        </w:rPr>
-        <w:t xml:space="preserve"> </w:t>
-      </w:r>
-      <w:proofErr w:type="spellStart"/>
-      <w:r>
-        <w:rPr>
-          <w:lang w:val="en-GB"/>
-        </w:rPr>
-        <w:t>soldering</w:t>
-      </w:r>
-      <w:proofErr w:type="spellEnd"/>
-      <w:r>
-        <w:rPr>
-          <w:lang w:val="en-GB"/>
-        </w:rPr>
-        <w:t xml:space="preserve"> and </w:t>
-      </w:r>
-      <w:proofErr w:type="spellStart"/>
-      <w:r>
-        <w:rPr>
-          <w:lang w:val="en-GB"/>
-        </w:rPr>
-        <w:t>handling</w:t>
-      </w:r>
-      <w:proofErr w:type="spellEnd"/>
-      <w:r>
-        <w:rPr>
-          <w:lang w:val="en-GB"/>
-        </w:rPr>
-        <w:t xml:space="preserve"> </w:t>
-      </w:r>
-      <w:proofErr w:type="spellStart"/>
-      <w:r>
-        <w:rPr>
-          <w:lang w:val="en-GB"/>
-        </w:rPr>
-        <w:t>the</w:t>
-      </w:r>
-      <w:proofErr w:type="spellEnd"/>
-      <w:r>
-        <w:rPr>
-          <w:lang w:val="en-GB"/>
-        </w:rPr>
-        <w:t xml:space="preserve"> </w:t>
-      </w:r>
-      <w:proofErr w:type="spellStart"/>
-      <w:r>
-        <w:rPr>
-          <w:lang w:val="en-GB"/>
-        </w:rPr>
-        <w:t>soldering</w:t>
-      </w:r>
-      <w:proofErr w:type="spellEnd"/>
-      <w:r>
-        <w:rPr>
-          <w:lang w:val="en-GB"/>
-        </w:rPr>
-        <w:t xml:space="preserve"> iron. </w:t>
-      </w:r>
-      <w:proofErr w:type="spellStart"/>
-      <w:r>
-        <w:rPr>
-          <w:lang w:val="en-GB"/>
-        </w:rPr>
-        <w:t>Soldering</w:t>
-      </w:r>
-      <w:proofErr w:type="spellEnd"/>
-      <w:r>
-        <w:rPr>
-          <w:lang w:val="en-GB"/>
-        </w:rPr>
-        <w:t xml:space="preserve"> </w:t>
-      </w:r>
-      <w:proofErr w:type="spellStart"/>
-      <w:r>
-        <w:rPr>
-          <w:lang w:val="en-GB"/>
-        </w:rPr>
-        <w:t>temperatures</w:t>
-      </w:r>
-      <w:proofErr w:type="spellEnd"/>
-      <w:r>
-        <w:rPr>
-          <w:lang w:val="en-GB"/>
-        </w:rPr>
-        <w:t xml:space="preserve"> </w:t>
-      </w:r>
-      <w:proofErr w:type="spellStart"/>
-      <w:r>
-        <w:rPr>
-          <w:lang w:val="en-GB"/>
-        </w:rPr>
-        <w:t>range</w:t>
-      </w:r>
-      <w:proofErr w:type="spellEnd"/>
-      <w:r>
-        <w:rPr>
-          <w:lang w:val="en-GB"/>
-        </w:rPr>
-        <w:t xml:space="preserve"> </w:t>
-      </w:r>
-      <w:proofErr w:type="spellStart"/>
-      <w:r>
-        <w:rPr>
-          <w:lang w:val="en-GB"/>
-        </w:rPr>
-        <w:t>from</w:t>
-      </w:r>
-      <w:proofErr w:type="spellEnd"/>
-      <w:r>
-        <w:rPr>
-          <w:lang w:val="en-GB"/>
-        </w:rPr>
-        <w:t xml:space="preserve"> 300 °C </w:t>
-      </w:r>
-      <w:proofErr w:type="spellStart"/>
-      <w:r>
-        <w:rPr>
-          <w:lang w:val="en-GB"/>
-        </w:rPr>
-        <w:t>to</w:t>
-      </w:r>
-      <w:proofErr w:type="spellEnd"/>
-      <w:r>
-        <w:rPr>
-          <w:lang w:val="en-GB"/>
-        </w:rPr>
-        <w:t xml:space="preserve"> 400 °C and </w:t>
-      </w:r>
-      <w:proofErr w:type="spellStart"/>
-      <w:r>
-        <w:rPr>
-          <w:lang w:val="en-GB"/>
-        </w:rPr>
-        <w:t>can</w:t>
-      </w:r>
-      <w:proofErr w:type="spellEnd"/>
-      <w:r>
-        <w:rPr>
-          <w:lang w:val="en-GB"/>
-        </w:rPr>
-        <w:t xml:space="preserve"> </w:t>
-      </w:r>
-      <w:proofErr w:type="spellStart"/>
-      <w:r>
-        <w:rPr>
-          <w:lang w:val="en-GB"/>
-        </w:rPr>
-        <w:t>cause</w:t>
-      </w:r>
-      <w:proofErr w:type="spellEnd"/>
-      <w:r>
-        <w:rPr>
-          <w:lang w:val="en-GB"/>
-        </w:rPr>
-        <w:t xml:space="preserve"> </w:t>
-      </w:r>
-      <w:proofErr w:type="spellStart"/>
-      <w:r>
-        <w:rPr>
-          <w:lang w:val="en-GB"/>
-        </w:rPr>
-        <w:t>serious</w:t>
-      </w:r>
-      <w:proofErr w:type="spellEnd"/>
-      <w:r>
-        <w:rPr>
-          <w:lang w:val="en-GB"/>
-        </w:rPr>
-        <w:t xml:space="preserve"> </w:t>
-      </w:r>
-      <w:proofErr w:type="spellStart"/>
-      <w:r>
-        <w:rPr>
-          <w:lang w:val="en-GB"/>
-        </w:rPr>
-        <w:t>burns</w:t>
-      </w:r>
-      <w:proofErr w:type="spellEnd"/>
-      <w:r>
-        <w:rPr>
-          <w:lang w:val="en-GB"/>
-        </w:rPr>
-        <w:t xml:space="preserve"> </w:t>
-      </w:r>
-      <w:proofErr w:type="spellStart"/>
-      <w:r>
-        <w:rPr>
-          <w:lang w:val="en-GB"/>
-        </w:rPr>
-        <w:t>if</w:t>
-      </w:r>
-      <w:proofErr w:type="spellEnd"/>
-      <w:r>
-        <w:rPr>
-          <w:lang w:val="en-GB"/>
-        </w:rPr>
-        <w:t xml:space="preserve"> not </w:t>
-      </w:r>
-      <w:proofErr w:type="spellStart"/>
-      <w:r>
-        <w:rPr>
-          <w:lang w:val="en-GB"/>
-        </w:rPr>
-        <w:t>handled</w:t>
-      </w:r>
-      <w:proofErr w:type="spellEnd"/>
-      <w:r>
-        <w:rPr>
-          <w:lang w:val="en-GB"/>
-        </w:rPr>
-        <w:t xml:space="preserve"> </w:t>
-      </w:r>
-      <w:proofErr w:type="spellStart"/>
-      <w:r>
-        <w:rPr>
-          <w:lang w:val="en-GB"/>
-        </w:rPr>
-        <w:t>properly</w:t>
-      </w:r>
-      <w:proofErr w:type="spellEnd"/>
-      <w:r>
-        <w:rPr>
-          <w:lang w:val="en-GB"/>
-        </w:rPr>
-        <w:t>.</w:t>
+      <w:r>
+        <w:rPr>
+          <w:lang w:val="en-GB"/>
+        </w:rPr>
+        <w:t>Although not part of the testing, care must be taken when soldering and handling the soldering iron. Soldering temperatures range from 300 °C to 400 °C and can cause serious burns if not handled properly.</w:t>
       </w:r>
     </w:p>
     <w:p>
@@ -1611,579 +1239,11 @@
           <w:lang w:val="en-GB"/>
         </w:rPr>
       </w:pPr>
-      <w:proofErr w:type="spellStart"/>
-      <w:r>
-        <w:rPr>
-          <w:lang w:val="en-GB"/>
-        </w:rPr>
-        <w:t>When</w:t>
-      </w:r>
-      <w:proofErr w:type="spellEnd"/>
-      <w:r>
-        <w:rPr>
-          <w:lang w:val="en-GB"/>
-        </w:rPr>
-        <w:t xml:space="preserve"> </w:t>
-      </w:r>
-      <w:proofErr w:type="spellStart"/>
-      <w:r>
-        <w:rPr>
-          <w:lang w:val="en-GB"/>
-        </w:rPr>
-        <w:t>powering</w:t>
-      </w:r>
-      <w:proofErr w:type="spellEnd"/>
-      <w:r>
-        <w:rPr>
-          <w:lang w:val="en-GB"/>
-        </w:rPr>
-        <w:t xml:space="preserve"> </w:t>
-      </w:r>
-      <w:proofErr w:type="spellStart"/>
-      <w:r>
-        <w:rPr>
-          <w:lang w:val="en-GB"/>
-        </w:rPr>
-        <w:t>the</w:t>
-      </w:r>
-      <w:proofErr w:type="spellEnd"/>
-      <w:r>
-        <w:rPr>
-          <w:lang w:val="en-GB"/>
-        </w:rPr>
-        <w:t xml:space="preserve"> </w:t>
-      </w:r>
-      <w:proofErr w:type="spellStart"/>
-      <w:r>
-        <w:rPr>
-          <w:lang w:val="en-GB"/>
-        </w:rPr>
-        <w:t>board</w:t>
-      </w:r>
-      <w:proofErr w:type="spellEnd"/>
-      <w:r>
-        <w:rPr>
-          <w:lang w:val="en-GB"/>
-        </w:rPr>
-        <w:t xml:space="preserve"> </w:t>
-      </w:r>
-      <w:proofErr w:type="spellStart"/>
-      <w:r>
-        <w:rPr>
-          <w:lang w:val="en-GB"/>
-        </w:rPr>
-        <w:t>for</w:t>
-      </w:r>
-      <w:proofErr w:type="spellEnd"/>
-      <w:r>
-        <w:rPr>
-          <w:lang w:val="en-GB"/>
-        </w:rPr>
-        <w:t xml:space="preserve"> </w:t>
-      </w:r>
-      <w:proofErr w:type="spellStart"/>
-      <w:r>
-        <w:rPr>
-          <w:lang w:val="en-GB"/>
-        </w:rPr>
-        <w:t>the</w:t>
-      </w:r>
-      <w:proofErr w:type="spellEnd"/>
-      <w:r>
-        <w:rPr>
-          <w:lang w:val="en-GB"/>
-        </w:rPr>
-        <w:t xml:space="preserve"> </w:t>
-      </w:r>
-      <w:proofErr w:type="spellStart"/>
-      <w:r>
-        <w:rPr>
-          <w:lang w:val="en-GB"/>
-        </w:rPr>
-        <w:t>first</w:t>
-      </w:r>
-      <w:proofErr w:type="spellEnd"/>
-      <w:r>
-        <w:rPr>
-          <w:lang w:val="en-GB"/>
-        </w:rPr>
-        <w:t xml:space="preserve"> time, </w:t>
-      </w:r>
-      <w:proofErr w:type="spellStart"/>
-      <w:r>
-        <w:rPr>
-          <w:lang w:val="en-GB"/>
-        </w:rPr>
-        <w:t>it</w:t>
-      </w:r>
-      <w:proofErr w:type="spellEnd"/>
-      <w:r>
-        <w:rPr>
-          <w:lang w:val="en-GB"/>
-        </w:rPr>
-        <w:t xml:space="preserve"> </w:t>
-      </w:r>
-      <w:proofErr w:type="spellStart"/>
-      <w:r>
-        <w:rPr>
-          <w:lang w:val="en-GB"/>
-        </w:rPr>
-        <w:t>is</w:t>
-      </w:r>
-      <w:proofErr w:type="spellEnd"/>
-      <w:r>
-        <w:rPr>
-          <w:lang w:val="en-GB"/>
-        </w:rPr>
-        <w:t xml:space="preserve"> </w:t>
-      </w:r>
-      <w:proofErr w:type="spellStart"/>
-      <w:r>
-        <w:rPr>
-          <w:lang w:val="en-GB"/>
-        </w:rPr>
-        <w:t>good</w:t>
-      </w:r>
-      <w:proofErr w:type="spellEnd"/>
-      <w:r>
-        <w:rPr>
-          <w:lang w:val="en-GB"/>
-        </w:rPr>
-        <w:t xml:space="preserve"> </w:t>
-      </w:r>
-      <w:proofErr w:type="spellStart"/>
-      <w:r>
-        <w:rPr>
-          <w:lang w:val="en-GB"/>
-        </w:rPr>
-        <w:t>practice</w:t>
-      </w:r>
-      <w:proofErr w:type="spellEnd"/>
-      <w:r>
-        <w:rPr>
-          <w:lang w:val="en-GB"/>
-        </w:rPr>
-        <w:t xml:space="preserve"> </w:t>
-      </w:r>
-      <w:proofErr w:type="spellStart"/>
-      <w:r>
-        <w:rPr>
-          <w:lang w:val="en-GB"/>
-        </w:rPr>
-        <w:t>to</w:t>
-      </w:r>
-      <w:proofErr w:type="spellEnd"/>
-      <w:r>
-        <w:rPr>
-          <w:lang w:val="en-GB"/>
-        </w:rPr>
-        <w:t xml:space="preserve"> </w:t>
-      </w:r>
-      <w:proofErr w:type="spellStart"/>
-      <w:r>
-        <w:rPr>
-          <w:lang w:val="en-GB"/>
-        </w:rPr>
-        <w:t>use</w:t>
-      </w:r>
-      <w:proofErr w:type="spellEnd"/>
-      <w:r>
-        <w:rPr>
-          <w:lang w:val="en-GB"/>
-        </w:rPr>
-        <w:t xml:space="preserve"> a </w:t>
-      </w:r>
-      <w:proofErr w:type="spellStart"/>
-      <w:r>
-        <w:rPr>
-          <w:lang w:val="en-GB"/>
-        </w:rPr>
-        <w:t>laboratory</w:t>
-      </w:r>
-      <w:proofErr w:type="spellEnd"/>
-      <w:r>
-        <w:rPr>
-          <w:lang w:val="en-GB"/>
-        </w:rPr>
-        <w:t xml:space="preserve"> power </w:t>
-      </w:r>
-      <w:proofErr w:type="spellStart"/>
-      <w:r>
-        <w:rPr>
-          <w:lang w:val="en-GB"/>
-        </w:rPr>
-        <w:t>supply</w:t>
-      </w:r>
-      <w:proofErr w:type="spellEnd"/>
-      <w:r>
-        <w:rPr>
-          <w:lang w:val="en-GB"/>
-        </w:rPr>
-        <w:t xml:space="preserve"> </w:t>
-      </w:r>
-      <w:proofErr w:type="spellStart"/>
-      <w:r>
-        <w:rPr>
-          <w:lang w:val="en-GB"/>
-        </w:rPr>
-        <w:t>with</w:t>
-      </w:r>
-      <w:proofErr w:type="spellEnd"/>
-      <w:r>
-        <w:rPr>
-          <w:lang w:val="en-GB"/>
-        </w:rPr>
-        <w:t xml:space="preserve"> a </w:t>
-      </w:r>
-      <w:proofErr w:type="spellStart"/>
-      <w:r>
-        <w:rPr>
-          <w:lang w:val="en-GB"/>
-        </w:rPr>
-        <w:t>current</w:t>
-      </w:r>
-      <w:proofErr w:type="spellEnd"/>
-      <w:r>
-        <w:rPr>
-          <w:lang w:val="en-GB"/>
-        </w:rPr>
-        <w:t xml:space="preserve">-limit feature </w:t>
-      </w:r>
-      <w:proofErr w:type="spellStart"/>
-      <w:r>
-        <w:rPr>
-          <w:lang w:val="en-GB"/>
-        </w:rPr>
-        <w:t>to</w:t>
-      </w:r>
-      <w:proofErr w:type="spellEnd"/>
-      <w:r>
-        <w:rPr>
-          <w:lang w:val="en-GB"/>
-        </w:rPr>
-        <w:t xml:space="preserve"> </w:t>
-      </w:r>
-      <w:proofErr w:type="spellStart"/>
-      <w:r>
-        <w:rPr>
-          <w:lang w:val="en-GB"/>
-        </w:rPr>
-        <w:t>prevent</w:t>
-      </w:r>
-      <w:proofErr w:type="spellEnd"/>
-      <w:r>
-        <w:rPr>
-          <w:lang w:val="en-GB"/>
-        </w:rPr>
-        <w:t xml:space="preserve"> </w:t>
-      </w:r>
-      <w:proofErr w:type="spellStart"/>
-      <w:r>
-        <w:rPr>
-          <w:lang w:val="en-GB"/>
-        </w:rPr>
-        <w:t>severe</w:t>
-      </w:r>
-      <w:proofErr w:type="spellEnd"/>
-      <w:r>
-        <w:rPr>
-          <w:lang w:val="en-GB"/>
-        </w:rPr>
-        <w:t xml:space="preserve"> </w:t>
-      </w:r>
-      <w:proofErr w:type="spellStart"/>
-      <w:r>
-        <w:rPr>
-          <w:lang w:val="en-GB"/>
-        </w:rPr>
-        <w:t>damage</w:t>
-      </w:r>
-      <w:proofErr w:type="spellEnd"/>
-      <w:r>
-        <w:rPr>
-          <w:lang w:val="en-GB"/>
-        </w:rPr>
-        <w:t xml:space="preserve"> in </w:t>
-      </w:r>
-      <w:proofErr w:type="spellStart"/>
-      <w:r>
-        <w:rPr>
-          <w:lang w:val="en-GB"/>
-        </w:rPr>
-        <w:t>case</w:t>
-      </w:r>
-      <w:proofErr w:type="spellEnd"/>
-      <w:r>
-        <w:rPr>
-          <w:lang w:val="en-GB"/>
-        </w:rPr>
-        <w:t xml:space="preserve"> </w:t>
-      </w:r>
-      <w:proofErr w:type="spellStart"/>
-      <w:r>
-        <w:rPr>
-          <w:lang w:val="en-GB"/>
-        </w:rPr>
-        <w:t>of</w:t>
-      </w:r>
-      <w:proofErr w:type="spellEnd"/>
-      <w:r>
-        <w:rPr>
-          <w:lang w:val="en-GB"/>
-        </w:rPr>
-        <w:t xml:space="preserve"> a </w:t>
-      </w:r>
-      <w:proofErr w:type="spellStart"/>
-      <w:r>
-        <w:rPr>
-          <w:lang w:val="en-GB"/>
-        </w:rPr>
-        <w:t>short</w:t>
-      </w:r>
-      <w:proofErr w:type="spellEnd"/>
-      <w:r>
-        <w:rPr>
-          <w:lang w:val="en-GB"/>
-        </w:rPr>
-        <w:t xml:space="preserve"> </w:t>
-      </w:r>
-      <w:proofErr w:type="spellStart"/>
-      <w:r>
-        <w:rPr>
-          <w:lang w:val="en-GB"/>
-        </w:rPr>
-        <w:t>circuit</w:t>
-      </w:r>
-      <w:proofErr w:type="spellEnd"/>
-      <w:r>
-        <w:rPr>
-          <w:lang w:val="en-GB"/>
-        </w:rPr>
-        <w:t xml:space="preserve">. Even </w:t>
-      </w:r>
-      <w:proofErr w:type="spellStart"/>
-      <w:r>
-        <w:rPr>
-          <w:lang w:val="en-GB"/>
-        </w:rPr>
-        <w:t>better</w:t>
-      </w:r>
-      <w:proofErr w:type="spellEnd"/>
-      <w:r>
-        <w:rPr>
-          <w:lang w:val="en-GB"/>
-        </w:rPr>
-        <w:t xml:space="preserve"> </w:t>
-      </w:r>
-      <w:proofErr w:type="spellStart"/>
-      <w:r>
-        <w:rPr>
-          <w:lang w:val="en-GB"/>
-        </w:rPr>
-        <w:t>results</w:t>
-      </w:r>
-      <w:proofErr w:type="spellEnd"/>
-      <w:r>
-        <w:rPr>
-          <w:lang w:val="en-GB"/>
-        </w:rPr>
-        <w:t xml:space="preserve"> </w:t>
-      </w:r>
-      <w:proofErr w:type="spellStart"/>
-      <w:r>
-        <w:rPr>
-          <w:lang w:val="en-GB"/>
-        </w:rPr>
-        <w:t>can</w:t>
-      </w:r>
-      <w:proofErr w:type="spellEnd"/>
-      <w:r>
-        <w:rPr>
-          <w:lang w:val="en-GB"/>
-        </w:rPr>
-        <w:t xml:space="preserve"> </w:t>
-      </w:r>
-      <w:proofErr w:type="spellStart"/>
-      <w:r>
-        <w:rPr>
-          <w:lang w:val="en-GB"/>
-        </w:rPr>
-        <w:t>be</w:t>
-      </w:r>
-      <w:proofErr w:type="spellEnd"/>
-      <w:r>
-        <w:rPr>
-          <w:lang w:val="en-GB"/>
-        </w:rPr>
-        <w:t xml:space="preserve"> </w:t>
-      </w:r>
-      <w:proofErr w:type="spellStart"/>
-      <w:r>
-        <w:rPr>
-          <w:lang w:val="en-GB"/>
-        </w:rPr>
-        <w:t>achieved</w:t>
-      </w:r>
-      <w:proofErr w:type="spellEnd"/>
-      <w:r>
-        <w:rPr>
-          <w:lang w:val="en-GB"/>
-        </w:rPr>
-        <w:t xml:space="preserve"> </w:t>
-      </w:r>
-      <w:proofErr w:type="spellStart"/>
-      <w:r>
-        <w:rPr>
-          <w:lang w:val="en-GB"/>
-        </w:rPr>
-        <w:t>by</w:t>
-      </w:r>
-      <w:proofErr w:type="spellEnd"/>
-      <w:r>
-        <w:rPr>
-          <w:lang w:val="en-GB"/>
-        </w:rPr>
-        <w:t xml:space="preserve"> </w:t>
-      </w:r>
-      <w:proofErr w:type="spellStart"/>
-      <w:r>
-        <w:rPr>
-          <w:lang w:val="en-GB"/>
-        </w:rPr>
-        <w:t>powering</w:t>
-      </w:r>
-      <w:proofErr w:type="spellEnd"/>
-      <w:r>
-        <w:rPr>
-          <w:lang w:val="en-GB"/>
-        </w:rPr>
-        <w:t xml:space="preserve"> </w:t>
-      </w:r>
-      <w:proofErr w:type="spellStart"/>
-      <w:r>
-        <w:rPr>
-          <w:lang w:val="en-GB"/>
-        </w:rPr>
-        <w:t>the</w:t>
-      </w:r>
-      <w:proofErr w:type="spellEnd"/>
-      <w:r>
-        <w:rPr>
-          <w:lang w:val="en-GB"/>
-        </w:rPr>
-        <w:t xml:space="preserve"> </w:t>
-      </w:r>
-      <w:proofErr w:type="spellStart"/>
-      <w:r>
-        <w:rPr>
-          <w:lang w:val="en-GB"/>
-        </w:rPr>
-        <w:t>board</w:t>
-      </w:r>
-      <w:proofErr w:type="spellEnd"/>
-      <w:r>
-        <w:rPr>
-          <w:lang w:val="en-GB"/>
-        </w:rPr>
-        <w:t xml:space="preserve"> at a </w:t>
-      </w:r>
-      <w:proofErr w:type="spellStart"/>
-      <w:r>
-        <w:rPr>
-          <w:lang w:val="en-GB"/>
-        </w:rPr>
-        <w:t>slightly</w:t>
-      </w:r>
-      <w:proofErr w:type="spellEnd"/>
-      <w:r>
-        <w:rPr>
-          <w:lang w:val="en-GB"/>
-        </w:rPr>
-        <w:t xml:space="preserve"> </w:t>
-      </w:r>
-      <w:proofErr w:type="spellStart"/>
-      <w:r>
-        <w:rPr>
-          <w:lang w:val="en-GB"/>
-        </w:rPr>
-        <w:t>lower</w:t>
-      </w:r>
-      <w:proofErr w:type="spellEnd"/>
-      <w:r>
-        <w:rPr>
-          <w:lang w:val="en-GB"/>
-        </w:rPr>
-        <w:t xml:space="preserve"> </w:t>
-      </w:r>
-      <w:proofErr w:type="spellStart"/>
-      <w:r>
-        <w:rPr>
-          <w:lang w:val="en-GB"/>
-        </w:rPr>
-        <w:t>voltage</w:t>
-      </w:r>
-      <w:proofErr w:type="spellEnd"/>
-      <w:r>
-        <w:rPr>
-          <w:lang w:val="en-GB"/>
-        </w:rPr>
-        <w:t xml:space="preserve"> </w:t>
-      </w:r>
-      <w:proofErr w:type="spellStart"/>
-      <w:r>
-        <w:rPr>
-          <w:lang w:val="en-GB"/>
-        </w:rPr>
-        <w:t>initially</w:t>
-      </w:r>
-      <w:proofErr w:type="spellEnd"/>
-      <w:r>
-        <w:rPr>
-          <w:lang w:val="en-GB"/>
-        </w:rPr>
-        <w:t xml:space="preserve"> </w:t>
-      </w:r>
-      <w:proofErr w:type="spellStart"/>
-      <w:r>
-        <w:rPr>
-          <w:lang w:val="en-GB"/>
-        </w:rPr>
-        <w:t>to</w:t>
-      </w:r>
-      <w:proofErr w:type="spellEnd"/>
-      <w:r>
-        <w:rPr>
-          <w:lang w:val="en-GB"/>
-        </w:rPr>
-        <w:t xml:space="preserve"> </w:t>
-      </w:r>
-      <w:proofErr w:type="spellStart"/>
-      <w:r>
-        <w:rPr>
-          <w:lang w:val="en-GB"/>
-        </w:rPr>
-        <w:t>further</w:t>
-      </w:r>
-      <w:proofErr w:type="spellEnd"/>
-      <w:r>
-        <w:rPr>
-          <w:lang w:val="en-GB"/>
-        </w:rPr>
-        <w:t xml:space="preserve"> </w:t>
-      </w:r>
-      <w:proofErr w:type="spellStart"/>
-      <w:r>
-        <w:rPr>
-          <w:lang w:val="en-GB"/>
-        </w:rPr>
-        <w:t>limit</w:t>
-      </w:r>
-      <w:proofErr w:type="spellEnd"/>
-      <w:r>
-        <w:rPr>
-          <w:lang w:val="en-GB"/>
-        </w:rPr>
-        <w:t xml:space="preserve"> power in case of a fault.</w:t>
+      <w:r>
+        <w:rPr>
+          <w:lang w:val="en-GB"/>
+        </w:rPr>
+        <w:t>When powering the board for the first time, it is good practice to use a laboratory power supply with a current-limit feature to prevent severe damage in case of a short circuit. Even better results can be achieved by powering the board at a slightly lower voltage initially to further limit power in case of a fault.</w:t>
       </w:r>
       <w:r>
         <w:rPr>
@@ -2202,175 +1262,7 @@
         <w:rPr>
           <w:lang w:val="en-GB"/>
         </w:rPr>
-        <w:t xml:space="preserve">If abnormal </w:t>
-      </w:r>
-      <w:proofErr w:type="spellStart"/>
-      <w:r>
-        <w:rPr>
-          <w:lang w:val="en-GB"/>
-        </w:rPr>
-        <w:t>behavior</w:t>
-      </w:r>
-      <w:proofErr w:type="spellEnd"/>
-      <w:r>
-        <w:rPr>
-          <w:lang w:val="en-GB"/>
-        </w:rPr>
-        <w:t xml:space="preserve"> such </w:t>
-      </w:r>
-      <w:proofErr w:type="spellStart"/>
-      <w:r>
-        <w:rPr>
-          <w:lang w:val="en-GB"/>
-        </w:rPr>
-        <w:t>as</w:t>
-      </w:r>
-      <w:proofErr w:type="spellEnd"/>
-      <w:r>
-        <w:rPr>
-          <w:lang w:val="en-GB"/>
-        </w:rPr>
-        <w:t xml:space="preserve"> smoke, </w:t>
-      </w:r>
-      <w:proofErr w:type="spellStart"/>
-      <w:r>
-        <w:rPr>
-          <w:lang w:val="en-GB"/>
-        </w:rPr>
-        <w:t>overheating</w:t>
-      </w:r>
-      <w:proofErr w:type="spellEnd"/>
-      <w:r>
-        <w:rPr>
-          <w:lang w:val="en-GB"/>
-        </w:rPr>
-        <w:t xml:space="preserve">, </w:t>
-      </w:r>
-      <w:proofErr w:type="spellStart"/>
-      <w:r>
-        <w:rPr>
-          <w:lang w:val="en-GB"/>
-        </w:rPr>
-        <w:t>or</w:t>
-      </w:r>
-      <w:proofErr w:type="spellEnd"/>
-      <w:r>
-        <w:rPr>
-          <w:lang w:val="en-GB"/>
-        </w:rPr>
-        <w:t xml:space="preserve"> </w:t>
-      </w:r>
-      <w:proofErr w:type="spellStart"/>
-      <w:r>
-        <w:rPr>
-          <w:lang w:val="en-GB"/>
-        </w:rPr>
-        <w:t>excessive</w:t>
-      </w:r>
-      <w:proofErr w:type="spellEnd"/>
-      <w:r>
-        <w:rPr>
-          <w:lang w:val="en-GB"/>
-        </w:rPr>
-        <w:t xml:space="preserve"> </w:t>
-      </w:r>
-      <w:proofErr w:type="spellStart"/>
-      <w:r>
-        <w:rPr>
-          <w:lang w:val="en-GB"/>
-        </w:rPr>
-        <w:t>current</w:t>
-      </w:r>
-      <w:proofErr w:type="spellEnd"/>
-      <w:r>
-        <w:rPr>
-          <w:lang w:val="en-GB"/>
-        </w:rPr>
-        <w:t xml:space="preserve"> </w:t>
-      </w:r>
-      <w:proofErr w:type="spellStart"/>
-      <w:r>
-        <w:rPr>
-          <w:lang w:val="en-GB"/>
-        </w:rPr>
-        <w:t>draw</w:t>
-      </w:r>
-      <w:proofErr w:type="spellEnd"/>
-      <w:r>
-        <w:rPr>
-          <w:lang w:val="en-GB"/>
-        </w:rPr>
-        <w:t xml:space="preserve"> </w:t>
-      </w:r>
-      <w:proofErr w:type="spellStart"/>
-      <w:r>
-        <w:rPr>
-          <w:lang w:val="en-GB"/>
-        </w:rPr>
-        <w:t>is</w:t>
-      </w:r>
-      <w:proofErr w:type="spellEnd"/>
-      <w:r>
-        <w:rPr>
-          <w:lang w:val="en-GB"/>
-        </w:rPr>
-        <w:t xml:space="preserve"> </w:t>
-      </w:r>
-      <w:proofErr w:type="spellStart"/>
-      <w:r>
-        <w:rPr>
-          <w:lang w:val="en-GB"/>
-        </w:rPr>
-        <w:t>observed</w:t>
-      </w:r>
-      <w:proofErr w:type="spellEnd"/>
-      <w:r>
-        <w:rPr>
-          <w:lang w:val="en-GB"/>
-        </w:rPr>
-        <w:t xml:space="preserve">, </w:t>
-      </w:r>
-      <w:proofErr w:type="spellStart"/>
-      <w:r>
-        <w:rPr>
-          <w:lang w:val="en-GB"/>
-        </w:rPr>
-        <w:t>disconnect</w:t>
-      </w:r>
-      <w:proofErr w:type="spellEnd"/>
-      <w:r>
-        <w:rPr>
-          <w:lang w:val="en-GB"/>
-        </w:rPr>
-        <w:t xml:space="preserve"> power </w:t>
-      </w:r>
-      <w:proofErr w:type="spellStart"/>
-      <w:r>
-        <w:rPr>
-          <w:lang w:val="en-GB"/>
-        </w:rPr>
-        <w:t>immediately</w:t>
-      </w:r>
-      <w:proofErr w:type="spellEnd"/>
-      <w:r>
-        <w:rPr>
-          <w:lang w:val="en-GB"/>
-        </w:rPr>
-        <w:t xml:space="preserve"> and </w:t>
-      </w:r>
-      <w:proofErr w:type="spellStart"/>
-      <w:r>
-        <w:rPr>
-          <w:lang w:val="en-GB"/>
-        </w:rPr>
-        <w:t>inspect</w:t>
-      </w:r>
-      <w:proofErr w:type="spellEnd"/>
-      <w:r>
-        <w:rPr>
-          <w:lang w:val="en-GB"/>
-        </w:rPr>
-        <w:t xml:space="preserve"> the hardware before continuing.</w:t>
+        <w:t>If abnormal behavior such as smoke, overheating, or excessive current draw is observed, disconnect power immediately and inspect the hardware before continuing.</w:t>
       </w:r>
     </w:p>
     <w:p>
@@ -2423,10 +1315,10 @@
         <w:tblLook w:val="04A0" w:firstRow="1" w:lastRow="0" w:firstColumn="1" w:lastColumn="0" w:noHBand="0" w:noVBand="1"/>
       </w:tblPr>
       <w:tblGrid>
-        <w:gridCol w:w="1599"/>
+        <w:gridCol w:w="1482"/>
         <w:gridCol w:w="1470"/>
-        <w:gridCol w:w="1529"/>
-        <w:gridCol w:w="1186"/>
+        <w:gridCol w:w="1701"/>
+        <w:gridCol w:w="1131"/>
         <w:gridCol w:w="1443"/>
         <w:gridCol w:w="1835"/>
       </w:tblGrid>
@@ -2659,14 +1551,14 @@
           <w:p>
             <w:pPr>
               <w:rPr>
-                <w:b/>
-                <w:sz w:val="16"/>
-                <w:lang w:val="en-GB"/>
-              </w:rPr>
-            </w:pPr>
-            <w:r>
-              <w:rPr>
-                <w:b/>
+                <w:bCs/>
+                <w:sz w:val="16"/>
+                <w:lang w:val="en-GB"/>
+              </w:rPr>
+            </w:pPr>
+            <w:r>
+              <w:rPr>
+                <w:bCs/>
                 <w:sz w:val="16"/>
                 <w:lang w:val="en-GB"/>
               </w:rPr>
@@ -2676,7 +1568,7 @@
           <w:p>
             <w:pPr>
               <w:rPr>
-                <w:b/>
+                <w:bCs/>
                 <w:sz w:val="16"/>
                 <w:lang w:val="en-GB"/>
               </w:rPr>
@@ -2770,14 +1662,14 @@
           <w:p>
             <w:pPr>
               <w:rPr>
-                <w:b/>
-                <w:sz w:val="16"/>
-                <w:lang w:val="en-GB"/>
-              </w:rPr>
-            </w:pPr>
-            <w:r>
-              <w:rPr>
-                <w:b/>
+                <w:bCs/>
+                <w:sz w:val="16"/>
+                <w:lang w:val="en-GB"/>
+              </w:rPr>
+            </w:pPr>
+            <w:r>
+              <w:rPr>
+                <w:bCs/>
                 <w:sz w:val="16"/>
                 <w:lang w:val="en-GB"/>
               </w:rPr>
@@ -2797,6 +1689,30 @@
                 <w:lang w:val="en-GB"/>
               </w:rPr>
             </w:pPr>
+            <w:r>
+              <w:rPr>
+                <w:b/>
+                <w:sz w:val="16"/>
+                <w:lang w:val="en-GB"/>
+              </w:rPr>
+              <w:t>5%</w:t>
+            </w:r>
+            <w:r>
+              <w:rPr>
+                <w:b/>
+                <w:sz w:val="16"/>
+                <w:lang w:val="en-GB"/>
+              </w:rPr>
+              <w:t xml:space="preserve"> |</w:t>
+            </w:r>
+            <w:r>
+              <w:rPr>
+                <w:b/>
+                <w:sz w:val="16"/>
+                <w:lang w:val="en-GB"/>
+              </w:rPr>
+              <w:t xml:space="preserve"> 4.75 V – 5.25 V</w:t>
+            </w:r>
           </w:p>
         </w:tc>
         <w:tc>
@@ -2872,14 +1788,14 @@
           <w:p>
             <w:pPr>
               <w:rPr>
-                <w:b/>
-                <w:sz w:val="16"/>
-                <w:lang w:val="en-GB"/>
-              </w:rPr>
-            </w:pPr>
-            <w:r>
-              <w:rPr>
-                <w:b/>
+                <w:bCs/>
+                <w:sz w:val="16"/>
+                <w:lang w:val="en-GB"/>
+              </w:rPr>
+            </w:pPr>
+            <w:r>
+              <w:rPr>
+                <w:bCs/>
                 <w:sz w:val="16"/>
                 <w:lang w:val="en-GB"/>
               </w:rPr>
@@ -2899,6 +1815,46 @@
                 <w:lang w:val="en-GB"/>
               </w:rPr>
             </w:pPr>
+            <w:r>
+              <w:rPr>
+                <w:b/>
+                <w:sz w:val="16"/>
+                <w:lang w:val="en-GB"/>
+              </w:rPr>
+              <w:t>49.9k(+-1%)*100uA(+-1%)=4.89</w:t>
+            </w:r>
+            <w:r>
+              <w:rPr>
+                <w:b/>
+                <w:sz w:val="16"/>
+                <w:lang w:val="en-GB"/>
+              </w:rPr>
+              <w:t>V</w:t>
+            </w:r>
+            <w:r>
+              <w:rPr>
+                <w:b/>
+                <w:sz w:val="16"/>
+                <w:lang w:val="en-GB"/>
+              </w:rPr>
+              <w:t xml:space="preserve"> – 5.09</w:t>
+            </w:r>
+            <w:r>
+              <w:rPr>
+                <w:b/>
+                <w:sz w:val="16"/>
+                <w:lang w:val="en-GB"/>
+              </w:rPr>
+              <w:t>V</w:t>
+            </w:r>
+            <w:r>
+              <w:rPr>
+                <w:b/>
+                <w:sz w:val="16"/>
+                <w:lang w:val="en-GB"/>
+              </w:rPr>
+              <w:t xml:space="preserve"> </w:t>
+            </w:r>
           </w:p>
         </w:tc>
         <w:tc>
@@ -2974,14 +1930,14 @@
           <w:p>
             <w:pPr>
               <w:rPr>
-                <w:b/>
-                <w:sz w:val="16"/>
-                <w:lang w:val="en-GB"/>
-              </w:rPr>
-            </w:pPr>
-            <w:r>
-              <w:rPr>
-                <w:b/>
+                <w:bCs/>
+                <w:sz w:val="16"/>
+                <w:lang w:val="en-GB"/>
+              </w:rPr>
+            </w:pPr>
+            <w:r>
+              <w:rPr>
+                <w:bCs/>
                 <w:sz w:val="16"/>
                 <w:lang w:val="en-GB"/>
               </w:rPr>
@@ -3076,14 +2032,14 @@
           <w:p>
             <w:pPr>
               <w:rPr>
-                <w:b/>
-                <w:sz w:val="16"/>
-                <w:lang w:val="en-GB"/>
-              </w:rPr>
-            </w:pPr>
-            <w:r>
-              <w:rPr>
-                <w:b/>
+                <w:bCs/>
+                <w:sz w:val="16"/>
+                <w:lang w:val="en-GB"/>
+              </w:rPr>
+            </w:pPr>
+            <w:r>
+              <w:rPr>
+                <w:bCs/>
                 <w:sz w:val="16"/>
                 <w:lang w:val="en-GB"/>
               </w:rPr>
@@ -3167,6 +2123,141 @@
                 <w:sz w:val="16"/>
                 <w:lang w:val="en-GB"/>
               </w:rPr>
+              <w:t xml:space="preserve">Input volume </w:t>
+            </w:r>
+            <w:r>
+              <w:rPr>
+                <w:b/>
+                <w:sz w:val="16"/>
+                <w:lang w:val="en-GB"/>
+              </w:rPr>
+              <w:t>adjust</w:t>
+            </w:r>
+          </w:p>
+        </w:tc>
+        <w:tc>
+          <w:tcPr>
+            <w:tcW w:w="0" w:type="auto"/>
+          </w:tcPr>
+          <w:p>
+            <w:pPr>
+              <w:rPr>
+                <w:bCs/>
+                <w:sz w:val="16"/>
+                <w:lang w:val="en-GB"/>
+              </w:rPr>
+            </w:pPr>
+            <w:r>
+              <w:rPr>
+                <w:bCs/>
+                <w:sz w:val="16"/>
+                <w:lang w:val="en-GB"/>
+              </w:rPr>
+              <w:t>Input signal</w:t>
+            </w:r>
+            <w:r>
+              <w:rPr>
+                <w:bCs/>
+                <w:sz w:val="16"/>
+                <w:lang w:val="en-GB"/>
+              </w:rPr>
+              <w:t>:</w:t>
+            </w:r>
+          </w:p>
+          <w:p>
+            <w:pPr>
+              <w:rPr>
+                <w:bCs/>
+                <w:sz w:val="16"/>
+                <w:lang w:val="en-GB"/>
+              </w:rPr>
+            </w:pPr>
+            <w:r>
+              <w:rPr>
+                <w:bCs/>
+                <w:sz w:val="16"/>
+                <w:lang w:val="en-GB"/>
+              </w:rPr>
+              <w:t>1mVpp 1kHz sine</w:t>
+            </w:r>
+          </w:p>
+        </w:tc>
+        <w:tc>
+          <w:tcPr>
+            <w:tcW w:w="0" w:type="auto"/>
+          </w:tcPr>
+          <w:p>
+            <w:pPr>
+              <w:rPr>
+                <w:b/>
+                <w:sz w:val="16"/>
+                <w:lang w:val="en-GB"/>
+              </w:rPr>
+            </w:pPr>
+          </w:p>
+        </w:tc>
+        <w:tc>
+          <w:tcPr>
+            <w:tcW w:w="0" w:type="auto"/>
+          </w:tcPr>
+          <w:p>
+            <w:pPr>
+              <w:rPr>
+                <w:b/>
+                <w:sz w:val="16"/>
+                <w:lang w:val="en-GB"/>
+              </w:rPr>
+            </w:pPr>
+          </w:p>
+        </w:tc>
+        <w:tc>
+          <w:tcPr>
+            <w:tcW w:w="0" w:type="auto"/>
+          </w:tcPr>
+          <w:p>
+            <w:pPr>
+              <w:rPr>
+                <w:b/>
+                <w:sz w:val="16"/>
+                <w:lang w:val="en-GB"/>
+              </w:rPr>
+            </w:pPr>
+          </w:p>
+        </w:tc>
+        <w:tc>
+          <w:tcPr>
+            <w:tcW w:w="0" w:type="auto"/>
+          </w:tcPr>
+          <w:p>
+            <w:pPr>
+              <w:rPr>
+                <w:b/>
+                <w:sz w:val="16"/>
+                <w:lang w:val="en-GB"/>
+              </w:rPr>
+            </w:pPr>
+          </w:p>
+        </w:tc>
+      </w:tr>
+      <w:tr>
+        <w:tc>
+          <w:tcPr>
+            <w:tcW w:w="0" w:type="auto"/>
+          </w:tcPr>
+          <w:p>
+            <w:pPr>
+              <w:rPr>
+                <w:b/>
+                <w:sz w:val="16"/>
+                <w:lang w:val="en-GB"/>
+              </w:rPr>
+            </w:pPr>
+            <w:r>
+              <w:rPr>
+                <w:b/>
+                <w:sz w:val="16"/>
+                <w:lang w:val="en-GB"/>
+              </w:rPr>
               <w:t>DC level</w:t>
             </w:r>
             <w:r>
@@ -3499,25 +2590,7 @@
                 <w:sz w:val="16"/>
                 <w:lang w:val="en-GB"/>
               </w:rPr>
-              <w:t>Check resistor </w:t>
-            </w:r>
-            <w:proofErr w:type="spellStart"/>
-            <w:r>
-              <w:rPr>
-                <w:b/>
-                <w:sz w:val="16"/>
-                <w:lang w:val="en-GB"/>
-              </w:rPr>
-              <w:t>tol</w:t>
-            </w:r>
-            <w:proofErr w:type="spellEnd"/>
-            <w:r>
-              <w:rPr>
-                <w:b/>
-                <w:sz w:val="16"/>
-                <w:lang w:val="en-GB"/>
-              </w:rPr>
-              <w:t>.</w:t>
+              <w:t>Check resistor tol.</w:t>
             </w:r>
             <w:r>
               <w:rPr>
@@ -3791,17 +2864,8 @@
                 <w:lang w:val="en-GB"/>
               </w:rPr>
               <w:br/>
-              <w:t>1mVpp 1kHz </w:t>
-            </w:r>
-            <w:proofErr w:type="spellStart"/>
-            <w:r>
-              <w:rPr>
-                <w:sz w:val="16"/>
-                <w:lang w:val="en-GB"/>
-              </w:rPr>
-              <w:t>rect</w:t>
-            </w:r>
-            <w:proofErr w:type="spellEnd"/>
+              <w:t>1mVpp 1kHz rect</w:t>
+            </w:r>
             <w:r>
               <w:rPr>
                 <w:sz w:val="16"/>
@@ -4141,6 +3205,7 @@
         <w:rPr>
           <w:lang w:val="en-GB"/>
         </w:rPr>
+        <w:lastRenderedPageBreak/>
         <w:t>Add a jumper in the supply conductor of a sub</w:t>
       </w:r>
       <w:r>
@@ -4219,7 +3284,6 @@
         <w:rPr>
           <w:lang w:val="en-GB"/>
         </w:rPr>
-        <w:lastRenderedPageBreak/>
         <w:t>Design the PCB to support testability:</w:t>
       </w:r>
     </w:p>
@@ -5605,7 +4669,6 @@
               </w:rPr>
               <w:t>Check resistor </w:t>
             </w:r>
-            <w:proofErr w:type="spellStart"/>
             <w:r>
               <w:rPr>
                 <w:b/>
@@ -5614,7 +4677,6 @@
               </w:rPr>
               <w:t>tol</w:t>
             </w:r>
-            <w:proofErr w:type="spellEnd"/>
             <w:r>
               <w:rPr>
                 <w:b/>
@@ -5893,6 +4955,14 @@
                 <w:lang w:val="en-GB"/>
               </w:rPr>
               <w:br/>
+            </w:r>
+            <w:r>
+              <w:rPr>
+                <w:b/>
+                <w:sz w:val="16"/>
+                <w:lang w:val="en-GB"/>
+              </w:rPr>
+              <w:lastRenderedPageBreak/>
               <w:t>Capacitor type: NP0?</w:t>
             </w:r>
             <w:r>
@@ -5941,6 +5011,7 @@
                 <w:sz w:val="16"/>
                 <w:lang w:val="en-GB"/>
               </w:rPr>
+              <w:lastRenderedPageBreak/>
               <w:t>Stability</w:t>
             </w:r>
             <w:r>
@@ -6002,17 +5073,8 @@
                 <w:lang w:val="en-GB"/>
               </w:rPr>
               <w:br/>
-              <w:t>1mVpp 1kHz </w:t>
-            </w:r>
-            <w:proofErr w:type="spellStart"/>
-            <w:r>
-              <w:rPr>
-                <w:sz w:val="16"/>
-                <w:lang w:val="en-GB"/>
-              </w:rPr>
-              <w:t>rect</w:t>
-            </w:r>
-            <w:proofErr w:type="spellEnd"/>
+              <w:t>1mVpp 1kHz rect</w:t>
+            </w:r>
             <w:r>
               <w:rPr>
                 <w:sz w:val="16"/>
@@ -6102,7 +5164,6 @@
         <w:rPr>
           <w:lang w:val="en-GB"/>
         </w:rPr>
-        <w:lastRenderedPageBreak/>
         <w:t>As can be seen, this table is also helpful for documenting the test procedure.</w:t>
       </w:r>
     </w:p>
@@ -6562,6 +5623,7 @@
         <w:rPr>
           <w:lang w:val="en-GB"/>
         </w:rPr>
+        <w:lastRenderedPageBreak/>
         <w:t>With the</w:t>
       </w:r>
       <w:r>
@@ -6667,7 +5729,6 @@
         <w:rPr>
           <w:lang w:val="en-GB"/>
         </w:rPr>
-        <w:lastRenderedPageBreak/>
         <w:t>After correcting an error, all the tests depending on the affected part, must be redone and the tests documented again.</w:t>
       </w:r>
     </w:p>
@@ -7122,56 +6183,14 @@
           <w:rPr>
             <w:lang w:val="en-GB"/>
           </w:rPr>
-          <w:t xml:space="preserve">Hanspeter </w:t>
-        </w:r>
-        <w:proofErr w:type="spellStart"/>
-        <w:r>
-          <w:rPr>
-            <w:lang w:val="en-GB"/>
-          </w:rPr>
-          <w:t>Hochreutener</w:t>
-        </w:r>
-        <w:proofErr w:type="spellEnd"/>
-        <w:r>
-          <w:rPr>
-            <w:lang w:val="en-GB"/>
-          </w:rPr>
-          <w:t xml:space="preserve"> (</w:t>
-        </w:r>
-        <w:proofErr w:type="spellStart"/>
-        <w:r>
-          <w:rPr>
-            <w:lang w:val="en-GB"/>
-          </w:rPr>
-          <w:t>hhrt</w:t>
-        </w:r>
-        <w:proofErr w:type="spellEnd"/>
-        <w:r>
-          <w:rPr>
-            <w:lang w:val="en-GB"/>
-          </w:rPr>
-          <w:t>)</w:t>
+          <w:t>Hanspeter Hochreutener (hhrt)</w:t>
         </w:r>
         <w:r>
           <w:rPr>
             <w:lang w:val="en-GB"/>
           </w:rPr>
           <w:br/>
-          <w:t>Josquin Rosset (</w:t>
-        </w:r>
-        <w:proofErr w:type="spellStart"/>
-        <w:r>
-          <w:rPr>
-            <w:lang w:val="en-GB"/>
-          </w:rPr>
-          <w:t>rost</w:t>
-        </w:r>
-        <w:proofErr w:type="spellEnd"/>
-        <w:r>
-          <w:rPr>
-            <w:lang w:val="en-GB"/>
-          </w:rPr>
-          <w:t>)</w:t>
+          <w:t>Josquin Rosset (rost)</w:t>
         </w:r>
       </w:sdtContent>
     </w:sdt>

</xml_diff>

<commit_message>
hw report some more wip
</commit_message>
<xml_diff>
--- a/3_Technical_Documents/PCB/HW_Testing.docx
+++ b/3_Technical_Documents/PCB/HW_Testing.docx
@@ -5,6 +5,9 @@
     <w:p>
       <w:bookmarkStart w:id="0" w:name="_Hlk184122178"/>
       <w:r>
+        <w:rPr>
+          <w:noProof/>
+        </w:rPr>
         <w:drawing>
           <wp:inline distT="0" distB="0" distL="0" distR="0" wp14:anchorId="3BBD3756" wp14:editId="6500B1EF">
             <wp:extent cx="1116000" cy="1080000"/>
@@ -82,6 +85,9 @@
         <w:tab/>
       </w:r>
       <w:r>
+        <w:rPr>
+          <w:noProof/>
+        </w:rPr>
         <w:drawing>
           <wp:inline distT="0" distB="0" distL="0" distR="0" wp14:anchorId="69FEB931" wp14:editId="6C137F4A">
             <wp:extent cx="815388" cy="1145901"/>
@@ -191,6 +197,8 @@
     <w:sdt>
       <w:sdtPr>
         <w:rPr>
+          <w:b w:val="0"/>
+          <w:bCs w:val="0"/>
           <w:sz w:val="22"/>
           <w:szCs w:val="24"/>
           <w:lang w:val="en-US"/>
@@ -201,11 +209,6 @@
           <w:docPartUnique/>
         </w:docPartObj>
       </w:sdtPr>
-      <w:sdtEndPr>
-        <w:rPr>
-          <w:b w:val="0"/>
-        </w:rPr>
-      </w:sdtEndPr>
       <w:sdtContent>
         <w:p>
           <w:pPr>
@@ -240,7 +243,6 @@
               <w:rFonts w:asciiTheme="minorHAnsi" w:eastAsiaTheme="minorEastAsia" w:hAnsiTheme="minorHAnsi" w:cstheme="minorBidi"/>
               <w:kern w:val="2"/>
               <w:sz w:val="24"/>
-              <w:lang/>
               <w14:ligatures w14:val="standardContextual"/>
             </w:rPr>
           </w:pPr>
@@ -266,7 +268,6 @@
                 <w:rFonts w:asciiTheme="minorHAnsi" w:eastAsiaTheme="minorEastAsia" w:hAnsiTheme="minorHAnsi" w:cstheme="minorBidi"/>
                 <w:kern w:val="2"/>
                 <w:sz w:val="24"/>
-                <w:lang/>
                 <w14:ligatures w14:val="standardContextual"/>
               </w:rPr>
               <w:tab/>
@@ -328,7 +329,6 @@
               <w:rFonts w:asciiTheme="minorHAnsi" w:eastAsiaTheme="minorEastAsia" w:hAnsiTheme="minorHAnsi" w:cstheme="minorBidi"/>
               <w:kern w:val="2"/>
               <w:sz w:val="24"/>
-              <w:lang/>
               <w14:ligatures w14:val="standardContextual"/>
             </w:rPr>
           </w:pPr>
@@ -345,7 +345,6 @@
                 <w:rFonts w:asciiTheme="minorHAnsi" w:eastAsiaTheme="minorEastAsia" w:hAnsiTheme="minorHAnsi" w:cstheme="minorBidi"/>
                 <w:kern w:val="2"/>
                 <w:sz w:val="24"/>
-                <w:lang/>
                 <w14:ligatures w14:val="standardContextual"/>
               </w:rPr>
               <w:tab/>
@@ -407,7 +406,6 @@
               <w:rFonts w:asciiTheme="minorHAnsi" w:eastAsiaTheme="minorEastAsia" w:hAnsiTheme="minorHAnsi" w:cstheme="minorBidi"/>
               <w:kern w:val="2"/>
               <w:sz w:val="24"/>
-              <w:lang/>
               <w14:ligatures w14:val="standardContextual"/>
             </w:rPr>
           </w:pPr>
@@ -424,7 +422,6 @@
                 <w:rFonts w:asciiTheme="minorHAnsi" w:eastAsiaTheme="minorEastAsia" w:hAnsiTheme="minorHAnsi" w:cstheme="minorBidi"/>
                 <w:kern w:val="2"/>
                 <w:sz w:val="24"/>
-                <w:lang/>
                 <w14:ligatures w14:val="standardContextual"/>
               </w:rPr>
               <w:tab/>
@@ -486,7 +483,6 @@
               <w:rFonts w:asciiTheme="minorHAnsi" w:eastAsiaTheme="minorEastAsia" w:hAnsiTheme="minorHAnsi" w:cstheme="minorBidi"/>
               <w:kern w:val="2"/>
               <w:sz w:val="24"/>
-              <w:lang/>
               <w14:ligatures w14:val="standardContextual"/>
             </w:rPr>
           </w:pPr>
@@ -503,7 +499,6 @@
                 <w:rFonts w:asciiTheme="minorHAnsi" w:eastAsiaTheme="minorEastAsia" w:hAnsiTheme="minorHAnsi" w:cstheme="minorBidi"/>
                 <w:kern w:val="2"/>
                 <w:sz w:val="24"/>
-                <w:lang/>
                 <w14:ligatures w14:val="standardContextual"/>
               </w:rPr>
               <w:tab/>
@@ -565,7 +560,6 @@
               <w:rFonts w:asciiTheme="minorHAnsi" w:eastAsiaTheme="minorEastAsia" w:hAnsiTheme="minorHAnsi" w:cstheme="minorBidi"/>
               <w:kern w:val="2"/>
               <w:sz w:val="24"/>
-              <w:lang/>
               <w14:ligatures w14:val="standardContextual"/>
             </w:rPr>
           </w:pPr>
@@ -582,7 +576,6 @@
                 <w:rFonts w:asciiTheme="minorHAnsi" w:eastAsiaTheme="minorEastAsia" w:hAnsiTheme="minorHAnsi" w:cstheme="minorBidi"/>
                 <w:kern w:val="2"/>
                 <w:sz w:val="24"/>
-                <w:lang/>
                 <w14:ligatures w14:val="standardContextual"/>
               </w:rPr>
               <w:tab/>
@@ -644,7 +637,6 @@
               <w:rFonts w:asciiTheme="minorHAnsi" w:eastAsiaTheme="minorEastAsia" w:hAnsiTheme="minorHAnsi" w:cstheme="minorBidi"/>
               <w:kern w:val="2"/>
               <w:sz w:val="24"/>
-              <w:lang/>
               <w14:ligatures w14:val="standardContextual"/>
             </w:rPr>
           </w:pPr>
@@ -661,7 +653,6 @@
                 <w:rFonts w:asciiTheme="minorHAnsi" w:eastAsiaTheme="minorEastAsia" w:hAnsiTheme="minorHAnsi" w:cstheme="minorBidi"/>
                 <w:kern w:val="2"/>
                 <w:sz w:val="24"/>
-                <w:lang/>
                 <w14:ligatures w14:val="standardContextual"/>
               </w:rPr>
               <w:tab/>
@@ -723,7 +714,6 @@
               <w:rFonts w:asciiTheme="minorHAnsi" w:eastAsiaTheme="minorEastAsia" w:hAnsiTheme="minorHAnsi" w:cstheme="minorBidi"/>
               <w:kern w:val="2"/>
               <w:sz w:val="24"/>
-              <w:lang/>
               <w14:ligatures w14:val="standardContextual"/>
             </w:rPr>
           </w:pPr>
@@ -740,7 +730,6 @@
                 <w:rFonts w:asciiTheme="minorHAnsi" w:eastAsiaTheme="minorEastAsia" w:hAnsiTheme="minorHAnsi" w:cstheme="minorBidi"/>
                 <w:kern w:val="2"/>
                 <w:sz w:val="24"/>
-                <w:lang/>
                 <w14:ligatures w14:val="standardContextual"/>
               </w:rPr>
               <w:tab/>
@@ -802,7 +791,6 @@
               <w:rFonts w:asciiTheme="minorHAnsi" w:eastAsiaTheme="minorEastAsia" w:hAnsiTheme="minorHAnsi" w:cstheme="minorBidi"/>
               <w:kern w:val="2"/>
               <w:sz w:val="24"/>
-              <w:lang/>
               <w14:ligatures w14:val="standardContextual"/>
             </w:rPr>
           </w:pPr>
@@ -819,7 +807,6 @@
                 <w:rFonts w:asciiTheme="minorHAnsi" w:eastAsiaTheme="minorEastAsia" w:hAnsiTheme="minorHAnsi" w:cstheme="minorBidi"/>
                 <w:kern w:val="2"/>
                 <w:sz w:val="24"/>
-                <w:lang/>
                 <w14:ligatures w14:val="standardContextual"/>
               </w:rPr>
               <w:tab/>
@@ -881,7 +868,6 @@
               <w:rFonts w:asciiTheme="minorHAnsi" w:eastAsiaTheme="minorEastAsia" w:hAnsiTheme="minorHAnsi" w:cstheme="minorBidi"/>
               <w:kern w:val="2"/>
               <w:sz w:val="24"/>
-              <w:lang/>
               <w14:ligatures w14:val="standardContextual"/>
             </w:rPr>
           </w:pPr>
@@ -898,7 +884,6 @@
                 <w:rFonts w:asciiTheme="minorHAnsi" w:eastAsiaTheme="minorEastAsia" w:hAnsiTheme="minorHAnsi" w:cstheme="minorBidi"/>
                 <w:kern w:val="2"/>
                 <w:sz w:val="24"/>
-                <w:lang/>
                 <w14:ligatures w14:val="standardContextual"/>
               </w:rPr>
               <w:tab/>
@@ -1505,6 +1490,7 @@
                 <w:bCs/>
                 <w:sz w:val="16"/>
                 <w:szCs w:val="16"/>
+                <w:lang w:val="de-CH"/>
               </w:rPr>
             </w:pPr>
             <m:oMathPara>
@@ -1518,7 +1504,30 @@
                     <w:sz w:val="16"/>
                     <w:szCs w:val="16"/>
                   </w:rPr>
-                  <m:t>3.3</m:t>
+                  <m:t>3</m:t>
+                </m:r>
+                <m:r>
+                  <m:rPr>
+                    <m:sty m:val="bi"/>
+                  </m:rPr>
+                  <w:rPr>
+                    <w:rFonts w:ascii="Cambria Math" w:hAnsi="Cambria Math"/>
+                    <w:sz w:val="16"/>
+                    <w:szCs w:val="16"/>
+                    <w:lang w:val="de-CH"/>
+                  </w:rPr>
+                  <m:t>.</m:t>
+                </m:r>
+                <m:r>
+                  <m:rPr>
+                    <m:sty m:val="bi"/>
+                  </m:rPr>
+                  <w:rPr>
+                    <w:rFonts w:ascii="Cambria Math" w:hAnsi="Cambria Math"/>
+                    <w:sz w:val="16"/>
+                    <w:szCs w:val="16"/>
+                  </w:rPr>
+                  <m:t>3</m:t>
                 </m:r>
                 <m:r>
                   <m:rPr>
@@ -1529,6 +1538,7 @@
                     <w:b/>
                     <w:sz w:val="16"/>
                     <w:szCs w:val="16"/>
+                    <w:lang w:val="de-CH"/>
                   </w:rPr>
                   <m:t>V</m:t>
                 </m:r>
@@ -1537,6 +1547,7 @@
                     <w:rFonts w:ascii="Cambria Math" w:hAnsi="Cambria Math"/>
                     <w:sz w:val="16"/>
                     <w:szCs w:val="16"/>
+                    <w:lang w:val="de-CH"/>
                   </w:rPr>
                   <m:t xml:space="preserve"> | 33.2</m:t>
                 </m:r>
@@ -1549,14 +1560,28 @@
                     <w:bCs/>
                     <w:sz w:val="16"/>
                     <w:szCs w:val="16"/>
-                  </w:rPr>
-                  <m:t>kΩ</m:t>
-                </m:r>
-                <m:r>
-                  <w:rPr>
-                    <w:rFonts w:ascii="Cambria Math" w:hAnsi="Cambria Math"/>
-                    <w:sz w:val="16"/>
-                    <w:szCs w:val="16"/>
+                    <w:lang w:val="de-CH"/>
+                  </w:rPr>
+                  <m:t>k</m:t>
+                </m:r>
+                <m:r>
+                  <m:rPr>
+                    <m:nor/>
+                  </m:rPr>
+                  <w:rPr>
+                    <w:rFonts w:ascii="Cambria Math" w:hAnsi="Cambria Math"/>
+                    <w:bCs/>
+                    <w:sz w:val="16"/>
+                    <w:szCs w:val="16"/>
+                  </w:rPr>
+                  <m:t>Ω</m:t>
+                </m:r>
+                <m:r>
+                  <w:rPr>
+                    <w:rFonts w:ascii="Cambria Math" w:hAnsi="Cambria Math"/>
+                    <w:sz w:val="16"/>
+                    <w:szCs w:val="16"/>
+                    <w:lang w:val="de-CH"/>
                   </w:rPr>
                   <m:t xml:space="preserve"> </m:t>
                 </m:r>
@@ -1578,6 +1603,7 @@
                         <w:rFonts w:ascii="Cambria Math" w:hAnsi="Cambria Math"/>
                         <w:sz w:val="16"/>
                         <w:szCs w:val="16"/>
+                        <w:lang w:val="de-CH"/>
                       </w:rPr>
                       <m:t>±1%</m:t>
                     </m:r>
@@ -1588,6 +1614,7 @@
                     <w:rFonts w:ascii="Cambria Math" w:hAnsi="Cambria Math"/>
                     <w:sz w:val="16"/>
                     <w:szCs w:val="16"/>
+                    <w:lang w:val="de-CH"/>
                   </w:rPr>
                   <m:t>⋅100</m:t>
                 </m:r>
@@ -1601,13 +1628,27 @@
                     <w:sz w:val="16"/>
                     <w:szCs w:val="16"/>
                   </w:rPr>
-                  <m:t>μA</m:t>
-                </m:r>
-                <m:r>
-                  <w:rPr>
-                    <w:rFonts w:ascii="Cambria Math" w:hAnsi="Cambria Math"/>
-                    <w:sz w:val="16"/>
-                    <w:szCs w:val="16"/>
+                  <m:t>μ</m:t>
+                </m:r>
+                <m:r>
+                  <m:rPr>
+                    <m:nor/>
+                  </m:rPr>
+                  <w:rPr>
+                    <w:rFonts w:ascii="Cambria Math" w:hAnsi="Cambria Math"/>
+                    <w:bCs/>
+                    <w:sz w:val="16"/>
+                    <w:szCs w:val="16"/>
+                    <w:lang w:val="de-CH"/>
+                  </w:rPr>
+                  <m:t>A</m:t>
+                </m:r>
+                <m:r>
+                  <w:rPr>
+                    <w:rFonts w:ascii="Cambria Math" w:hAnsi="Cambria Math"/>
+                    <w:sz w:val="16"/>
+                    <w:szCs w:val="16"/>
+                    <w:lang w:val="de-CH"/>
                   </w:rPr>
                   <m:t xml:space="preserve"> </m:t>
                 </m:r>
@@ -1629,6 +1670,7 @@
                         <w:rFonts w:ascii="Cambria Math" w:hAnsi="Cambria Math"/>
                         <w:sz w:val="16"/>
                         <w:szCs w:val="16"/>
+                        <w:lang w:val="de-CH"/>
                       </w:rPr>
                       <m:t>±1%</m:t>
                     </m:r>
@@ -1639,6 +1681,7 @@
                     <w:rFonts w:ascii="Cambria Math" w:hAnsi="Cambria Math"/>
                     <w:sz w:val="16"/>
                     <w:szCs w:val="16"/>
+                    <w:lang w:val="de-CH"/>
                   </w:rPr>
                   <m:t>=</m:t>
                 </m:r>
@@ -1651,7 +1694,30 @@
                     <w:sz w:val="16"/>
                     <w:szCs w:val="16"/>
                   </w:rPr>
-                  <m:t>3.25</m:t>
+                  <m:t>3</m:t>
+                </m:r>
+                <m:r>
+                  <m:rPr>
+                    <m:sty m:val="bi"/>
+                  </m:rPr>
+                  <w:rPr>
+                    <w:rFonts w:ascii="Cambria Math" w:hAnsi="Cambria Math"/>
+                    <w:sz w:val="16"/>
+                    <w:szCs w:val="16"/>
+                    <w:lang w:val="de-CH"/>
+                  </w:rPr>
+                  <m:t>.</m:t>
+                </m:r>
+                <m:r>
+                  <m:rPr>
+                    <m:sty m:val="bi"/>
+                  </m:rPr>
+                  <w:rPr>
+                    <w:rFonts w:ascii="Cambria Math" w:hAnsi="Cambria Math"/>
+                    <w:sz w:val="16"/>
+                    <w:szCs w:val="16"/>
+                  </w:rPr>
+                  <m:t>25</m:t>
                 </m:r>
                 <m:r>
                   <m:rPr>
@@ -1662,6 +1728,7 @@
                     <w:b/>
                     <w:sz w:val="16"/>
                     <w:szCs w:val="16"/>
+                    <w:lang w:val="de-CH"/>
                   </w:rPr>
                   <m:t>V</m:t>
                 </m:r>
@@ -1673,8 +1740,43 @@
                     <w:rFonts w:ascii="Cambria Math" w:hAnsi="Cambria Math"/>
                     <w:sz w:val="16"/>
                     <w:szCs w:val="16"/>
-                  </w:rPr>
-                  <m:t>…3.39</m:t>
+                    <w:lang w:val="de-CH"/>
+                  </w:rPr>
+                  <m:t>…</m:t>
+                </m:r>
+                <m:r>
+                  <m:rPr>
+                    <m:sty m:val="bi"/>
+                  </m:rPr>
+                  <w:rPr>
+                    <w:rFonts w:ascii="Cambria Math" w:hAnsi="Cambria Math"/>
+                    <w:sz w:val="16"/>
+                    <w:szCs w:val="16"/>
+                  </w:rPr>
+                  <m:t>3</m:t>
+                </m:r>
+                <m:r>
+                  <m:rPr>
+                    <m:sty m:val="bi"/>
+                  </m:rPr>
+                  <w:rPr>
+                    <w:rFonts w:ascii="Cambria Math" w:hAnsi="Cambria Math"/>
+                    <w:sz w:val="16"/>
+                    <w:szCs w:val="16"/>
+                    <w:lang w:val="de-CH"/>
+                  </w:rPr>
+                  <m:t>.</m:t>
+                </m:r>
+                <m:r>
+                  <m:rPr>
+                    <m:sty m:val="bi"/>
+                  </m:rPr>
+                  <w:rPr>
+                    <w:rFonts w:ascii="Cambria Math" w:hAnsi="Cambria Math"/>
+                    <w:sz w:val="16"/>
+                    <w:szCs w:val="16"/>
+                  </w:rPr>
+                  <m:t>39</m:t>
                 </m:r>
                 <m:r>
                   <m:rPr>
@@ -1685,6 +1787,7 @@
                     <w:b/>
                     <w:sz w:val="16"/>
                     <w:szCs w:val="16"/>
+                    <w:lang w:val="de-CH"/>
                   </w:rPr>
                   <m:t>V</m:t>
                 </m:r>
@@ -1863,6 +1966,7 @@
                 <w:b/>
                 <w:sz w:val="16"/>
                 <w:szCs w:val="16"/>
+                <w:lang w:val="de-CH"/>
               </w:rPr>
             </w:pPr>
             <m:oMathPara>
@@ -1876,7 +1980,30 @@
                     <w:sz w:val="16"/>
                     <w:szCs w:val="16"/>
                   </w:rPr>
-                  <m:t>3.3</m:t>
+                  <m:t>3</m:t>
+                </m:r>
+                <m:r>
+                  <m:rPr>
+                    <m:sty m:val="bi"/>
+                  </m:rPr>
+                  <w:rPr>
+                    <w:rFonts w:ascii="Cambria Math" w:hAnsi="Cambria Math"/>
+                    <w:sz w:val="16"/>
+                    <w:szCs w:val="16"/>
+                    <w:lang w:val="de-CH"/>
+                  </w:rPr>
+                  <m:t>.</m:t>
+                </m:r>
+                <m:r>
+                  <m:rPr>
+                    <m:sty m:val="bi"/>
+                  </m:rPr>
+                  <w:rPr>
+                    <w:rFonts w:ascii="Cambria Math" w:hAnsi="Cambria Math"/>
+                    <w:sz w:val="16"/>
+                    <w:szCs w:val="16"/>
+                  </w:rPr>
+                  <m:t>3</m:t>
                 </m:r>
                 <m:r>
                   <m:rPr>
@@ -1887,6 +2014,7 @@
                     <w:b/>
                     <w:sz w:val="16"/>
                     <w:szCs w:val="16"/>
+                    <w:lang w:val="de-CH"/>
                   </w:rPr>
                   <m:t>V</m:t>
                 </m:r>
@@ -1895,6 +2023,7 @@
                     <w:rFonts w:ascii="Cambria Math" w:hAnsi="Cambria Math"/>
                     <w:sz w:val="16"/>
                     <w:szCs w:val="16"/>
+                    <w:lang w:val="de-CH"/>
                   </w:rPr>
                   <m:t xml:space="preserve"> | 33.2</m:t>
                 </m:r>
@@ -1907,14 +2036,28 @@
                     <w:bCs/>
                     <w:sz w:val="16"/>
                     <w:szCs w:val="16"/>
-                  </w:rPr>
-                  <m:t>kΩ</m:t>
-                </m:r>
-                <m:r>
-                  <w:rPr>
-                    <w:rFonts w:ascii="Cambria Math" w:hAnsi="Cambria Math"/>
-                    <w:sz w:val="16"/>
-                    <w:szCs w:val="16"/>
+                    <w:lang w:val="de-CH"/>
+                  </w:rPr>
+                  <m:t>k</m:t>
+                </m:r>
+                <m:r>
+                  <m:rPr>
+                    <m:nor/>
+                  </m:rPr>
+                  <w:rPr>
+                    <w:rFonts w:ascii="Cambria Math" w:hAnsi="Cambria Math"/>
+                    <w:bCs/>
+                    <w:sz w:val="16"/>
+                    <w:szCs w:val="16"/>
+                  </w:rPr>
+                  <m:t>Ω</m:t>
+                </m:r>
+                <m:r>
+                  <w:rPr>
+                    <w:rFonts w:ascii="Cambria Math" w:hAnsi="Cambria Math"/>
+                    <w:sz w:val="16"/>
+                    <w:szCs w:val="16"/>
+                    <w:lang w:val="de-CH"/>
                   </w:rPr>
                   <m:t xml:space="preserve"> </m:t>
                 </m:r>
@@ -1936,6 +2079,7 @@
                         <w:rFonts w:ascii="Cambria Math" w:hAnsi="Cambria Math"/>
                         <w:sz w:val="16"/>
                         <w:szCs w:val="16"/>
+                        <w:lang w:val="de-CH"/>
                       </w:rPr>
                       <m:t>±1%</m:t>
                     </m:r>
@@ -1946,6 +2090,7 @@
                     <w:rFonts w:ascii="Cambria Math" w:hAnsi="Cambria Math"/>
                     <w:sz w:val="16"/>
                     <w:szCs w:val="16"/>
+                    <w:lang w:val="de-CH"/>
                   </w:rPr>
                   <m:t>⋅100</m:t>
                 </m:r>
@@ -1959,13 +2104,27 @@
                     <w:sz w:val="16"/>
                     <w:szCs w:val="16"/>
                   </w:rPr>
-                  <m:t>μA</m:t>
-                </m:r>
-                <m:r>
-                  <w:rPr>
-                    <w:rFonts w:ascii="Cambria Math" w:hAnsi="Cambria Math"/>
-                    <w:sz w:val="16"/>
-                    <w:szCs w:val="16"/>
+                  <m:t>μ</m:t>
+                </m:r>
+                <m:r>
+                  <m:rPr>
+                    <m:nor/>
+                  </m:rPr>
+                  <w:rPr>
+                    <w:rFonts w:ascii="Cambria Math" w:hAnsi="Cambria Math"/>
+                    <w:bCs/>
+                    <w:sz w:val="16"/>
+                    <w:szCs w:val="16"/>
+                    <w:lang w:val="de-CH"/>
+                  </w:rPr>
+                  <m:t>A</m:t>
+                </m:r>
+                <m:r>
+                  <w:rPr>
+                    <w:rFonts w:ascii="Cambria Math" w:hAnsi="Cambria Math"/>
+                    <w:sz w:val="16"/>
+                    <w:szCs w:val="16"/>
+                    <w:lang w:val="de-CH"/>
                   </w:rPr>
                   <m:t xml:space="preserve"> </m:t>
                 </m:r>
@@ -1987,6 +2146,7 @@
                         <w:rFonts w:ascii="Cambria Math" w:hAnsi="Cambria Math"/>
                         <w:sz w:val="16"/>
                         <w:szCs w:val="16"/>
+                        <w:lang w:val="de-CH"/>
                       </w:rPr>
                       <m:t>±1%</m:t>
                     </m:r>
@@ -1997,6 +2157,7 @@
                     <w:rFonts w:ascii="Cambria Math" w:hAnsi="Cambria Math"/>
                     <w:sz w:val="16"/>
                     <w:szCs w:val="16"/>
+                    <w:lang w:val="de-CH"/>
                   </w:rPr>
                   <m:t>=</m:t>
                 </m:r>
@@ -2009,7 +2170,30 @@
                     <w:sz w:val="16"/>
                     <w:szCs w:val="16"/>
                   </w:rPr>
-                  <m:t>3.25</m:t>
+                  <m:t>3</m:t>
+                </m:r>
+                <m:r>
+                  <m:rPr>
+                    <m:sty m:val="bi"/>
+                  </m:rPr>
+                  <w:rPr>
+                    <w:rFonts w:ascii="Cambria Math" w:hAnsi="Cambria Math"/>
+                    <w:sz w:val="16"/>
+                    <w:szCs w:val="16"/>
+                    <w:lang w:val="de-CH"/>
+                  </w:rPr>
+                  <m:t>.</m:t>
+                </m:r>
+                <m:r>
+                  <m:rPr>
+                    <m:sty m:val="bi"/>
+                  </m:rPr>
+                  <w:rPr>
+                    <w:rFonts w:ascii="Cambria Math" w:hAnsi="Cambria Math"/>
+                    <w:sz w:val="16"/>
+                    <w:szCs w:val="16"/>
+                  </w:rPr>
+                  <m:t>25</m:t>
                 </m:r>
                 <m:r>
                   <m:rPr>
@@ -2020,6 +2204,7 @@
                     <w:b/>
                     <w:sz w:val="16"/>
                     <w:szCs w:val="16"/>
+                    <w:lang w:val="de-CH"/>
                   </w:rPr>
                   <m:t>V</m:t>
                 </m:r>
@@ -2031,8 +2216,43 @@
                     <w:rFonts w:ascii="Cambria Math" w:hAnsi="Cambria Math"/>
                     <w:sz w:val="16"/>
                     <w:szCs w:val="16"/>
-                  </w:rPr>
-                  <m:t>…3.39</m:t>
+                    <w:lang w:val="de-CH"/>
+                  </w:rPr>
+                  <m:t>…</m:t>
+                </m:r>
+                <m:r>
+                  <m:rPr>
+                    <m:sty m:val="bi"/>
+                  </m:rPr>
+                  <w:rPr>
+                    <w:rFonts w:ascii="Cambria Math" w:hAnsi="Cambria Math"/>
+                    <w:sz w:val="16"/>
+                    <w:szCs w:val="16"/>
+                  </w:rPr>
+                  <m:t>3</m:t>
+                </m:r>
+                <m:r>
+                  <m:rPr>
+                    <m:sty m:val="bi"/>
+                  </m:rPr>
+                  <w:rPr>
+                    <w:rFonts w:ascii="Cambria Math" w:hAnsi="Cambria Math"/>
+                    <w:sz w:val="16"/>
+                    <w:szCs w:val="16"/>
+                    <w:lang w:val="de-CH"/>
+                  </w:rPr>
+                  <m:t>.</m:t>
+                </m:r>
+                <m:r>
+                  <m:rPr>
+                    <m:sty m:val="bi"/>
+                  </m:rPr>
+                  <w:rPr>
+                    <w:rFonts w:ascii="Cambria Math" w:hAnsi="Cambria Math"/>
+                    <w:sz w:val="16"/>
+                    <w:szCs w:val="16"/>
+                  </w:rPr>
+                  <m:t>39</m:t>
                 </m:r>
                 <m:r>
                   <m:rPr>
@@ -2043,6 +2263,7 @@
                     <w:b/>
                     <w:sz w:val="16"/>
                     <w:szCs w:val="16"/>
+                    <w:lang w:val="de-CH"/>
                   </w:rPr>
                   <m:t>V</m:t>
                 </m:r>
@@ -2212,6 +2433,7 @@
                 <w:b/>
                 <w:sz w:val="16"/>
                 <w:szCs w:val="16"/>
+                <w:lang w:val="de-CH"/>
               </w:rPr>
             </w:pPr>
             <m:oMathPara>
@@ -2236,6 +2458,7 @@
                     <w:b/>
                     <w:sz w:val="16"/>
                     <w:szCs w:val="16"/>
+                    <w:lang w:val="de-CH"/>
                   </w:rPr>
                   <m:t>V</m:t>
                 </m:r>
@@ -2244,6 +2467,7 @@
                     <w:rFonts w:ascii="Cambria Math" w:hAnsi="Cambria Math"/>
                     <w:sz w:val="16"/>
                     <w:szCs w:val="16"/>
+                    <w:lang w:val="de-CH"/>
                   </w:rPr>
                   <m:t xml:space="preserve"> | 49.9</m:t>
                 </m:r>
@@ -2256,14 +2480,28 @@
                     <w:bCs/>
                     <w:sz w:val="16"/>
                     <w:szCs w:val="16"/>
-                  </w:rPr>
-                  <m:t>kΩ</m:t>
-                </m:r>
-                <m:r>
-                  <w:rPr>
-                    <w:rFonts w:ascii="Cambria Math" w:hAnsi="Cambria Math"/>
-                    <w:sz w:val="16"/>
-                    <w:szCs w:val="16"/>
+                    <w:lang w:val="de-CH"/>
+                  </w:rPr>
+                  <m:t>k</m:t>
+                </m:r>
+                <m:r>
+                  <m:rPr>
+                    <m:nor/>
+                  </m:rPr>
+                  <w:rPr>
+                    <w:rFonts w:ascii="Cambria Math" w:hAnsi="Cambria Math"/>
+                    <w:bCs/>
+                    <w:sz w:val="16"/>
+                    <w:szCs w:val="16"/>
+                  </w:rPr>
+                  <m:t>Ω</m:t>
+                </m:r>
+                <m:r>
+                  <w:rPr>
+                    <w:rFonts w:ascii="Cambria Math" w:hAnsi="Cambria Math"/>
+                    <w:sz w:val="16"/>
+                    <w:szCs w:val="16"/>
+                    <w:lang w:val="de-CH"/>
                   </w:rPr>
                   <m:t xml:space="preserve"> </m:t>
                 </m:r>
@@ -2285,6 +2523,7 @@
                         <w:rFonts w:ascii="Cambria Math" w:hAnsi="Cambria Math"/>
                         <w:sz w:val="16"/>
                         <w:szCs w:val="16"/>
+                        <w:lang w:val="de-CH"/>
                       </w:rPr>
                       <m:t>±1%</m:t>
                     </m:r>
@@ -2295,6 +2534,7 @@
                     <w:rFonts w:ascii="Cambria Math" w:hAnsi="Cambria Math"/>
                     <w:sz w:val="16"/>
                     <w:szCs w:val="16"/>
+                    <w:lang w:val="de-CH"/>
                   </w:rPr>
                   <m:t>⋅100</m:t>
                 </m:r>
@@ -2308,13 +2548,27 @@
                     <w:sz w:val="16"/>
                     <w:szCs w:val="16"/>
                   </w:rPr>
-                  <m:t>μA</m:t>
-                </m:r>
-                <m:r>
-                  <w:rPr>
-                    <w:rFonts w:ascii="Cambria Math" w:hAnsi="Cambria Math"/>
-                    <w:sz w:val="16"/>
-                    <w:szCs w:val="16"/>
+                  <m:t>μ</m:t>
+                </m:r>
+                <m:r>
+                  <m:rPr>
+                    <m:nor/>
+                  </m:rPr>
+                  <w:rPr>
+                    <w:rFonts w:ascii="Cambria Math" w:hAnsi="Cambria Math"/>
+                    <w:bCs/>
+                    <w:sz w:val="16"/>
+                    <w:szCs w:val="16"/>
+                    <w:lang w:val="de-CH"/>
+                  </w:rPr>
+                  <m:t>A</m:t>
+                </m:r>
+                <m:r>
+                  <w:rPr>
+                    <w:rFonts w:ascii="Cambria Math" w:hAnsi="Cambria Math"/>
+                    <w:sz w:val="16"/>
+                    <w:szCs w:val="16"/>
+                    <w:lang w:val="de-CH"/>
                   </w:rPr>
                   <m:t xml:space="preserve"> </m:t>
                 </m:r>
@@ -2336,6 +2590,7 @@
                         <w:rFonts w:ascii="Cambria Math" w:hAnsi="Cambria Math"/>
                         <w:sz w:val="16"/>
                         <w:szCs w:val="16"/>
+                        <w:lang w:val="de-CH"/>
                       </w:rPr>
                       <m:t>±1%</m:t>
                     </m:r>
@@ -2346,6 +2601,7 @@
                     <w:rFonts w:ascii="Cambria Math" w:hAnsi="Cambria Math"/>
                     <w:sz w:val="16"/>
                     <w:szCs w:val="16"/>
+                    <w:lang w:val="de-CH"/>
                   </w:rPr>
                   <m:t>=</m:t>
                 </m:r>
@@ -2358,7 +2614,30 @@
                     <w:sz w:val="16"/>
                     <w:szCs w:val="16"/>
                   </w:rPr>
-                  <m:t>4.89</m:t>
+                  <m:t>4</m:t>
+                </m:r>
+                <m:r>
+                  <m:rPr>
+                    <m:sty m:val="bi"/>
+                  </m:rPr>
+                  <w:rPr>
+                    <w:rFonts w:ascii="Cambria Math" w:hAnsi="Cambria Math"/>
+                    <w:sz w:val="16"/>
+                    <w:szCs w:val="16"/>
+                    <w:lang w:val="de-CH"/>
+                  </w:rPr>
+                  <m:t>.</m:t>
+                </m:r>
+                <m:r>
+                  <m:rPr>
+                    <m:sty m:val="bi"/>
+                  </m:rPr>
+                  <w:rPr>
+                    <w:rFonts w:ascii="Cambria Math" w:hAnsi="Cambria Math"/>
+                    <w:sz w:val="16"/>
+                    <w:szCs w:val="16"/>
+                  </w:rPr>
+                  <m:t>89</m:t>
                 </m:r>
                 <m:r>
                   <m:rPr>
@@ -2369,6 +2648,7 @@
                     <w:b/>
                     <w:sz w:val="16"/>
                     <w:szCs w:val="16"/>
+                    <w:lang w:val="de-CH"/>
                   </w:rPr>
                   <m:t>V</m:t>
                 </m:r>
@@ -2380,8 +2660,43 @@
                     <w:rFonts w:ascii="Cambria Math" w:hAnsi="Cambria Math"/>
                     <w:sz w:val="16"/>
                     <w:szCs w:val="16"/>
-                  </w:rPr>
-                  <m:t>…5.09</m:t>
+                    <w:lang w:val="de-CH"/>
+                  </w:rPr>
+                  <m:t>…</m:t>
+                </m:r>
+                <m:r>
+                  <m:rPr>
+                    <m:sty m:val="bi"/>
+                  </m:rPr>
+                  <w:rPr>
+                    <w:rFonts w:ascii="Cambria Math" w:hAnsi="Cambria Math"/>
+                    <w:sz w:val="16"/>
+                    <w:szCs w:val="16"/>
+                  </w:rPr>
+                  <m:t>5</m:t>
+                </m:r>
+                <m:r>
+                  <m:rPr>
+                    <m:sty m:val="bi"/>
+                  </m:rPr>
+                  <w:rPr>
+                    <w:rFonts w:ascii="Cambria Math" w:hAnsi="Cambria Math"/>
+                    <w:sz w:val="16"/>
+                    <w:szCs w:val="16"/>
+                    <w:lang w:val="de-CH"/>
+                  </w:rPr>
+                  <m:t>.</m:t>
+                </m:r>
+                <m:r>
+                  <m:rPr>
+                    <m:sty m:val="bi"/>
+                  </m:rPr>
+                  <w:rPr>
+                    <w:rFonts w:ascii="Cambria Math" w:hAnsi="Cambria Math"/>
+                    <w:sz w:val="16"/>
+                    <w:szCs w:val="16"/>
+                  </w:rPr>
+                  <m:t>09</m:t>
                 </m:r>
                 <m:r>
                   <m:rPr>
@@ -2392,6 +2707,7 @@
                     <w:b/>
                     <w:sz w:val="16"/>
                     <w:szCs w:val="16"/>
+                    <w:lang w:val="de-CH"/>
                   </w:rPr>
                   <m:t>V</m:t>
                 </m:r>
@@ -2571,6 +2887,7 @@
                 <w:sz w:val="16"/>
                 <w:szCs w:val="16"/>
                 <w:highlight w:val="yellow"/>
+                <w:lang w:val="de-CH"/>
               </w:rPr>
             </w:pPr>
             <m:oMathPara>
@@ -2597,6 +2914,7 @@
                     <w:sz w:val="16"/>
                     <w:szCs w:val="16"/>
                     <w:highlight w:val="yellow"/>
+                    <w:lang w:val="de-CH"/>
                   </w:rPr>
                   <m:t>V</m:t>
                 </m:r>
@@ -2606,6 +2924,7 @@
                     <w:sz w:val="16"/>
                     <w:szCs w:val="16"/>
                     <w:highlight w:val="yellow"/>
+                    <w:lang w:val="de-CH"/>
                   </w:rPr>
                   <m:t xml:space="preserve"> | 270</m:t>
                 </m:r>
@@ -2628,6 +2947,7 @@
                     <w:sz w:val="16"/>
                     <w:szCs w:val="16"/>
                     <w:highlight w:val="yellow"/>
+                    <w:lang w:val="de-CH"/>
                   </w:rPr>
                   <m:t xml:space="preserve"> </m:t>
                 </m:r>
@@ -2651,6 +2971,7 @@
                         <w:sz w:val="16"/>
                         <w:szCs w:val="16"/>
                         <w:highlight w:val="yellow"/>
+                        <w:lang w:val="de-CH"/>
                       </w:rPr>
                       <m:t>±1%</m:t>
                     </m:r>
@@ -2662,6 +2983,7 @@
                     <w:sz w:val="16"/>
                     <w:szCs w:val="16"/>
                     <w:highlight w:val="yellow"/>
+                    <w:lang w:val="de-CH"/>
                   </w:rPr>
                   <m:t>⋅20</m:t>
                 </m:r>
@@ -2675,6 +2997,7 @@
                     <w:sz w:val="16"/>
                     <w:szCs w:val="16"/>
                     <w:highlight w:val="yellow"/>
+                    <w:lang w:val="de-CH"/>
                   </w:rPr>
                   <m:t>mA</m:t>
                 </m:r>
@@ -2684,6 +3007,7 @@
                     <w:sz w:val="16"/>
                     <w:szCs w:val="16"/>
                     <w:highlight w:val="yellow"/>
+                    <w:lang w:val="de-CH"/>
                   </w:rPr>
                   <m:t xml:space="preserve"> </m:t>
                 </m:r>
@@ -2707,6 +3031,7 @@
                         <w:sz w:val="16"/>
                         <w:szCs w:val="16"/>
                         <w:highlight w:val="yellow"/>
+                        <w:lang w:val="de-CH"/>
                       </w:rPr>
                       <m:t>±1%</m:t>
                     </m:r>
@@ -2718,6 +3043,7 @@
                     <w:sz w:val="16"/>
                     <w:szCs w:val="16"/>
                     <w:highlight w:val="yellow"/>
+                    <w:lang w:val="de-CH"/>
                   </w:rPr>
                   <m:t>=</m:t>
                 </m:r>
@@ -2731,7 +3057,32 @@
                     <w:szCs w:val="16"/>
                     <w:highlight w:val="yellow"/>
                   </w:rPr>
-                  <m:t>5.29</m:t>
+                  <m:t>5</m:t>
+                </m:r>
+                <m:r>
+                  <m:rPr>
+                    <m:sty m:val="bi"/>
+                  </m:rPr>
+                  <w:rPr>
+                    <w:rFonts w:ascii="Cambria Math" w:hAnsi="Cambria Math"/>
+                    <w:sz w:val="16"/>
+                    <w:szCs w:val="16"/>
+                    <w:highlight w:val="yellow"/>
+                    <w:lang w:val="de-CH"/>
+                  </w:rPr>
+                  <m:t>.</m:t>
+                </m:r>
+                <m:r>
+                  <m:rPr>
+                    <m:sty m:val="bi"/>
+                  </m:rPr>
+                  <w:rPr>
+                    <w:rFonts w:ascii="Cambria Math" w:hAnsi="Cambria Math"/>
+                    <w:sz w:val="16"/>
+                    <w:szCs w:val="16"/>
+                    <w:highlight w:val="yellow"/>
+                  </w:rPr>
+                  <m:t>29</m:t>
                 </m:r>
                 <m:r>
                   <m:rPr>
@@ -2743,6 +3094,7 @@
                     <w:sz w:val="16"/>
                     <w:szCs w:val="16"/>
                     <w:highlight w:val="yellow"/>
+                    <w:lang w:val="de-CH"/>
                   </w:rPr>
                   <m:t>V</m:t>
                 </m:r>
@@ -2754,6 +3106,7 @@
                     <w:rFonts w:ascii="Cambria Math" w:hAnsi="Cambria Math"/>
                     <w:sz w:val="16"/>
                     <w:szCs w:val="16"/>
+                    <w:lang w:val="de-CH"/>
                   </w:rPr>
                   <m:t>…</m:t>
                 </m:r>
@@ -2767,7 +3120,32 @@
                     <w:szCs w:val="16"/>
                     <w:highlight w:val="yellow"/>
                   </w:rPr>
-                  <m:t>5.51</m:t>
+                  <m:t>5</m:t>
+                </m:r>
+                <m:r>
+                  <m:rPr>
+                    <m:sty m:val="bi"/>
+                  </m:rPr>
+                  <w:rPr>
+                    <w:rFonts w:ascii="Cambria Math" w:hAnsi="Cambria Math"/>
+                    <w:sz w:val="16"/>
+                    <w:szCs w:val="16"/>
+                    <w:highlight w:val="yellow"/>
+                    <w:lang w:val="de-CH"/>
+                  </w:rPr>
+                  <m:t>.</m:t>
+                </m:r>
+                <m:r>
+                  <m:rPr>
+                    <m:sty m:val="bi"/>
+                  </m:rPr>
+                  <w:rPr>
+                    <w:rFonts w:ascii="Cambria Math" w:hAnsi="Cambria Math"/>
+                    <w:sz w:val="16"/>
+                    <w:szCs w:val="16"/>
+                    <w:highlight w:val="yellow"/>
+                  </w:rPr>
+                  <m:t>51</m:t>
                 </m:r>
                 <m:r>
                   <m:rPr>
@@ -2779,6 +3157,7 @@
                     <w:sz w:val="16"/>
                     <w:szCs w:val="16"/>
                     <w:highlight w:val="yellow"/>
+                    <w:lang w:val="de-CH"/>
                   </w:rPr>
                   <m:t>V</m:t>
                 </m:r>
@@ -5041,7 +5420,23 @@
                 <w:sz w:val="16"/>
                 <w:szCs w:val="16"/>
               </w:rPr>
+              <w:t>+</w:t>
+            </w:r>
+            <w:r>
+              <w:rPr>
+                <w:bCs/>
+                <w:sz w:val="16"/>
+                <w:szCs w:val="16"/>
+              </w:rPr>
               <w:t>3V</w:t>
+            </w:r>
+            <w:r>
+              <w:rPr>
+                <w:bCs/>
+                <w:sz w:val="16"/>
+                <w:szCs w:val="16"/>
+              </w:rPr>
+              <w:t>0</w:t>
             </w:r>
             <w:r>
               <w:rPr>
@@ -5940,15 +6335,7 @@
                 <w:sz w:val="16"/>
                 <w:szCs w:val="16"/>
               </w:rPr>
-              <w:t>I</w:t>
-            </w:r>
-            <w:r>
-              <w:rPr>
-                <w:bCs/>
-                <w:sz w:val="16"/>
-                <w:szCs w:val="16"/>
-              </w:rPr>
-              <w:t>n range →</w:t>
+              <w:t>In range →</w:t>
             </w:r>
             <w:r>
               <w:rPr>
@@ -6250,15 +6637,7 @@
                 <w:sz w:val="16"/>
                 <w:szCs w:val="16"/>
               </w:rPr>
-              <w:t>I</w:t>
-            </w:r>
-            <w:r>
-              <w:rPr>
-                <w:bCs/>
-                <w:sz w:val="16"/>
-                <w:szCs w:val="16"/>
-              </w:rPr>
-              <w:t>n range →</w:t>
+              <w:t>In range →</w:t>
             </w:r>
             <w:r>
               <w:rPr>
@@ -6526,15 +6905,7 @@
                 <w:sz w:val="16"/>
                 <w:szCs w:val="16"/>
               </w:rPr>
-              <w:t>I</w:t>
-            </w:r>
-            <w:r>
-              <w:rPr>
-                <w:bCs/>
-                <w:sz w:val="16"/>
-                <w:szCs w:val="16"/>
-              </w:rPr>
-              <w:t>n range →</w:t>
+              <w:t>In range →</w:t>
             </w:r>
             <w:r>
               <w:rPr>
@@ -6817,15 +7188,7 @@
                 <w:sz w:val="16"/>
                 <w:szCs w:val="16"/>
               </w:rPr>
-              <w:t>I</w:t>
-            </w:r>
-            <w:r>
-              <w:rPr>
-                <w:bCs/>
-                <w:sz w:val="16"/>
-                <w:szCs w:val="16"/>
-              </w:rPr>
-              <w:t>n range →</w:t>
+              <w:t>In range →</w:t>
             </w:r>
             <w:r>
               <w:rPr>
@@ -7413,9 +7776,16 @@
             </w:r>
             <w:r>
               <w:rPr>
-                <w:sz w:val="16"/>
-              </w:rPr>
-              <w:t>1mVpp 1kHz sine</w:t>
+                <w:bCs/>
+                <w:sz w:val="16"/>
+              </w:rPr>
+              <w:t>500</w:t>
+            </w:r>
+            <w:r>
+              <w:rPr>
+                <w:sz w:val="16"/>
+              </w:rPr>
+              <w:t>mVpp 1kHz sine</w:t>
             </w:r>
           </w:p>
         </w:tc>
@@ -7432,7 +7802,7 @@
               <w:spacing w:before="0"/>
               <w:jc w:val="center"/>
               <w:rPr>
-                <w:b/>
+                <w:bCs/>
                 <w:sz w:val="16"/>
                 <w:szCs w:val="16"/>
               </w:rPr>
@@ -7441,16 +7811,95 @@
               <m:oMath>
                 <m:r>
                   <m:rPr>
+                    <m:nor/>
+                  </m:rPr>
+                  <w:rPr>
+                    <w:rFonts w:ascii="Cambria Math" w:hAnsi="Cambria Math"/>
+                    <w:bCs/>
+                    <w:sz w:val="16"/>
+                    <w:szCs w:val="16"/>
+                  </w:rPr>
+                  <m:t>No attenuation for</m:t>
+                </m:r>
+                <m:r>
+                  <w:rPr>
+                    <w:rFonts w:ascii="Cambria Math" w:hAnsi="Cambria Math"/>
+                    <w:sz w:val="16"/>
+                    <w:szCs w:val="16"/>
+                  </w:rPr>
+                  <m:t xml:space="preserve"> 1</m:t>
+                </m:r>
+                <m:r>
+                  <m:rPr>
+                    <m:nor/>
+                  </m:rPr>
+                  <w:rPr>
+                    <w:rFonts w:ascii="Cambria Math" w:hAnsi="Cambria Math"/>
+                    <w:bCs/>
+                    <w:sz w:val="16"/>
+                    <w:szCs w:val="16"/>
+                  </w:rPr>
+                  <m:t>kHz</m:t>
+                </m:r>
+                <m:r>
+                  <w:rPr>
+                    <w:rFonts w:ascii="Cambria Math" w:hAnsi="Cambria Math"/>
+                    <w:sz w:val="16"/>
+                    <w:szCs w:val="16"/>
+                  </w:rPr>
+                  <m:t>→</m:t>
+                </m:r>
+                <m:r>
+                  <m:rPr>
                     <m:sty m:val="bi"/>
                   </m:rPr>
                   <w:rPr>
                     <w:rFonts w:ascii="Cambria Math" w:hAnsi="Cambria Math"/>
                     <w:sz w:val="16"/>
                     <w:szCs w:val="16"/>
-                    <w:highlight w:val="yellow"/>
-                  </w:rPr>
-                  <m:t>…</m:t>
-                </m:r>
+                  </w:rPr>
+                  <m:t>500</m:t>
+                </m:r>
+                <m:sSub>
+                  <m:sSubPr>
+                    <m:ctrlPr>
+                      <w:rPr>
+                        <w:rFonts w:ascii="Cambria Math" w:hAnsi="Cambria Math"/>
+                        <w:b/>
+                        <w:sz w:val="16"/>
+                        <w:szCs w:val="16"/>
+                      </w:rPr>
+                    </m:ctrlPr>
+                  </m:sSubPr>
+                  <m:e>
+                    <m:r>
+                      <m:rPr>
+                        <m:nor/>
+                      </m:rPr>
+                      <w:rPr>
+                        <w:rFonts w:ascii="Cambria Math" w:hAnsi="Cambria Math"/>
+                        <w:b/>
+                        <w:sz w:val="16"/>
+                        <w:szCs w:val="16"/>
+                      </w:rPr>
+                      <m:t>mV</m:t>
+                    </m:r>
+                  </m:e>
+                  <m:sub>
+                    <m:r>
+                      <m:rPr>
+                        <m:nor/>
+                      </m:rPr>
+                      <w:rPr>
+                        <w:rFonts w:ascii="Cambria Math" w:hAnsi="Cambria Math"/>
+                        <w:b/>
+                        <w:sz w:val="16"/>
+                        <w:szCs w:val="16"/>
+                      </w:rPr>
+                      <m:t>PP</m:t>
+                    </m:r>
+                  </m:sub>
+                </m:sSub>
               </m:oMath>
             </m:oMathPara>
           </w:p>
@@ -7537,23 +7986,7 @@
                 <w:sz w:val="16"/>
                 <w:szCs w:val="16"/>
               </w:rPr>
-              <w:t xml:space="preserve">Line in signal after Anti-Aliasing filter, </w:t>
-            </w:r>
-            <w:r>
-              <w:rPr>
-                <w:b/>
-                <w:sz w:val="16"/>
-                <w:szCs w:val="16"/>
-              </w:rPr>
-              <w:t>right</w:t>
-            </w:r>
-            <w:r>
-              <w:rPr>
-                <w:b/>
-                <w:sz w:val="16"/>
-                <w:szCs w:val="16"/>
-              </w:rPr>
-              <w:t xml:space="preserve"> channel</w:t>
+              <w:t>Line in signal after Anti-Aliasing filter, right channel</w:t>
             </w:r>
           </w:p>
         </w:tc>
@@ -7584,9 +8017,16 @@
             </w:r>
             <w:r>
               <w:rPr>
-                <w:sz w:val="16"/>
-              </w:rPr>
-              <w:t>1mVpp 1kHz sine</w:t>
+                <w:bCs/>
+                <w:sz w:val="16"/>
+              </w:rPr>
+              <w:t>500</w:t>
+            </w:r>
+            <w:r>
+              <w:rPr>
+                <w:sz w:val="16"/>
+              </w:rPr>
+              <w:t>mVpp 1kHz sine</w:t>
             </w:r>
           </w:p>
         </w:tc>
@@ -7612,16 +8052,95 @@
               <m:oMath>
                 <m:r>
                   <m:rPr>
+                    <m:nor/>
+                  </m:rPr>
+                  <w:rPr>
+                    <w:rFonts w:ascii="Cambria Math" w:hAnsi="Cambria Math"/>
+                    <w:bCs/>
+                    <w:sz w:val="16"/>
+                    <w:szCs w:val="16"/>
+                  </w:rPr>
+                  <m:t>No attenuation for</m:t>
+                </m:r>
+                <m:r>
+                  <w:rPr>
+                    <w:rFonts w:ascii="Cambria Math" w:hAnsi="Cambria Math"/>
+                    <w:sz w:val="16"/>
+                    <w:szCs w:val="16"/>
+                  </w:rPr>
+                  <m:t xml:space="preserve"> 1</m:t>
+                </m:r>
+                <m:r>
+                  <m:rPr>
+                    <m:nor/>
+                  </m:rPr>
+                  <w:rPr>
+                    <w:rFonts w:ascii="Cambria Math" w:hAnsi="Cambria Math"/>
+                    <w:bCs/>
+                    <w:sz w:val="16"/>
+                    <w:szCs w:val="16"/>
+                  </w:rPr>
+                  <m:t>kHz</m:t>
+                </m:r>
+                <m:r>
+                  <w:rPr>
+                    <w:rFonts w:ascii="Cambria Math" w:hAnsi="Cambria Math"/>
+                    <w:sz w:val="16"/>
+                    <w:szCs w:val="16"/>
+                  </w:rPr>
+                  <m:t>→</m:t>
+                </m:r>
+                <m:r>
+                  <m:rPr>
                     <m:sty m:val="bi"/>
                   </m:rPr>
                   <w:rPr>
                     <w:rFonts w:ascii="Cambria Math" w:hAnsi="Cambria Math"/>
                     <w:sz w:val="16"/>
                     <w:szCs w:val="16"/>
-                    <w:highlight w:val="yellow"/>
-                  </w:rPr>
-                  <m:t>…</m:t>
-                </m:r>
+                  </w:rPr>
+                  <m:t>500</m:t>
+                </m:r>
+                <m:sSub>
+                  <m:sSubPr>
+                    <m:ctrlPr>
+                      <w:rPr>
+                        <w:rFonts w:ascii="Cambria Math" w:hAnsi="Cambria Math"/>
+                        <w:b/>
+                        <w:sz w:val="16"/>
+                        <w:szCs w:val="16"/>
+                      </w:rPr>
+                    </m:ctrlPr>
+                  </m:sSubPr>
+                  <m:e>
+                    <m:r>
+                      <m:rPr>
+                        <m:nor/>
+                      </m:rPr>
+                      <w:rPr>
+                        <w:rFonts w:ascii="Cambria Math" w:hAnsi="Cambria Math"/>
+                        <w:b/>
+                        <w:sz w:val="16"/>
+                        <w:szCs w:val="16"/>
+                      </w:rPr>
+                      <m:t>mV</m:t>
+                    </m:r>
+                  </m:e>
+                  <m:sub>
+                    <m:r>
+                      <m:rPr>
+                        <m:nor/>
+                      </m:rPr>
+                      <w:rPr>
+                        <w:rFonts w:ascii="Cambria Math" w:hAnsi="Cambria Math"/>
+                        <w:b/>
+                        <w:sz w:val="16"/>
+                        <w:szCs w:val="16"/>
+                      </w:rPr>
+                      <m:t>PP</m:t>
+                    </m:r>
+                  </m:sub>
+                </m:sSub>
               </m:oMath>
             </m:oMathPara>
           </w:p>
@@ -7760,6 +8279,22 @@
                 <w:szCs w:val="16"/>
               </w:rPr>
             </w:pPr>
+            <m:oMathPara>
+              <m:oMath>
+                <m:r>
+                  <m:rPr>
+                    <m:sty m:val="bi"/>
+                  </m:rPr>
+                  <w:rPr>
+                    <w:rFonts w:ascii="Cambria Math" w:hAnsi="Cambria Math"/>
+                    <w:sz w:val="16"/>
+                    <w:szCs w:val="16"/>
+                    <w:highlight w:val="yellow"/>
+                  </w:rPr>
+                  <m:t>…</m:t>
+                </m:r>
+              </m:oMath>
+            </m:oMathPara>
           </w:p>
         </w:tc>
         <w:tc>
@@ -7923,6 +8458,22 @@
                 <w:szCs w:val="16"/>
               </w:rPr>
             </w:pPr>
+            <m:oMathPara>
+              <m:oMath>
+                <m:r>
+                  <m:rPr>
+                    <m:sty m:val="bi"/>
+                  </m:rPr>
+                  <w:rPr>
+                    <w:rFonts w:ascii="Cambria Math" w:hAnsi="Cambria Math"/>
+                    <w:sz w:val="16"/>
+                    <w:szCs w:val="16"/>
+                    <w:highlight w:val="yellow"/>
+                  </w:rPr>
+                  <m:t>…</m:t>
+                </m:r>
+              </m:oMath>
+            </m:oMathPara>
           </w:p>
         </w:tc>
         <w:tc>
@@ -9238,39 +9789,7 @@
                 <w:sz w:val="16"/>
                 <w:szCs w:val="16"/>
               </w:rPr>
-              <w:t>Output signal after</w:t>
-            </w:r>
-            <w:r>
-              <w:rPr>
-                <w:b/>
-                <w:sz w:val="16"/>
-                <w:szCs w:val="16"/>
-              </w:rPr>
-              <w:t xml:space="preserve"> Headphone Amplifier</w:t>
-            </w:r>
-            <w:r>
-              <w:rPr>
-                <w:b/>
-                <w:sz w:val="16"/>
-                <w:szCs w:val="16"/>
-              </w:rPr>
-              <w:t>, left</w:t>
-            </w:r>
-            <w:r>
-              <w:rPr>
-                <w:b/>
-                <w:sz w:val="16"/>
-                <w:szCs w:val="16"/>
-              </w:rPr>
-              <w:t> </w:t>
-            </w:r>
-            <w:r>
-              <w:rPr>
-                <w:b/>
-                <w:sz w:val="16"/>
-                <w:szCs w:val="16"/>
-              </w:rPr>
-              <w:t>channel</w:t>
+              <w:t>Output signal after Headphone Amplifier, left channel</w:t>
             </w:r>
           </w:p>
         </w:tc>
@@ -9407,23 +9926,7 @@
                 <w:sz w:val="16"/>
                 <w:szCs w:val="16"/>
               </w:rPr>
-              <w:t xml:space="preserve">Output signal after Reconstruction filter, </w:t>
-            </w:r>
-            <w:r>
-              <w:rPr>
-                <w:b/>
-                <w:sz w:val="16"/>
-                <w:szCs w:val="16"/>
-              </w:rPr>
-              <w:t>right </w:t>
-            </w:r>
-            <w:r>
-              <w:rPr>
-                <w:b/>
-                <w:sz w:val="16"/>
-                <w:szCs w:val="16"/>
-              </w:rPr>
-              <w:t>channel</w:t>
+              <w:t>Output signal after Reconstruction filter, right channel</w:t>
             </w:r>
           </w:p>
         </w:tc>
@@ -9560,23 +10063,7 @@
                 <w:sz w:val="16"/>
                 <w:szCs w:val="16"/>
               </w:rPr>
-              <w:t xml:space="preserve">Output signal after Headphone Amplifier, </w:t>
-            </w:r>
-            <w:r>
-              <w:rPr>
-                <w:b/>
-                <w:sz w:val="16"/>
-                <w:szCs w:val="16"/>
-              </w:rPr>
-              <w:t>right </w:t>
-            </w:r>
-            <w:r>
-              <w:rPr>
-                <w:b/>
-                <w:sz w:val="16"/>
-                <w:szCs w:val="16"/>
-              </w:rPr>
-              <w:t>channel</w:t>
+              <w:t>Output signal after Headphone Amplifier, right channel</w:t>
             </w:r>
           </w:p>
         </w:tc>
@@ -10876,7 +11363,6 @@
               </w:rPr>
               <w:t>Check resistor </w:t>
             </w:r>
-            <w:proofErr w:type="spellStart"/>
             <w:r>
               <w:rPr>
                 <w:b/>
@@ -10884,7 +11370,6 @@
               </w:rPr>
               <w:t>tol</w:t>
             </w:r>
-            <w:proofErr w:type="spellEnd"/>
             <w:r>
               <w:rPr>
                 <w:b/>
@@ -11208,16 +11693,8 @@
                 <w:sz w:val="16"/>
               </w:rPr>
               <w:br/>
-              <w:t>1mVpp 1kHz </w:t>
-            </w:r>
-            <w:proofErr w:type="spellStart"/>
-            <w:r>
-              <w:rPr>
-                <w:sz w:val="16"/>
-              </w:rPr>
-              <w:t>rect</w:t>
-            </w:r>
-            <w:proofErr w:type="spellEnd"/>
+              <w:t>1mVpp 1kHz rect</w:t>
+            </w:r>
             <w:r>
               <w:rPr>
                 <w:sz w:val="16"/>
@@ -11352,15 +11829,7 @@
         <w:t>, no short circuits, correct orientation of the components</w:t>
       </w:r>
       <w:r>
-        <w:t xml:space="preserve"> (electrolytic capacitors can explode with wrong </w:t>
-      </w:r>
-      <w:proofErr w:type="spellStart"/>
-      <w:r>
-        <w:t>polarisation</w:t>
-      </w:r>
-      <w:proofErr w:type="spellEnd"/>
-      <w:r>
-        <w:t>)</w:t>
+        <w:t xml:space="preserve"> (electrolytic capacitors can explode with wrong polarisation)</w:t>
       </w:r>
       <w:r>
         <w:t>, no missing components, correct values …</w:t>
@@ -11809,24 +12278,14 @@
         <w:tab w:val="clear" w:pos="9072"/>
       </w:tabs>
     </w:pPr>
-    <w:r>
-      <w:fldChar w:fldCharType="begin"/>
-    </w:r>
-    <w:r>
-      <w:instrText xml:space="preserve"> FILENAME \* MERGEFORMAT </w:instrText>
-    </w:r>
-    <w:r>
-      <w:fldChar w:fldCharType="separate"/>
-    </w:r>
-    <w:r>
-      <w:rPr>
-        <w:noProof/>
-      </w:rPr>
-      <w:t>HW_Testing.docx</w:t>
-    </w:r>
-    <w:r>
-      <w:fldChar w:fldCharType="end"/>
-    </w:r>
+    <w:fldSimple w:instr=" FILENAME \* MERGEFORMAT ">
+      <w:r>
+        <w:rPr>
+          <w:noProof/>
+        </w:rPr>
+        <w:t>HW_Testing.docx</w:t>
+      </w:r>
+    </w:fldSimple>
     <w:r>
       <w:ptab w:relativeTo="margin" w:alignment="center" w:leader="none"/>
     </w:r>
@@ -11851,34 +12310,16 @@
     <w:r>
       <w:t xml:space="preserve"> of </w:t>
     </w:r>
-    <w:r>
-      <w:fldChar w:fldCharType="begin"/>
-    </w:r>
-    <w:r>
-      <w:instrText xml:space="preserve"> NUMPAGES   \* MERGEFORMAT </w:instrText>
-    </w:r>
-    <w:r>
-      <w:fldChar w:fldCharType="separate"/>
-    </w:r>
-    <w:r>
-      <w:t>7</w:t>
-    </w:r>
-    <w:r>
-      <w:fldChar w:fldCharType="end"/>
-    </w:r>
+    <w:fldSimple w:instr=" NUMPAGES   \* MERGEFORMAT ">
+      <w:r>
+        <w:t>7</w:t>
+      </w:r>
+    </w:fldSimple>
     <w:r>
       <w:ptab w:relativeTo="margin" w:alignment="right" w:leader="none"/>
     </w:r>
     <w:r>
-      <w:t>Thomas Perri (</w:t>
-    </w:r>
-    <w:proofErr w:type="spellStart"/>
-    <w:r>
-      <w:t>perritho</w:t>
-    </w:r>
-    <w:proofErr w:type="spellEnd"/>
-    <w:r>
-      <w:t>)</w:t>
+      <w:t>Thomas Perri (perritho)</w:t>
     </w:r>
     <w:r>
       <w:br/>
@@ -14196,6 +14637,7 @@
   <w:style w:type="character" w:default="1" w:styleId="DefaultParagraphFont">
     <w:name w:val="Default Paragraph Font"/>
     <w:uiPriority w:val="1"/>
+    <w:semiHidden/>
     <w:unhideWhenUsed/>
   </w:style>
   <w:style w:type="table" w:default="1" w:styleId="TableNormal">

</xml_diff>

<commit_message>
hw report - done
</commit_message>
<xml_diff>
--- a/3_Technical_Documents/PCB/HW_Testing.docx
+++ b/3_Technical_Documents/PCB/HW_Testing.docx
@@ -244,7 +244,6 @@
               <w:noProof/>
               <w:kern w:val="2"/>
               <w:sz w:val="24"/>
-              <w:lang/>
               <w14:ligatures w14:val="standardContextual"/>
             </w:rPr>
           </w:pPr>
@@ -257,7 +256,7 @@
           <w:r>
             <w:fldChar w:fldCharType="separate"/>
           </w:r>
-          <w:hyperlink w:anchor="_Toc213915665" w:history="1">
+          <w:hyperlink w:anchor="_Toc213998205" w:history="1">
             <w:r>
               <w:rPr>
                 <w:rStyle w:val="Hyperlink"/>
@@ -272,7 +271,6 @@
                 <w:noProof/>
                 <w:kern w:val="2"/>
                 <w:sz w:val="24"/>
-                <w:lang/>
                 <w14:ligatures w14:val="standardContextual"/>
               </w:rPr>
               <w:tab/>
@@ -304,7 +302,7 @@
                 <w:noProof/>
                 <w:webHidden/>
               </w:rPr>
-              <w:instrText xml:space="preserve"> PAGEREF _Toc213915665 \h </w:instrText>
+              <w:instrText xml:space="preserve"> PAGEREF _Toc213998205 \h </w:instrText>
             </w:r>
             <w:r>
               <w:rPr>
@@ -343,11 +341,10 @@
               <w:noProof/>
               <w:kern w:val="2"/>
               <w:sz w:val="24"/>
-              <w:lang/>
               <w14:ligatures w14:val="standardContextual"/>
             </w:rPr>
           </w:pPr>
-          <w:hyperlink w:anchor="_Toc213915666" w:history="1">
+          <w:hyperlink w:anchor="_Toc213998206" w:history="1">
             <w:r>
               <w:rPr>
                 <w:rStyle w:val="Hyperlink"/>
@@ -362,7 +359,6 @@
                 <w:noProof/>
                 <w:kern w:val="2"/>
                 <w:sz w:val="24"/>
-                <w:lang/>
                 <w14:ligatures w14:val="standardContextual"/>
               </w:rPr>
               <w:tab/>
@@ -394,7 +390,7 @@
                 <w:noProof/>
                 <w:webHidden/>
               </w:rPr>
-              <w:instrText xml:space="preserve"> PAGEREF _Toc213915666 \h </w:instrText>
+              <w:instrText xml:space="preserve"> PAGEREF _Toc213998206 \h </w:instrText>
             </w:r>
             <w:r>
               <w:rPr>
@@ -433,11 +429,10 @@
               <w:noProof/>
               <w:kern w:val="2"/>
               <w:sz w:val="24"/>
-              <w:lang/>
               <w14:ligatures w14:val="standardContextual"/>
             </w:rPr>
           </w:pPr>
-          <w:hyperlink w:anchor="_Toc213915667" w:history="1">
+          <w:hyperlink w:anchor="_Toc213998207" w:history="1">
             <w:r>
               <w:rPr>
                 <w:rStyle w:val="Hyperlink"/>
@@ -452,7 +447,6 @@
                 <w:noProof/>
                 <w:kern w:val="2"/>
                 <w:sz w:val="24"/>
-                <w:lang/>
                 <w14:ligatures w14:val="standardContextual"/>
               </w:rPr>
               <w:tab/>
@@ -484,7 +478,7 @@
                 <w:noProof/>
                 <w:webHidden/>
               </w:rPr>
-              <w:instrText xml:space="preserve"> PAGEREF _Toc213915667 \h </w:instrText>
+              <w:instrText xml:space="preserve"> PAGEREF _Toc213998207 \h </w:instrText>
             </w:r>
             <w:r>
               <w:rPr>
@@ -523,11 +517,10 @@
               <w:noProof/>
               <w:kern w:val="2"/>
               <w:sz w:val="24"/>
-              <w:lang/>
               <w14:ligatures w14:val="standardContextual"/>
             </w:rPr>
           </w:pPr>
-          <w:hyperlink w:anchor="_Toc213915668" w:history="1">
+          <w:hyperlink w:anchor="_Toc213998208" w:history="1">
             <w:r>
               <w:rPr>
                 <w:rStyle w:val="Hyperlink"/>
@@ -542,7 +535,6 @@
                 <w:noProof/>
                 <w:kern w:val="2"/>
                 <w:sz w:val="24"/>
-                <w:lang/>
                 <w14:ligatures w14:val="standardContextual"/>
               </w:rPr>
               <w:tab/>
@@ -553,7 +545,7 @@
                 <w:rFonts w:eastAsiaTheme="majorEastAsia"/>
                 <w:noProof/>
               </w:rPr>
-              <w:t>Design for Test</w:t>
+              <w:t>Test Analysis</w:t>
             </w:r>
             <w:r>
               <w:rPr>
@@ -574,7 +566,7 @@
                 <w:noProof/>
                 <w:webHidden/>
               </w:rPr>
-              <w:instrText xml:space="preserve"> PAGEREF _Toc213915668 \h </w:instrText>
+              <w:instrText xml:space="preserve"> PAGEREF _Toc213998208 \h </w:instrText>
             </w:r>
             <w:r>
               <w:rPr>
@@ -594,367 +586,7 @@
                 <w:noProof/>
                 <w:webHidden/>
               </w:rPr>
-              <w:t>6</w:t>
-            </w:r>
-            <w:r>
-              <w:rPr>
-                <w:noProof/>
-                <w:webHidden/>
-              </w:rPr>
-              <w:fldChar w:fldCharType="end"/>
-            </w:r>
-          </w:hyperlink>
-        </w:p>
-        <w:p>
-          <w:pPr>
-            <w:pStyle w:val="TOC1"/>
-            <w:rPr>
-              <w:rFonts w:asciiTheme="minorHAnsi" w:eastAsiaTheme="minorEastAsia" w:hAnsiTheme="minorHAnsi" w:cstheme="minorBidi"/>
-              <w:noProof/>
-              <w:kern w:val="2"/>
-              <w:sz w:val="24"/>
-              <w:lang/>
-              <w14:ligatures w14:val="standardContextual"/>
-            </w:rPr>
-          </w:pPr>
-          <w:hyperlink w:anchor="_Toc213915669" w:history="1">
-            <w:r>
-              <w:rPr>
-                <w:rStyle w:val="Hyperlink"/>
-                <w:rFonts w:eastAsiaTheme="majorEastAsia"/>
-                <w:noProof/>
-              </w:rPr>
-              <w:t>5.</w:t>
-            </w:r>
-            <w:r>
-              <w:rPr>
-                <w:rFonts w:asciiTheme="minorHAnsi" w:eastAsiaTheme="minorEastAsia" w:hAnsiTheme="minorHAnsi" w:cstheme="minorBidi"/>
-                <w:noProof/>
-                <w:kern w:val="2"/>
-                <w:sz w:val="24"/>
-                <w:lang/>
-                <w14:ligatures w14:val="standardContextual"/>
-              </w:rPr>
-              <w:tab/>
-            </w:r>
-            <w:r>
-              <w:rPr>
-                <w:rStyle w:val="Hyperlink"/>
-                <w:rFonts w:eastAsiaTheme="majorEastAsia"/>
-                <w:noProof/>
-              </w:rPr>
-              <w:t>Test Plan</w:t>
-            </w:r>
-            <w:r>
-              <w:rPr>
-                <w:noProof/>
-                <w:webHidden/>
-              </w:rPr>
-              <w:tab/>
-            </w:r>
-            <w:r>
-              <w:rPr>
-                <w:noProof/>
-                <w:webHidden/>
-              </w:rPr>
-              <w:fldChar w:fldCharType="begin"/>
-            </w:r>
-            <w:r>
-              <w:rPr>
-                <w:noProof/>
-                <w:webHidden/>
-              </w:rPr>
-              <w:instrText xml:space="preserve"> PAGEREF _Toc213915669 \h </w:instrText>
-            </w:r>
-            <w:r>
-              <w:rPr>
-                <w:noProof/>
-                <w:webHidden/>
-              </w:rPr>
-            </w:r>
-            <w:r>
-              <w:rPr>
-                <w:noProof/>
-                <w:webHidden/>
-              </w:rPr>
-              <w:fldChar w:fldCharType="separate"/>
-            </w:r>
-            <w:r>
-              <w:rPr>
-                <w:noProof/>
-                <w:webHidden/>
-              </w:rPr>
-              <w:t>6</w:t>
-            </w:r>
-            <w:r>
-              <w:rPr>
-                <w:noProof/>
-                <w:webHidden/>
-              </w:rPr>
-              <w:fldChar w:fldCharType="end"/>
-            </w:r>
-          </w:hyperlink>
-        </w:p>
-        <w:p>
-          <w:pPr>
-            <w:pStyle w:val="TOC1"/>
-            <w:rPr>
-              <w:rFonts w:asciiTheme="minorHAnsi" w:eastAsiaTheme="minorEastAsia" w:hAnsiTheme="minorHAnsi" w:cstheme="minorBidi"/>
-              <w:noProof/>
-              <w:kern w:val="2"/>
-              <w:sz w:val="24"/>
-              <w:lang/>
-              <w14:ligatures w14:val="standardContextual"/>
-            </w:rPr>
-          </w:pPr>
-          <w:hyperlink w:anchor="_Toc213915670" w:history="1">
-            <w:r>
-              <w:rPr>
-                <w:rStyle w:val="Hyperlink"/>
-                <w:rFonts w:eastAsiaTheme="majorEastAsia"/>
-                <w:noProof/>
-              </w:rPr>
-              <w:t>6.</w:t>
-            </w:r>
-            <w:r>
-              <w:rPr>
-                <w:rFonts w:asciiTheme="minorHAnsi" w:eastAsiaTheme="minorEastAsia" w:hAnsiTheme="minorHAnsi" w:cstheme="minorBidi"/>
-                <w:noProof/>
-                <w:kern w:val="2"/>
-                <w:sz w:val="24"/>
-                <w:lang/>
-                <w14:ligatures w14:val="standardContextual"/>
-              </w:rPr>
-              <w:tab/>
-            </w:r>
-            <w:r>
-              <w:rPr>
-                <w:rStyle w:val="Hyperlink"/>
-                <w:rFonts w:eastAsiaTheme="majorEastAsia"/>
-                <w:noProof/>
-              </w:rPr>
-              <w:t>Run the Tests</w:t>
-            </w:r>
-            <w:r>
-              <w:rPr>
-                <w:noProof/>
-                <w:webHidden/>
-              </w:rPr>
-              <w:tab/>
-            </w:r>
-            <w:r>
-              <w:rPr>
-                <w:noProof/>
-                <w:webHidden/>
-              </w:rPr>
-              <w:fldChar w:fldCharType="begin"/>
-            </w:r>
-            <w:r>
-              <w:rPr>
-                <w:noProof/>
-                <w:webHidden/>
-              </w:rPr>
-              <w:instrText xml:space="preserve"> PAGEREF _Toc213915670 \h </w:instrText>
-            </w:r>
-            <w:r>
-              <w:rPr>
-                <w:noProof/>
-                <w:webHidden/>
-              </w:rPr>
-            </w:r>
-            <w:r>
-              <w:rPr>
-                <w:noProof/>
-                <w:webHidden/>
-              </w:rPr>
-              <w:fldChar w:fldCharType="separate"/>
-            </w:r>
-            <w:r>
-              <w:rPr>
-                <w:noProof/>
-                <w:webHidden/>
-              </w:rPr>
-              <w:t>7</w:t>
-            </w:r>
-            <w:r>
-              <w:rPr>
-                <w:noProof/>
-                <w:webHidden/>
-              </w:rPr>
-              <w:fldChar w:fldCharType="end"/>
-            </w:r>
-          </w:hyperlink>
-        </w:p>
-        <w:p>
-          <w:pPr>
-            <w:pStyle w:val="TOC1"/>
-            <w:rPr>
-              <w:rFonts w:asciiTheme="minorHAnsi" w:eastAsiaTheme="minorEastAsia" w:hAnsiTheme="minorHAnsi" w:cstheme="minorBidi"/>
-              <w:noProof/>
-              <w:kern w:val="2"/>
-              <w:sz w:val="24"/>
-              <w:lang/>
-              <w14:ligatures w14:val="standardContextual"/>
-            </w:rPr>
-          </w:pPr>
-          <w:hyperlink w:anchor="_Toc213915671" w:history="1">
-            <w:r>
-              <w:rPr>
-                <w:rStyle w:val="Hyperlink"/>
-                <w:rFonts w:eastAsiaTheme="majorEastAsia"/>
-                <w:noProof/>
-              </w:rPr>
-              <w:t>7.</w:t>
-            </w:r>
-            <w:r>
-              <w:rPr>
-                <w:rFonts w:asciiTheme="minorHAnsi" w:eastAsiaTheme="minorEastAsia" w:hAnsiTheme="minorHAnsi" w:cstheme="minorBidi"/>
-                <w:noProof/>
-                <w:kern w:val="2"/>
-                <w:sz w:val="24"/>
-                <w:lang/>
-                <w14:ligatures w14:val="standardContextual"/>
-              </w:rPr>
-              <w:tab/>
-            </w:r>
-            <w:r>
-              <w:rPr>
-                <w:rStyle w:val="Hyperlink"/>
-                <w:rFonts w:eastAsiaTheme="majorEastAsia"/>
-                <w:noProof/>
-              </w:rPr>
-              <w:t>Test Analysis</w:t>
-            </w:r>
-            <w:r>
-              <w:rPr>
-                <w:noProof/>
-                <w:webHidden/>
-              </w:rPr>
-              <w:tab/>
-            </w:r>
-            <w:r>
-              <w:rPr>
-                <w:noProof/>
-                <w:webHidden/>
-              </w:rPr>
-              <w:fldChar w:fldCharType="begin"/>
-            </w:r>
-            <w:r>
-              <w:rPr>
-                <w:noProof/>
-                <w:webHidden/>
-              </w:rPr>
-              <w:instrText xml:space="preserve"> PAGEREF _Toc213915671 \h </w:instrText>
-            </w:r>
-            <w:r>
-              <w:rPr>
-                <w:noProof/>
-                <w:webHidden/>
-              </w:rPr>
-            </w:r>
-            <w:r>
-              <w:rPr>
-                <w:noProof/>
-                <w:webHidden/>
-              </w:rPr>
-              <w:fldChar w:fldCharType="separate"/>
-            </w:r>
-            <w:r>
-              <w:rPr>
-                <w:noProof/>
-                <w:webHidden/>
-              </w:rPr>
-              <w:t>8</w:t>
-            </w:r>
-            <w:r>
-              <w:rPr>
-                <w:noProof/>
-                <w:webHidden/>
-              </w:rPr>
-              <w:fldChar w:fldCharType="end"/>
-            </w:r>
-          </w:hyperlink>
-        </w:p>
-        <w:p>
-          <w:pPr>
-            <w:pStyle w:val="TOC1"/>
-            <w:rPr>
-              <w:rFonts w:asciiTheme="minorHAnsi" w:eastAsiaTheme="minorEastAsia" w:hAnsiTheme="minorHAnsi" w:cstheme="minorBidi"/>
-              <w:noProof/>
-              <w:kern w:val="2"/>
-              <w:sz w:val="24"/>
-              <w:lang/>
-              <w14:ligatures w14:val="standardContextual"/>
-            </w:rPr>
-          </w:pPr>
-          <w:hyperlink w:anchor="_Toc213915672" w:history="1">
-            <w:r>
-              <w:rPr>
-                <w:rStyle w:val="Hyperlink"/>
-                <w:rFonts w:eastAsiaTheme="majorEastAsia"/>
-                <w:noProof/>
-              </w:rPr>
-              <w:t>8.</w:t>
-            </w:r>
-            <w:r>
-              <w:rPr>
-                <w:rFonts w:asciiTheme="minorHAnsi" w:eastAsiaTheme="minorEastAsia" w:hAnsiTheme="minorHAnsi" w:cstheme="minorBidi"/>
-                <w:noProof/>
-                <w:kern w:val="2"/>
-                <w:sz w:val="24"/>
-                <w:lang/>
-                <w14:ligatures w14:val="standardContextual"/>
-              </w:rPr>
-              <w:tab/>
-            </w:r>
-            <w:r>
-              <w:rPr>
-                <w:rStyle w:val="Hyperlink"/>
-                <w:rFonts w:eastAsiaTheme="majorEastAsia"/>
-                <w:noProof/>
-              </w:rPr>
-              <w:t>Test Documentation</w:t>
-            </w:r>
-            <w:r>
-              <w:rPr>
-                <w:noProof/>
-                <w:webHidden/>
-              </w:rPr>
-              <w:tab/>
-            </w:r>
-            <w:r>
-              <w:rPr>
-                <w:noProof/>
-                <w:webHidden/>
-              </w:rPr>
-              <w:fldChar w:fldCharType="begin"/>
-            </w:r>
-            <w:r>
-              <w:rPr>
-                <w:noProof/>
-                <w:webHidden/>
-              </w:rPr>
-              <w:instrText xml:space="preserve"> PAGEREF _Toc213915672 \h </w:instrText>
-            </w:r>
-            <w:r>
-              <w:rPr>
-                <w:noProof/>
-                <w:webHidden/>
-              </w:rPr>
-            </w:r>
-            <w:r>
-              <w:rPr>
-                <w:noProof/>
-                <w:webHidden/>
-              </w:rPr>
-              <w:fldChar w:fldCharType="separate"/>
-            </w:r>
-            <w:r>
-              <w:rPr>
-                <w:noProof/>
-                <w:webHidden/>
-              </w:rPr>
-              <w:t>8</w:t>
+              <w:t>5</w:t>
             </w:r>
             <w:r>
               <w:rPr>
@@ -995,7 +627,7 @@
       <w:pPr>
         <w:pStyle w:val="Heading1"/>
       </w:pPr>
-      <w:bookmarkStart w:id="1" w:name="_Toc213915665"/>
+      <w:bookmarkStart w:id="1" w:name="_Toc213998205"/>
       <w:r>
         <w:lastRenderedPageBreak/>
         <w:t>Test procedure</w:t>
@@ -1027,7 +659,7 @@
       <w:pPr>
         <w:pStyle w:val="Heading1"/>
       </w:pPr>
-      <w:bookmarkStart w:id="2" w:name="_Toc213915666"/>
+      <w:bookmarkStart w:id="2" w:name="_Toc213998206"/>
       <w:r>
         <w:t>Safety</w:t>
       </w:r>
@@ -1052,20 +684,7 @@
       </w:r>
     </w:p>
     <w:p>
-      <w:r>
-        <w:t>Work on a ESD protected surface to prevent ESD damage to components.</w:t>
-      </w:r>
-    </w:p>
-    <w:p>
       <w:pPr>
-        <w:spacing w:before="0" w:after="160" w:line="259" w:lineRule="auto"/>
-        <w:jc w:val="left"/>
-      </w:pPr>
-    </w:p>
-    <w:p>
-      <w:pPr>
-        <w:spacing w:before="0" w:after="160" w:line="259" w:lineRule="auto"/>
-        <w:jc w:val="left"/>
         <w:sectPr>
           <w:footerReference w:type="default" r:id="rId10"/>
           <w:pgSz w:w="11906" w:h="16838"/>
@@ -1074,6 +693,9 @@
           <w:docGrid w:linePitch="360"/>
         </w:sectPr>
       </w:pPr>
+      <w:r>
+        <w:t>Work on a ESD protected surface to prevent ESD damage to components.</w:t>
+      </w:r>
     </w:p>
     <w:p>
       <w:pPr>
@@ -1081,7 +703,7 @@
         <w:spacing w:before="0"/>
         <w:ind w:left="624" w:hanging="624"/>
       </w:pPr>
-      <w:bookmarkStart w:id="3" w:name="_Toc213915667"/>
+      <w:bookmarkStart w:id="3" w:name="_Toc213998207"/>
       <w:r>
         <w:lastRenderedPageBreak/>
         <w:t>Test Plan</w:t>
@@ -1095,11 +717,11 @@
         <w:tblLook w:val="04A0" w:firstRow="1" w:lastRow="0" w:firstColumn="1" w:lastColumn="0" w:noHBand="0" w:noVBand="1"/>
       </w:tblPr>
       <w:tblGrid>
-        <w:gridCol w:w="2912"/>
-        <w:gridCol w:w="2378"/>
-        <w:gridCol w:w="4588"/>
-        <w:gridCol w:w="963"/>
-        <w:gridCol w:w="2450"/>
+        <w:gridCol w:w="2889"/>
+        <w:gridCol w:w="2183"/>
+        <w:gridCol w:w="4822"/>
+        <w:gridCol w:w="972"/>
+        <w:gridCol w:w="2425"/>
         <w:gridCol w:w="1835"/>
       </w:tblGrid>
       <w:tr>
@@ -1165,7 +787,7 @@
         </w:tc>
         <w:tc>
           <w:tcPr>
-            <w:tcW w:w="0" w:type="auto"/>
+            <w:tcW w:w="2183" w:type="dxa"/>
             <w:tcBorders>
               <w:bottom w:val="single" w:sz="12" w:space="0" w:color="auto"/>
             </w:tcBorders>
@@ -1355,7 +977,7 @@
       <w:tr>
         <w:tc>
           <w:tcPr>
-            <w:tcW w:w="0" w:type="auto"/>
+            <w:tcW w:w="2183" w:type="dxa"/>
             <w:gridSpan w:val="6"/>
             <w:tcBorders>
               <w:top w:val="single" w:sz="12" w:space="0" w:color="auto"/>
@@ -1478,7 +1100,7 @@
         </w:tc>
         <w:tc>
           <w:tcPr>
-            <w:tcW w:w="2378" w:type="dxa"/>
+            <w:tcW w:w="2183" w:type="dxa"/>
             <w:tcBorders>
               <w:top w:val="single" w:sz="12" w:space="0" w:color="auto"/>
             </w:tcBorders>
@@ -1555,8 +1177,9 @@
                     <w:rFonts w:ascii="Cambria Math" w:hAnsi="Cambria Math"/>
                     <w:sz w:val="16"/>
                     <w:szCs w:val="16"/>
-                  </w:rPr>
-                  <m:t>3</m:t>
+                    <w:lang w:val="de-CH"/>
+                  </w:rPr>
+                  <m:t>32</m:t>
                 </m:r>
                 <m:r>
                   <m:rPr>
@@ -1960,7 +1583,7 @@
         </w:tc>
         <w:tc>
           <w:tcPr>
-            <w:tcW w:w="2378" w:type="dxa"/>
+            <w:tcW w:w="2183" w:type="dxa"/>
           </w:tcPr>
           <w:p>
             <w:pPr>
@@ -2031,8 +1654,9 @@
                     <w:rFonts w:ascii="Cambria Math" w:hAnsi="Cambria Math"/>
                     <w:sz w:val="16"/>
                     <w:szCs w:val="16"/>
-                  </w:rPr>
-                  <m:t>3</m:t>
+                    <w:lang w:val="de-CH"/>
+                  </w:rPr>
+                  <m:t>32</m:t>
                 </m:r>
                 <m:r>
                   <m:rPr>
@@ -2427,7 +2051,7 @@
         </w:tc>
         <w:tc>
           <w:tcPr>
-            <w:tcW w:w="2378" w:type="dxa"/>
+            <w:tcW w:w="2183" w:type="dxa"/>
           </w:tcPr>
           <w:p>
             <w:pPr>
@@ -2476,7 +2100,30 @@
                     <w:sz w:val="16"/>
                     <w:szCs w:val="16"/>
                   </w:rPr>
-                  <m:t>5</m:t>
+                  <m:t>4</m:t>
+                </m:r>
+                <m:r>
+                  <m:rPr>
+                    <m:sty m:val="bi"/>
+                  </m:rPr>
+                  <w:rPr>
+                    <w:rFonts w:ascii="Cambria Math" w:hAnsi="Cambria Math"/>
+                    <w:sz w:val="16"/>
+                    <w:szCs w:val="16"/>
+                    <w:lang w:val="de-CH"/>
+                  </w:rPr>
+                  <m:t>.</m:t>
+                </m:r>
+                <m:r>
+                  <m:rPr>
+                    <m:sty m:val="bi"/>
+                  </m:rPr>
+                  <w:rPr>
+                    <w:rFonts w:ascii="Cambria Math" w:hAnsi="Cambria Math"/>
+                    <w:sz w:val="16"/>
+                    <w:szCs w:val="16"/>
+                  </w:rPr>
+                  <m:t>99</m:t>
                 </m:r>
                 <m:r>
                   <m:rPr>
@@ -2874,7 +2521,7 @@
         </w:tc>
         <w:tc>
           <w:tcPr>
-            <w:tcW w:w="2378" w:type="dxa"/>
+            <w:tcW w:w="2183" w:type="dxa"/>
             <w:tcBorders>
               <w:bottom w:val="single" w:sz="4" w:space="0" w:color="auto"/>
             </w:tcBorders>
@@ -2931,6 +2578,29 @@
                     <w:szCs w:val="16"/>
                   </w:rPr>
                   <m:t>5</m:t>
+                </m:r>
+                <m:r>
+                  <m:rPr>
+                    <m:sty m:val="bi"/>
+                  </m:rPr>
+                  <w:rPr>
+                    <w:rFonts w:ascii="Cambria Math" w:hAnsi="Cambria Math"/>
+                    <w:sz w:val="16"/>
+                    <w:szCs w:val="16"/>
+                    <w:lang w:val="de-CH"/>
+                  </w:rPr>
+                  <m:t>.</m:t>
+                </m:r>
+                <m:r>
+                  <m:rPr>
+                    <m:sty m:val="bi"/>
+                  </m:rPr>
+                  <w:rPr>
+                    <w:rFonts w:ascii="Cambria Math" w:hAnsi="Cambria Math"/>
+                    <w:sz w:val="16"/>
+                    <w:szCs w:val="16"/>
+                  </w:rPr>
+                  <m:t>4</m:t>
                 </m:r>
                 <m:r>
                   <m:rPr>
@@ -3301,7 +2971,6 @@
                 <w:bCs/>
                 <w:sz w:val="16"/>
                 <w:szCs w:val="16"/>
-                <w:lang/>
               </w:rPr>
               <w:t>aking into account</w:t>
             </w:r>
@@ -3346,7 +3015,7 @@
         </w:tc>
         <w:tc>
           <w:tcPr>
-            <w:tcW w:w="2378" w:type="dxa"/>
+            <w:tcW w:w="2183" w:type="dxa"/>
             <w:tcBorders>
               <w:bottom w:val="single" w:sz="12" w:space="0" w:color="auto"/>
             </w:tcBorders>
@@ -3384,9 +3053,10 @@
               <w:spacing w:before="0"/>
               <w:jc w:val="center"/>
               <w:rPr>
-                <w:b/>
-                <w:sz w:val="16"/>
-                <w:szCs w:val="16"/>
+                <w:bCs/>
+                <w:sz w:val="16"/>
+                <w:szCs w:val="16"/>
+                <w:lang w:val="de-CH"/>
               </w:rPr>
             </w:pPr>
             <m:oMathPara>
@@ -3399,12 +3069,34 @@
                     <w:rFonts w:ascii="Cambria Math" w:hAnsi="Cambria Math"/>
                     <w:sz w:val="16"/>
                     <w:szCs w:val="16"/>
-                    <w:highlight w:val="yellow"/>
                   </w:rPr>
                   <m:t>5</m:t>
                 </m:r>
                 <m:r>
                   <m:rPr>
+                    <m:sty m:val="bi"/>
+                  </m:rPr>
+                  <w:rPr>
+                    <w:rFonts w:ascii="Cambria Math" w:hAnsi="Cambria Math"/>
+                    <w:sz w:val="16"/>
+                    <w:szCs w:val="16"/>
+                    <w:lang w:val="de-CH"/>
+                  </w:rPr>
+                  <m:t>.</m:t>
+                </m:r>
+                <m:r>
+                  <m:rPr>
+                    <m:sty m:val="bi"/>
+                  </m:rPr>
+                  <w:rPr>
+                    <w:rFonts w:ascii="Cambria Math" w:hAnsi="Cambria Math"/>
+                    <w:sz w:val="16"/>
+                    <w:szCs w:val="16"/>
+                  </w:rPr>
+                  <m:t>51</m:t>
+                </m:r>
+                <m:r>
+                  <m:rPr>
                     <m:nor/>
                   </m:rPr>
                   <w:rPr>
@@ -3412,11 +3104,275 @@
                     <w:b/>
                     <w:sz w:val="16"/>
                     <w:szCs w:val="16"/>
-                    <w:highlight w:val="yellow"/>
+                    <w:lang w:val="de-CH"/>
                   </w:rPr>
                   <m:t>V</m:t>
                 </m:r>
                 <m:r>
+                  <w:rPr>
+                    <w:rFonts w:ascii="Cambria Math" w:hAnsi="Cambria Math"/>
+                    <w:sz w:val="16"/>
+                    <w:szCs w:val="16"/>
+                    <w:lang w:val="de-CH"/>
+                  </w:rPr>
+                  <m:t xml:space="preserve"> | </m:t>
+                </m:r>
+                <m:d>
+                  <m:dPr>
+                    <m:ctrlPr>
+                      <w:rPr>
+                        <w:rFonts w:ascii="Cambria Math" w:hAnsi="Cambria Math"/>
+                        <w:bCs/>
+                        <w:i/>
+                        <w:sz w:val="16"/>
+                        <w:szCs w:val="16"/>
+                      </w:rPr>
+                    </m:ctrlPr>
+                  </m:dPr>
+                  <m:e>
+                    <m:f>
+                      <m:fPr>
+                        <m:ctrlPr>
+                          <w:rPr>
+                            <w:rFonts w:ascii="Cambria Math" w:hAnsi="Cambria Math"/>
+                            <w:bCs/>
+                            <w:i/>
+                            <w:sz w:val="16"/>
+                            <w:szCs w:val="16"/>
+                          </w:rPr>
+                        </m:ctrlPr>
+                      </m:fPr>
+                      <m:num>
+                        <m:r>
+                          <w:rPr>
+                            <w:rFonts w:ascii="Cambria Math" w:hAnsi="Cambria Math"/>
+                            <w:sz w:val="16"/>
+                            <w:szCs w:val="16"/>
+                            <w:lang w:val="de-CH"/>
+                          </w:rPr>
+                          <m:t>301</m:t>
+                        </m:r>
+                        <m:r>
+                          <m:rPr>
+                            <m:nor/>
+                          </m:rPr>
+                          <w:rPr>
+                            <w:rFonts w:ascii="Cambria Math" w:hAnsi="Cambria Math"/>
+                            <w:bCs/>
+                            <w:sz w:val="16"/>
+                            <w:szCs w:val="16"/>
+                            <w:lang w:val="de-CH"/>
+                          </w:rPr>
+                          <m:t>k</m:t>
+                        </m:r>
+                        <m:r>
+                          <m:rPr>
+                            <m:nor/>
+                          </m:rPr>
+                          <w:rPr>
+                            <w:rFonts w:ascii="Cambria Math" w:hAnsi="Cambria Math"/>
+                            <w:bCs/>
+                            <w:sz w:val="16"/>
+                            <w:szCs w:val="16"/>
+                          </w:rPr>
+                          <m:t>Ω</m:t>
+                        </m:r>
+                        <m:r>
+                          <w:rPr>
+                            <w:rFonts w:ascii="Cambria Math" w:hAnsi="Cambria Math"/>
+                            <w:sz w:val="16"/>
+                            <w:szCs w:val="16"/>
+                            <w:lang w:val="de-CH"/>
+                          </w:rPr>
+                          <m:t xml:space="preserve"> </m:t>
+                        </m:r>
+                        <m:d>
+                          <m:dPr>
+                            <m:ctrlPr>
+                              <w:rPr>
+                                <w:rFonts w:ascii="Cambria Math" w:hAnsi="Cambria Math"/>
+                                <w:bCs/>
+                                <w:i/>
+                                <w:sz w:val="16"/>
+                                <w:szCs w:val="16"/>
+                                <w:lang w:val="de-CH"/>
+                              </w:rPr>
+                            </m:ctrlPr>
+                          </m:dPr>
+                          <m:e>
+                            <m:r>
+                              <w:rPr>
+                                <w:rFonts w:ascii="Cambria Math" w:hAnsi="Cambria Math"/>
+                                <w:sz w:val="16"/>
+                                <w:szCs w:val="16"/>
+                                <w:lang w:val="de-CH"/>
+                              </w:rPr>
+                              <m:t>±1%</m:t>
+                            </m:r>
+                          </m:e>
+                        </m:d>
+                      </m:num>
+                      <m:den>
+                        <m:r>
+                          <w:rPr>
+                            <w:rFonts w:ascii="Cambria Math" w:hAnsi="Cambria Math"/>
+                            <w:sz w:val="16"/>
+                            <w:szCs w:val="16"/>
+                            <w:lang w:val="de-CH"/>
+                          </w:rPr>
+                          <m:t>30</m:t>
+                        </m:r>
+                        <m:r>
+                          <m:rPr>
+                            <m:nor/>
+                          </m:rPr>
+                          <w:rPr>
+                            <w:rFonts w:ascii="Cambria Math" w:hAnsi="Cambria Math"/>
+                            <w:bCs/>
+                            <w:sz w:val="16"/>
+                            <w:szCs w:val="16"/>
+                            <w:lang w:val="de-CH"/>
+                          </w:rPr>
+                          <m:t>k</m:t>
+                        </m:r>
+                        <m:r>
+                          <m:rPr>
+                            <m:nor/>
+                          </m:rPr>
+                          <w:rPr>
+                            <w:rFonts w:ascii="Cambria Math" w:hAnsi="Cambria Math"/>
+                            <w:bCs/>
+                            <w:sz w:val="16"/>
+                            <w:szCs w:val="16"/>
+                          </w:rPr>
+                          <m:t>Ω</m:t>
+                        </m:r>
+                        <m:r>
+                          <w:rPr>
+                            <w:rFonts w:ascii="Cambria Math" w:hAnsi="Cambria Math"/>
+                            <w:sz w:val="16"/>
+                            <w:szCs w:val="16"/>
+                            <w:lang w:val="de-CH"/>
+                          </w:rPr>
+                          <m:t xml:space="preserve"> </m:t>
+                        </m:r>
+                        <m:d>
+                          <m:dPr>
+                            <m:ctrlPr>
+                              <w:rPr>
+                                <w:rFonts w:ascii="Cambria Math" w:hAnsi="Cambria Math"/>
+                                <w:bCs/>
+                                <w:i/>
+                                <w:sz w:val="16"/>
+                                <w:szCs w:val="16"/>
+                                <w:lang w:val="de-CH"/>
+                              </w:rPr>
+                            </m:ctrlPr>
+                          </m:dPr>
+                          <m:e>
+                            <m:r>
+                              <w:rPr>
+                                <w:rFonts w:ascii="Cambria Math" w:hAnsi="Cambria Math"/>
+                                <w:sz w:val="16"/>
+                                <w:szCs w:val="16"/>
+                                <w:lang w:val="de-CH"/>
+                              </w:rPr>
+                              <m:t>±1%</m:t>
+                            </m:r>
+                          </m:e>
+                        </m:d>
+                      </m:den>
+                    </m:f>
+                    <m:r>
+                      <w:rPr>
+                        <w:rFonts w:ascii="Cambria Math" w:hAnsi="Cambria Math"/>
+                        <w:sz w:val="16"/>
+                        <w:szCs w:val="16"/>
+                        <w:lang w:val="de-CH"/>
+                      </w:rPr>
+                      <m:t>+1</m:t>
+                    </m:r>
+                  </m:e>
+                </m:d>
+                <m:r>
+                  <w:rPr>
+                    <w:rFonts w:ascii="Cambria Math" w:hAnsi="Cambria Math"/>
+                    <w:sz w:val="16"/>
+                    <w:szCs w:val="16"/>
+                    <w:lang w:val="de-CH"/>
+                  </w:rPr>
+                  <m:t>⋅500</m:t>
+                </m:r>
+                <m:r>
+                  <m:rPr>
+                    <m:nor/>
+                  </m:rPr>
+                  <w:rPr>
+                    <w:rFonts w:ascii="Cambria Math" w:hAnsi="Cambria Math"/>
+                    <w:bCs/>
+                    <w:sz w:val="16"/>
+                    <w:szCs w:val="16"/>
+                    <w:lang w:val="de-CH"/>
+                  </w:rPr>
+                  <m:t>mV</m:t>
+                </m:r>
+                <m:r>
+                  <w:rPr>
+                    <w:rFonts w:ascii="Cambria Math" w:hAnsi="Cambria Math"/>
+                    <w:sz w:val="16"/>
+                    <w:szCs w:val="16"/>
+                    <w:lang w:val="de-CH"/>
+                  </w:rPr>
+                  <m:t xml:space="preserve"> </m:t>
+                </m:r>
+                <m:d>
+                  <m:dPr>
+                    <m:ctrlPr>
+                      <w:rPr>
+                        <w:rFonts w:ascii="Cambria Math" w:hAnsi="Cambria Math"/>
+                        <w:bCs/>
+                        <w:i/>
+                        <w:sz w:val="16"/>
+                        <w:szCs w:val="16"/>
+                        <w:lang w:val="de-CH"/>
+                      </w:rPr>
+                    </m:ctrlPr>
+                  </m:dPr>
+                  <m:e>
+                    <m:r>
+                      <w:rPr>
+                        <w:rFonts w:ascii="Cambria Math" w:hAnsi="Cambria Math"/>
+                        <w:sz w:val="16"/>
+                        <w:szCs w:val="16"/>
+                        <w:lang w:val="de-CH"/>
+                      </w:rPr>
+                      <m:t>±15</m:t>
+                    </m:r>
+                    <m:r>
+                      <m:rPr>
+                        <m:nor/>
+                      </m:rPr>
+                      <w:rPr>
+                        <w:rFonts w:ascii="Cambria Math" w:hAnsi="Cambria Math"/>
+                        <w:bCs/>
+                        <w:sz w:val="16"/>
+                        <w:szCs w:val="16"/>
+                        <w:lang w:val="de-CH"/>
+                      </w:rPr>
+                      <m:t>mV</m:t>
+                    </m:r>
+                  </m:e>
+                </m:d>
+                <m:r>
+                  <w:rPr>
+                    <w:rFonts w:ascii="Cambria Math" w:hAnsi="Cambria Math"/>
+                    <w:sz w:val="16"/>
+                    <w:szCs w:val="16"/>
+                    <w:lang w:val="de-CH"/>
+                  </w:rPr>
+                  <m:t>=</m:t>
+                </m:r>
+                <m:r>
                   <m:rPr>
                     <m:sty m:val="bi"/>
                   </m:rPr>
@@ -3424,9 +3380,47 @@
                     <w:rFonts w:ascii="Cambria Math" w:hAnsi="Cambria Math"/>
                     <w:sz w:val="16"/>
                     <w:szCs w:val="16"/>
-                    <w:highlight w:val="yellow"/>
-                  </w:rPr>
-                  <m:t xml:space="preserve"> |…</m:t>
+                    <w:lang w:val="de-CH"/>
+                  </w:rPr>
+                  <m:t>5.25</m:t>
+                </m:r>
+                <m:r>
+                  <m:rPr>
+                    <m:nor/>
+                  </m:rPr>
+                  <w:rPr>
+                    <w:rFonts w:ascii="Cambria Math" w:hAnsi="Cambria Math"/>
+                    <w:b/>
+                    <w:sz w:val="16"/>
+                    <w:szCs w:val="16"/>
+                    <w:lang w:val="de-CH"/>
+                  </w:rPr>
+                  <m:t>V</m:t>
+                </m:r>
+                <m:r>
+                  <m:rPr>
+                    <m:sty m:val="bi"/>
+                  </m:rPr>
+                  <w:rPr>
+                    <w:rFonts w:ascii="Cambria Math" w:hAnsi="Cambria Math"/>
+                    <w:sz w:val="16"/>
+                    <w:szCs w:val="16"/>
+                    <w:lang w:val="de-CH"/>
+                  </w:rPr>
+                  <m:t>…5.78</m:t>
+                </m:r>
+                <m:r>
+                  <m:rPr>
+                    <m:nor/>
+                  </m:rPr>
+                  <w:rPr>
+                    <w:rFonts w:ascii="Cambria Math" w:hAnsi="Cambria Math"/>
+                    <w:b/>
+                    <w:sz w:val="16"/>
+                    <w:szCs w:val="16"/>
+                    <w:lang w:val="de-CH"/>
+                  </w:rPr>
+                  <m:t>V</m:t>
                 </m:r>
               </m:oMath>
             </m:oMathPara>
@@ -3495,6 +3489,22 @@
                 <w:szCs w:val="16"/>
               </w:rPr>
             </w:pPr>
+            <w:r>
+              <w:rPr>
+                <w:bCs/>
+                <w:sz w:val="16"/>
+                <w:szCs w:val="16"/>
+              </w:rPr>
+              <w:t>In range →</w:t>
+            </w:r>
+            <w:r>
+              <w:rPr>
+                <w:b/>
+                <w:sz w:val="16"/>
+                <w:szCs w:val="16"/>
+              </w:rPr>
+              <w:t xml:space="preserve"> passed</w:t>
+            </w:r>
           </w:p>
         </w:tc>
         <w:tc>
@@ -3547,7 +3557,7 @@
         </w:tc>
         <w:tc>
           <w:tcPr>
-            <w:tcW w:w="2378" w:type="dxa"/>
+            <w:tcW w:w="2183" w:type="dxa"/>
             <w:tcBorders>
               <w:top w:val="single" w:sz="12" w:space="0" w:color="auto"/>
             </w:tcBorders>
@@ -3971,7 +3981,7 @@
         </w:tc>
         <w:tc>
           <w:tcPr>
-            <w:tcW w:w="2378" w:type="dxa"/>
+            <w:tcW w:w="2183" w:type="dxa"/>
           </w:tcPr>
           <w:p>
             <w:pPr>
@@ -4364,7 +4374,7 @@
         </w:tc>
         <w:tc>
           <w:tcPr>
-            <w:tcW w:w="2378" w:type="dxa"/>
+            <w:tcW w:w="2183" w:type="dxa"/>
           </w:tcPr>
           <w:p>
             <w:pPr>
@@ -4760,7 +4770,7 @@
         </w:tc>
         <w:tc>
           <w:tcPr>
-            <w:tcW w:w="2378" w:type="dxa"/>
+            <w:tcW w:w="2183" w:type="dxa"/>
             <w:tcBorders>
               <w:bottom w:val="single" w:sz="4" w:space="0" w:color="auto"/>
             </w:tcBorders>
@@ -5019,7 +5029,7 @@
         </w:tc>
         <w:tc>
           <w:tcPr>
-            <w:tcW w:w="2378" w:type="dxa"/>
+            <w:tcW w:w="2183" w:type="dxa"/>
             <w:tcBorders>
               <w:bottom w:val="single" w:sz="12" w:space="0" w:color="auto"/>
             </w:tcBorders>
@@ -5104,6 +5114,14 @@
                         <w:szCs w:val="16"/>
                       </w:rPr>
                       <m:t>⋅0.1</m:t>
+                    </m:r>
+                    <m:r>
+                      <w:rPr>
+                        <w:rFonts w:ascii="Cambria Math" w:hAnsi="Cambria Math"/>
+                        <w:sz w:val="16"/>
+                        <w:szCs w:val="16"/>
+                      </w:rPr>
+                      <m:t>8</m:t>
                     </m:r>
                   </m:num>
                   <m:den>
@@ -5166,7 +5184,40 @@
                     <w:sz w:val="16"/>
                     <w:szCs w:val="16"/>
                   </w:rPr>
-                  <m:t xml:space="preserve"> &lt;10.0</m:t>
+                  <m:t xml:space="preserve"> &lt;1</m:t>
+                </m:r>
+                <m:r>
+                  <m:rPr>
+                    <m:sty m:val="bi"/>
+                  </m:rPr>
+                  <w:rPr>
+                    <w:rFonts w:ascii="Cambria Math" w:hAnsi="Cambria Math"/>
+                    <w:sz w:val="16"/>
+                    <w:szCs w:val="16"/>
+                  </w:rPr>
+                  <m:t>8</m:t>
+                </m:r>
+                <m:r>
+                  <m:rPr>
+                    <m:sty m:val="bi"/>
+                  </m:rPr>
+                  <w:rPr>
+                    <w:rFonts w:ascii="Cambria Math" w:hAnsi="Cambria Math"/>
+                    <w:sz w:val="16"/>
+                    <w:szCs w:val="16"/>
+                  </w:rPr>
+                  <m:t>.</m:t>
+                </m:r>
+                <m:r>
+                  <m:rPr>
+                    <m:sty m:val="bi"/>
+                  </m:rPr>
+                  <w:rPr>
+                    <w:rFonts w:ascii="Cambria Math" w:hAnsi="Cambria Math"/>
+                    <w:sz w:val="16"/>
+                    <w:szCs w:val="16"/>
+                  </w:rPr>
+                  <m:t>3</m:t>
                 </m:r>
                 <m:r>
                   <m:rPr>
@@ -5344,7 +5395,7 @@
         </w:tc>
         <w:tc>
           <w:tcPr>
-            <w:tcW w:w="2378" w:type="dxa"/>
+            <w:tcW w:w="2183" w:type="dxa"/>
             <w:tcBorders>
               <w:top w:val="single" w:sz="12" w:space="0" w:color="auto"/>
             </w:tcBorders>
@@ -5541,13 +5592,45 @@
                 <w:sz w:val="16"/>
                 <w:szCs w:val="16"/>
               </w:rPr>
-              <w:t>Current on Power in at 5V, +3V0 disconnected</w:t>
-            </w:r>
-          </w:p>
-        </w:tc>
-        <w:tc>
-          <w:tcPr>
-            <w:tcW w:w="2378" w:type="dxa"/>
+              <w:t>Current on Power in at 5V,</w:t>
+            </w:r>
+            <w:r>
+              <w:rPr>
+                <w:b/>
+                <w:sz w:val="16"/>
+                <w:szCs w:val="16"/>
+              </w:rPr>
+              <w:t xml:space="preserve"> </w:t>
+            </w:r>
+            <w:r>
+              <w:rPr>
+                <w:b/>
+                <w:sz w:val="16"/>
+                <w:szCs w:val="16"/>
+              </w:rPr>
+              <w:t>+3V0</w:t>
+            </w:r>
+            <w:r>
+              <w:rPr>
+                <w:b/>
+                <w:sz w:val="16"/>
+                <w:szCs w:val="16"/>
+              </w:rPr>
+              <w:t> </w:t>
+            </w:r>
+            <w:r>
+              <w:rPr>
+                <w:b/>
+                <w:sz w:val="16"/>
+                <w:szCs w:val="16"/>
+              </w:rPr>
+              <w:t>disconnected</w:t>
+            </w:r>
+          </w:p>
+        </w:tc>
+        <w:tc>
+          <w:tcPr>
+            <w:tcW w:w="2183" w:type="dxa"/>
             <w:tcBorders>
               <w:bottom w:val="single" w:sz="4" w:space="0" w:color="auto"/>
             </w:tcBorders>
@@ -5782,7 +5865,7 @@
         </w:tc>
         <w:tc>
           <w:tcPr>
-            <w:tcW w:w="2378" w:type="dxa"/>
+            <w:tcW w:w="2183" w:type="dxa"/>
             <w:tcBorders>
               <w:bottom w:val="single" w:sz="12" w:space="0" w:color="auto"/>
             </w:tcBorders>
@@ -5827,6 +5910,109 @@
             </w:pPr>
             <m:oMathPara>
               <m:oMath>
+                <m:f>
+                  <m:fPr>
+                    <m:ctrlPr>
+                      <w:rPr>
+                        <w:rFonts w:ascii="Cambria Math" w:hAnsi="Cambria Math"/>
+                        <w:bCs/>
+                        <w:i/>
+                        <w:sz w:val="16"/>
+                        <w:szCs w:val="16"/>
+                      </w:rPr>
+                    </m:ctrlPr>
+                  </m:fPr>
+                  <m:num>
+                    <m:r>
+                      <w:rPr>
+                        <w:rFonts w:ascii="Cambria Math" w:hAnsi="Cambria Math"/>
+                        <w:sz w:val="16"/>
+                        <w:szCs w:val="16"/>
+                      </w:rPr>
+                      <m:t>1</m:t>
+                    </m:r>
+                    <m:r>
+                      <m:rPr>
+                        <m:nor/>
+                      </m:rPr>
+                      <w:rPr>
+                        <w:rFonts w:ascii="Cambria Math" w:hAnsi="Cambria Math"/>
+                        <w:bCs/>
+                        <w:sz w:val="16"/>
+                        <w:szCs w:val="16"/>
+                      </w:rPr>
+                      <m:t>mV</m:t>
+                    </m:r>
+                  </m:num>
+                  <m:den>
+                    <m:f>
+                      <m:fPr>
+                        <m:type m:val="lin"/>
+                        <m:ctrlPr>
+                          <w:rPr>
+                            <w:rFonts w:ascii="Cambria Math" w:hAnsi="Cambria Math"/>
+                            <w:bCs/>
+                            <w:i/>
+                            <w:sz w:val="16"/>
+                            <w:szCs w:val="16"/>
+                          </w:rPr>
+                        </m:ctrlPr>
+                      </m:fPr>
+                      <m:num>
+                        <m:r>
+                          <w:rPr>
+                            <w:rFonts w:ascii="Cambria Math" w:hAnsi="Cambria Math"/>
+                            <w:sz w:val="16"/>
+                            <w:szCs w:val="16"/>
+                          </w:rPr>
+                          <m:t>5</m:t>
+                        </m:r>
+                        <m:r>
+                          <m:rPr>
+                            <m:nor/>
+                          </m:rPr>
+                          <w:rPr>
+                            <w:rFonts w:ascii="Cambria Math" w:hAnsi="Cambria Math"/>
+                            <w:bCs/>
+                            <w:sz w:val="16"/>
+                            <w:szCs w:val="16"/>
+                          </w:rPr>
+                          <m:t>V</m:t>
+                        </m:r>
+                      </m:num>
+                      <m:den>
+                        <m:r>
+                          <w:rPr>
+                            <w:rFonts w:ascii="Cambria Math" w:hAnsi="Cambria Math"/>
+                            <w:sz w:val="16"/>
+                            <w:szCs w:val="16"/>
+                          </w:rPr>
+                          <m:t>180</m:t>
+                        </m:r>
+                        <m:r>
+                          <m:rPr>
+                            <m:nor/>
+                          </m:rPr>
+                          <w:rPr>
+                            <w:rFonts w:ascii="Cambria Math" w:hAnsi="Cambria Math"/>
+                            <w:bCs/>
+                            <w:sz w:val="16"/>
+                            <w:szCs w:val="16"/>
+                          </w:rPr>
+                          <m:t>mA</m:t>
+                        </m:r>
+                      </m:den>
+                    </m:f>
+                  </m:den>
+                </m:f>
+                <m:r>
+                  <w:rPr>
+                    <w:rFonts w:ascii="Cambria Math" w:hAnsi="Cambria Math"/>
+                    <w:sz w:val="16"/>
+                    <w:szCs w:val="16"/>
+                  </w:rPr>
+                  <m:t>→</m:t>
+                </m:r>
                 <m:r>
                   <m:rPr>
                     <m:sty m:val="bi"/>
@@ -5835,9 +6021,20 @@
                     <w:rFonts w:ascii="Cambria Math" w:hAnsi="Cambria Math"/>
                     <w:sz w:val="16"/>
                     <w:szCs w:val="16"/>
-                    <w:highlight w:val="yellow"/>
-                  </w:rPr>
-                  <m:t>…</m:t>
+                  </w:rPr>
+                  <m:t>&lt;36</m:t>
+                </m:r>
+                <m:r>
+                  <m:rPr>
+                    <m:nor/>
+                  </m:rPr>
+                  <w:rPr>
+                    <w:rFonts w:ascii="Cambria Math" w:hAnsi="Cambria Math"/>
+                    <w:b/>
+                    <w:sz w:val="16"/>
+                    <w:szCs w:val="16"/>
+                  </w:rPr>
+                  <m:t>μV</m:t>
                 </m:r>
               </m:oMath>
             </m:oMathPara>
@@ -5934,6 +6131,39 @@
                 <w:szCs w:val="16"/>
               </w:rPr>
             </w:pPr>
+            <w:r>
+              <w:rPr>
+                <w:bCs/>
+                <w:sz w:val="16"/>
+                <w:szCs w:val="16"/>
+              </w:rPr>
+              <w:t>Out of range, considered acceptable</w:t>
+            </w:r>
+            <w:r>
+              <w:rPr>
+                <w:bCs/>
+                <w:sz w:val="16"/>
+                <w:szCs w:val="16"/>
+                <w:vertAlign w:val="superscript"/>
+              </w:rPr>
+              <w:t>*)</w:t>
+            </w:r>
+            <w:r>
+              <w:rPr>
+                <w:bCs/>
+                <w:sz w:val="16"/>
+                <w:szCs w:val="16"/>
+              </w:rPr>
+              <w:t xml:space="preserve"> → </w:t>
+            </w:r>
+            <w:r>
+              <w:rPr>
+                <w:b/>
+                <w:sz w:val="16"/>
+                <w:szCs w:val="16"/>
+              </w:rPr>
+              <w:t>passed</w:t>
+            </w:r>
           </w:p>
         </w:tc>
         <w:tc>
@@ -5953,6 +6183,54 @@
                 <w:szCs w:val="16"/>
               </w:rPr>
             </w:pPr>
+            <w:r>
+              <w:rPr>
+                <w:bCs/>
+                <w:sz w:val="16"/>
+                <w:szCs w:val="16"/>
+              </w:rPr>
+              <w:t xml:space="preserve">*) </w:t>
+            </w:r>
+            <w:r>
+              <w:rPr>
+                <w:bCs/>
+                <w:sz w:val="16"/>
+                <w:szCs w:val="16"/>
+              </w:rPr>
+              <w:t>M</w:t>
+            </w:r>
+            <w:r>
+              <w:rPr>
+                <w:bCs/>
+                <w:sz w:val="16"/>
+                <w:szCs w:val="16"/>
+              </w:rPr>
+              <w:t xml:space="preserve">easurement method </w:t>
+            </w:r>
+            <w:r>
+              <w:rPr>
+                <w:bCs/>
+                <w:sz w:val="16"/>
+                <w:szCs w:val="16"/>
+              </w:rPr>
+              <w:t>provide</w:t>
+            </w:r>
+            <w:r>
+              <w:rPr>
+                <w:bCs/>
+                <w:sz w:val="16"/>
+                <w:szCs w:val="16"/>
+              </w:rPr>
+              <w:t>s</w:t>
+            </w:r>
+            <w:r>
+              <w:rPr>
+                <w:bCs/>
+                <w:sz w:val="16"/>
+                <w:szCs w:val="16"/>
+              </w:rPr>
+              <w:t xml:space="preserve"> not enough accuracy</w:t>
+            </w:r>
           </w:p>
         </w:tc>
       </w:tr>
@@ -5986,7 +6264,7 @@
         </w:tc>
         <w:tc>
           <w:tcPr>
-            <w:tcW w:w="2378" w:type="dxa"/>
+            <w:tcW w:w="2183" w:type="dxa"/>
             <w:tcBorders>
               <w:top w:val="single" w:sz="12" w:space="0" w:color="auto"/>
             </w:tcBorders>
@@ -6240,7 +6518,7 @@
         </w:tc>
         <w:tc>
           <w:tcPr>
-            <w:tcW w:w="2378" w:type="dxa"/>
+            <w:tcW w:w="2183" w:type="dxa"/>
           </w:tcPr>
           <w:p>
             <w:pPr>
@@ -6481,6 +6759,24 @@
             <w:r>
               <w:rPr>
                 <w:bCs/>
+                <w:i/>
+                <w:iCs/>
+                <w:sz w:val="16"/>
+                <w:szCs w:val="16"/>
+              </w:rPr>
+              <w:t>Note</w:t>
+            </w:r>
+            <w:r>
+              <w:rPr>
+                <w:bCs/>
+                <w:sz w:val="16"/>
+                <w:szCs w:val="16"/>
+              </w:rPr>
+              <w:t xml:space="preserve">: </w:t>
+            </w:r>
+            <w:r>
+              <w:rPr>
+                <w:bCs/>
                 <w:sz w:val="16"/>
                 <w:szCs w:val="16"/>
               </w:rPr>
@@ -6516,7 +6812,7 @@
         </w:tc>
         <w:tc>
           <w:tcPr>
-            <w:tcW w:w="2378" w:type="dxa"/>
+            <w:tcW w:w="2183" w:type="dxa"/>
           </w:tcPr>
           <w:p>
             <w:pPr>
@@ -6784,7 +7080,7 @@
         </w:tc>
         <w:tc>
           <w:tcPr>
-            <w:tcW w:w="2378" w:type="dxa"/>
+            <w:tcW w:w="2183" w:type="dxa"/>
           </w:tcPr>
           <w:p>
             <w:pPr>
@@ -7055,7 +7351,7 @@
         </w:tc>
         <w:tc>
           <w:tcPr>
-            <w:tcW w:w="2378" w:type="dxa"/>
+            <w:tcW w:w="2183" w:type="dxa"/>
             <w:tcBorders>
               <w:bottom w:val="single" w:sz="4" w:space="0" w:color="auto"/>
             </w:tcBorders>
@@ -7335,13 +7631,14 @@
                 <w:sz w:val="16"/>
                 <w:szCs w:val="16"/>
               </w:rPr>
+              <w:lastRenderedPageBreak/>
               <w:t>Preamp reference voltage (U4)</w:t>
             </w:r>
           </w:p>
         </w:tc>
         <w:tc>
           <w:tcPr>
-            <w:tcW w:w="2378" w:type="dxa"/>
+            <w:tcW w:w="2183" w:type="dxa"/>
             <w:tcBorders>
               <w:bottom w:val="single" w:sz="12" w:space="0" w:color="auto"/>
             </w:tcBorders>
@@ -7546,7 +7843,7 @@
                         <w:sz w:val="16"/>
                         <w:szCs w:val="16"/>
                       </w:rPr>
-                      <m:t>⋅</m:t>
+                      <m:t>+</m:t>
                     </m:r>
                     <m:d>
                       <m:dPr>
@@ -7779,14 +8076,13 @@
                 <w:sz w:val="16"/>
                 <w:szCs w:val="16"/>
               </w:rPr>
-              <w:lastRenderedPageBreak/>
               <w:t>Line in signal after Anti-Aliasing filter, left channel</w:t>
             </w:r>
           </w:p>
         </w:tc>
         <w:tc>
           <w:tcPr>
-            <w:tcW w:w="2378" w:type="dxa"/>
+            <w:tcW w:w="2183" w:type="dxa"/>
             <w:tcBorders>
               <w:top w:val="single" w:sz="12" w:space="0" w:color="auto"/>
             </w:tcBorders>
@@ -7854,19 +8150,7 @@
                     <w:sz w:val="16"/>
                     <w:szCs w:val="16"/>
                   </w:rPr>
-                  <m:t xml:space="preserve">No attenuation </m:t>
-                </m:r>
-                <m:r>
-                  <m:rPr>
-                    <m:nor/>
-                  </m:rPr>
-                  <w:rPr>
-                    <w:rFonts w:ascii="Cambria Math" w:hAnsi="Cambria Math"/>
-                    <w:bCs/>
-                    <w:sz w:val="16"/>
-                    <w:szCs w:val="16"/>
-                  </w:rPr>
-                  <m:t>@</m:t>
+                  <m:t>No attenuation @</m:t>
                 </m:r>
                 <m:r>
                   <w:rPr>
@@ -7968,189 +8252,10 @@
                 <w:szCs w:val="16"/>
               </w:rPr>
             </w:pPr>
-          </w:p>
-        </w:tc>
-        <w:tc>
-          <w:tcPr>
-            <w:tcW w:w="0" w:type="auto"/>
-            <w:tcBorders>
-              <w:top w:val="single" w:sz="12" w:space="0" w:color="auto"/>
-            </w:tcBorders>
-          </w:tcPr>
-          <w:p>
-            <w:pPr>
-              <w:spacing w:before="0"/>
-              <w:jc w:val="left"/>
-              <w:rPr>
-                <w:b/>
-                <w:sz w:val="16"/>
-                <w:szCs w:val="16"/>
-              </w:rPr>
-            </w:pPr>
-          </w:p>
-        </w:tc>
-        <w:tc>
-          <w:tcPr>
-            <w:tcW w:w="1835" w:type="dxa"/>
-            <w:tcBorders>
-              <w:top w:val="single" w:sz="12" w:space="0" w:color="auto"/>
-            </w:tcBorders>
-          </w:tcPr>
-          <w:p>
-            <w:pPr>
-              <w:spacing w:before="0"/>
-              <w:jc w:val="left"/>
-              <w:rPr>
-                <w:bCs/>
-                <w:sz w:val="16"/>
-                <w:szCs w:val="16"/>
-              </w:rPr>
-            </w:pPr>
-          </w:p>
-        </w:tc>
-      </w:tr>
-      <w:tr>
-        <w:tc>
-          <w:tcPr>
-            <w:tcW w:w="0" w:type="auto"/>
-            <w:tcBorders>
-              <w:bottom w:val="single" w:sz="12" w:space="0" w:color="auto"/>
-            </w:tcBorders>
-          </w:tcPr>
-          <w:p>
-            <w:pPr>
-              <w:spacing w:before="0"/>
-              <w:jc w:val="left"/>
-              <w:rPr>
-                <w:b/>
-                <w:sz w:val="16"/>
-                <w:szCs w:val="16"/>
-              </w:rPr>
-            </w:pPr>
-            <w:r>
-              <w:rPr>
-                <w:b/>
-                <w:sz w:val="16"/>
-                <w:szCs w:val="16"/>
-              </w:rPr>
-              <w:t>Line in signal after Anti-Aliasing filter, right channel</w:t>
-            </w:r>
-          </w:p>
-        </w:tc>
-        <w:tc>
-          <w:tcPr>
-            <w:tcW w:w="2378" w:type="dxa"/>
-            <w:tcBorders>
-              <w:bottom w:val="single" w:sz="12" w:space="0" w:color="auto"/>
-            </w:tcBorders>
-          </w:tcPr>
-          <w:p>
-            <w:pPr>
-              <w:spacing w:before="0"/>
-              <w:jc w:val="left"/>
-              <w:rPr>
-                <w:bCs/>
-                <w:sz w:val="16"/>
-                <w:szCs w:val="16"/>
-              </w:rPr>
-            </w:pPr>
-            <w:r>
-              <w:rPr>
-                <w:bCs/>
-                <w:sz w:val="16"/>
-                <w:szCs w:val="16"/>
-              </w:rPr>
-              <w:t xml:space="preserve">Input signal: </w:t>
-            </w:r>
-            <w:r>
-              <w:rPr>
-                <w:bCs/>
-                <w:sz w:val="16"/>
-              </w:rPr>
-              <w:t>500</w:t>
-            </w:r>
-            <w:r>
-              <w:rPr>
-                <w:sz w:val="16"/>
-              </w:rPr>
-              <w:t>mVpp 1kHz sine</w:t>
-            </w:r>
-          </w:p>
-        </w:tc>
-        <w:tc>
-          <w:tcPr>
-            <w:tcW w:w="0" w:type="auto"/>
-            <w:tcBorders>
-              <w:bottom w:val="single" w:sz="12" w:space="0" w:color="auto"/>
-            </w:tcBorders>
-            <w:noWrap/>
-          </w:tcPr>
-          <w:p>
-            <w:pPr>
-              <w:spacing w:before="0"/>
-              <w:jc w:val="center"/>
-              <w:rPr>
-                <w:b/>
-                <w:sz w:val="16"/>
-                <w:szCs w:val="16"/>
-              </w:rPr>
-            </w:pPr>
             <m:oMathPara>
               <m:oMath>
                 <m:r>
                   <m:rPr>
-                    <m:nor/>
-                  </m:rPr>
-                  <w:rPr>
-                    <w:rFonts w:ascii="Cambria Math" w:hAnsi="Cambria Math"/>
-                    <w:bCs/>
-                    <w:sz w:val="16"/>
-                    <w:szCs w:val="16"/>
-                  </w:rPr>
-                  <m:t xml:space="preserve">No attenuation </m:t>
-                </m:r>
-                <m:r>
-                  <m:rPr>
-                    <m:nor/>
-                  </m:rPr>
-                  <w:rPr>
-                    <w:rFonts w:ascii="Cambria Math" w:hAnsi="Cambria Math"/>
-                    <w:bCs/>
-                    <w:sz w:val="16"/>
-                    <w:szCs w:val="16"/>
-                  </w:rPr>
-                  <m:t>@</m:t>
-                </m:r>
-                <m:r>
-                  <w:rPr>
-                    <w:rFonts w:ascii="Cambria Math" w:hAnsi="Cambria Math"/>
-                    <w:sz w:val="16"/>
-                    <w:szCs w:val="16"/>
-                  </w:rPr>
-                  <m:t xml:space="preserve"> 1</m:t>
-                </m:r>
-                <m:r>
-                  <m:rPr>
-                    <m:nor/>
-                  </m:rPr>
-                  <w:rPr>
-                    <w:rFonts w:ascii="Cambria Math" w:hAnsi="Cambria Math"/>
-                    <w:bCs/>
-                    <w:sz w:val="16"/>
-                    <w:szCs w:val="16"/>
-                  </w:rPr>
-                  <m:t>kHz</m:t>
-                </m:r>
-                <m:r>
-                  <w:rPr>
-                    <w:rFonts w:ascii="Cambria Math" w:hAnsi="Cambria Math"/>
-                    <w:sz w:val="16"/>
-                    <w:szCs w:val="16"/>
-                  </w:rPr>
-                  <m:t>→</m:t>
-                </m:r>
-                <m:r>
-                  <m:rPr>
                     <m:sty m:val="bi"/>
                   </m:rPr>
                   <w:rPr>
@@ -8158,7 +8263,7 @@
                     <w:sz w:val="16"/>
                     <w:szCs w:val="16"/>
                   </w:rPr>
-                  <m:t>500</m:t>
+                  <m:t>532</m:t>
                 </m:r>
                 <m:sSub>
                   <m:sSubPr>
@@ -8208,7 +8313,7 @@
           <w:tcPr>
             <w:tcW w:w="0" w:type="auto"/>
             <w:tcBorders>
-              <w:bottom w:val="single" w:sz="12" w:space="0" w:color="auto"/>
+              <w:top w:val="single" w:sz="12" w:space="0" w:color="auto"/>
             </w:tcBorders>
           </w:tcPr>
           <w:p>
@@ -8221,8 +8326,53 @@
                 <w:szCs w:val="16"/>
               </w:rPr>
             </w:pPr>
-          </w:p>
-        </w:tc>
+            <w:r>
+              <w:rPr>
+                <w:bCs/>
+                <w:sz w:val="16"/>
+                <w:szCs w:val="16"/>
+              </w:rPr>
+              <w:t>Acceptable with tolerance</w:t>
+            </w:r>
+            <w:r>
+              <w:rPr>
+                <w:bCs/>
+                <w:sz w:val="16"/>
+                <w:szCs w:val="16"/>
+              </w:rPr>
+              <w:t xml:space="preserve"> →</w:t>
+            </w:r>
+            <w:r>
+              <w:rPr>
+                <w:b/>
+                <w:sz w:val="16"/>
+                <w:szCs w:val="16"/>
+              </w:rPr>
+              <w:t xml:space="preserve"> passed</w:t>
+            </w:r>
+          </w:p>
+        </w:tc>
+        <w:tc>
+          <w:tcPr>
+            <w:tcW w:w="1835" w:type="dxa"/>
+            <w:tcBorders>
+              <w:top w:val="single" w:sz="12" w:space="0" w:color="auto"/>
+            </w:tcBorders>
+          </w:tcPr>
+          <w:p>
+            <w:pPr>
+              <w:spacing w:before="0"/>
+              <w:jc w:val="left"/>
+              <w:rPr>
+                <w:bCs/>
+                <w:sz w:val="16"/>
+                <w:szCs w:val="16"/>
+              </w:rPr>
+            </w:pPr>
+          </w:p>
+        </w:tc>
+      </w:tr>
+      <w:tr>
         <w:tc>
           <w:tcPr>
             <w:tcW w:w="0" w:type="auto"/>
@@ -8240,6 +8390,286 @@
                 <w:szCs w:val="16"/>
               </w:rPr>
             </w:pPr>
+            <w:r>
+              <w:rPr>
+                <w:b/>
+                <w:sz w:val="16"/>
+                <w:szCs w:val="16"/>
+              </w:rPr>
+              <w:t>Line in signal after Anti-Aliasing filter, right channel</w:t>
+            </w:r>
+          </w:p>
+        </w:tc>
+        <w:tc>
+          <w:tcPr>
+            <w:tcW w:w="2183" w:type="dxa"/>
+            <w:tcBorders>
+              <w:bottom w:val="single" w:sz="12" w:space="0" w:color="auto"/>
+            </w:tcBorders>
+          </w:tcPr>
+          <w:p>
+            <w:pPr>
+              <w:spacing w:before="0"/>
+              <w:jc w:val="left"/>
+              <w:rPr>
+                <w:bCs/>
+                <w:sz w:val="16"/>
+                <w:szCs w:val="16"/>
+              </w:rPr>
+            </w:pPr>
+            <w:r>
+              <w:rPr>
+                <w:bCs/>
+                <w:sz w:val="16"/>
+                <w:szCs w:val="16"/>
+              </w:rPr>
+              <w:t xml:space="preserve">Input signal: </w:t>
+            </w:r>
+            <w:r>
+              <w:rPr>
+                <w:bCs/>
+                <w:sz w:val="16"/>
+              </w:rPr>
+              <w:t>500</w:t>
+            </w:r>
+            <w:r>
+              <w:rPr>
+                <w:sz w:val="16"/>
+              </w:rPr>
+              <w:t>mVpp 1kHz sine</w:t>
+            </w:r>
+          </w:p>
+        </w:tc>
+        <w:tc>
+          <w:tcPr>
+            <w:tcW w:w="0" w:type="auto"/>
+            <w:tcBorders>
+              <w:bottom w:val="single" w:sz="12" w:space="0" w:color="auto"/>
+            </w:tcBorders>
+            <w:noWrap/>
+          </w:tcPr>
+          <w:p>
+            <w:pPr>
+              <w:spacing w:before="0"/>
+              <w:jc w:val="center"/>
+              <w:rPr>
+                <w:b/>
+                <w:sz w:val="16"/>
+                <w:szCs w:val="16"/>
+              </w:rPr>
+            </w:pPr>
+            <m:oMathPara>
+              <m:oMath>
+                <m:r>
+                  <m:rPr>
+                    <m:nor/>
+                  </m:rPr>
+                  <w:rPr>
+                    <w:rFonts w:ascii="Cambria Math" w:hAnsi="Cambria Math"/>
+                    <w:bCs/>
+                    <w:sz w:val="16"/>
+                    <w:szCs w:val="16"/>
+                  </w:rPr>
+                  <m:t>No attenuation @</m:t>
+                </m:r>
+                <m:r>
+                  <w:rPr>
+                    <w:rFonts w:ascii="Cambria Math" w:hAnsi="Cambria Math"/>
+                    <w:sz w:val="16"/>
+                    <w:szCs w:val="16"/>
+                  </w:rPr>
+                  <m:t xml:space="preserve"> 1</m:t>
+                </m:r>
+                <m:r>
+                  <m:rPr>
+                    <m:nor/>
+                  </m:rPr>
+                  <w:rPr>
+                    <w:rFonts w:ascii="Cambria Math" w:hAnsi="Cambria Math"/>
+                    <w:bCs/>
+                    <w:sz w:val="16"/>
+                    <w:szCs w:val="16"/>
+                  </w:rPr>
+                  <m:t>kHz</m:t>
+                </m:r>
+                <m:r>
+                  <w:rPr>
+                    <w:rFonts w:ascii="Cambria Math" w:hAnsi="Cambria Math"/>
+                    <w:sz w:val="16"/>
+                    <w:szCs w:val="16"/>
+                  </w:rPr>
+                  <m:t>→</m:t>
+                </m:r>
+                <m:r>
+                  <m:rPr>
+                    <m:sty m:val="bi"/>
+                  </m:rPr>
+                  <w:rPr>
+                    <w:rFonts w:ascii="Cambria Math" w:hAnsi="Cambria Math"/>
+                    <w:sz w:val="16"/>
+                    <w:szCs w:val="16"/>
+                  </w:rPr>
+                  <m:t>500</m:t>
+                </m:r>
+                <m:sSub>
+                  <m:sSubPr>
+                    <m:ctrlPr>
+                      <w:rPr>
+                        <w:rFonts w:ascii="Cambria Math" w:hAnsi="Cambria Math"/>
+                        <w:b/>
+                        <w:sz w:val="16"/>
+                        <w:szCs w:val="16"/>
+                      </w:rPr>
+                    </m:ctrlPr>
+                  </m:sSubPr>
+                  <m:e>
+                    <m:r>
+                      <m:rPr>
+                        <m:nor/>
+                      </m:rPr>
+                      <w:rPr>
+                        <w:rFonts w:ascii="Cambria Math" w:hAnsi="Cambria Math"/>
+                        <w:b/>
+                        <w:sz w:val="16"/>
+                        <w:szCs w:val="16"/>
+                      </w:rPr>
+                      <m:t>mV</m:t>
+                    </m:r>
+                  </m:e>
+                  <m:sub>
+                    <m:r>
+                      <m:rPr>
+                        <m:nor/>
+                      </m:rPr>
+                      <w:rPr>
+                        <w:rFonts w:ascii="Cambria Math" w:hAnsi="Cambria Math"/>
+                        <w:b/>
+                        <w:sz w:val="16"/>
+                        <w:szCs w:val="16"/>
+                      </w:rPr>
+                      <m:t>PP</m:t>
+                    </m:r>
+                  </m:sub>
+                </m:sSub>
+              </m:oMath>
+            </m:oMathPara>
+          </w:p>
+        </w:tc>
+        <w:tc>
+          <w:tcPr>
+            <w:tcW w:w="0" w:type="auto"/>
+            <w:tcBorders>
+              <w:bottom w:val="single" w:sz="12" w:space="0" w:color="auto"/>
+            </w:tcBorders>
+          </w:tcPr>
+          <w:p>
+            <w:pPr>
+              <w:spacing w:before="0"/>
+              <w:jc w:val="left"/>
+              <w:rPr>
+                <w:b/>
+                <w:sz w:val="16"/>
+                <w:szCs w:val="16"/>
+              </w:rPr>
+            </w:pPr>
+            <m:oMathPara>
+              <m:oMath>
+                <m:r>
+                  <m:rPr>
+                    <m:sty m:val="bi"/>
+                  </m:rPr>
+                  <w:rPr>
+                    <w:rFonts w:ascii="Cambria Math" w:hAnsi="Cambria Math"/>
+                    <w:sz w:val="16"/>
+                    <w:szCs w:val="16"/>
+                  </w:rPr>
+                  <m:t>532</m:t>
+                </m:r>
+                <m:sSub>
+                  <m:sSubPr>
+                    <m:ctrlPr>
+                      <w:rPr>
+                        <w:rFonts w:ascii="Cambria Math" w:hAnsi="Cambria Math"/>
+                        <w:b/>
+                        <w:sz w:val="16"/>
+                        <w:szCs w:val="16"/>
+                      </w:rPr>
+                    </m:ctrlPr>
+                  </m:sSubPr>
+                  <m:e>
+                    <m:r>
+                      <m:rPr>
+                        <m:nor/>
+                      </m:rPr>
+                      <w:rPr>
+                        <w:rFonts w:ascii="Cambria Math" w:hAnsi="Cambria Math"/>
+                        <w:b/>
+                        <w:sz w:val="16"/>
+                        <w:szCs w:val="16"/>
+                      </w:rPr>
+                      <m:t>mV</m:t>
+                    </m:r>
+                  </m:e>
+                  <m:sub>
+                    <m:r>
+                      <m:rPr>
+                        <m:nor/>
+                      </m:rPr>
+                      <w:rPr>
+                        <w:rFonts w:ascii="Cambria Math" w:hAnsi="Cambria Math"/>
+                        <w:b/>
+                        <w:sz w:val="16"/>
+                        <w:szCs w:val="16"/>
+                      </w:rPr>
+                      <m:t>PP</m:t>
+                    </m:r>
+                  </m:sub>
+                </m:sSub>
+              </m:oMath>
+            </m:oMathPara>
+          </w:p>
+        </w:tc>
+        <w:tc>
+          <w:tcPr>
+            <w:tcW w:w="0" w:type="auto"/>
+            <w:tcBorders>
+              <w:bottom w:val="single" w:sz="12" w:space="0" w:color="auto"/>
+            </w:tcBorders>
+          </w:tcPr>
+          <w:p>
+            <w:pPr>
+              <w:spacing w:before="0"/>
+              <w:jc w:val="left"/>
+              <w:rPr>
+                <w:b/>
+                <w:sz w:val="16"/>
+                <w:szCs w:val="16"/>
+              </w:rPr>
+            </w:pPr>
+            <w:r>
+              <w:rPr>
+                <w:bCs/>
+                <w:sz w:val="16"/>
+                <w:szCs w:val="16"/>
+              </w:rPr>
+              <w:t>Acceptable with tolerance</w:t>
+            </w:r>
+            <w:r>
+              <w:rPr>
+                <w:bCs/>
+                <w:sz w:val="16"/>
+                <w:szCs w:val="16"/>
+              </w:rPr>
+              <w:t xml:space="preserve"> →</w:t>
+            </w:r>
+            <w:r>
+              <w:rPr>
+                <w:b/>
+                <w:sz w:val="16"/>
+                <w:szCs w:val="16"/>
+              </w:rPr>
+              <w:t xml:space="preserve"> passed</w:t>
+            </w:r>
           </w:p>
         </w:tc>
         <w:tc>
@@ -8293,7 +8723,7 @@
         </w:tc>
         <w:tc>
           <w:tcPr>
-            <w:tcW w:w="2378" w:type="dxa"/>
+            <w:tcW w:w="2183" w:type="dxa"/>
             <w:tcBorders>
               <w:top w:val="single" w:sz="12" w:space="0" w:color="auto"/>
               <w:bottom w:val="single" w:sz="4" w:space="0" w:color="auto"/>
@@ -8333,7 +8763,7 @@
               <w:spacing w:before="0"/>
               <w:jc w:val="center"/>
               <w:rPr>
-                <w:b/>
+                <w:bCs/>
                 <w:sz w:val="16"/>
                 <w:szCs w:val="16"/>
               </w:rPr>
@@ -8341,6 +8771,88 @@
             <m:oMathPara>
               <m:oMath>
                 <m:r>
+                  <w:rPr>
+                    <w:rFonts w:ascii="Cambria Math" w:hAnsi="Cambria Math"/>
+                    <w:sz w:val="16"/>
+                    <w:szCs w:val="16"/>
+                  </w:rPr>
+                  <m:t>3</m:t>
+                </m:r>
+                <m:r>
+                  <m:rPr>
+                    <m:nor/>
+                  </m:rPr>
+                  <w:rPr>
+                    <w:rFonts w:ascii="Cambria Math" w:hAnsi="Cambria Math"/>
+                    <w:bCs/>
+                    <w:sz w:val="16"/>
+                    <w:szCs w:val="16"/>
+                  </w:rPr>
+                  <m:t>V</m:t>
+                </m:r>
+                <m:r>
+                  <w:rPr>
+                    <w:rFonts w:ascii="Cambria Math" w:hAnsi="Cambria Math"/>
+                    <w:sz w:val="16"/>
+                    <w:szCs w:val="16"/>
+                  </w:rPr>
+                  <m:t>+</m:t>
+                </m:r>
+                <m:f>
+                  <m:fPr>
+                    <m:type m:val="lin"/>
+                    <m:ctrlPr>
+                      <w:rPr>
+                        <w:rFonts w:ascii="Cambria Math" w:hAnsi="Cambria Math"/>
+                        <w:bCs/>
+                        <w:i/>
+                        <w:sz w:val="16"/>
+                        <w:szCs w:val="16"/>
+                      </w:rPr>
+                    </m:ctrlPr>
+                  </m:fPr>
+                  <m:num>
+                    <m:r>
+                      <w:rPr>
+                        <w:rFonts w:ascii="Cambria Math" w:hAnsi="Cambria Math"/>
+                        <w:sz w:val="16"/>
+                        <w:szCs w:val="16"/>
+                      </w:rPr>
+                      <m:t>5</m:t>
+                    </m:r>
+                    <m:r>
+                      <m:rPr>
+                        <m:nor/>
+                      </m:rPr>
+                      <w:rPr>
+                        <w:rFonts w:ascii="Cambria Math" w:hAnsi="Cambria Math"/>
+                        <w:bCs/>
+                        <w:sz w:val="16"/>
+                        <w:szCs w:val="16"/>
+                      </w:rPr>
+                      <m:t>V</m:t>
+                    </m:r>
+                  </m:num>
+                  <m:den>
+                    <m:r>
+                      <w:rPr>
+                        <w:rFonts w:ascii="Cambria Math" w:hAnsi="Cambria Math"/>
+                        <w:sz w:val="16"/>
+                        <w:szCs w:val="16"/>
+                      </w:rPr>
+                      <m:t>2</m:t>
+                    </m:r>
+                  </m:den>
+                </m:f>
+                <m:r>
+                  <w:rPr>
+                    <w:rFonts w:ascii="Cambria Math" w:hAnsi="Cambria Math"/>
+                    <w:sz w:val="16"/>
+                    <w:szCs w:val="16"/>
+                  </w:rPr>
+                  <m:t>=</m:t>
+                </m:r>
+                <m:r>
                   <m:rPr>
                     <m:sty m:val="bi"/>
                   </m:rPr>
@@ -8348,9 +8860,21 @@
                     <w:rFonts w:ascii="Cambria Math" w:hAnsi="Cambria Math"/>
                     <w:sz w:val="16"/>
                     <w:szCs w:val="16"/>
-                    <w:highlight w:val="yellow"/>
-                  </w:rPr>
-                  <m:t>…</m:t>
+                  </w:rPr>
+                  <m:t>5.5</m:t>
+                </m:r>
+                <m:r>
+                  <m:rPr>
+                    <m:nor/>
+                  </m:rPr>
+                  <w:rPr>
+                    <w:rFonts w:ascii="Cambria Math" w:hAnsi="Cambria Math"/>
+                    <w:b/>
+                    <w:bCs/>
+                    <w:sz w:val="16"/>
+                    <w:szCs w:val="16"/>
+                  </w:rPr>
+                  <m:t>V</m:t>
                 </m:r>
               </m:oMath>
             </m:oMathPara>
@@ -8416,19 +8940,52 @@
               <w:spacing w:before="0"/>
               <w:jc w:val="left"/>
               <w:rPr>
-                <w:b/>
-                <w:sz w:val="16"/>
-                <w:szCs w:val="16"/>
-              </w:rPr>
-            </w:pPr>
+                <w:bCs/>
+                <w:sz w:val="16"/>
+                <w:szCs w:val="16"/>
+              </w:rPr>
+            </w:pPr>
+            <w:r>
+              <w:rPr>
+                <w:bCs/>
+                <w:sz w:val="16"/>
+                <w:szCs w:val="16"/>
+              </w:rPr>
+              <w:t>Not as expected, considered acceptable</w:t>
+            </w:r>
+            <w:r>
+              <w:rPr>
+                <w:bCs/>
+                <w:sz w:val="16"/>
+                <w:szCs w:val="16"/>
+                <w:vertAlign w:val="superscript"/>
+              </w:rPr>
+              <w:t>*)</w:t>
+            </w:r>
+            <w:r>
+              <w:rPr>
+                <w:bCs/>
+                <w:sz w:val="16"/>
+                <w:szCs w:val="16"/>
+              </w:rPr>
+              <w:t xml:space="preserve"> → </w:t>
+            </w:r>
+            <w:r>
+              <w:rPr>
+                <w:b/>
+                <w:sz w:val="16"/>
+                <w:szCs w:val="16"/>
+              </w:rPr>
+              <w:t>passed</w:t>
+            </w:r>
           </w:p>
         </w:tc>
         <w:tc>
           <w:tcPr>
             <w:tcW w:w="1835" w:type="dxa"/>
+            <w:vMerge w:val="restart"/>
             <w:tcBorders>
               <w:top w:val="single" w:sz="12" w:space="0" w:color="auto"/>
-              <w:bottom w:val="single" w:sz="4" w:space="0" w:color="auto"/>
             </w:tcBorders>
           </w:tcPr>
           <w:p>
@@ -8441,6 +8998,128 @@
                 <w:szCs w:val="16"/>
               </w:rPr>
             </w:pPr>
+            <w:r>
+              <w:rPr>
+                <w:bCs/>
+                <w:sz w:val="16"/>
+                <w:szCs w:val="16"/>
+              </w:rPr>
+              <w:t>*) C</w:t>
+            </w:r>
+            <w:r>
+              <w:rPr>
+                <w:bCs/>
+                <w:sz w:val="16"/>
+                <w:szCs w:val="16"/>
+              </w:rPr>
+              <w:t xml:space="preserve">alculated with </w:t>
+            </w:r>
+            <w:r>
+              <w:rPr>
+                <w:bCs/>
+                <w:sz w:val="16"/>
+                <w:szCs w:val="16"/>
+              </w:rPr>
+              <w:t>max</w:t>
+            </w:r>
+            <w:r>
+              <w:rPr>
+                <w:bCs/>
+                <w:sz w:val="16"/>
+                <w:szCs w:val="16"/>
+              </w:rPr>
+              <w:t xml:space="preserve"> values from the datasheet</w:t>
+            </w:r>
+            <w:r>
+              <w:rPr>
+                <w:bCs/>
+                <w:sz w:val="16"/>
+                <w:szCs w:val="16"/>
+              </w:rPr>
+              <w:t xml:space="preserve">, </w:t>
+            </w:r>
+            <w:r>
+              <w:rPr>
+                <w:bCs/>
+                <w:sz w:val="16"/>
+                <w:szCs w:val="16"/>
+              </w:rPr>
+              <w:t xml:space="preserve">is in range for </w:t>
+            </w:r>
+            <m:oMath>
+              <m:sSub>
+                <m:sSubPr>
+                  <m:ctrlPr>
+                    <w:rPr>
+                      <w:rFonts w:ascii="Cambria Math" w:hAnsi="Cambria Math"/>
+                      <w:bCs/>
+                      <w:i/>
+                      <w:sz w:val="16"/>
+                      <w:szCs w:val="16"/>
+                    </w:rPr>
+                  </m:ctrlPr>
+                </m:sSubPr>
+                <m:e>
+                  <m:r>
+                    <w:rPr>
+                      <w:rFonts w:ascii="Cambria Math" w:hAnsi="Cambria Math"/>
+                      <w:sz w:val="16"/>
+                      <w:szCs w:val="16"/>
+                    </w:rPr>
+                    <m:t>V</m:t>
+                  </m:r>
+                </m:e>
+                <m:sub>
+                  <m:r>
+                    <w:rPr>
+                      <w:rFonts w:ascii="Cambria Math" w:hAnsi="Cambria Math"/>
+                      <w:sz w:val="16"/>
+                      <w:szCs w:val="16"/>
+                    </w:rPr>
+                    <m:t>OD</m:t>
+                  </m:r>
+                  <m:r>
+                    <w:rPr>
+                      <w:rFonts w:ascii="Cambria Math" w:hAnsi="Cambria Math"/>
+                      <w:sz w:val="16"/>
+                      <w:szCs w:val="16"/>
+                    </w:rPr>
+                    <m:t xml:space="preserve">, </m:t>
+                  </m:r>
+                  <m:r>
+                    <m:rPr>
+                      <m:sty m:val="bi"/>
+                    </m:rPr>
+                    <w:rPr>
+                      <w:rFonts w:ascii="Cambria Math" w:hAnsi="Cambria Math"/>
+                      <w:sz w:val="16"/>
+                      <w:szCs w:val="16"/>
+                    </w:rPr>
+                    <m:t>min</m:t>
+                  </m:r>
+                </m:sub>
+              </m:sSub>
+              <m:r>
+                <w:rPr>
+                  <w:rFonts w:ascii="Cambria Math" w:hAnsi="Cambria Math"/>
+                  <w:sz w:val="16"/>
+                  <w:szCs w:val="16"/>
+                </w:rPr>
+                <m:t>=1.5</m:t>
+              </m:r>
+              <m:r>
+                <m:rPr>
+                  <m:nor/>
+                </m:rPr>
+                <w:rPr>
+                  <w:rFonts w:ascii="Cambria Math" w:hAnsi="Cambria Math"/>
+                  <w:bCs/>
+                  <w:sz w:val="16"/>
+                  <w:szCs w:val="16"/>
+                </w:rPr>
+                <m:t>V</m:t>
+              </m:r>
+            </m:oMath>
           </w:p>
         </w:tc>
       </w:tr>
@@ -8474,7 +9153,7 @@
         </w:tc>
         <w:tc>
           <w:tcPr>
-            <w:tcW w:w="2378" w:type="dxa"/>
+            <w:tcW w:w="2183" w:type="dxa"/>
             <w:tcBorders>
               <w:bottom w:val="single" w:sz="12" w:space="0" w:color="auto"/>
             </w:tcBorders>
@@ -8520,6 +9199,88 @@
             <m:oMathPara>
               <m:oMath>
                 <m:r>
+                  <w:rPr>
+                    <w:rFonts w:ascii="Cambria Math" w:hAnsi="Cambria Math"/>
+                    <w:sz w:val="16"/>
+                    <w:szCs w:val="16"/>
+                  </w:rPr>
+                  <m:t>3</m:t>
+                </m:r>
+                <m:r>
+                  <m:rPr>
+                    <m:nor/>
+                  </m:rPr>
+                  <w:rPr>
+                    <w:rFonts w:ascii="Cambria Math" w:hAnsi="Cambria Math"/>
+                    <w:bCs/>
+                    <w:sz w:val="16"/>
+                    <w:szCs w:val="16"/>
+                  </w:rPr>
+                  <m:t>V</m:t>
+                </m:r>
+                <m:r>
+                  <w:rPr>
+                    <w:rFonts w:ascii="Cambria Math" w:hAnsi="Cambria Math"/>
+                    <w:sz w:val="16"/>
+                    <w:szCs w:val="16"/>
+                  </w:rPr>
+                  <m:t>-</m:t>
+                </m:r>
+                <m:f>
+                  <m:fPr>
+                    <m:type m:val="lin"/>
+                    <m:ctrlPr>
+                      <w:rPr>
+                        <w:rFonts w:ascii="Cambria Math" w:hAnsi="Cambria Math"/>
+                        <w:bCs/>
+                        <w:i/>
+                        <w:sz w:val="16"/>
+                        <w:szCs w:val="16"/>
+                      </w:rPr>
+                    </m:ctrlPr>
+                  </m:fPr>
+                  <m:num>
+                    <m:r>
+                      <w:rPr>
+                        <w:rFonts w:ascii="Cambria Math" w:hAnsi="Cambria Math"/>
+                        <w:sz w:val="16"/>
+                        <w:szCs w:val="16"/>
+                      </w:rPr>
+                      <m:t>5</m:t>
+                    </m:r>
+                    <m:r>
+                      <m:rPr>
+                        <m:nor/>
+                      </m:rPr>
+                      <w:rPr>
+                        <w:rFonts w:ascii="Cambria Math" w:hAnsi="Cambria Math"/>
+                        <w:bCs/>
+                        <w:sz w:val="16"/>
+                        <w:szCs w:val="16"/>
+                      </w:rPr>
+                      <m:t>V</m:t>
+                    </m:r>
+                  </m:num>
+                  <m:den>
+                    <m:r>
+                      <w:rPr>
+                        <w:rFonts w:ascii="Cambria Math" w:hAnsi="Cambria Math"/>
+                        <w:sz w:val="16"/>
+                        <w:szCs w:val="16"/>
+                      </w:rPr>
+                      <m:t>2</m:t>
+                    </m:r>
+                  </m:den>
+                </m:f>
+                <m:r>
+                  <w:rPr>
+                    <w:rFonts w:ascii="Cambria Math" w:hAnsi="Cambria Math"/>
+                    <w:sz w:val="16"/>
+                    <w:szCs w:val="16"/>
+                  </w:rPr>
+                  <m:t>=</m:t>
+                </m:r>
+                <m:r>
                   <m:rPr>
                     <m:sty m:val="bi"/>
                   </m:rPr>
@@ -8527,9 +9288,21 @@
                     <w:rFonts w:ascii="Cambria Math" w:hAnsi="Cambria Math"/>
                     <w:sz w:val="16"/>
                     <w:szCs w:val="16"/>
-                    <w:highlight w:val="yellow"/>
-                  </w:rPr>
-                  <m:t>…</m:t>
+                  </w:rPr>
+                  <m:t>0.5</m:t>
+                </m:r>
+                <m:r>
+                  <m:rPr>
+                    <m:nor/>
+                  </m:rPr>
+                  <w:rPr>
+                    <w:rFonts w:ascii="Cambria Math" w:hAnsi="Cambria Math"/>
+                    <w:b/>
+                    <w:bCs/>
+                    <w:sz w:val="16"/>
+                    <w:szCs w:val="16"/>
+                  </w:rPr>
+                  <m:t>V</m:t>
                 </m:r>
               </m:oMath>
             </m:oMathPara>
@@ -8598,11 +9371,45 @@
                 <w:szCs w:val="16"/>
               </w:rPr>
             </w:pPr>
+            <w:r>
+              <w:rPr>
+                <w:bCs/>
+                <w:sz w:val="16"/>
+                <w:szCs w:val="16"/>
+              </w:rPr>
+              <w:t>Not as expected, considered acceptable</w:t>
+            </w:r>
+            <w:r>
+              <w:rPr>
+                <w:bCs/>
+                <w:sz w:val="16"/>
+                <w:szCs w:val="16"/>
+                <w:vertAlign w:val="superscript"/>
+              </w:rPr>
+              <w:t>*)</w:t>
+            </w:r>
+            <w:r>
+              <w:rPr>
+                <w:bCs/>
+                <w:sz w:val="16"/>
+                <w:szCs w:val="16"/>
+              </w:rPr>
+              <w:t xml:space="preserve"> → </w:t>
+            </w:r>
+            <w:r>
+              <w:rPr>
+                <w:b/>
+                <w:sz w:val="16"/>
+                <w:szCs w:val="16"/>
+              </w:rPr>
+              <w:t>passed</w:t>
+            </w:r>
           </w:p>
         </w:tc>
         <w:tc>
           <w:tcPr>
             <w:tcW w:w="1835" w:type="dxa"/>
+            <w:vMerge/>
             <w:tcBorders>
               <w:bottom w:val="single" w:sz="12" w:space="0" w:color="auto"/>
             </w:tcBorders>
@@ -8623,7 +9430,7 @@
       <w:tr>
         <w:tc>
           <w:tcPr>
-            <w:tcW w:w="0" w:type="auto"/>
+            <w:tcW w:w="2183" w:type="dxa"/>
             <w:gridSpan w:val="6"/>
             <w:tcBorders>
               <w:top w:val="single" w:sz="12" w:space="0" w:color="auto"/>
@@ -8778,7 +9585,7 @@
         </w:tc>
         <w:tc>
           <w:tcPr>
-            <w:tcW w:w="0" w:type="auto"/>
+            <w:tcW w:w="2183" w:type="dxa"/>
             <w:tcBorders>
               <w:top w:val="single" w:sz="12" w:space="0" w:color="auto"/>
             </w:tcBorders>
@@ -8890,6 +9697,33 @@
                 <w:szCs w:val="16"/>
               </w:rPr>
             </w:pPr>
+            <m:oMathPara>
+              <m:oMath>
+                <m:r>
+                  <m:rPr>
+                    <m:sty m:val="bi"/>
+                  </m:rPr>
+                  <w:rPr>
+                    <w:rFonts w:ascii="Cambria Math" w:hAnsi="Cambria Math"/>
+                    <w:sz w:val="16"/>
+                    <w:szCs w:val="16"/>
+                  </w:rPr>
+                  <m:t>24.88</m:t>
+                </m:r>
+                <m:r>
+                  <m:rPr>
+                    <m:nor/>
+                  </m:rPr>
+                  <w:rPr>
+                    <w:rFonts w:ascii="Cambria Math" w:hAnsi="Cambria Math"/>
+                    <w:b/>
+                    <w:sz w:val="16"/>
+                    <w:szCs w:val="16"/>
+                  </w:rPr>
+                  <m:t>MHz</m:t>
+                </m:r>
+              </m:oMath>
+            </m:oMathPara>
           </w:p>
         </w:tc>
         <w:tc>
@@ -8909,6 +9743,22 @@
                 <w:szCs w:val="16"/>
               </w:rPr>
             </w:pPr>
+            <w:r>
+              <w:rPr>
+                <w:bCs/>
+                <w:sz w:val="16"/>
+                <w:szCs w:val="16"/>
+              </w:rPr>
+              <w:t>In range →</w:t>
+            </w:r>
+            <w:r>
+              <w:rPr>
+                <w:b/>
+                <w:sz w:val="16"/>
+                <w:szCs w:val="16"/>
+              </w:rPr>
+              <w:t xml:space="preserve"> passed</w:t>
+            </w:r>
           </w:p>
         </w:tc>
         <w:tc>
@@ -8958,7 +9808,7 @@
         </w:tc>
         <w:tc>
           <w:tcPr>
-            <w:tcW w:w="0" w:type="auto"/>
+            <w:tcW w:w="2183" w:type="dxa"/>
           </w:tcPr>
           <w:p>
             <w:pPr>
@@ -9166,7 +10016,7 @@
         </w:tc>
         <w:tc>
           <w:tcPr>
-            <w:tcW w:w="0" w:type="auto"/>
+            <w:tcW w:w="2183" w:type="dxa"/>
           </w:tcPr>
           <w:p>
             <w:pPr>
@@ -9348,6 +10198,9 @@
         </w:tc>
       </w:tr>
       <w:tr>
+        <w:trPr>
+          <w:trHeight w:val="152"/>
+        </w:trPr>
         <w:tc>
           <w:tcPr>
             <w:tcW w:w="0" w:type="auto"/>
@@ -9371,13 +10224,29 @@
                 <w:sz w:val="16"/>
                 <w:szCs w:val="16"/>
               </w:rPr>
-              <w:t>SCL Frequency</w:t>
-            </w:r>
-          </w:p>
-        </w:tc>
-        <w:tc>
-          <w:tcPr>
-            <w:tcW w:w="0" w:type="auto"/>
+              <w:t>SCL</w:t>
+            </w:r>
+            <w:r>
+              <w:rPr>
+                <w:b/>
+                <w:sz w:val="16"/>
+                <w:szCs w:val="16"/>
+              </w:rPr>
+              <w:t>K</w:t>
+            </w:r>
+            <w:r>
+              <w:rPr>
+                <w:b/>
+                <w:sz w:val="16"/>
+                <w:szCs w:val="16"/>
+              </w:rPr>
+              <w:t xml:space="preserve"> Frequency</w:t>
+            </w:r>
+          </w:p>
+        </w:tc>
+        <w:tc>
+          <w:tcPr>
+            <w:tcW w:w="2183" w:type="dxa"/>
             <w:tcBorders>
               <w:bottom w:val="single" w:sz="4" w:space="0" w:color="auto"/>
             </w:tcBorders>
@@ -9418,12 +10287,52 @@
                 <w:b/>
                 <w:sz w:val="16"/>
                 <w:szCs w:val="16"/>
+                <w:lang w:val="de-CH"/>
               </w:rPr>
             </w:pPr>
             <m:oMathPara>
               <m:oMath>
                 <m:r>
                   <m:rPr>
+                    <m:nor/>
+                  </m:rPr>
+                  <w:rPr>
+                    <w:rFonts w:ascii="Cambria Math" w:hAnsi="Cambria Math"/>
+                    <w:bCs/>
+                    <w:sz w:val="16"/>
+                    <w:szCs w:val="16"/>
+                    <w:lang w:val="de-CH"/>
+                  </w:rPr>
+                  <m:t>LRCLK</m:t>
+                </m:r>
+                <m:r>
+                  <w:rPr>
+                    <w:rFonts w:ascii="Cambria Math" w:hAnsi="Cambria Math"/>
+                    <w:sz w:val="16"/>
+                    <w:szCs w:val="16"/>
+                    <w:lang w:val="de-CH"/>
+                  </w:rPr>
+                  <m:t>×</m:t>
+                </m:r>
+                <m:r>
+                  <w:rPr>
+                    <w:rFonts w:ascii="Cambria Math" w:hAnsi="Cambria Math"/>
+                    <w:sz w:val="16"/>
+                    <w:szCs w:val="16"/>
+                  </w:rPr>
+                  <m:t>64</m:t>
+                </m:r>
+                <m:r>
+                  <w:rPr>
+                    <w:rFonts w:ascii="Cambria Math" w:hAnsi="Cambria Math"/>
+                    <w:sz w:val="16"/>
+                    <w:szCs w:val="16"/>
+                    <w:lang w:val="de-CH"/>
+                  </w:rPr>
+                  <m:t>=</m:t>
+                </m:r>
+                <m:r>
+                  <m:rPr>
                     <m:sty m:val="bi"/>
                   </m:rPr>
                   <w:rPr>
@@ -9431,7 +10340,7 @@
                     <w:sz w:val="16"/>
                     <w:szCs w:val="16"/>
                   </w:rPr>
-                  <m:t>&lt;100</m:t>
+                  <m:t>256</m:t>
                 </m:r>
                 <m:r>
                   <m:rPr>
@@ -9442,8 +10351,68 @@
                     <w:b/>
                     <w:sz w:val="16"/>
                     <w:szCs w:val="16"/>
+                    <w:lang w:val="de-CH"/>
                   </w:rPr>
                   <m:t>kHz</m:t>
+                </m:r>
+                <m:r>
+                  <m:rPr>
+                    <m:sty m:val="bi"/>
+                  </m:rPr>
+                  <w:rPr>
+                    <w:rFonts w:ascii="Cambria Math" w:hAnsi="Cambria Math"/>
+                    <w:sz w:val="16"/>
+                    <w:szCs w:val="16"/>
+                    <w:lang w:val="de-CH"/>
+                  </w:rPr>
+                  <m:t>…</m:t>
+                </m:r>
+                <m:r>
+                  <m:rPr>
+                    <m:sty m:val="bi"/>
+                  </m:rPr>
+                  <w:rPr>
+                    <w:rFonts w:ascii="Cambria Math" w:hAnsi="Cambria Math"/>
+                    <w:sz w:val="16"/>
+                    <w:szCs w:val="16"/>
+                  </w:rPr>
+                  <m:t>3</m:t>
+                </m:r>
+                <m:r>
+                  <m:rPr>
+                    <m:sty m:val="bi"/>
+                  </m:rPr>
+                  <w:rPr>
+                    <w:rFonts w:ascii="Cambria Math" w:hAnsi="Cambria Math"/>
+                    <w:sz w:val="16"/>
+                    <w:szCs w:val="16"/>
+                    <w:lang w:val="de-CH"/>
+                  </w:rPr>
+                  <m:t>.</m:t>
+                </m:r>
+                <m:r>
+                  <m:rPr>
+                    <m:sty m:val="bi"/>
+                  </m:rPr>
+                  <w:rPr>
+                    <w:rFonts w:ascii="Cambria Math" w:hAnsi="Cambria Math"/>
+                    <w:sz w:val="16"/>
+                    <w:szCs w:val="16"/>
+                  </w:rPr>
+                  <m:t>2</m:t>
+                </m:r>
+                <m:r>
+                  <m:rPr>
+                    <m:nor/>
+                  </m:rPr>
+                  <w:rPr>
+                    <w:rFonts w:ascii="Cambria Math" w:hAnsi="Cambria Math"/>
+                    <w:b/>
+                    <w:sz w:val="16"/>
+                    <w:szCs w:val="16"/>
+                    <w:lang w:val="de-CH"/>
+                  </w:rPr>
+                  <m:t>MHz</m:t>
                 </m:r>
               </m:oMath>
             </m:oMathPara>
@@ -9464,8 +10433,38 @@
                 <w:b/>
                 <w:sz w:val="16"/>
                 <w:szCs w:val="16"/>
-              </w:rPr>
-            </w:pPr>
+                <w:lang w:val="de-CH"/>
+              </w:rPr>
+            </w:pPr>
+            <m:oMathPara>
+              <m:oMath>
+                <m:r>
+                  <m:rPr>
+                    <m:sty m:val="bi"/>
+                  </m:rPr>
+                  <w:rPr>
+                    <w:rFonts w:ascii="Cambria Math" w:hAnsi="Cambria Math"/>
+                    <w:sz w:val="16"/>
+                    <w:szCs w:val="16"/>
+                    <w:lang w:val="de-CH"/>
+                  </w:rPr>
+                  <m:t>3.07</m:t>
+                </m:r>
+                <m:r>
+                  <m:rPr>
+                    <m:nor/>
+                  </m:rPr>
+                  <w:rPr>
+                    <w:rFonts w:ascii="Cambria Math" w:hAnsi="Cambria Math"/>
+                    <w:b/>
+                    <w:sz w:val="16"/>
+                    <w:szCs w:val="16"/>
+                    <w:lang w:val="de-CH"/>
+                  </w:rPr>
+                  <m:t>MHz</m:t>
+                </m:r>
+              </m:oMath>
+            </m:oMathPara>
           </w:p>
         </w:tc>
         <w:tc>
@@ -9483,8 +10482,25 @@
                 <w:b/>
                 <w:sz w:val="16"/>
                 <w:szCs w:val="16"/>
-              </w:rPr>
-            </w:pPr>
+                <w:lang w:val="de-CH"/>
+              </w:rPr>
+            </w:pPr>
+            <w:r>
+              <w:rPr>
+                <w:bCs/>
+                <w:sz w:val="16"/>
+                <w:szCs w:val="16"/>
+              </w:rPr>
+              <w:t>In range →</w:t>
+            </w:r>
+            <w:r>
+              <w:rPr>
+                <w:b/>
+                <w:sz w:val="16"/>
+                <w:szCs w:val="16"/>
+              </w:rPr>
+              <w:t xml:space="preserve"> passed</w:t>
+            </w:r>
           </w:p>
         </w:tc>
         <w:tc>
@@ -9502,6 +10518,7 @@
                 <w:b/>
                 <w:sz w:val="16"/>
                 <w:szCs w:val="16"/>
+                <w:lang w:val="de-CH"/>
               </w:rPr>
             </w:pPr>
           </w:p>
@@ -9537,7 +10554,7 @@
         </w:tc>
         <w:tc>
           <w:tcPr>
-            <w:tcW w:w="0" w:type="auto"/>
+            <w:tcW w:w="2183" w:type="dxa"/>
             <w:tcBorders>
               <w:bottom w:val="single" w:sz="12" w:space="0" w:color="auto"/>
             </w:tcBorders>
@@ -9615,6 +10632,22 @@
                 <w:szCs w:val="16"/>
               </w:rPr>
             </w:pPr>
+            <m:oMathPara>
+              <m:oMath>
+                <m:r>
+                  <m:rPr>
+                    <m:nor/>
+                  </m:rPr>
+                  <w:rPr>
+                    <w:rFonts w:ascii="Cambria Math" w:hAnsi="Cambria Math"/>
+                    <w:b/>
+                    <w:sz w:val="16"/>
+                    <w:szCs w:val="16"/>
+                  </w:rPr>
+                  <m:t>Yes</m:t>
+                </m:r>
+              </m:oMath>
+            </m:oMathPara>
           </w:p>
         </w:tc>
         <w:tc>
@@ -9634,6 +10667,30 @@
                 <w:szCs w:val="16"/>
               </w:rPr>
             </w:pPr>
+            <w:r>
+              <w:rPr>
+                <w:bCs/>
+                <w:sz w:val="16"/>
+                <w:szCs w:val="16"/>
+              </w:rPr>
+              <w:t>As expected →</w:t>
+            </w:r>
+            <w:r>
+              <w:rPr>
+                <w:b/>
+                <w:sz w:val="16"/>
+                <w:szCs w:val="16"/>
+              </w:rPr>
+              <w:t xml:space="preserve"> p</w:t>
+            </w:r>
+            <w:r>
+              <w:rPr>
+                <w:b/>
+                <w:sz w:val="16"/>
+                <w:szCs w:val="16"/>
+              </w:rPr>
+              <w:t>assed</w:t>
+            </w:r>
           </w:p>
         </w:tc>
         <w:tc>
@@ -9686,7 +10743,7 @@
         </w:tc>
         <w:tc>
           <w:tcPr>
-            <w:tcW w:w="0" w:type="auto"/>
+            <w:tcW w:w="2183" w:type="dxa"/>
             <w:tcBorders>
               <w:top w:val="single" w:sz="12" w:space="0" w:color="auto"/>
             </w:tcBorders>
@@ -9739,16 +10796,95 @@
               <m:oMath>
                 <m:r>
                   <m:rPr>
+                    <m:nor/>
+                  </m:rPr>
+                  <w:rPr>
+                    <w:rFonts w:ascii="Cambria Math" w:hAnsi="Cambria Math"/>
+                    <w:bCs/>
+                    <w:sz w:val="16"/>
+                    <w:szCs w:val="16"/>
+                  </w:rPr>
+                  <m:t>No attenuation @</m:t>
+                </m:r>
+                <m:r>
+                  <w:rPr>
+                    <w:rFonts w:ascii="Cambria Math" w:hAnsi="Cambria Math"/>
+                    <w:sz w:val="16"/>
+                    <w:szCs w:val="16"/>
+                  </w:rPr>
+                  <m:t xml:space="preserve"> 1</m:t>
+                </m:r>
+                <m:r>
+                  <m:rPr>
+                    <m:nor/>
+                  </m:rPr>
+                  <w:rPr>
+                    <w:rFonts w:ascii="Cambria Math" w:hAnsi="Cambria Math"/>
+                    <w:bCs/>
+                    <w:sz w:val="16"/>
+                    <w:szCs w:val="16"/>
+                  </w:rPr>
+                  <m:t>kHz</m:t>
+                </m:r>
+                <m:r>
+                  <w:rPr>
+                    <w:rFonts w:ascii="Cambria Math" w:hAnsi="Cambria Math"/>
+                    <w:sz w:val="16"/>
+                    <w:szCs w:val="16"/>
+                  </w:rPr>
+                  <m:t>→</m:t>
+                </m:r>
+                <m:r>
+                  <m:rPr>
                     <m:sty m:val="bi"/>
                   </m:rPr>
                   <w:rPr>
                     <w:rFonts w:ascii="Cambria Math" w:hAnsi="Cambria Math"/>
                     <w:sz w:val="16"/>
                     <w:szCs w:val="16"/>
-                    <w:highlight w:val="yellow"/>
-                  </w:rPr>
-                  <m:t>…</m:t>
-                </m:r>
+                  </w:rPr>
+                  <m:t>500</m:t>
+                </m:r>
+                <m:sSub>
+                  <m:sSubPr>
+                    <m:ctrlPr>
+                      <w:rPr>
+                        <w:rFonts w:ascii="Cambria Math" w:hAnsi="Cambria Math"/>
+                        <w:b/>
+                        <w:sz w:val="16"/>
+                        <w:szCs w:val="16"/>
+                      </w:rPr>
+                    </m:ctrlPr>
+                  </m:sSubPr>
+                  <m:e>
+                    <m:r>
+                      <m:rPr>
+                        <m:nor/>
+                      </m:rPr>
+                      <w:rPr>
+                        <w:rFonts w:ascii="Cambria Math" w:hAnsi="Cambria Math"/>
+                        <w:b/>
+                        <w:sz w:val="16"/>
+                        <w:szCs w:val="16"/>
+                      </w:rPr>
+                      <m:t>mV</m:t>
+                    </m:r>
+                  </m:e>
+                  <m:sub>
+                    <m:r>
+                      <m:rPr>
+                        <m:nor/>
+                      </m:rPr>
+                      <w:rPr>
+                        <w:rFonts w:ascii="Cambria Math" w:hAnsi="Cambria Math"/>
+                        <w:b/>
+                        <w:sz w:val="16"/>
+                        <w:szCs w:val="16"/>
+                      </w:rPr>
+                      <m:t>PP</m:t>
+                    </m:r>
+                  </m:sub>
+                </m:sSub>
               </m:oMath>
             </m:oMathPara>
           </w:p>
@@ -9770,6 +10906,61 @@
                 <w:szCs w:val="16"/>
               </w:rPr>
             </w:pPr>
+            <m:oMathPara>
+              <m:oMath>
+                <m:r>
+                  <m:rPr>
+                    <m:sty m:val="bi"/>
+                  </m:rPr>
+                  <w:rPr>
+                    <w:rFonts w:ascii="Cambria Math" w:hAnsi="Cambria Math"/>
+                    <w:sz w:val="16"/>
+                    <w:szCs w:val="16"/>
+                  </w:rPr>
+                  <m:t>533</m:t>
+                </m:r>
+                <m:sSub>
+                  <m:sSubPr>
+                    <m:ctrlPr>
+                      <w:rPr>
+                        <w:rFonts w:ascii="Cambria Math" w:hAnsi="Cambria Math"/>
+                        <w:b/>
+                        <w:sz w:val="16"/>
+                        <w:szCs w:val="16"/>
+                      </w:rPr>
+                    </m:ctrlPr>
+                  </m:sSubPr>
+                  <m:e>
+                    <m:r>
+                      <m:rPr>
+                        <m:nor/>
+                      </m:rPr>
+                      <w:rPr>
+                        <w:rFonts w:ascii="Cambria Math" w:hAnsi="Cambria Math"/>
+                        <w:b/>
+                        <w:sz w:val="16"/>
+                        <w:szCs w:val="16"/>
+                      </w:rPr>
+                      <m:t>mV</m:t>
+                    </m:r>
+                  </m:e>
+                  <m:sub>
+                    <m:r>
+                      <m:rPr>
+                        <m:nor/>
+                      </m:rPr>
+                      <w:rPr>
+                        <w:rFonts w:ascii="Cambria Math" w:hAnsi="Cambria Math"/>
+                        <w:b/>
+                        <w:sz w:val="16"/>
+                        <w:szCs w:val="16"/>
+                      </w:rPr>
+                      <m:t>PP</m:t>
+                    </m:r>
+                  </m:sub>
+                </m:sSub>
+              </m:oMath>
+            </m:oMathPara>
           </w:p>
         </w:tc>
         <w:tc>
@@ -9789,11 +10980,35 @@
                 <w:szCs w:val="16"/>
               </w:rPr>
             </w:pPr>
-          </w:p>
-        </w:tc>
-        <w:tc>
-          <w:tcPr>
-            <w:tcW w:w="0" w:type="auto"/>
+            <w:r>
+              <w:rPr>
+                <w:bCs/>
+                <w:sz w:val="16"/>
+                <w:szCs w:val="16"/>
+              </w:rPr>
+              <w:t>Acceptable with tolerance</w:t>
+            </w:r>
+            <w:r>
+              <w:rPr>
+                <w:bCs/>
+                <w:sz w:val="16"/>
+                <w:szCs w:val="16"/>
+              </w:rPr>
+              <w:t xml:space="preserve"> →</w:t>
+            </w:r>
+            <w:r>
+              <w:rPr>
+                <w:b/>
+                <w:sz w:val="16"/>
+                <w:szCs w:val="16"/>
+              </w:rPr>
+              <w:t xml:space="preserve"> passed</w:t>
+            </w:r>
+          </w:p>
+        </w:tc>
+        <w:tc>
+          <w:tcPr>
+            <w:tcW w:w="1835" w:type="dxa"/>
             <w:tcBorders>
               <w:top w:val="single" w:sz="12" w:space="0" w:color="auto"/>
             </w:tcBorders>
@@ -9803,7 +11018,7 @@
               <w:spacing w:before="0"/>
               <w:jc w:val="left"/>
               <w:rPr>
-                <w:b/>
+                <w:bCs/>
                 <w:sz w:val="16"/>
                 <w:szCs w:val="16"/>
               </w:rPr>
@@ -9838,7 +11053,7 @@
         </w:tc>
         <w:tc>
           <w:tcPr>
-            <w:tcW w:w="0" w:type="auto"/>
+            <w:tcW w:w="2183" w:type="dxa"/>
           </w:tcPr>
           <w:p>
             <w:pPr>
@@ -9885,16 +11100,74 @@
               <m:oMath>
                 <m:r>
                   <m:rPr>
+                    <m:nor/>
+                  </m:rPr>
+                  <w:rPr>
+                    <w:rFonts w:ascii="Cambria Math" w:hAnsi="Cambria Math"/>
+                    <w:sz w:val="16"/>
+                    <w:szCs w:val="16"/>
+                  </w:rPr>
+                  <m:t>Amplification  factor</m:t>
+                </m:r>
+                <m:r>
+                  <w:rPr>
+                    <w:rFonts w:ascii="Cambria Math" w:hAnsi="Cambria Math"/>
+                    <w:sz w:val="16"/>
+                    <w:szCs w:val="16"/>
+                  </w:rPr>
+                  <m:t>=5→</m:t>
+                </m:r>
+                <m:r>
+                  <m:rPr>
                     <m:sty m:val="bi"/>
                   </m:rPr>
                   <w:rPr>
                     <w:rFonts w:ascii="Cambria Math" w:hAnsi="Cambria Math"/>
                     <w:sz w:val="16"/>
                     <w:szCs w:val="16"/>
-                    <w:highlight w:val="yellow"/>
-                  </w:rPr>
-                  <m:t>…</m:t>
-                </m:r>
+                  </w:rPr>
+                  <m:t>2.5</m:t>
+                </m:r>
+                <m:sSub>
+                  <m:sSubPr>
+                    <m:ctrlPr>
+                      <w:rPr>
+                        <w:rFonts w:ascii="Cambria Math" w:hAnsi="Cambria Math"/>
+                        <w:b/>
+                        <w:sz w:val="16"/>
+                        <w:szCs w:val="16"/>
+                      </w:rPr>
+                    </m:ctrlPr>
+                  </m:sSubPr>
+                  <m:e>
+                    <m:r>
+                      <m:rPr>
+                        <m:nor/>
+                      </m:rPr>
+                      <w:rPr>
+                        <w:rFonts w:ascii="Cambria Math" w:hAnsi="Cambria Math"/>
+                        <w:b/>
+                        <w:sz w:val="16"/>
+                        <w:szCs w:val="16"/>
+                      </w:rPr>
+                      <m:t>V</m:t>
+                    </m:r>
+                  </m:e>
+                  <m:sub>
+                    <m:r>
+                      <m:rPr>
+                        <m:nor/>
+                      </m:rPr>
+                      <w:rPr>
+                        <w:rFonts w:ascii="Cambria Math" w:hAnsi="Cambria Math"/>
+                        <w:b/>
+                        <w:sz w:val="16"/>
+                        <w:szCs w:val="16"/>
+                      </w:rPr>
+                      <m:t>PP</m:t>
+                    </m:r>
+                  </m:sub>
+                </m:sSub>
               </m:oMath>
             </m:oMathPara>
           </w:p>
@@ -9913,27 +11186,106 @@
                 <w:szCs w:val="16"/>
               </w:rPr>
             </w:pPr>
-          </w:p>
-        </w:tc>
-        <w:tc>
-          <w:tcPr>
-            <w:tcW w:w="0" w:type="auto"/>
-          </w:tcPr>
-          <w:p>
-            <w:pPr>
-              <w:spacing w:before="0"/>
-              <w:jc w:val="left"/>
-              <w:rPr>
-                <w:b/>
-                <w:sz w:val="16"/>
-                <w:szCs w:val="16"/>
-              </w:rPr>
-            </w:pPr>
-          </w:p>
-        </w:tc>
-        <w:tc>
-          <w:tcPr>
-            <w:tcW w:w="0" w:type="auto"/>
+            <m:oMathPara>
+              <m:oMath>
+                <m:r>
+                  <m:rPr>
+                    <m:sty m:val="bi"/>
+                  </m:rPr>
+                  <w:rPr>
+                    <w:rFonts w:ascii="Cambria Math" w:hAnsi="Cambria Math"/>
+                    <w:sz w:val="16"/>
+                    <w:szCs w:val="16"/>
+                  </w:rPr>
+                  <m:t>2.62</m:t>
+                </m:r>
+                <m:sSub>
+                  <m:sSubPr>
+                    <m:ctrlPr>
+                      <w:rPr>
+                        <w:rFonts w:ascii="Cambria Math" w:hAnsi="Cambria Math"/>
+                        <w:b/>
+                        <w:sz w:val="16"/>
+                        <w:szCs w:val="16"/>
+                      </w:rPr>
+                    </m:ctrlPr>
+                  </m:sSubPr>
+                  <m:e>
+                    <m:r>
+                      <m:rPr>
+                        <m:nor/>
+                      </m:rPr>
+                      <w:rPr>
+                        <w:rFonts w:ascii="Cambria Math" w:hAnsi="Cambria Math"/>
+                        <w:b/>
+                        <w:sz w:val="16"/>
+                        <w:szCs w:val="16"/>
+                      </w:rPr>
+                      <m:t>V</m:t>
+                    </m:r>
+                  </m:e>
+                  <m:sub>
+                    <m:r>
+                      <m:rPr>
+                        <m:nor/>
+                      </m:rPr>
+                      <w:rPr>
+                        <w:rFonts w:ascii="Cambria Math" w:hAnsi="Cambria Math"/>
+                        <w:b/>
+                        <w:sz w:val="16"/>
+                        <w:szCs w:val="16"/>
+                      </w:rPr>
+                      <m:t>PP</m:t>
+                    </m:r>
+                  </m:sub>
+                </m:sSub>
+              </m:oMath>
+            </m:oMathPara>
+          </w:p>
+        </w:tc>
+        <w:tc>
+          <w:tcPr>
+            <w:tcW w:w="0" w:type="auto"/>
+          </w:tcPr>
+          <w:p>
+            <w:pPr>
+              <w:spacing w:before="0"/>
+              <w:jc w:val="left"/>
+              <w:rPr>
+                <w:b/>
+                <w:sz w:val="16"/>
+                <w:szCs w:val="16"/>
+              </w:rPr>
+            </w:pPr>
+            <w:r>
+              <w:rPr>
+                <w:bCs/>
+                <w:sz w:val="16"/>
+                <w:szCs w:val="16"/>
+              </w:rPr>
+              <w:t>Acceptable with tolerance</w:t>
+            </w:r>
+            <w:r>
+              <w:rPr>
+                <w:bCs/>
+                <w:sz w:val="16"/>
+                <w:szCs w:val="16"/>
+              </w:rPr>
+              <w:t xml:space="preserve"> →</w:t>
+            </w:r>
+            <w:r>
+              <w:rPr>
+                <w:b/>
+                <w:sz w:val="16"/>
+                <w:szCs w:val="16"/>
+              </w:rPr>
+              <w:t xml:space="preserve"> passed</w:t>
+            </w:r>
+          </w:p>
+        </w:tc>
+        <w:tc>
+          <w:tcPr>
+            <w:tcW w:w="1835" w:type="dxa"/>
           </w:tcPr>
           <w:p>
             <w:pPr>
@@ -9975,7 +11327,7 @@
         </w:tc>
         <w:tc>
           <w:tcPr>
-            <w:tcW w:w="0" w:type="auto"/>
+            <w:tcW w:w="2183" w:type="dxa"/>
           </w:tcPr>
           <w:p>
             <w:pPr>
@@ -10022,16 +11374,95 @@
               <m:oMath>
                 <m:r>
                   <m:rPr>
+                    <m:nor/>
+                  </m:rPr>
+                  <w:rPr>
+                    <w:rFonts w:ascii="Cambria Math" w:hAnsi="Cambria Math"/>
+                    <w:bCs/>
+                    <w:sz w:val="16"/>
+                    <w:szCs w:val="16"/>
+                  </w:rPr>
+                  <m:t>No attenuation @</m:t>
+                </m:r>
+                <m:r>
+                  <w:rPr>
+                    <w:rFonts w:ascii="Cambria Math" w:hAnsi="Cambria Math"/>
+                    <w:sz w:val="16"/>
+                    <w:szCs w:val="16"/>
+                  </w:rPr>
+                  <m:t xml:space="preserve"> 1</m:t>
+                </m:r>
+                <m:r>
+                  <m:rPr>
+                    <m:nor/>
+                  </m:rPr>
+                  <w:rPr>
+                    <w:rFonts w:ascii="Cambria Math" w:hAnsi="Cambria Math"/>
+                    <w:bCs/>
+                    <w:sz w:val="16"/>
+                    <w:szCs w:val="16"/>
+                  </w:rPr>
+                  <m:t>kHz</m:t>
+                </m:r>
+                <m:r>
+                  <w:rPr>
+                    <w:rFonts w:ascii="Cambria Math" w:hAnsi="Cambria Math"/>
+                    <w:sz w:val="16"/>
+                    <w:szCs w:val="16"/>
+                  </w:rPr>
+                  <m:t>→</m:t>
+                </m:r>
+                <m:r>
+                  <m:rPr>
                     <m:sty m:val="bi"/>
                   </m:rPr>
                   <w:rPr>
                     <w:rFonts w:ascii="Cambria Math" w:hAnsi="Cambria Math"/>
                     <w:sz w:val="16"/>
                     <w:szCs w:val="16"/>
-                    <w:highlight w:val="yellow"/>
-                  </w:rPr>
-                  <m:t>…</m:t>
-                </m:r>
+                  </w:rPr>
+                  <m:t>500</m:t>
+                </m:r>
+                <m:sSub>
+                  <m:sSubPr>
+                    <m:ctrlPr>
+                      <w:rPr>
+                        <w:rFonts w:ascii="Cambria Math" w:hAnsi="Cambria Math"/>
+                        <w:b/>
+                        <w:sz w:val="16"/>
+                        <w:szCs w:val="16"/>
+                      </w:rPr>
+                    </m:ctrlPr>
+                  </m:sSubPr>
+                  <m:e>
+                    <m:r>
+                      <m:rPr>
+                        <m:nor/>
+                      </m:rPr>
+                      <w:rPr>
+                        <w:rFonts w:ascii="Cambria Math" w:hAnsi="Cambria Math"/>
+                        <w:b/>
+                        <w:sz w:val="16"/>
+                        <w:szCs w:val="16"/>
+                      </w:rPr>
+                      <m:t>mV</m:t>
+                    </m:r>
+                  </m:e>
+                  <m:sub>
+                    <m:r>
+                      <m:rPr>
+                        <m:nor/>
+                      </m:rPr>
+                      <w:rPr>
+                        <w:rFonts w:ascii="Cambria Math" w:hAnsi="Cambria Math"/>
+                        <w:b/>
+                        <w:sz w:val="16"/>
+                        <w:szCs w:val="16"/>
+                      </w:rPr>
+                      <m:t>PP</m:t>
+                    </m:r>
+                  </m:sub>
+                </m:sSub>
               </m:oMath>
             </m:oMathPara>
           </w:p>
@@ -10050,27 +11481,106 @@
                 <w:szCs w:val="16"/>
               </w:rPr>
             </w:pPr>
-          </w:p>
-        </w:tc>
-        <w:tc>
-          <w:tcPr>
-            <w:tcW w:w="0" w:type="auto"/>
-          </w:tcPr>
-          <w:p>
-            <w:pPr>
-              <w:spacing w:before="0"/>
-              <w:jc w:val="left"/>
-              <w:rPr>
-                <w:b/>
-                <w:sz w:val="16"/>
-                <w:szCs w:val="16"/>
-              </w:rPr>
-            </w:pPr>
-          </w:p>
-        </w:tc>
-        <w:tc>
-          <w:tcPr>
-            <w:tcW w:w="0" w:type="auto"/>
+            <m:oMathPara>
+              <m:oMath>
+                <m:r>
+                  <m:rPr>
+                    <m:sty m:val="bi"/>
+                  </m:rPr>
+                  <w:rPr>
+                    <w:rFonts w:ascii="Cambria Math" w:hAnsi="Cambria Math"/>
+                    <w:sz w:val="16"/>
+                    <w:szCs w:val="16"/>
+                  </w:rPr>
+                  <m:t>536</m:t>
+                </m:r>
+                <m:sSub>
+                  <m:sSubPr>
+                    <m:ctrlPr>
+                      <w:rPr>
+                        <w:rFonts w:ascii="Cambria Math" w:hAnsi="Cambria Math"/>
+                        <w:b/>
+                        <w:sz w:val="16"/>
+                        <w:szCs w:val="16"/>
+                      </w:rPr>
+                    </m:ctrlPr>
+                  </m:sSubPr>
+                  <m:e>
+                    <m:r>
+                      <m:rPr>
+                        <m:nor/>
+                      </m:rPr>
+                      <w:rPr>
+                        <w:rFonts w:ascii="Cambria Math" w:hAnsi="Cambria Math"/>
+                        <w:b/>
+                        <w:sz w:val="16"/>
+                        <w:szCs w:val="16"/>
+                      </w:rPr>
+                      <m:t>mV</m:t>
+                    </m:r>
+                  </m:e>
+                  <m:sub>
+                    <m:r>
+                      <m:rPr>
+                        <m:nor/>
+                      </m:rPr>
+                      <w:rPr>
+                        <w:rFonts w:ascii="Cambria Math" w:hAnsi="Cambria Math"/>
+                        <w:b/>
+                        <w:sz w:val="16"/>
+                        <w:szCs w:val="16"/>
+                      </w:rPr>
+                      <m:t>PP</m:t>
+                    </m:r>
+                  </m:sub>
+                </m:sSub>
+              </m:oMath>
+            </m:oMathPara>
+          </w:p>
+        </w:tc>
+        <w:tc>
+          <w:tcPr>
+            <w:tcW w:w="0" w:type="auto"/>
+          </w:tcPr>
+          <w:p>
+            <w:pPr>
+              <w:spacing w:before="0"/>
+              <w:jc w:val="left"/>
+              <w:rPr>
+                <w:b/>
+                <w:sz w:val="16"/>
+                <w:szCs w:val="16"/>
+              </w:rPr>
+            </w:pPr>
+            <w:r>
+              <w:rPr>
+                <w:bCs/>
+                <w:sz w:val="16"/>
+                <w:szCs w:val="16"/>
+              </w:rPr>
+              <w:t>Acceptable with tolerance</w:t>
+            </w:r>
+            <w:r>
+              <w:rPr>
+                <w:bCs/>
+                <w:sz w:val="16"/>
+                <w:szCs w:val="16"/>
+              </w:rPr>
+              <w:t xml:space="preserve"> →</w:t>
+            </w:r>
+            <w:r>
+              <w:rPr>
+                <w:b/>
+                <w:sz w:val="16"/>
+                <w:szCs w:val="16"/>
+              </w:rPr>
+              <w:t xml:space="preserve"> passed</w:t>
+            </w:r>
+          </w:p>
+        </w:tc>
+        <w:tc>
+          <w:tcPr>
+            <w:tcW w:w="1835" w:type="dxa"/>
           </w:tcPr>
           <w:p>
             <w:pPr>
@@ -10089,6 +11599,9 @@
         <w:tc>
           <w:tcPr>
             <w:tcW w:w="0" w:type="auto"/>
+            <w:tcBorders>
+              <w:bottom w:val="single" w:sz="12" w:space="0" w:color="auto"/>
+            </w:tcBorders>
           </w:tcPr>
           <w:p>
             <w:pPr>
@@ -10112,7 +11625,10 @@
         </w:tc>
         <w:tc>
           <w:tcPr>
-            <w:tcW w:w="0" w:type="auto"/>
+            <w:tcW w:w="2183" w:type="dxa"/>
+            <w:tcBorders>
+              <w:bottom w:val="single" w:sz="12" w:space="0" w:color="auto"/>
+            </w:tcBorders>
           </w:tcPr>
           <w:p>
             <w:pPr>
@@ -10143,6 +11659,9 @@
         <w:tc>
           <w:tcPr>
             <w:tcW w:w="0" w:type="auto"/>
+            <w:tcBorders>
+              <w:bottom w:val="single" w:sz="12" w:space="0" w:color="auto"/>
+            </w:tcBorders>
             <w:noWrap/>
           </w:tcPr>
           <w:p>
@@ -10159,16 +11678,74 @@
               <m:oMath>
                 <m:r>
                   <m:rPr>
+                    <m:nor/>
+                  </m:rPr>
+                  <w:rPr>
+                    <w:rFonts w:ascii="Cambria Math" w:hAnsi="Cambria Math"/>
+                    <w:sz w:val="16"/>
+                    <w:szCs w:val="16"/>
+                  </w:rPr>
+                  <m:t>Amplification  factor</m:t>
+                </m:r>
+                <m:r>
+                  <w:rPr>
+                    <w:rFonts w:ascii="Cambria Math" w:hAnsi="Cambria Math"/>
+                    <w:sz w:val="16"/>
+                    <w:szCs w:val="16"/>
+                  </w:rPr>
+                  <m:t>=5→</m:t>
+                </m:r>
+                <m:r>
+                  <m:rPr>
                     <m:sty m:val="bi"/>
                   </m:rPr>
                   <w:rPr>
                     <w:rFonts w:ascii="Cambria Math" w:hAnsi="Cambria Math"/>
                     <w:sz w:val="16"/>
                     <w:szCs w:val="16"/>
-                    <w:highlight w:val="yellow"/>
-                  </w:rPr>
-                  <m:t>…</m:t>
-                </m:r>
+                  </w:rPr>
+                  <m:t>2.5</m:t>
+                </m:r>
+                <m:sSub>
+                  <m:sSubPr>
+                    <m:ctrlPr>
+                      <w:rPr>
+                        <w:rFonts w:ascii="Cambria Math" w:hAnsi="Cambria Math"/>
+                        <w:b/>
+                        <w:sz w:val="16"/>
+                        <w:szCs w:val="16"/>
+                      </w:rPr>
+                    </m:ctrlPr>
+                  </m:sSubPr>
+                  <m:e>
+                    <m:r>
+                      <m:rPr>
+                        <m:nor/>
+                      </m:rPr>
+                      <w:rPr>
+                        <w:rFonts w:ascii="Cambria Math" w:hAnsi="Cambria Math"/>
+                        <w:b/>
+                        <w:sz w:val="16"/>
+                        <w:szCs w:val="16"/>
+                      </w:rPr>
+                      <m:t>V</m:t>
+                    </m:r>
+                  </m:e>
+                  <m:sub>
+                    <m:r>
+                      <m:rPr>
+                        <m:nor/>
+                      </m:rPr>
+                      <w:rPr>
+                        <w:rFonts w:ascii="Cambria Math" w:hAnsi="Cambria Math"/>
+                        <w:b/>
+                        <w:sz w:val="16"/>
+                        <w:szCs w:val="16"/>
+                      </w:rPr>
+                      <m:t>PP</m:t>
+                    </m:r>
+                  </m:sub>
+                </m:sSub>
               </m:oMath>
             </m:oMathPara>
           </w:p>
@@ -10176,45 +11753,331 @@
         <w:tc>
           <w:tcPr>
             <w:tcW w:w="0" w:type="auto"/>
-          </w:tcPr>
-          <w:p>
-            <w:pPr>
-              <w:spacing w:before="0"/>
-              <w:jc w:val="left"/>
-              <w:rPr>
-                <w:b/>
-                <w:sz w:val="16"/>
-                <w:szCs w:val="16"/>
-              </w:rPr>
-            </w:pPr>
-          </w:p>
-        </w:tc>
-        <w:tc>
-          <w:tcPr>
-            <w:tcW w:w="0" w:type="auto"/>
-          </w:tcPr>
-          <w:p>
-            <w:pPr>
-              <w:spacing w:before="0"/>
-              <w:jc w:val="left"/>
-              <w:rPr>
-                <w:b/>
-                <w:sz w:val="16"/>
-                <w:szCs w:val="16"/>
-              </w:rPr>
-            </w:pPr>
-          </w:p>
-        </w:tc>
-        <w:tc>
-          <w:tcPr>
-            <w:tcW w:w="0" w:type="auto"/>
-          </w:tcPr>
-          <w:p>
-            <w:pPr>
-              <w:spacing w:before="0"/>
-              <w:jc w:val="left"/>
-              <w:rPr>
-                <w:b/>
+            <w:tcBorders>
+              <w:bottom w:val="single" w:sz="12" w:space="0" w:color="auto"/>
+            </w:tcBorders>
+          </w:tcPr>
+          <w:p>
+            <w:pPr>
+              <w:spacing w:before="0"/>
+              <w:jc w:val="left"/>
+              <w:rPr>
+                <w:b/>
+                <w:sz w:val="16"/>
+                <w:szCs w:val="16"/>
+              </w:rPr>
+            </w:pPr>
+            <m:oMathPara>
+              <m:oMath>
+                <m:r>
+                  <m:rPr>
+                    <m:sty m:val="bi"/>
+                  </m:rPr>
+                  <w:rPr>
+                    <w:rFonts w:ascii="Cambria Math" w:hAnsi="Cambria Math"/>
+                    <w:sz w:val="16"/>
+                    <w:szCs w:val="16"/>
+                  </w:rPr>
+                  <m:t>2.60</m:t>
+                </m:r>
+                <m:sSub>
+                  <m:sSubPr>
+                    <m:ctrlPr>
+                      <w:rPr>
+                        <w:rFonts w:ascii="Cambria Math" w:hAnsi="Cambria Math"/>
+                        <w:b/>
+                        <w:sz w:val="16"/>
+                        <w:szCs w:val="16"/>
+                      </w:rPr>
+                    </m:ctrlPr>
+                  </m:sSubPr>
+                  <m:e>
+                    <m:r>
+                      <m:rPr>
+                        <m:nor/>
+                      </m:rPr>
+                      <w:rPr>
+                        <w:rFonts w:ascii="Cambria Math" w:hAnsi="Cambria Math"/>
+                        <w:b/>
+                        <w:sz w:val="16"/>
+                        <w:szCs w:val="16"/>
+                      </w:rPr>
+                      <m:t>V</m:t>
+                    </m:r>
+                  </m:e>
+                  <m:sub>
+                    <m:r>
+                      <m:rPr>
+                        <m:nor/>
+                      </m:rPr>
+                      <w:rPr>
+                        <w:rFonts w:ascii="Cambria Math" w:hAnsi="Cambria Math"/>
+                        <w:b/>
+                        <w:sz w:val="16"/>
+                        <w:szCs w:val="16"/>
+                      </w:rPr>
+                      <m:t>PP</m:t>
+                    </m:r>
+                  </m:sub>
+                </m:sSub>
+              </m:oMath>
+            </m:oMathPara>
+          </w:p>
+        </w:tc>
+        <w:tc>
+          <w:tcPr>
+            <w:tcW w:w="0" w:type="auto"/>
+            <w:tcBorders>
+              <w:bottom w:val="single" w:sz="12" w:space="0" w:color="auto"/>
+            </w:tcBorders>
+          </w:tcPr>
+          <w:p>
+            <w:pPr>
+              <w:spacing w:before="0"/>
+              <w:jc w:val="left"/>
+              <w:rPr>
+                <w:b/>
+                <w:sz w:val="16"/>
+                <w:szCs w:val="16"/>
+              </w:rPr>
+            </w:pPr>
+            <w:r>
+              <w:rPr>
+                <w:bCs/>
+                <w:sz w:val="16"/>
+                <w:szCs w:val="16"/>
+              </w:rPr>
+              <w:t>Acceptable with tolerance</w:t>
+            </w:r>
+            <w:r>
+              <w:rPr>
+                <w:bCs/>
+                <w:sz w:val="16"/>
+                <w:szCs w:val="16"/>
+              </w:rPr>
+              <w:t xml:space="preserve"> →</w:t>
+            </w:r>
+            <w:r>
+              <w:rPr>
+                <w:b/>
+                <w:sz w:val="16"/>
+                <w:szCs w:val="16"/>
+              </w:rPr>
+              <w:t xml:space="preserve"> passed</w:t>
+            </w:r>
+          </w:p>
+        </w:tc>
+        <w:tc>
+          <w:tcPr>
+            <w:tcW w:w="1835" w:type="dxa"/>
+            <w:tcBorders>
+              <w:bottom w:val="single" w:sz="12" w:space="0" w:color="auto"/>
+            </w:tcBorders>
+          </w:tcPr>
+          <w:p>
+            <w:pPr>
+              <w:spacing w:before="0"/>
+              <w:jc w:val="left"/>
+              <w:rPr>
+                <w:b/>
+                <w:sz w:val="16"/>
+                <w:szCs w:val="16"/>
+              </w:rPr>
+            </w:pPr>
+          </w:p>
+        </w:tc>
+      </w:tr>
+      <w:tr>
+        <w:tc>
+          <w:tcPr>
+            <w:tcW w:w="0" w:type="auto"/>
+            <w:tcBorders>
+              <w:top w:val="single" w:sz="12" w:space="0" w:color="auto"/>
+            </w:tcBorders>
+          </w:tcPr>
+          <w:p>
+            <w:pPr>
+              <w:spacing w:before="0"/>
+              <w:jc w:val="left"/>
+              <w:rPr>
+                <w:b/>
+                <w:sz w:val="16"/>
+                <w:szCs w:val="16"/>
+              </w:rPr>
+            </w:pPr>
+            <w:r>
+              <w:rPr>
+                <w:b/>
+                <w:sz w:val="16"/>
+                <w:szCs w:val="16"/>
+              </w:rPr>
+              <w:t>Frequency sweep</w:t>
+            </w:r>
+          </w:p>
+        </w:tc>
+        <w:tc>
+          <w:tcPr>
+            <w:tcW w:w="2183" w:type="dxa"/>
+            <w:tcBorders>
+              <w:top w:val="single" w:sz="12" w:space="0" w:color="auto"/>
+            </w:tcBorders>
+          </w:tcPr>
+          <w:p>
+            <w:pPr>
+              <w:spacing w:before="0"/>
+              <w:jc w:val="left"/>
+              <w:rPr>
+                <w:bCs/>
+                <w:sz w:val="16"/>
+                <w:szCs w:val="16"/>
+              </w:rPr>
+            </w:pPr>
+            <w:r>
+              <w:rPr>
+                <w:bCs/>
+                <w:sz w:val="16"/>
+                <w:szCs w:val="16"/>
+              </w:rPr>
+              <w:t xml:space="preserve">Input signal: </w:t>
+            </w:r>
+            <w:r>
+              <w:rPr>
+                <w:sz w:val="16"/>
+              </w:rPr>
+              <w:t>Frequency sweep 400Hz … 20kHz</w:t>
+            </w:r>
+          </w:p>
+        </w:tc>
+        <w:tc>
+          <w:tcPr>
+            <w:tcW w:w="0" w:type="auto"/>
+            <w:tcBorders>
+              <w:top w:val="single" w:sz="12" w:space="0" w:color="auto"/>
+            </w:tcBorders>
+            <w:noWrap/>
+          </w:tcPr>
+          <w:p>
+            <w:pPr>
+              <w:spacing w:before="0"/>
+              <w:jc w:val="center"/>
+              <w:rPr>
+                <w:sz w:val="16"/>
+                <w:szCs w:val="16"/>
+              </w:rPr>
+            </w:pPr>
+            <m:oMathPara>
+              <m:oMath>
+                <m:r>
+                  <m:rPr>
+                    <m:nor/>
+                  </m:rPr>
+                  <w:rPr>
+                    <w:rFonts w:ascii="Cambria Math" w:hAnsi="Cambria Math"/>
+                    <w:b/>
+                    <w:sz w:val="16"/>
+                    <w:szCs w:val="16"/>
+                  </w:rPr>
+                  <m:t xml:space="preserve">No attenuation </m:t>
+                </m:r>
+                <m:r>
+                  <m:rPr>
+                    <m:nor/>
+                  </m:rPr>
+                  <w:rPr>
+                    <w:rFonts w:ascii="Cambria Math" w:hAnsi="Cambria Math"/>
+                    <w:bCs/>
+                    <w:sz w:val="16"/>
+                    <w:szCs w:val="16"/>
+                  </w:rPr>
+                  <m:t>in FFT spectrum</m:t>
+                </m:r>
+              </m:oMath>
+            </m:oMathPara>
+          </w:p>
+        </w:tc>
+        <w:tc>
+          <w:tcPr>
+            <w:tcW w:w="0" w:type="auto"/>
+            <w:tcBorders>
+              <w:top w:val="single" w:sz="12" w:space="0" w:color="auto"/>
+            </w:tcBorders>
+          </w:tcPr>
+          <w:p>
+            <w:pPr>
+              <w:spacing w:before="0"/>
+              <w:jc w:val="left"/>
+              <w:rPr>
+                <w:b/>
+                <w:sz w:val="16"/>
+                <w:szCs w:val="16"/>
+              </w:rPr>
+            </w:pPr>
+            <m:oMathPara>
+              <m:oMath>
+                <m:r>
+                  <m:rPr>
+                    <m:nor/>
+                  </m:rPr>
+                  <w:rPr>
+                    <w:rFonts w:ascii="Cambria Math" w:hAnsi="Cambria Math"/>
+                    <w:b/>
+                    <w:sz w:val="16"/>
+                    <w:szCs w:val="16"/>
+                  </w:rPr>
+                  <m:t>Yes</m:t>
+                </m:r>
+              </m:oMath>
+            </m:oMathPara>
+          </w:p>
+        </w:tc>
+        <w:tc>
+          <w:tcPr>
+            <w:tcW w:w="0" w:type="auto"/>
+            <w:tcBorders>
+              <w:top w:val="single" w:sz="12" w:space="0" w:color="auto"/>
+            </w:tcBorders>
+          </w:tcPr>
+          <w:p>
+            <w:pPr>
+              <w:spacing w:before="0"/>
+              <w:jc w:val="left"/>
+              <w:rPr>
+                <w:b/>
+                <w:sz w:val="16"/>
+                <w:szCs w:val="16"/>
+              </w:rPr>
+            </w:pPr>
+            <w:r>
+              <w:rPr>
+                <w:bCs/>
+                <w:sz w:val="16"/>
+                <w:szCs w:val="16"/>
+              </w:rPr>
+              <w:t>As expected →</w:t>
+            </w:r>
+            <w:r>
+              <w:rPr>
+                <w:b/>
+                <w:sz w:val="16"/>
+                <w:szCs w:val="16"/>
+              </w:rPr>
+              <w:t xml:space="preserve"> passed</w:t>
+            </w:r>
+          </w:p>
+        </w:tc>
+        <w:tc>
+          <w:tcPr>
+            <w:tcW w:w="1835" w:type="dxa"/>
+            <w:tcBorders>
+              <w:top w:val="single" w:sz="12" w:space="0" w:color="auto"/>
+            </w:tcBorders>
+          </w:tcPr>
+          <w:p>
+            <w:pPr>
+              <w:spacing w:before="0"/>
+              <w:jc w:val="left"/>
+              <w:rPr>
+                <w:bCs/>
                 <w:sz w:val="16"/>
                 <w:szCs w:val="16"/>
               </w:rPr>
@@ -10223,15 +12086,232 @@
         </w:tc>
       </w:tr>
     </w:tbl>
-    <w:p/>
     <w:p>
-      <w:r>
+      <w:pPr>
+        <w:spacing w:before="0"/>
+        <w:jc w:val="left"/>
         <w:rPr>
-          <w:highlight w:val="yellow"/>
+          <w:sz w:val="10"/>
+          <w:szCs w:val="12"/>
         </w:rPr>
-        <w:t>**********************************</w:t>
-      </w:r>
+      </w:pPr>
     </w:p>
+    <w:tbl>
+      <w:tblPr>
+        <w:tblStyle w:val="TableGrid"/>
+        <w:tblW w:w="0" w:type="auto"/>
+        <w:tblBorders>
+          <w:top w:val="none" w:sz="0" w:space="0" w:color="auto"/>
+          <w:left w:val="none" w:sz="0" w:space="0" w:color="auto"/>
+          <w:bottom w:val="none" w:sz="0" w:space="0" w:color="auto"/>
+          <w:right w:val="none" w:sz="0" w:space="0" w:color="auto"/>
+          <w:insideH w:val="none" w:sz="0" w:space="0" w:color="auto"/>
+          <w:insideV w:val="none" w:sz="0" w:space="0" w:color="auto"/>
+        </w:tblBorders>
+        <w:tblLook w:val="04A0" w:firstRow="1" w:lastRow="0" w:firstColumn="1" w:lastColumn="0" w:noHBand="0" w:noVBand="1"/>
+      </w:tblPr>
+      <w:tblGrid>
+        <w:gridCol w:w="5597"/>
+        <w:gridCol w:w="7405"/>
+      </w:tblGrid>
+      <w:tr>
+        <w:tc>
+          <w:tcPr>
+            <w:tcW w:w="0" w:type="auto"/>
+          </w:tcPr>
+          <w:p>
+            <w:pPr>
+              <w:spacing w:before="0"/>
+              <w:jc w:val="left"/>
+            </w:pPr>
+            <w:r>
+              <w:t>Information on the conducted tests</w:t>
+            </w:r>
+            <w:r>
+              <w:t>:</w:t>
+            </w:r>
+          </w:p>
+        </w:tc>
+        <w:tc>
+          <w:tcPr>
+            <w:tcW w:w="0" w:type="auto"/>
+          </w:tcPr>
+          <w:p>
+            <w:pPr>
+              <w:spacing w:before="0"/>
+              <w:jc w:val="left"/>
+              <w:rPr>
+                <w:b/>
+                <w:bCs/>
+              </w:rPr>
+            </w:pPr>
+          </w:p>
+        </w:tc>
+      </w:tr>
+      <w:tr>
+        <w:tc>
+          <w:tcPr>
+            <w:tcW w:w="0" w:type="auto"/>
+          </w:tcPr>
+          <w:p>
+            <w:pPr>
+              <w:spacing w:before="0"/>
+              <w:jc w:val="left"/>
+            </w:pPr>
+            <w:r>
+              <w:rPr>
+                <w:b/>
+                <w:bCs/>
+              </w:rPr>
+              <w:t>Date</w:t>
+            </w:r>
+            <w:r>
+              <w:t>: 31.10.2025, 07.11.2025 and 14.11.2025</w:t>
+            </w:r>
+          </w:p>
+        </w:tc>
+        <w:tc>
+          <w:tcPr>
+            <w:tcW w:w="0" w:type="auto"/>
+          </w:tcPr>
+          <w:p>
+            <w:pPr>
+              <w:spacing w:before="0"/>
+              <w:jc w:val="left"/>
+            </w:pPr>
+            <w:r>
+              <w:rPr>
+                <w:b/>
+                <w:bCs/>
+              </w:rPr>
+              <w:t>Location</w:t>
+            </w:r>
+            <w:r>
+              <w:t xml:space="preserve">: ZHAW, </w:t>
+            </w:r>
+            <w:proofErr w:type="spellStart"/>
+            <w:r>
+              <w:t>Technikumstrasse</w:t>
+            </w:r>
+            <w:proofErr w:type="spellEnd"/>
+            <w:r>
+              <w:t xml:space="preserve"> 71, 8400 Winterthur</w:t>
+            </w:r>
+            <w:r>
+              <w:t>, Room TS04.11</w:t>
+            </w:r>
+          </w:p>
+        </w:tc>
+      </w:tr>
+      <w:tr>
+        <w:tc>
+          <w:tcPr>
+            <w:tcW w:w="0" w:type="auto"/>
+          </w:tcPr>
+          <w:p>
+            <w:pPr>
+              <w:spacing w:before="0"/>
+              <w:jc w:val="left"/>
+            </w:pPr>
+            <w:r>
+              <w:rPr>
+                <w:b/>
+                <w:bCs/>
+              </w:rPr>
+              <w:t>Test personnel</w:t>
+            </w:r>
+            <w:r>
+              <w:t xml:space="preserve">: </w:t>
+            </w:r>
+            <w:r>
+              <w:t>Thomas Perri</w:t>
+            </w:r>
+            <w:r>
+              <w:t xml:space="preserve"> and Bogdans Grebnevs</w:t>
+            </w:r>
+          </w:p>
+        </w:tc>
+        <w:tc>
+          <w:tcPr>
+            <w:tcW w:w="0" w:type="auto"/>
+          </w:tcPr>
+          <w:p>
+            <w:pPr>
+              <w:spacing w:before="0"/>
+              <w:jc w:val="left"/>
+            </w:pPr>
+          </w:p>
+        </w:tc>
+      </w:tr>
+      <w:tr>
+        <w:tc>
+          <w:tcPr>
+            <w:tcW w:w="0" w:type="auto"/>
+            <w:gridSpan w:val="2"/>
+          </w:tcPr>
+          <w:p>
+            <w:pPr>
+              <w:spacing w:before="0"/>
+              <w:jc w:val="left"/>
+            </w:pPr>
+            <w:r>
+              <w:rPr>
+                <w:b/>
+                <w:bCs/>
+              </w:rPr>
+              <w:t>Equipment</w:t>
+            </w:r>
+            <w:r>
+              <w:t xml:space="preserve">: </w:t>
+            </w:r>
+            <w:r>
+              <w:t xml:space="preserve">Keysight U3402A digital multimeter, Tektronix TDS 2012C oscilloscope, </w:t>
+            </w:r>
+            <w:proofErr w:type="spellStart"/>
+            <w:r>
+              <w:t>TTi</w:t>
+            </w:r>
+            <w:proofErr w:type="spellEnd"/>
+            <w:r>
+              <w:t xml:space="preserve"> EL302RT</w:t>
+            </w:r>
+            <w:r>
+              <w:t xml:space="preserve"> </w:t>
+            </w:r>
+            <w:r>
+              <w:t>l</w:t>
+            </w:r>
+            <w:r>
+              <w:t>aboratory power supply</w:t>
+            </w:r>
+          </w:p>
+        </w:tc>
+      </w:tr>
+      <w:tr>
+        <w:tc>
+          <w:tcPr>
+            <w:tcW w:w="0" w:type="auto"/>
+            <w:gridSpan w:val="2"/>
+          </w:tcPr>
+          <w:p>
+            <w:pPr>
+              <w:jc w:val="left"/>
+              <w:rPr>
+                <w:i/>
+                <w:iCs/>
+              </w:rPr>
+            </w:pPr>
+            <w:r>
+              <w:rPr>
+                <w:i/>
+                <w:iCs/>
+              </w:rPr>
+              <w:t>For further detailed information see the accompanying Excel table.</w:t>
+            </w:r>
+          </w:p>
+        </w:tc>
+      </w:tr>
+    </w:tbl>
     <w:p>
       <w:pPr>
         <w:sectPr>
@@ -10246,295 +12326,123 @@
       <w:pPr>
         <w:pStyle w:val="Heading1"/>
       </w:pPr>
-      <w:bookmarkStart w:id="4" w:name="_Toc213915670"/>
+      <w:bookmarkStart w:id="4" w:name="_Toc213998208"/>
       <w:r>
         <w:lastRenderedPageBreak/>
-        <w:t>Run</w:t>
-      </w:r>
-      <w:r>
-        <w:t xml:space="preserve"> the T</w:t>
-      </w:r>
-      <w:r>
-        <w:t>est</w:t>
-      </w:r>
-      <w:r>
-        <w:t>s</w:t>
+        <w:t>Test Analysis</w:t>
       </w:r>
       <w:bookmarkEnd w:id="4"/>
     </w:p>
     <w:p>
+      <w:pPr>
+        <w:jc w:val="left"/>
+      </w:pPr>
       <w:r>
-        <w:t>Execute the tests as define</w:t>
-      </w:r>
-      <w:r>
-        <w:t xml:space="preserve">d in the test plan. </w:t>
-      </w:r>
-      <w:r>
-        <w:t>It should therefore always be clear what results you would expect.</w:t>
-      </w:r>
-    </w:p>
-    <w:p>
-      <w:r>
-        <w:t>Write a test protocol while doing the tests. It should include:</w:t>
+        <w:t>During testing, several issues related to missing or incorrect electrical connections were identified and subsequently corrected.</w:t>
       </w:r>
     </w:p>
     <w:p>
       <w:pPr>
-        <w:pStyle w:val="ListParagraph"/>
-        <w:numPr>
-          <w:ilvl w:val="0"/>
-          <w:numId w:val="15"/>
-        </w:numPr>
+        <w:jc w:val="left"/>
       </w:pPr>
       <w:r>
-        <w:t xml:space="preserve">All information about the conditions and results of the measurement. </w:t>
+        <w:rPr>
+          <w:b/>
+          <w:bCs/>
+        </w:rPr>
+        <w:t>Problem 1: Incorrect power-supply flag naming</w:t>
       </w:r>
       <w:r>
         <w:br/>
-        <w:t>E.g. tables with raw data, generat</w:t>
+        <w:t>During schematic design, some power-supply flags were inconsistently named across different sheets. As a result, the corresponding nets were not connected in the PCB layout.</w:t>
       </w:r>
       <w:r>
-        <w:t>ed log files or graphs</w:t>
+        <w:br/>
+      </w:r>
+      <w:r>
+        <w:rPr>
+          <w:b/>
+          <w:bCs/>
+        </w:rPr>
+        <w:t>Solution:</w:t>
+      </w:r>
+      <w:r>
+        <w:t xml:space="preserve"> Two patch wires were added: one from the 3.3 V </w:t>
+      </w:r>
+      <w:r>
+        <w:t>line</w:t>
+      </w:r>
+      <w:r>
+        <w:t xml:space="preserve"> to C29 and another from JP5 to R27.</w:t>
+      </w:r>
+      <w:r>
+        <w:br/>
+        <w:t>After applying these modifications, the power-supply functioned correctly throughout the entire device.</w:t>
       </w:r>
     </w:p>
     <w:p>
       <w:pPr>
-        <w:pStyle w:val="ListParagraph"/>
-        <w:numPr>
-          <w:ilvl w:val="0"/>
-          <w:numId w:val="15"/>
-        </w:numPr>
+        <w:jc w:val="left"/>
       </w:pPr>
       <w:r>
-        <w:t>Comments on any noteworthy observations: unexpected results, special insights, instabilities …</w:t>
+        <w:rPr>
+          <w:b/>
+          <w:bCs/>
+        </w:rPr>
+        <w:t>Problem 2: Reference-voltage (VCOM) buffer of the input filter</w:t>
+      </w:r>
+      <w:r>
+        <w:br/>
+        <w:t>Similar to Problem 1, the signal flags for the VCOM reference voltage were mixed up. This caused an unintended bridging of the buffer stage and led to a short between the codec and filter VCOM pins.</w:t>
+      </w:r>
+      <w:r>
+        <w:br/>
+      </w:r>
+      <w:r>
+        <w:rPr>
+          <w:b/>
+          <w:bCs/>
+        </w:rPr>
+        <w:t>Solution:</w:t>
+      </w:r>
+      <w:r>
+        <w:t xml:space="preserve"> The affected PCB traces were cut in three locations, and two patch wires were added: one from the codec’s VCOM output (via) to the input pin of the buffer op-amp, and another from R37 to C37.</w:t>
+      </w:r>
+      <w:r>
+        <w:br/>
+        <w:t>After implementing these changes, both the codec VCOM output and the buffer output showed correct levels, restoring proper operation of the input filter.</w:t>
       </w:r>
     </w:p>
     <w:p>
       <w:pPr>
-        <w:pStyle w:val="ListParagraph"/>
-        <w:numPr>
-          <w:ilvl w:val="0"/>
-          <w:numId w:val="15"/>
-        </w:numPr>
+        <w:jc w:val="left"/>
       </w:pPr>
       <w:r>
-        <w:t>Formal information: who did the test, date, time, location, identification of equipment used</w:t>
-      </w:r>
-    </w:p>
-    <w:p>
-      <w:r>
-        <w:t>With the</w:t>
+        <w:t xml:space="preserve">After implementing these </w:t>
       </w:r>
       <w:r>
-        <w:t xml:space="preserve"> t</w:t>
+        <w:t>corrections</w:t>
       </w:r>
       <w:r>
-        <w:t>est plan and the test protocol, it</w:t>
+        <w:t xml:space="preserve">, all tests </w:t>
       </w:r>
       <w:r>
-        <w:t xml:space="preserve"> should be possible to redo a measurement and reproduce the results.</w:t>
-      </w:r>
-    </w:p>
-    <w:p>
-      <w:r>
-        <w:t xml:space="preserve">When a test case has been finished, it </w:t>
+        <w:t xml:space="preserve">were </w:t>
       </w:r>
       <w:r>
-        <w:t>must</w:t>
+        <w:t xml:space="preserve">completed successfully, with only minor deviations that </w:t>
       </w:r>
       <w:r>
-        <w:t xml:space="preserve"> be clear whether the test </w:t>
+        <w:t>stayed</w:t>
       </w:r>
       <w:r>
-        <w:t>has</w:t>
+        <w:t xml:space="preserve"> </w:t>
       </w:r>
       <w:r>
-        <w:t xml:space="preserve"> passed or failed.</w:t>
-      </w:r>
-    </w:p>
-    <w:p>
-      <w:r>
-        <w:t xml:space="preserve">When a test </w:t>
+        <w:t xml:space="preserve">within acceptable limits. In summary, the DUT has passed the hardware validation and is ready </w:t>
       </w:r>
       <w:r>
-        <w:t>has</w:t>
-      </w:r>
-      <w:r>
-        <w:t xml:space="preserve"> failed, decide whether the test session can be continued or whether </w:t>
-      </w:r>
-      <w:r>
-        <w:t>it</w:t>
-      </w:r>
-      <w:r>
-        <w:t xml:space="preserve"> has to be aborted.</w:t>
-      </w:r>
-    </w:p>
-    <w:p>
-      <w:r>
-        <w:t>After correcting an error, all the tests depending on the affected part, must be redone and the tests documented again.</w:t>
-      </w:r>
-    </w:p>
-    <w:p>
-      <w:pPr>
-        <w:pStyle w:val="Heading1"/>
-      </w:pPr>
-      <w:bookmarkStart w:id="5" w:name="_Toc213915671"/>
-      <w:r>
-        <w:t>Test Analysis</w:t>
-      </w:r>
-      <w:bookmarkEnd w:id="5"/>
-    </w:p>
-    <w:p>
-      <w:r>
-        <w:t xml:space="preserve">Test analysis after the </w:t>
-      </w:r>
-      <w:r>
-        <w:t>test session</w:t>
-      </w:r>
-      <w:r>
-        <w:t xml:space="preserve"> may</w:t>
-      </w:r>
-      <w:r>
-        <w:t xml:space="preserve"> include:</w:t>
-      </w:r>
-    </w:p>
-    <w:p>
-      <w:pPr>
-        <w:pStyle w:val="ListParagraph"/>
-        <w:numPr>
-          <w:ilvl w:val="0"/>
-          <w:numId w:val="16"/>
-        </w:numPr>
-      </w:pPr>
-      <w:r>
-        <w:t>Post processing of the test results</w:t>
-      </w:r>
-    </w:p>
-    <w:p>
-      <w:pPr>
-        <w:pStyle w:val="ListParagraph"/>
-        <w:numPr>
-          <w:ilvl w:val="0"/>
-          <w:numId w:val="16"/>
-        </w:numPr>
-      </w:pPr>
-      <w:r>
-        <w:t>Presentation of the r</w:t>
-      </w:r>
-      <w:r>
-        <w:t>esults e.g. as graphs, tables, ...</w:t>
-      </w:r>
-    </w:p>
-    <w:p>
-      <w:pPr>
-        <w:pStyle w:val="ListParagraph"/>
-        <w:numPr>
-          <w:ilvl w:val="0"/>
-          <w:numId w:val="16"/>
-        </w:numPr>
-      </w:pPr>
-      <w:r>
-        <w:t>Detailed comparison against the expect</w:t>
-      </w:r>
-      <w:r>
-        <w:t xml:space="preserve">ations, simulations, datasheets, </w:t>
-      </w:r>
-      <w:r>
-        <w:t>…</w:t>
-      </w:r>
-    </w:p>
-    <w:p>
-      <w:pPr>
-        <w:pStyle w:val="ListParagraph"/>
-        <w:numPr>
-          <w:ilvl w:val="0"/>
-          <w:numId w:val="16"/>
-        </w:numPr>
-      </w:pPr>
-      <w:r>
-        <w:t>Finding  reasons for deviations and errors</w:t>
-      </w:r>
-    </w:p>
-    <w:p>
-      <w:pPr>
-        <w:pStyle w:val="ListParagraph"/>
-        <w:numPr>
-          <w:ilvl w:val="0"/>
-          <w:numId w:val="16"/>
-        </w:numPr>
-      </w:pPr>
-      <w:r>
-        <w:t xml:space="preserve">Commenting </w:t>
-      </w:r>
-      <w:r>
-        <w:t>and</w:t>
-      </w:r>
-      <w:r>
-        <w:t xml:space="preserve"> discussing the results</w:t>
-      </w:r>
-    </w:p>
-    <w:p>
-      <w:pPr>
-        <w:pStyle w:val="ListParagraph"/>
-        <w:numPr>
-          <w:ilvl w:val="0"/>
-          <w:numId w:val="16"/>
-        </w:numPr>
-      </w:pPr>
-      <w:r>
-        <w:t>Make a f</w:t>
-      </w:r>
-      <w:r>
-        <w:t xml:space="preserve">inal verdict: </w:t>
-      </w:r>
-      <w:r>
-        <w:t>p</w:t>
-      </w:r>
-      <w:r>
-        <w:t xml:space="preserve">assed or </w:t>
-      </w:r>
-      <w:r>
-        <w:t>f</w:t>
-      </w:r>
-      <w:r>
-        <w:t>ailed</w:t>
-      </w:r>
-    </w:p>
-    <w:p>
-      <w:pPr>
-        <w:pStyle w:val="Heading1"/>
-      </w:pPr>
-      <w:bookmarkStart w:id="6" w:name="_Toc213915672"/>
-      <w:r>
-        <w:t>Test Documentation</w:t>
-      </w:r>
-      <w:bookmarkEnd w:id="6"/>
-    </w:p>
-    <w:p>
-      <w:r>
-        <w:t>Add a chapter in the HW report covering the main aspects and results of the tests.</w:t>
-      </w:r>
-    </w:p>
-    <w:p>
-      <w:pPr>
-        <w:rPr>
-          <w:lang w:val="en-GB"/>
-        </w:rPr>
-      </w:pPr>
-      <w:r>
-        <w:t>The detailed t</w:t>
-      </w:r>
-      <w:r>
-        <w:t>est protocol</w:t>
-      </w:r>
-      <w:r>
-        <w:t>s and the</w:t>
-      </w:r>
-      <w:r>
-        <w:t xml:space="preserve"> r</w:t>
-      </w:r>
-      <w:r>
-        <w:t>aw test data go to the appendix (and, if sensible, to a digital data carrier).</w:t>
+        <w:t>to proceed to the next phase of firmware development.</w:t>
       </w:r>
     </w:p>
     <w:sectPr>
@@ -12852,7 +14760,7 @@
   <w:style w:type="paragraph" w:default="1" w:styleId="Normal">
     <w:name w:val="Normal"/>
     <w:qFormat/>
-    <w:rsid w:val="007F3EE4"/>
+    <w:rsid w:val="00106AD9"/>
     <w:pPr>
       <w:spacing w:before="120" w:after="0" w:line="312" w:lineRule="auto"/>
       <w:jc w:val="both"/>
@@ -12962,6 +14870,7 @@
   <w:style w:type="character" w:default="1" w:styleId="DefaultParagraphFont">
     <w:name w:val="Default Paragraph Font"/>
     <w:uiPriority w:val="1"/>
+    <w:semiHidden/>
     <w:unhideWhenUsed/>
   </w:style>
   <w:style w:type="table" w:default="1" w:styleId="TableNormal">

</xml_diff>

<commit_message>
testing report - done
</commit_message>
<xml_diff>
--- a/3_Technical_Documents/PCB/HW_Testing.docx
+++ b/3_Technical_Documents/PCB/HW_Testing.docx
@@ -244,7 +244,6 @@
               <w:noProof/>
               <w:kern w:val="2"/>
               <w:sz w:val="24"/>
-              <w:lang/>
               <w14:ligatures w14:val="standardContextual"/>
             </w:rPr>
           </w:pPr>
@@ -257,7 +256,7 @@
           <w:r>
             <w:fldChar w:fldCharType="separate"/>
           </w:r>
-          <w:hyperlink w:anchor="_Toc213915665" w:history="1">
+          <w:hyperlink w:anchor="_Toc213998205" w:history="1">
             <w:r>
               <w:rPr>
                 <w:rStyle w:val="Hyperlink"/>
@@ -272,7 +271,6 @@
                 <w:noProof/>
                 <w:kern w:val="2"/>
                 <w:sz w:val="24"/>
-                <w:lang/>
                 <w14:ligatures w14:val="standardContextual"/>
               </w:rPr>
               <w:tab/>
@@ -304,7 +302,7 @@
                 <w:noProof/>
                 <w:webHidden/>
               </w:rPr>
-              <w:instrText xml:space="preserve"> PAGEREF _Toc213915665 \h </w:instrText>
+              <w:instrText xml:space="preserve"> PAGEREF _Toc213998205 \h </w:instrText>
             </w:r>
             <w:r>
               <w:rPr>
@@ -343,11 +341,10 @@
               <w:noProof/>
               <w:kern w:val="2"/>
               <w:sz w:val="24"/>
-              <w:lang/>
               <w14:ligatures w14:val="standardContextual"/>
             </w:rPr>
           </w:pPr>
-          <w:hyperlink w:anchor="_Toc213915666" w:history="1">
+          <w:hyperlink w:anchor="_Toc213998206" w:history="1">
             <w:r>
               <w:rPr>
                 <w:rStyle w:val="Hyperlink"/>
@@ -362,7 +359,6 @@
                 <w:noProof/>
                 <w:kern w:val="2"/>
                 <w:sz w:val="24"/>
-                <w:lang/>
                 <w14:ligatures w14:val="standardContextual"/>
               </w:rPr>
               <w:tab/>
@@ -394,7 +390,7 @@
                 <w:noProof/>
                 <w:webHidden/>
               </w:rPr>
-              <w:instrText xml:space="preserve"> PAGEREF _Toc213915666 \h </w:instrText>
+              <w:instrText xml:space="preserve"> PAGEREF _Toc213998206 \h </w:instrText>
             </w:r>
             <w:r>
               <w:rPr>
@@ -433,11 +429,10 @@
               <w:noProof/>
               <w:kern w:val="2"/>
               <w:sz w:val="24"/>
-              <w:lang/>
               <w14:ligatures w14:val="standardContextual"/>
             </w:rPr>
           </w:pPr>
-          <w:hyperlink w:anchor="_Toc213915667" w:history="1">
+          <w:hyperlink w:anchor="_Toc213998207" w:history="1">
             <w:r>
               <w:rPr>
                 <w:rStyle w:val="Hyperlink"/>
@@ -452,7 +447,6 @@
                 <w:noProof/>
                 <w:kern w:val="2"/>
                 <w:sz w:val="24"/>
-                <w:lang/>
                 <w14:ligatures w14:val="standardContextual"/>
               </w:rPr>
               <w:tab/>
@@ -484,7 +478,7 @@
                 <w:noProof/>
                 <w:webHidden/>
               </w:rPr>
-              <w:instrText xml:space="preserve"> PAGEREF _Toc213915667 \h </w:instrText>
+              <w:instrText xml:space="preserve"> PAGEREF _Toc213998207 \h </w:instrText>
             </w:r>
             <w:r>
               <w:rPr>
@@ -523,11 +517,10 @@
               <w:noProof/>
               <w:kern w:val="2"/>
               <w:sz w:val="24"/>
-              <w:lang/>
               <w14:ligatures w14:val="standardContextual"/>
             </w:rPr>
           </w:pPr>
-          <w:hyperlink w:anchor="_Toc213915668" w:history="1">
+          <w:hyperlink w:anchor="_Toc213998208" w:history="1">
             <w:r>
               <w:rPr>
                 <w:rStyle w:val="Hyperlink"/>
@@ -542,7 +535,6 @@
                 <w:noProof/>
                 <w:kern w:val="2"/>
                 <w:sz w:val="24"/>
-                <w:lang/>
                 <w14:ligatures w14:val="standardContextual"/>
               </w:rPr>
               <w:tab/>
@@ -553,7 +545,7 @@
                 <w:rFonts w:eastAsiaTheme="majorEastAsia"/>
                 <w:noProof/>
               </w:rPr>
-              <w:t>Design for Test</w:t>
+              <w:t>Test Analysis</w:t>
             </w:r>
             <w:r>
               <w:rPr>
@@ -574,7 +566,7 @@
                 <w:noProof/>
                 <w:webHidden/>
               </w:rPr>
-              <w:instrText xml:space="preserve"> PAGEREF _Toc213915668 \h </w:instrText>
+              <w:instrText xml:space="preserve"> PAGEREF _Toc213998208 \h </w:instrText>
             </w:r>
             <w:r>
               <w:rPr>
@@ -594,367 +586,7 @@
                 <w:noProof/>
                 <w:webHidden/>
               </w:rPr>
-              <w:t>6</w:t>
-            </w:r>
-            <w:r>
-              <w:rPr>
-                <w:noProof/>
-                <w:webHidden/>
-              </w:rPr>
-              <w:fldChar w:fldCharType="end"/>
-            </w:r>
-          </w:hyperlink>
-        </w:p>
-        <w:p>
-          <w:pPr>
-            <w:pStyle w:val="TOC1"/>
-            <w:rPr>
-              <w:rFonts w:asciiTheme="minorHAnsi" w:eastAsiaTheme="minorEastAsia" w:hAnsiTheme="minorHAnsi" w:cstheme="minorBidi"/>
-              <w:noProof/>
-              <w:kern w:val="2"/>
-              <w:sz w:val="24"/>
-              <w:lang/>
-              <w14:ligatures w14:val="standardContextual"/>
-            </w:rPr>
-          </w:pPr>
-          <w:hyperlink w:anchor="_Toc213915669" w:history="1">
-            <w:r>
-              <w:rPr>
-                <w:rStyle w:val="Hyperlink"/>
-                <w:rFonts w:eastAsiaTheme="majorEastAsia"/>
-                <w:noProof/>
-              </w:rPr>
-              <w:t>5.</w:t>
-            </w:r>
-            <w:r>
-              <w:rPr>
-                <w:rFonts w:asciiTheme="minorHAnsi" w:eastAsiaTheme="minorEastAsia" w:hAnsiTheme="minorHAnsi" w:cstheme="minorBidi"/>
-                <w:noProof/>
-                <w:kern w:val="2"/>
-                <w:sz w:val="24"/>
-                <w:lang/>
-                <w14:ligatures w14:val="standardContextual"/>
-              </w:rPr>
-              <w:tab/>
-            </w:r>
-            <w:r>
-              <w:rPr>
-                <w:rStyle w:val="Hyperlink"/>
-                <w:rFonts w:eastAsiaTheme="majorEastAsia"/>
-                <w:noProof/>
-              </w:rPr>
-              <w:t>Test Plan</w:t>
-            </w:r>
-            <w:r>
-              <w:rPr>
-                <w:noProof/>
-                <w:webHidden/>
-              </w:rPr>
-              <w:tab/>
-            </w:r>
-            <w:r>
-              <w:rPr>
-                <w:noProof/>
-                <w:webHidden/>
-              </w:rPr>
-              <w:fldChar w:fldCharType="begin"/>
-            </w:r>
-            <w:r>
-              <w:rPr>
-                <w:noProof/>
-                <w:webHidden/>
-              </w:rPr>
-              <w:instrText xml:space="preserve"> PAGEREF _Toc213915669 \h </w:instrText>
-            </w:r>
-            <w:r>
-              <w:rPr>
-                <w:noProof/>
-                <w:webHidden/>
-              </w:rPr>
-            </w:r>
-            <w:r>
-              <w:rPr>
-                <w:noProof/>
-                <w:webHidden/>
-              </w:rPr>
-              <w:fldChar w:fldCharType="separate"/>
-            </w:r>
-            <w:r>
-              <w:rPr>
-                <w:noProof/>
-                <w:webHidden/>
-              </w:rPr>
-              <w:t>6</w:t>
-            </w:r>
-            <w:r>
-              <w:rPr>
-                <w:noProof/>
-                <w:webHidden/>
-              </w:rPr>
-              <w:fldChar w:fldCharType="end"/>
-            </w:r>
-          </w:hyperlink>
-        </w:p>
-        <w:p>
-          <w:pPr>
-            <w:pStyle w:val="TOC1"/>
-            <w:rPr>
-              <w:rFonts w:asciiTheme="minorHAnsi" w:eastAsiaTheme="minorEastAsia" w:hAnsiTheme="minorHAnsi" w:cstheme="minorBidi"/>
-              <w:noProof/>
-              <w:kern w:val="2"/>
-              <w:sz w:val="24"/>
-              <w:lang/>
-              <w14:ligatures w14:val="standardContextual"/>
-            </w:rPr>
-          </w:pPr>
-          <w:hyperlink w:anchor="_Toc213915670" w:history="1">
-            <w:r>
-              <w:rPr>
-                <w:rStyle w:val="Hyperlink"/>
-                <w:rFonts w:eastAsiaTheme="majorEastAsia"/>
-                <w:noProof/>
-              </w:rPr>
-              <w:t>6.</w:t>
-            </w:r>
-            <w:r>
-              <w:rPr>
-                <w:rFonts w:asciiTheme="minorHAnsi" w:eastAsiaTheme="minorEastAsia" w:hAnsiTheme="minorHAnsi" w:cstheme="minorBidi"/>
-                <w:noProof/>
-                <w:kern w:val="2"/>
-                <w:sz w:val="24"/>
-                <w:lang/>
-                <w14:ligatures w14:val="standardContextual"/>
-              </w:rPr>
-              <w:tab/>
-            </w:r>
-            <w:r>
-              <w:rPr>
-                <w:rStyle w:val="Hyperlink"/>
-                <w:rFonts w:eastAsiaTheme="majorEastAsia"/>
-                <w:noProof/>
-              </w:rPr>
-              <w:t>Run the Tests</w:t>
-            </w:r>
-            <w:r>
-              <w:rPr>
-                <w:noProof/>
-                <w:webHidden/>
-              </w:rPr>
-              <w:tab/>
-            </w:r>
-            <w:r>
-              <w:rPr>
-                <w:noProof/>
-                <w:webHidden/>
-              </w:rPr>
-              <w:fldChar w:fldCharType="begin"/>
-            </w:r>
-            <w:r>
-              <w:rPr>
-                <w:noProof/>
-                <w:webHidden/>
-              </w:rPr>
-              <w:instrText xml:space="preserve"> PAGEREF _Toc213915670 \h </w:instrText>
-            </w:r>
-            <w:r>
-              <w:rPr>
-                <w:noProof/>
-                <w:webHidden/>
-              </w:rPr>
-            </w:r>
-            <w:r>
-              <w:rPr>
-                <w:noProof/>
-                <w:webHidden/>
-              </w:rPr>
-              <w:fldChar w:fldCharType="separate"/>
-            </w:r>
-            <w:r>
-              <w:rPr>
-                <w:noProof/>
-                <w:webHidden/>
-              </w:rPr>
-              <w:t>7</w:t>
-            </w:r>
-            <w:r>
-              <w:rPr>
-                <w:noProof/>
-                <w:webHidden/>
-              </w:rPr>
-              <w:fldChar w:fldCharType="end"/>
-            </w:r>
-          </w:hyperlink>
-        </w:p>
-        <w:p>
-          <w:pPr>
-            <w:pStyle w:val="TOC1"/>
-            <w:rPr>
-              <w:rFonts w:asciiTheme="minorHAnsi" w:eastAsiaTheme="minorEastAsia" w:hAnsiTheme="minorHAnsi" w:cstheme="minorBidi"/>
-              <w:noProof/>
-              <w:kern w:val="2"/>
-              <w:sz w:val="24"/>
-              <w:lang/>
-              <w14:ligatures w14:val="standardContextual"/>
-            </w:rPr>
-          </w:pPr>
-          <w:hyperlink w:anchor="_Toc213915671" w:history="1">
-            <w:r>
-              <w:rPr>
-                <w:rStyle w:val="Hyperlink"/>
-                <w:rFonts w:eastAsiaTheme="majorEastAsia"/>
-                <w:noProof/>
-              </w:rPr>
-              <w:t>7.</w:t>
-            </w:r>
-            <w:r>
-              <w:rPr>
-                <w:rFonts w:asciiTheme="minorHAnsi" w:eastAsiaTheme="minorEastAsia" w:hAnsiTheme="minorHAnsi" w:cstheme="minorBidi"/>
-                <w:noProof/>
-                <w:kern w:val="2"/>
-                <w:sz w:val="24"/>
-                <w:lang/>
-                <w14:ligatures w14:val="standardContextual"/>
-              </w:rPr>
-              <w:tab/>
-            </w:r>
-            <w:r>
-              <w:rPr>
-                <w:rStyle w:val="Hyperlink"/>
-                <w:rFonts w:eastAsiaTheme="majorEastAsia"/>
-                <w:noProof/>
-              </w:rPr>
-              <w:t>Test Analysis</w:t>
-            </w:r>
-            <w:r>
-              <w:rPr>
-                <w:noProof/>
-                <w:webHidden/>
-              </w:rPr>
-              <w:tab/>
-            </w:r>
-            <w:r>
-              <w:rPr>
-                <w:noProof/>
-                <w:webHidden/>
-              </w:rPr>
-              <w:fldChar w:fldCharType="begin"/>
-            </w:r>
-            <w:r>
-              <w:rPr>
-                <w:noProof/>
-                <w:webHidden/>
-              </w:rPr>
-              <w:instrText xml:space="preserve"> PAGEREF _Toc213915671 \h </w:instrText>
-            </w:r>
-            <w:r>
-              <w:rPr>
-                <w:noProof/>
-                <w:webHidden/>
-              </w:rPr>
-            </w:r>
-            <w:r>
-              <w:rPr>
-                <w:noProof/>
-                <w:webHidden/>
-              </w:rPr>
-              <w:fldChar w:fldCharType="separate"/>
-            </w:r>
-            <w:r>
-              <w:rPr>
-                <w:noProof/>
-                <w:webHidden/>
-              </w:rPr>
-              <w:t>8</w:t>
-            </w:r>
-            <w:r>
-              <w:rPr>
-                <w:noProof/>
-                <w:webHidden/>
-              </w:rPr>
-              <w:fldChar w:fldCharType="end"/>
-            </w:r>
-          </w:hyperlink>
-        </w:p>
-        <w:p>
-          <w:pPr>
-            <w:pStyle w:val="TOC1"/>
-            <w:rPr>
-              <w:rFonts w:asciiTheme="minorHAnsi" w:eastAsiaTheme="minorEastAsia" w:hAnsiTheme="minorHAnsi" w:cstheme="minorBidi"/>
-              <w:noProof/>
-              <w:kern w:val="2"/>
-              <w:sz w:val="24"/>
-              <w:lang/>
-              <w14:ligatures w14:val="standardContextual"/>
-            </w:rPr>
-          </w:pPr>
-          <w:hyperlink w:anchor="_Toc213915672" w:history="1">
-            <w:r>
-              <w:rPr>
-                <w:rStyle w:val="Hyperlink"/>
-                <w:rFonts w:eastAsiaTheme="majorEastAsia"/>
-                <w:noProof/>
-              </w:rPr>
-              <w:t>8.</w:t>
-            </w:r>
-            <w:r>
-              <w:rPr>
-                <w:rFonts w:asciiTheme="minorHAnsi" w:eastAsiaTheme="minorEastAsia" w:hAnsiTheme="minorHAnsi" w:cstheme="minorBidi"/>
-                <w:noProof/>
-                <w:kern w:val="2"/>
-                <w:sz w:val="24"/>
-                <w:lang/>
-                <w14:ligatures w14:val="standardContextual"/>
-              </w:rPr>
-              <w:tab/>
-            </w:r>
-            <w:r>
-              <w:rPr>
-                <w:rStyle w:val="Hyperlink"/>
-                <w:rFonts w:eastAsiaTheme="majorEastAsia"/>
-                <w:noProof/>
-              </w:rPr>
-              <w:t>Test Documentation</w:t>
-            </w:r>
-            <w:r>
-              <w:rPr>
-                <w:noProof/>
-                <w:webHidden/>
-              </w:rPr>
-              <w:tab/>
-            </w:r>
-            <w:r>
-              <w:rPr>
-                <w:noProof/>
-                <w:webHidden/>
-              </w:rPr>
-              <w:fldChar w:fldCharType="begin"/>
-            </w:r>
-            <w:r>
-              <w:rPr>
-                <w:noProof/>
-                <w:webHidden/>
-              </w:rPr>
-              <w:instrText xml:space="preserve"> PAGEREF _Toc213915672 \h </w:instrText>
-            </w:r>
-            <w:r>
-              <w:rPr>
-                <w:noProof/>
-                <w:webHidden/>
-              </w:rPr>
-            </w:r>
-            <w:r>
-              <w:rPr>
-                <w:noProof/>
-                <w:webHidden/>
-              </w:rPr>
-              <w:fldChar w:fldCharType="separate"/>
-            </w:r>
-            <w:r>
-              <w:rPr>
-                <w:noProof/>
-                <w:webHidden/>
-              </w:rPr>
-              <w:t>8</w:t>
+              <w:t>5</w:t>
             </w:r>
             <w:r>
               <w:rPr>
@@ -995,7 +627,7 @@
       <w:pPr>
         <w:pStyle w:val="Heading1"/>
       </w:pPr>
-      <w:bookmarkStart w:id="1" w:name="_Toc213915665"/>
+      <w:bookmarkStart w:id="1" w:name="_Toc213998205"/>
       <w:r>
         <w:lastRenderedPageBreak/>
         <w:t>Test procedure</w:t>
@@ -1027,7 +659,7 @@
       <w:pPr>
         <w:pStyle w:val="Heading1"/>
       </w:pPr>
-      <w:bookmarkStart w:id="2" w:name="_Toc213915666"/>
+      <w:bookmarkStart w:id="2" w:name="_Toc213998206"/>
       <w:r>
         <w:t>Safety</w:t>
       </w:r>
@@ -1052,20 +684,7 @@
       </w:r>
     </w:p>
     <w:p>
-      <w:r>
-        <w:t>Work on a ESD protected surface to prevent ESD damage to components.</w:t>
-      </w:r>
-    </w:p>
-    <w:p>
       <w:pPr>
-        <w:spacing w:before="0" w:after="160" w:line="259" w:lineRule="auto"/>
-        <w:jc w:val="left"/>
-      </w:pPr>
-    </w:p>
-    <w:p>
-      <w:pPr>
-        <w:spacing w:before="0" w:after="160" w:line="259" w:lineRule="auto"/>
-        <w:jc w:val="left"/>
         <w:sectPr>
           <w:footerReference w:type="default" r:id="rId10"/>
           <w:pgSz w:w="11906" w:h="16838"/>
@@ -1074,6 +693,9 @@
           <w:docGrid w:linePitch="360"/>
         </w:sectPr>
       </w:pPr>
+      <w:r>
+        <w:t>Work on a ESD protected surface to prevent ESD damage to components.</w:t>
+      </w:r>
     </w:p>
     <w:p>
       <w:pPr>
@@ -1081,7 +703,7 @@
         <w:spacing w:before="0"/>
         <w:ind w:left="624" w:hanging="624"/>
       </w:pPr>
-      <w:bookmarkStart w:id="3" w:name="_Toc213915667"/>
+      <w:bookmarkStart w:id="3" w:name="_Toc213998207"/>
       <w:r>
         <w:lastRenderedPageBreak/>
         <w:t>Test Plan</w:t>
@@ -1095,11 +717,11 @@
         <w:tblLook w:val="04A0" w:firstRow="1" w:lastRow="0" w:firstColumn="1" w:lastColumn="0" w:noHBand="0" w:noVBand="1"/>
       </w:tblPr>
       <w:tblGrid>
-        <w:gridCol w:w="2912"/>
-        <w:gridCol w:w="2378"/>
-        <w:gridCol w:w="4588"/>
-        <w:gridCol w:w="963"/>
-        <w:gridCol w:w="2450"/>
+        <w:gridCol w:w="2889"/>
+        <w:gridCol w:w="2183"/>
+        <w:gridCol w:w="4822"/>
+        <w:gridCol w:w="972"/>
+        <w:gridCol w:w="2425"/>
         <w:gridCol w:w="1835"/>
       </w:tblGrid>
       <w:tr>
@@ -1165,7 +787,7 @@
         </w:tc>
         <w:tc>
           <w:tcPr>
-            <w:tcW w:w="0" w:type="auto"/>
+            <w:tcW w:w="2183" w:type="dxa"/>
             <w:tcBorders>
               <w:bottom w:val="single" w:sz="12" w:space="0" w:color="auto"/>
             </w:tcBorders>
@@ -1355,7 +977,7 @@
       <w:tr>
         <w:tc>
           <w:tcPr>
-            <w:tcW w:w="0" w:type="auto"/>
+            <w:tcW w:w="2183" w:type="dxa"/>
             <w:gridSpan w:val="6"/>
             <w:tcBorders>
               <w:top w:val="single" w:sz="12" w:space="0" w:color="auto"/>
@@ -1478,7 +1100,7 @@
         </w:tc>
         <w:tc>
           <w:tcPr>
-            <w:tcW w:w="2378" w:type="dxa"/>
+            <w:tcW w:w="2183" w:type="dxa"/>
             <w:tcBorders>
               <w:top w:val="single" w:sz="12" w:space="0" w:color="auto"/>
             </w:tcBorders>
@@ -1555,8 +1177,9 @@
                     <w:rFonts w:ascii="Cambria Math" w:hAnsi="Cambria Math"/>
                     <w:sz w:val="16"/>
                     <w:szCs w:val="16"/>
-                  </w:rPr>
-                  <m:t>3</m:t>
+                    <w:lang w:val="de-CH"/>
+                  </w:rPr>
+                  <m:t>32</m:t>
                 </m:r>
                 <m:r>
                   <m:rPr>
@@ -1960,7 +1583,7 @@
         </w:tc>
         <w:tc>
           <w:tcPr>
-            <w:tcW w:w="2378" w:type="dxa"/>
+            <w:tcW w:w="2183" w:type="dxa"/>
           </w:tcPr>
           <w:p>
             <w:pPr>
@@ -2031,8 +1654,9 @@
                     <w:rFonts w:ascii="Cambria Math" w:hAnsi="Cambria Math"/>
                     <w:sz w:val="16"/>
                     <w:szCs w:val="16"/>
-                  </w:rPr>
-                  <m:t>3</m:t>
+                    <w:lang w:val="de-CH"/>
+                  </w:rPr>
+                  <m:t>32</m:t>
                 </m:r>
                 <m:r>
                   <m:rPr>
@@ -2427,7 +2051,7 @@
         </w:tc>
         <w:tc>
           <w:tcPr>
-            <w:tcW w:w="2378" w:type="dxa"/>
+            <w:tcW w:w="2183" w:type="dxa"/>
           </w:tcPr>
           <w:p>
             <w:pPr>
@@ -2476,7 +2100,30 @@
                     <w:sz w:val="16"/>
                     <w:szCs w:val="16"/>
                   </w:rPr>
-                  <m:t>5</m:t>
+                  <m:t>4</m:t>
+                </m:r>
+                <m:r>
+                  <m:rPr>
+                    <m:sty m:val="bi"/>
+                  </m:rPr>
+                  <w:rPr>
+                    <w:rFonts w:ascii="Cambria Math" w:hAnsi="Cambria Math"/>
+                    <w:sz w:val="16"/>
+                    <w:szCs w:val="16"/>
+                    <w:lang w:val="de-CH"/>
+                  </w:rPr>
+                  <m:t>.</m:t>
+                </m:r>
+                <m:r>
+                  <m:rPr>
+                    <m:sty m:val="bi"/>
+                  </m:rPr>
+                  <w:rPr>
+                    <w:rFonts w:ascii="Cambria Math" w:hAnsi="Cambria Math"/>
+                    <w:sz w:val="16"/>
+                    <w:szCs w:val="16"/>
+                  </w:rPr>
+                  <m:t>99</m:t>
                 </m:r>
                 <m:r>
                   <m:rPr>
@@ -2874,7 +2521,7 @@
         </w:tc>
         <w:tc>
           <w:tcPr>
-            <w:tcW w:w="2378" w:type="dxa"/>
+            <w:tcW w:w="2183" w:type="dxa"/>
             <w:tcBorders>
               <w:bottom w:val="single" w:sz="4" w:space="0" w:color="auto"/>
             </w:tcBorders>
@@ -2931,6 +2578,29 @@
                     <w:szCs w:val="16"/>
                   </w:rPr>
                   <m:t>5</m:t>
+                </m:r>
+                <m:r>
+                  <m:rPr>
+                    <m:sty m:val="bi"/>
+                  </m:rPr>
+                  <w:rPr>
+                    <w:rFonts w:ascii="Cambria Math" w:hAnsi="Cambria Math"/>
+                    <w:sz w:val="16"/>
+                    <w:szCs w:val="16"/>
+                    <w:lang w:val="de-CH"/>
+                  </w:rPr>
+                  <m:t>.</m:t>
+                </m:r>
+                <m:r>
+                  <m:rPr>
+                    <m:sty m:val="bi"/>
+                  </m:rPr>
+                  <w:rPr>
+                    <w:rFonts w:ascii="Cambria Math" w:hAnsi="Cambria Math"/>
+                    <w:sz w:val="16"/>
+                    <w:szCs w:val="16"/>
+                  </w:rPr>
+                  <m:t>4</m:t>
                 </m:r>
                 <m:r>
                   <m:rPr>
@@ -3301,7 +2971,6 @@
                 <w:bCs/>
                 <w:sz w:val="16"/>
                 <w:szCs w:val="16"/>
-                <w:lang/>
               </w:rPr>
               <w:t>aking into account</w:t>
             </w:r>
@@ -3346,7 +3015,7 @@
         </w:tc>
         <w:tc>
           <w:tcPr>
-            <w:tcW w:w="2378" w:type="dxa"/>
+            <w:tcW w:w="2183" w:type="dxa"/>
             <w:tcBorders>
               <w:bottom w:val="single" w:sz="12" w:space="0" w:color="auto"/>
             </w:tcBorders>
@@ -3384,9 +3053,10 @@
               <w:spacing w:before="0"/>
               <w:jc w:val="center"/>
               <w:rPr>
-                <w:b/>
-                <w:sz w:val="16"/>
-                <w:szCs w:val="16"/>
+                <w:bCs/>
+                <w:sz w:val="16"/>
+                <w:szCs w:val="16"/>
+                <w:lang w:val="de-CH"/>
               </w:rPr>
             </w:pPr>
             <m:oMathPara>
@@ -3399,12 +3069,34 @@
                     <w:rFonts w:ascii="Cambria Math" w:hAnsi="Cambria Math"/>
                     <w:sz w:val="16"/>
                     <w:szCs w:val="16"/>
-                    <w:highlight w:val="yellow"/>
                   </w:rPr>
                   <m:t>5</m:t>
                 </m:r>
                 <m:r>
                   <m:rPr>
+                    <m:sty m:val="bi"/>
+                  </m:rPr>
+                  <w:rPr>
+                    <w:rFonts w:ascii="Cambria Math" w:hAnsi="Cambria Math"/>
+                    <w:sz w:val="16"/>
+                    <w:szCs w:val="16"/>
+                    <w:lang w:val="de-CH"/>
+                  </w:rPr>
+                  <m:t>.</m:t>
+                </m:r>
+                <m:r>
+                  <m:rPr>
+                    <m:sty m:val="bi"/>
+                  </m:rPr>
+                  <w:rPr>
+                    <w:rFonts w:ascii="Cambria Math" w:hAnsi="Cambria Math"/>
+                    <w:sz w:val="16"/>
+                    <w:szCs w:val="16"/>
+                  </w:rPr>
+                  <m:t>51</m:t>
+                </m:r>
+                <m:r>
+                  <m:rPr>
                     <m:nor/>
                   </m:rPr>
                   <w:rPr>
@@ -3412,11 +3104,275 @@
                     <w:b/>
                     <w:sz w:val="16"/>
                     <w:szCs w:val="16"/>
-                    <w:highlight w:val="yellow"/>
+                    <w:lang w:val="de-CH"/>
                   </w:rPr>
                   <m:t>V</m:t>
                 </m:r>
                 <m:r>
+                  <w:rPr>
+                    <w:rFonts w:ascii="Cambria Math" w:hAnsi="Cambria Math"/>
+                    <w:sz w:val="16"/>
+                    <w:szCs w:val="16"/>
+                    <w:lang w:val="de-CH"/>
+                  </w:rPr>
+                  <m:t xml:space="preserve"> | </m:t>
+                </m:r>
+                <m:d>
+                  <m:dPr>
+                    <m:ctrlPr>
+                      <w:rPr>
+                        <w:rFonts w:ascii="Cambria Math" w:hAnsi="Cambria Math"/>
+                        <w:bCs/>
+                        <w:i/>
+                        <w:sz w:val="16"/>
+                        <w:szCs w:val="16"/>
+                      </w:rPr>
+                    </m:ctrlPr>
+                  </m:dPr>
+                  <m:e>
+                    <m:f>
+                      <m:fPr>
+                        <m:ctrlPr>
+                          <w:rPr>
+                            <w:rFonts w:ascii="Cambria Math" w:hAnsi="Cambria Math"/>
+                            <w:bCs/>
+                            <w:i/>
+                            <w:sz w:val="16"/>
+                            <w:szCs w:val="16"/>
+                          </w:rPr>
+                        </m:ctrlPr>
+                      </m:fPr>
+                      <m:num>
+                        <m:r>
+                          <w:rPr>
+                            <w:rFonts w:ascii="Cambria Math" w:hAnsi="Cambria Math"/>
+                            <w:sz w:val="16"/>
+                            <w:szCs w:val="16"/>
+                            <w:lang w:val="de-CH"/>
+                          </w:rPr>
+                          <m:t>301</m:t>
+                        </m:r>
+                        <m:r>
+                          <m:rPr>
+                            <m:nor/>
+                          </m:rPr>
+                          <w:rPr>
+                            <w:rFonts w:ascii="Cambria Math" w:hAnsi="Cambria Math"/>
+                            <w:bCs/>
+                            <w:sz w:val="16"/>
+                            <w:szCs w:val="16"/>
+                            <w:lang w:val="de-CH"/>
+                          </w:rPr>
+                          <m:t>k</m:t>
+                        </m:r>
+                        <m:r>
+                          <m:rPr>
+                            <m:nor/>
+                          </m:rPr>
+                          <w:rPr>
+                            <w:rFonts w:ascii="Cambria Math" w:hAnsi="Cambria Math"/>
+                            <w:bCs/>
+                            <w:sz w:val="16"/>
+                            <w:szCs w:val="16"/>
+                          </w:rPr>
+                          <m:t>Ω</m:t>
+                        </m:r>
+                        <m:r>
+                          <w:rPr>
+                            <w:rFonts w:ascii="Cambria Math" w:hAnsi="Cambria Math"/>
+                            <w:sz w:val="16"/>
+                            <w:szCs w:val="16"/>
+                            <w:lang w:val="de-CH"/>
+                          </w:rPr>
+                          <m:t xml:space="preserve"> </m:t>
+                        </m:r>
+                        <m:d>
+                          <m:dPr>
+                            <m:ctrlPr>
+                              <w:rPr>
+                                <w:rFonts w:ascii="Cambria Math" w:hAnsi="Cambria Math"/>
+                                <w:bCs/>
+                                <w:i/>
+                                <w:sz w:val="16"/>
+                                <w:szCs w:val="16"/>
+                                <w:lang w:val="de-CH"/>
+                              </w:rPr>
+                            </m:ctrlPr>
+                          </m:dPr>
+                          <m:e>
+                            <m:r>
+                              <w:rPr>
+                                <w:rFonts w:ascii="Cambria Math" w:hAnsi="Cambria Math"/>
+                                <w:sz w:val="16"/>
+                                <w:szCs w:val="16"/>
+                                <w:lang w:val="de-CH"/>
+                              </w:rPr>
+                              <m:t>±1%</m:t>
+                            </m:r>
+                          </m:e>
+                        </m:d>
+                      </m:num>
+                      <m:den>
+                        <m:r>
+                          <w:rPr>
+                            <w:rFonts w:ascii="Cambria Math" w:hAnsi="Cambria Math"/>
+                            <w:sz w:val="16"/>
+                            <w:szCs w:val="16"/>
+                            <w:lang w:val="de-CH"/>
+                          </w:rPr>
+                          <m:t>30</m:t>
+                        </m:r>
+                        <m:r>
+                          <m:rPr>
+                            <m:nor/>
+                          </m:rPr>
+                          <w:rPr>
+                            <w:rFonts w:ascii="Cambria Math" w:hAnsi="Cambria Math"/>
+                            <w:bCs/>
+                            <w:sz w:val="16"/>
+                            <w:szCs w:val="16"/>
+                            <w:lang w:val="de-CH"/>
+                          </w:rPr>
+                          <m:t>k</m:t>
+                        </m:r>
+                        <m:r>
+                          <m:rPr>
+                            <m:nor/>
+                          </m:rPr>
+                          <w:rPr>
+                            <w:rFonts w:ascii="Cambria Math" w:hAnsi="Cambria Math"/>
+                            <w:bCs/>
+                            <w:sz w:val="16"/>
+                            <w:szCs w:val="16"/>
+                          </w:rPr>
+                          <m:t>Ω</m:t>
+                        </m:r>
+                        <m:r>
+                          <w:rPr>
+                            <w:rFonts w:ascii="Cambria Math" w:hAnsi="Cambria Math"/>
+                            <w:sz w:val="16"/>
+                            <w:szCs w:val="16"/>
+                            <w:lang w:val="de-CH"/>
+                          </w:rPr>
+                          <m:t xml:space="preserve"> </m:t>
+                        </m:r>
+                        <m:d>
+                          <m:dPr>
+                            <m:ctrlPr>
+                              <w:rPr>
+                                <w:rFonts w:ascii="Cambria Math" w:hAnsi="Cambria Math"/>
+                                <w:bCs/>
+                                <w:i/>
+                                <w:sz w:val="16"/>
+                                <w:szCs w:val="16"/>
+                                <w:lang w:val="de-CH"/>
+                              </w:rPr>
+                            </m:ctrlPr>
+                          </m:dPr>
+                          <m:e>
+                            <m:r>
+                              <w:rPr>
+                                <w:rFonts w:ascii="Cambria Math" w:hAnsi="Cambria Math"/>
+                                <w:sz w:val="16"/>
+                                <w:szCs w:val="16"/>
+                                <w:lang w:val="de-CH"/>
+                              </w:rPr>
+                              <m:t>±1%</m:t>
+                            </m:r>
+                          </m:e>
+                        </m:d>
+                      </m:den>
+                    </m:f>
+                    <m:r>
+                      <w:rPr>
+                        <w:rFonts w:ascii="Cambria Math" w:hAnsi="Cambria Math"/>
+                        <w:sz w:val="16"/>
+                        <w:szCs w:val="16"/>
+                        <w:lang w:val="de-CH"/>
+                      </w:rPr>
+                      <m:t>+1</m:t>
+                    </m:r>
+                  </m:e>
+                </m:d>
+                <m:r>
+                  <w:rPr>
+                    <w:rFonts w:ascii="Cambria Math" w:hAnsi="Cambria Math"/>
+                    <w:sz w:val="16"/>
+                    <w:szCs w:val="16"/>
+                    <w:lang w:val="de-CH"/>
+                  </w:rPr>
+                  <m:t>⋅500</m:t>
+                </m:r>
+                <m:r>
+                  <m:rPr>
+                    <m:nor/>
+                  </m:rPr>
+                  <w:rPr>
+                    <w:rFonts w:ascii="Cambria Math" w:hAnsi="Cambria Math"/>
+                    <w:bCs/>
+                    <w:sz w:val="16"/>
+                    <w:szCs w:val="16"/>
+                    <w:lang w:val="de-CH"/>
+                  </w:rPr>
+                  <m:t>mV</m:t>
+                </m:r>
+                <m:r>
+                  <w:rPr>
+                    <w:rFonts w:ascii="Cambria Math" w:hAnsi="Cambria Math"/>
+                    <w:sz w:val="16"/>
+                    <w:szCs w:val="16"/>
+                    <w:lang w:val="de-CH"/>
+                  </w:rPr>
+                  <m:t xml:space="preserve"> </m:t>
+                </m:r>
+                <m:d>
+                  <m:dPr>
+                    <m:ctrlPr>
+                      <w:rPr>
+                        <w:rFonts w:ascii="Cambria Math" w:hAnsi="Cambria Math"/>
+                        <w:bCs/>
+                        <w:i/>
+                        <w:sz w:val="16"/>
+                        <w:szCs w:val="16"/>
+                        <w:lang w:val="de-CH"/>
+                      </w:rPr>
+                    </m:ctrlPr>
+                  </m:dPr>
+                  <m:e>
+                    <m:r>
+                      <w:rPr>
+                        <w:rFonts w:ascii="Cambria Math" w:hAnsi="Cambria Math"/>
+                        <w:sz w:val="16"/>
+                        <w:szCs w:val="16"/>
+                        <w:lang w:val="de-CH"/>
+                      </w:rPr>
+                      <m:t>±15</m:t>
+                    </m:r>
+                    <m:r>
+                      <m:rPr>
+                        <m:nor/>
+                      </m:rPr>
+                      <w:rPr>
+                        <w:rFonts w:ascii="Cambria Math" w:hAnsi="Cambria Math"/>
+                        <w:bCs/>
+                        <w:sz w:val="16"/>
+                        <w:szCs w:val="16"/>
+                        <w:lang w:val="de-CH"/>
+                      </w:rPr>
+                      <m:t>mV</m:t>
+                    </m:r>
+                  </m:e>
+                </m:d>
+                <m:r>
+                  <w:rPr>
+                    <w:rFonts w:ascii="Cambria Math" w:hAnsi="Cambria Math"/>
+                    <w:sz w:val="16"/>
+                    <w:szCs w:val="16"/>
+                    <w:lang w:val="de-CH"/>
+                  </w:rPr>
+                  <m:t>=</m:t>
+                </m:r>
+                <m:r>
                   <m:rPr>
                     <m:sty m:val="bi"/>
                   </m:rPr>
@@ -3424,9 +3380,47 @@
                     <w:rFonts w:ascii="Cambria Math" w:hAnsi="Cambria Math"/>
                     <w:sz w:val="16"/>
                     <w:szCs w:val="16"/>
-                    <w:highlight w:val="yellow"/>
-                  </w:rPr>
-                  <m:t xml:space="preserve"> |…</m:t>
+                    <w:lang w:val="de-CH"/>
+                  </w:rPr>
+                  <m:t>5.25</m:t>
+                </m:r>
+                <m:r>
+                  <m:rPr>
+                    <m:nor/>
+                  </m:rPr>
+                  <w:rPr>
+                    <w:rFonts w:ascii="Cambria Math" w:hAnsi="Cambria Math"/>
+                    <w:b/>
+                    <w:sz w:val="16"/>
+                    <w:szCs w:val="16"/>
+                    <w:lang w:val="de-CH"/>
+                  </w:rPr>
+                  <m:t>V</m:t>
+                </m:r>
+                <m:r>
+                  <m:rPr>
+                    <m:sty m:val="bi"/>
+                  </m:rPr>
+                  <w:rPr>
+                    <w:rFonts w:ascii="Cambria Math" w:hAnsi="Cambria Math"/>
+                    <w:sz w:val="16"/>
+                    <w:szCs w:val="16"/>
+                    <w:lang w:val="de-CH"/>
+                  </w:rPr>
+                  <m:t>…5.78</m:t>
+                </m:r>
+                <m:r>
+                  <m:rPr>
+                    <m:nor/>
+                  </m:rPr>
+                  <w:rPr>
+                    <w:rFonts w:ascii="Cambria Math" w:hAnsi="Cambria Math"/>
+                    <w:b/>
+                    <w:sz w:val="16"/>
+                    <w:szCs w:val="16"/>
+                    <w:lang w:val="de-CH"/>
+                  </w:rPr>
+                  <m:t>V</m:t>
                 </m:r>
               </m:oMath>
             </m:oMathPara>
@@ -3495,6 +3489,22 @@
                 <w:szCs w:val="16"/>
               </w:rPr>
             </w:pPr>
+            <w:r>
+              <w:rPr>
+                <w:bCs/>
+                <w:sz w:val="16"/>
+                <w:szCs w:val="16"/>
+              </w:rPr>
+              <w:t>In range →</w:t>
+            </w:r>
+            <w:r>
+              <w:rPr>
+                <w:b/>
+                <w:sz w:val="16"/>
+                <w:szCs w:val="16"/>
+              </w:rPr>
+              <w:t xml:space="preserve"> passed</w:t>
+            </w:r>
           </w:p>
         </w:tc>
         <w:tc>
@@ -3547,7 +3557,7 @@
         </w:tc>
         <w:tc>
           <w:tcPr>
-            <w:tcW w:w="2378" w:type="dxa"/>
+            <w:tcW w:w="2183" w:type="dxa"/>
             <w:tcBorders>
               <w:top w:val="single" w:sz="12" w:space="0" w:color="auto"/>
             </w:tcBorders>
@@ -3971,7 +3981,7 @@
         </w:tc>
         <w:tc>
           <w:tcPr>
-            <w:tcW w:w="2378" w:type="dxa"/>
+            <w:tcW w:w="2183" w:type="dxa"/>
           </w:tcPr>
           <w:p>
             <w:pPr>
@@ -4364,7 +4374,7 @@
         </w:tc>
         <w:tc>
           <w:tcPr>
-            <w:tcW w:w="2378" w:type="dxa"/>
+            <w:tcW w:w="2183" w:type="dxa"/>
           </w:tcPr>
           <w:p>
             <w:pPr>
@@ -4760,7 +4770,7 @@
         </w:tc>
         <w:tc>
           <w:tcPr>
-            <w:tcW w:w="2378" w:type="dxa"/>
+            <w:tcW w:w="2183" w:type="dxa"/>
             <w:tcBorders>
               <w:bottom w:val="single" w:sz="4" w:space="0" w:color="auto"/>
             </w:tcBorders>
@@ -5019,7 +5029,7 @@
         </w:tc>
         <w:tc>
           <w:tcPr>
-            <w:tcW w:w="2378" w:type="dxa"/>
+            <w:tcW w:w="2183" w:type="dxa"/>
             <w:tcBorders>
               <w:bottom w:val="single" w:sz="12" w:space="0" w:color="auto"/>
             </w:tcBorders>
@@ -5104,6 +5114,14 @@
                         <w:szCs w:val="16"/>
                       </w:rPr>
                       <m:t>⋅0.1</m:t>
+                    </m:r>
+                    <m:r>
+                      <w:rPr>
+                        <w:rFonts w:ascii="Cambria Math" w:hAnsi="Cambria Math"/>
+                        <w:sz w:val="16"/>
+                        <w:szCs w:val="16"/>
+                      </w:rPr>
+                      <m:t>8</m:t>
                     </m:r>
                   </m:num>
                   <m:den>
@@ -5166,7 +5184,40 @@
                     <w:sz w:val="16"/>
                     <w:szCs w:val="16"/>
                   </w:rPr>
-                  <m:t xml:space="preserve"> &lt;10.0</m:t>
+                  <m:t xml:space="preserve"> &lt;1</m:t>
+                </m:r>
+                <m:r>
+                  <m:rPr>
+                    <m:sty m:val="bi"/>
+                  </m:rPr>
+                  <w:rPr>
+                    <w:rFonts w:ascii="Cambria Math" w:hAnsi="Cambria Math"/>
+                    <w:sz w:val="16"/>
+                    <w:szCs w:val="16"/>
+                  </w:rPr>
+                  <m:t>8</m:t>
+                </m:r>
+                <m:r>
+                  <m:rPr>
+                    <m:sty m:val="bi"/>
+                  </m:rPr>
+                  <w:rPr>
+                    <w:rFonts w:ascii="Cambria Math" w:hAnsi="Cambria Math"/>
+                    <w:sz w:val="16"/>
+                    <w:szCs w:val="16"/>
+                  </w:rPr>
+                  <m:t>.</m:t>
+                </m:r>
+                <m:r>
+                  <m:rPr>
+                    <m:sty m:val="bi"/>
+                  </m:rPr>
+                  <w:rPr>
+                    <w:rFonts w:ascii="Cambria Math" w:hAnsi="Cambria Math"/>
+                    <w:sz w:val="16"/>
+                    <w:szCs w:val="16"/>
+                  </w:rPr>
+                  <m:t>3</m:t>
                 </m:r>
                 <m:r>
                   <m:rPr>
@@ -5344,7 +5395,7 @@
         </w:tc>
         <w:tc>
           <w:tcPr>
-            <w:tcW w:w="2378" w:type="dxa"/>
+            <w:tcW w:w="2183" w:type="dxa"/>
             <w:tcBorders>
               <w:top w:val="single" w:sz="12" w:space="0" w:color="auto"/>
             </w:tcBorders>
@@ -5541,13 +5592,45 @@
                 <w:sz w:val="16"/>
                 <w:szCs w:val="16"/>
               </w:rPr>
-              <w:t>Current on Power in at 5V, +3V0 disconnected</w:t>
-            </w:r>
-          </w:p>
-        </w:tc>
-        <w:tc>
-          <w:tcPr>
-            <w:tcW w:w="2378" w:type="dxa"/>
+              <w:t>Current on Power in at 5V,</w:t>
+            </w:r>
+            <w:r>
+              <w:rPr>
+                <w:b/>
+                <w:sz w:val="16"/>
+                <w:szCs w:val="16"/>
+              </w:rPr>
+              <w:t xml:space="preserve"> </w:t>
+            </w:r>
+            <w:r>
+              <w:rPr>
+                <w:b/>
+                <w:sz w:val="16"/>
+                <w:szCs w:val="16"/>
+              </w:rPr>
+              <w:t>+3V0</w:t>
+            </w:r>
+            <w:r>
+              <w:rPr>
+                <w:b/>
+                <w:sz w:val="16"/>
+                <w:szCs w:val="16"/>
+              </w:rPr>
+              <w:t> </w:t>
+            </w:r>
+            <w:r>
+              <w:rPr>
+                <w:b/>
+                <w:sz w:val="16"/>
+                <w:szCs w:val="16"/>
+              </w:rPr>
+              <w:t>disconnected</w:t>
+            </w:r>
+          </w:p>
+        </w:tc>
+        <w:tc>
+          <w:tcPr>
+            <w:tcW w:w="2183" w:type="dxa"/>
             <w:tcBorders>
               <w:bottom w:val="single" w:sz="4" w:space="0" w:color="auto"/>
             </w:tcBorders>
@@ -5782,7 +5865,7 @@
         </w:tc>
         <w:tc>
           <w:tcPr>
-            <w:tcW w:w="2378" w:type="dxa"/>
+            <w:tcW w:w="2183" w:type="dxa"/>
             <w:tcBorders>
               <w:bottom w:val="single" w:sz="12" w:space="0" w:color="auto"/>
             </w:tcBorders>
@@ -5827,6 +5910,109 @@
             </w:pPr>
             <m:oMathPara>
               <m:oMath>
+                <m:f>
+                  <m:fPr>
+                    <m:ctrlPr>
+                      <w:rPr>
+                        <w:rFonts w:ascii="Cambria Math" w:hAnsi="Cambria Math"/>
+                        <w:bCs/>
+                        <w:i/>
+                        <w:sz w:val="16"/>
+                        <w:szCs w:val="16"/>
+                      </w:rPr>
+                    </m:ctrlPr>
+                  </m:fPr>
+                  <m:num>
+                    <m:r>
+                      <w:rPr>
+                        <w:rFonts w:ascii="Cambria Math" w:hAnsi="Cambria Math"/>
+                        <w:sz w:val="16"/>
+                        <w:szCs w:val="16"/>
+                      </w:rPr>
+                      <m:t>1</m:t>
+                    </m:r>
+                    <m:r>
+                      <m:rPr>
+                        <m:nor/>
+                      </m:rPr>
+                      <w:rPr>
+                        <w:rFonts w:ascii="Cambria Math" w:hAnsi="Cambria Math"/>
+                        <w:bCs/>
+                        <w:sz w:val="16"/>
+                        <w:szCs w:val="16"/>
+                      </w:rPr>
+                      <m:t>mV</m:t>
+                    </m:r>
+                  </m:num>
+                  <m:den>
+                    <m:f>
+                      <m:fPr>
+                        <m:type m:val="lin"/>
+                        <m:ctrlPr>
+                          <w:rPr>
+                            <w:rFonts w:ascii="Cambria Math" w:hAnsi="Cambria Math"/>
+                            <w:bCs/>
+                            <w:i/>
+                            <w:sz w:val="16"/>
+                            <w:szCs w:val="16"/>
+                          </w:rPr>
+                        </m:ctrlPr>
+                      </m:fPr>
+                      <m:num>
+                        <m:r>
+                          <w:rPr>
+                            <w:rFonts w:ascii="Cambria Math" w:hAnsi="Cambria Math"/>
+                            <w:sz w:val="16"/>
+                            <w:szCs w:val="16"/>
+                          </w:rPr>
+                          <m:t>5</m:t>
+                        </m:r>
+                        <m:r>
+                          <m:rPr>
+                            <m:nor/>
+                          </m:rPr>
+                          <w:rPr>
+                            <w:rFonts w:ascii="Cambria Math" w:hAnsi="Cambria Math"/>
+                            <w:bCs/>
+                            <w:sz w:val="16"/>
+                            <w:szCs w:val="16"/>
+                          </w:rPr>
+                          <m:t>V</m:t>
+                        </m:r>
+                      </m:num>
+                      <m:den>
+                        <m:r>
+                          <w:rPr>
+                            <w:rFonts w:ascii="Cambria Math" w:hAnsi="Cambria Math"/>
+                            <w:sz w:val="16"/>
+                            <w:szCs w:val="16"/>
+                          </w:rPr>
+                          <m:t>180</m:t>
+                        </m:r>
+                        <m:r>
+                          <m:rPr>
+                            <m:nor/>
+                          </m:rPr>
+                          <w:rPr>
+                            <w:rFonts w:ascii="Cambria Math" w:hAnsi="Cambria Math"/>
+                            <w:bCs/>
+                            <w:sz w:val="16"/>
+                            <w:szCs w:val="16"/>
+                          </w:rPr>
+                          <m:t>mA</m:t>
+                        </m:r>
+                      </m:den>
+                    </m:f>
+                  </m:den>
+                </m:f>
+                <m:r>
+                  <w:rPr>
+                    <w:rFonts w:ascii="Cambria Math" w:hAnsi="Cambria Math"/>
+                    <w:sz w:val="16"/>
+                    <w:szCs w:val="16"/>
+                  </w:rPr>
+                  <m:t>→</m:t>
+                </m:r>
                 <m:r>
                   <m:rPr>
                     <m:sty m:val="bi"/>
@@ -5835,9 +6021,20 @@
                     <w:rFonts w:ascii="Cambria Math" w:hAnsi="Cambria Math"/>
                     <w:sz w:val="16"/>
                     <w:szCs w:val="16"/>
-                    <w:highlight w:val="yellow"/>
-                  </w:rPr>
-                  <m:t>…</m:t>
+                  </w:rPr>
+                  <m:t>&lt;36</m:t>
+                </m:r>
+                <m:r>
+                  <m:rPr>
+                    <m:nor/>
+                  </m:rPr>
+                  <w:rPr>
+                    <w:rFonts w:ascii="Cambria Math" w:hAnsi="Cambria Math"/>
+                    <w:b/>
+                    <w:sz w:val="16"/>
+                    <w:szCs w:val="16"/>
+                  </w:rPr>
+                  <m:t>μV</m:t>
                 </m:r>
               </m:oMath>
             </m:oMathPara>
@@ -5934,6 +6131,39 @@
                 <w:szCs w:val="16"/>
               </w:rPr>
             </w:pPr>
+            <w:r>
+              <w:rPr>
+                <w:bCs/>
+                <w:sz w:val="16"/>
+                <w:szCs w:val="16"/>
+              </w:rPr>
+              <w:t>Out of range, considered acceptable</w:t>
+            </w:r>
+            <w:r>
+              <w:rPr>
+                <w:bCs/>
+                <w:sz w:val="16"/>
+                <w:szCs w:val="16"/>
+                <w:vertAlign w:val="superscript"/>
+              </w:rPr>
+              <w:t>*)</w:t>
+            </w:r>
+            <w:r>
+              <w:rPr>
+                <w:bCs/>
+                <w:sz w:val="16"/>
+                <w:szCs w:val="16"/>
+              </w:rPr>
+              <w:t xml:space="preserve"> → </w:t>
+            </w:r>
+            <w:r>
+              <w:rPr>
+                <w:b/>
+                <w:sz w:val="16"/>
+                <w:szCs w:val="16"/>
+              </w:rPr>
+              <w:t>passed</w:t>
+            </w:r>
           </w:p>
         </w:tc>
         <w:tc>
@@ -5953,6 +6183,54 @@
                 <w:szCs w:val="16"/>
               </w:rPr>
             </w:pPr>
+            <w:r>
+              <w:rPr>
+                <w:bCs/>
+                <w:sz w:val="16"/>
+                <w:szCs w:val="16"/>
+              </w:rPr>
+              <w:t xml:space="preserve">*) </w:t>
+            </w:r>
+            <w:r>
+              <w:rPr>
+                <w:bCs/>
+                <w:sz w:val="16"/>
+                <w:szCs w:val="16"/>
+              </w:rPr>
+              <w:t>M</w:t>
+            </w:r>
+            <w:r>
+              <w:rPr>
+                <w:bCs/>
+                <w:sz w:val="16"/>
+                <w:szCs w:val="16"/>
+              </w:rPr>
+              <w:t xml:space="preserve">easurement method </w:t>
+            </w:r>
+            <w:r>
+              <w:rPr>
+                <w:bCs/>
+                <w:sz w:val="16"/>
+                <w:szCs w:val="16"/>
+              </w:rPr>
+              <w:t>provide</w:t>
+            </w:r>
+            <w:r>
+              <w:rPr>
+                <w:bCs/>
+                <w:sz w:val="16"/>
+                <w:szCs w:val="16"/>
+              </w:rPr>
+              <w:t>s</w:t>
+            </w:r>
+            <w:r>
+              <w:rPr>
+                <w:bCs/>
+                <w:sz w:val="16"/>
+                <w:szCs w:val="16"/>
+              </w:rPr>
+              <w:t xml:space="preserve"> not enough accuracy</w:t>
+            </w:r>
           </w:p>
         </w:tc>
       </w:tr>
@@ -5986,7 +6264,7 @@
         </w:tc>
         <w:tc>
           <w:tcPr>
-            <w:tcW w:w="2378" w:type="dxa"/>
+            <w:tcW w:w="2183" w:type="dxa"/>
             <w:tcBorders>
               <w:top w:val="single" w:sz="12" w:space="0" w:color="auto"/>
             </w:tcBorders>
@@ -6240,7 +6518,7 @@
         </w:tc>
         <w:tc>
           <w:tcPr>
-            <w:tcW w:w="2378" w:type="dxa"/>
+            <w:tcW w:w="2183" w:type="dxa"/>
           </w:tcPr>
           <w:p>
             <w:pPr>
@@ -6481,6 +6759,24 @@
             <w:r>
               <w:rPr>
                 <w:bCs/>
+                <w:i/>
+                <w:iCs/>
+                <w:sz w:val="16"/>
+                <w:szCs w:val="16"/>
+              </w:rPr>
+              <w:t>Note</w:t>
+            </w:r>
+            <w:r>
+              <w:rPr>
+                <w:bCs/>
+                <w:sz w:val="16"/>
+                <w:szCs w:val="16"/>
+              </w:rPr>
+              <w:t xml:space="preserve">: </w:t>
+            </w:r>
+            <w:r>
+              <w:rPr>
+                <w:bCs/>
                 <w:sz w:val="16"/>
                 <w:szCs w:val="16"/>
               </w:rPr>
@@ -6516,7 +6812,7 @@
         </w:tc>
         <w:tc>
           <w:tcPr>
-            <w:tcW w:w="2378" w:type="dxa"/>
+            <w:tcW w:w="2183" w:type="dxa"/>
           </w:tcPr>
           <w:p>
             <w:pPr>
@@ -6784,7 +7080,7 @@
         </w:tc>
         <w:tc>
           <w:tcPr>
-            <w:tcW w:w="2378" w:type="dxa"/>
+            <w:tcW w:w="2183" w:type="dxa"/>
           </w:tcPr>
           <w:p>
             <w:pPr>
@@ -7055,7 +7351,7 @@
         </w:tc>
         <w:tc>
           <w:tcPr>
-            <w:tcW w:w="2378" w:type="dxa"/>
+            <w:tcW w:w="2183" w:type="dxa"/>
             <w:tcBorders>
               <w:bottom w:val="single" w:sz="4" w:space="0" w:color="auto"/>
             </w:tcBorders>
@@ -7335,13 +7631,14 @@
                 <w:sz w:val="16"/>
                 <w:szCs w:val="16"/>
               </w:rPr>
+              <w:lastRenderedPageBreak/>
               <w:t>Preamp reference voltage (U4)</w:t>
             </w:r>
           </w:p>
         </w:tc>
         <w:tc>
           <w:tcPr>
-            <w:tcW w:w="2378" w:type="dxa"/>
+            <w:tcW w:w="2183" w:type="dxa"/>
             <w:tcBorders>
               <w:bottom w:val="single" w:sz="12" w:space="0" w:color="auto"/>
             </w:tcBorders>
@@ -7546,7 +7843,7 @@
                         <w:sz w:val="16"/>
                         <w:szCs w:val="16"/>
                       </w:rPr>
-                      <m:t>⋅</m:t>
+                      <m:t>+</m:t>
                     </m:r>
                     <m:d>
                       <m:dPr>
@@ -7779,14 +8076,13 @@
                 <w:sz w:val="16"/>
                 <w:szCs w:val="16"/>
               </w:rPr>
-              <w:lastRenderedPageBreak/>
               <w:t>Line in signal after Anti-Aliasing filter, left channel</w:t>
             </w:r>
           </w:p>
         </w:tc>
         <w:tc>
           <w:tcPr>
-            <w:tcW w:w="2378" w:type="dxa"/>
+            <w:tcW w:w="2183" w:type="dxa"/>
             <w:tcBorders>
               <w:top w:val="single" w:sz="12" w:space="0" w:color="auto"/>
             </w:tcBorders>
@@ -7854,19 +8150,7 @@
                     <w:sz w:val="16"/>
                     <w:szCs w:val="16"/>
                   </w:rPr>
-                  <m:t xml:space="preserve">No attenuation </m:t>
-                </m:r>
-                <m:r>
-                  <m:rPr>
-                    <m:nor/>
-                  </m:rPr>
-                  <w:rPr>
-                    <w:rFonts w:ascii="Cambria Math" w:hAnsi="Cambria Math"/>
-                    <w:bCs/>
-                    <w:sz w:val="16"/>
-                    <w:szCs w:val="16"/>
-                  </w:rPr>
-                  <m:t>@</m:t>
+                  <m:t>No attenuation @</m:t>
                 </m:r>
                 <m:r>
                   <w:rPr>
@@ -7968,189 +8252,10 @@
                 <w:szCs w:val="16"/>
               </w:rPr>
             </w:pPr>
-          </w:p>
-        </w:tc>
-        <w:tc>
-          <w:tcPr>
-            <w:tcW w:w="0" w:type="auto"/>
-            <w:tcBorders>
-              <w:top w:val="single" w:sz="12" w:space="0" w:color="auto"/>
-            </w:tcBorders>
-          </w:tcPr>
-          <w:p>
-            <w:pPr>
-              <w:spacing w:before="0"/>
-              <w:jc w:val="left"/>
-              <w:rPr>
-                <w:b/>
-                <w:sz w:val="16"/>
-                <w:szCs w:val="16"/>
-              </w:rPr>
-            </w:pPr>
-          </w:p>
-        </w:tc>
-        <w:tc>
-          <w:tcPr>
-            <w:tcW w:w="1835" w:type="dxa"/>
-            <w:tcBorders>
-              <w:top w:val="single" w:sz="12" w:space="0" w:color="auto"/>
-            </w:tcBorders>
-          </w:tcPr>
-          <w:p>
-            <w:pPr>
-              <w:spacing w:before="0"/>
-              <w:jc w:val="left"/>
-              <w:rPr>
-                <w:bCs/>
-                <w:sz w:val="16"/>
-                <w:szCs w:val="16"/>
-              </w:rPr>
-            </w:pPr>
-          </w:p>
-        </w:tc>
-      </w:tr>
-      <w:tr>
-        <w:tc>
-          <w:tcPr>
-            <w:tcW w:w="0" w:type="auto"/>
-            <w:tcBorders>
-              <w:bottom w:val="single" w:sz="12" w:space="0" w:color="auto"/>
-            </w:tcBorders>
-          </w:tcPr>
-          <w:p>
-            <w:pPr>
-              <w:spacing w:before="0"/>
-              <w:jc w:val="left"/>
-              <w:rPr>
-                <w:b/>
-                <w:sz w:val="16"/>
-                <w:szCs w:val="16"/>
-              </w:rPr>
-            </w:pPr>
-            <w:r>
-              <w:rPr>
-                <w:b/>
-                <w:sz w:val="16"/>
-                <w:szCs w:val="16"/>
-              </w:rPr>
-              <w:t>Line in signal after Anti-Aliasing filter, right channel</w:t>
-            </w:r>
-          </w:p>
-        </w:tc>
-        <w:tc>
-          <w:tcPr>
-            <w:tcW w:w="2378" w:type="dxa"/>
-            <w:tcBorders>
-              <w:bottom w:val="single" w:sz="12" w:space="0" w:color="auto"/>
-            </w:tcBorders>
-          </w:tcPr>
-          <w:p>
-            <w:pPr>
-              <w:spacing w:before="0"/>
-              <w:jc w:val="left"/>
-              <w:rPr>
-                <w:bCs/>
-                <w:sz w:val="16"/>
-                <w:szCs w:val="16"/>
-              </w:rPr>
-            </w:pPr>
-            <w:r>
-              <w:rPr>
-                <w:bCs/>
-                <w:sz w:val="16"/>
-                <w:szCs w:val="16"/>
-              </w:rPr>
-              <w:t xml:space="preserve">Input signal: </w:t>
-            </w:r>
-            <w:r>
-              <w:rPr>
-                <w:bCs/>
-                <w:sz w:val="16"/>
-              </w:rPr>
-              <w:t>500</w:t>
-            </w:r>
-            <w:r>
-              <w:rPr>
-                <w:sz w:val="16"/>
-              </w:rPr>
-              <w:t>mVpp 1kHz sine</w:t>
-            </w:r>
-          </w:p>
-        </w:tc>
-        <w:tc>
-          <w:tcPr>
-            <w:tcW w:w="0" w:type="auto"/>
-            <w:tcBorders>
-              <w:bottom w:val="single" w:sz="12" w:space="0" w:color="auto"/>
-            </w:tcBorders>
-            <w:noWrap/>
-          </w:tcPr>
-          <w:p>
-            <w:pPr>
-              <w:spacing w:before="0"/>
-              <w:jc w:val="center"/>
-              <w:rPr>
-                <w:b/>
-                <w:sz w:val="16"/>
-                <w:szCs w:val="16"/>
-              </w:rPr>
-            </w:pPr>
             <m:oMathPara>
               <m:oMath>
                 <m:r>
                   <m:rPr>
-                    <m:nor/>
-                  </m:rPr>
-                  <w:rPr>
-                    <w:rFonts w:ascii="Cambria Math" w:hAnsi="Cambria Math"/>
-                    <w:bCs/>
-                    <w:sz w:val="16"/>
-                    <w:szCs w:val="16"/>
-                  </w:rPr>
-                  <m:t xml:space="preserve">No attenuation </m:t>
-                </m:r>
-                <m:r>
-                  <m:rPr>
-                    <m:nor/>
-                  </m:rPr>
-                  <w:rPr>
-                    <w:rFonts w:ascii="Cambria Math" w:hAnsi="Cambria Math"/>
-                    <w:bCs/>
-                    <w:sz w:val="16"/>
-                    <w:szCs w:val="16"/>
-                  </w:rPr>
-                  <m:t>@</m:t>
-                </m:r>
-                <m:r>
-                  <w:rPr>
-                    <w:rFonts w:ascii="Cambria Math" w:hAnsi="Cambria Math"/>
-                    <w:sz w:val="16"/>
-                    <w:szCs w:val="16"/>
-                  </w:rPr>
-                  <m:t xml:space="preserve"> 1</m:t>
-                </m:r>
-                <m:r>
-                  <m:rPr>
-                    <m:nor/>
-                  </m:rPr>
-                  <w:rPr>
-                    <w:rFonts w:ascii="Cambria Math" w:hAnsi="Cambria Math"/>
-                    <w:bCs/>
-                    <w:sz w:val="16"/>
-                    <w:szCs w:val="16"/>
-                  </w:rPr>
-                  <m:t>kHz</m:t>
-                </m:r>
-                <m:r>
-                  <w:rPr>
-                    <w:rFonts w:ascii="Cambria Math" w:hAnsi="Cambria Math"/>
-                    <w:sz w:val="16"/>
-                    <w:szCs w:val="16"/>
-                  </w:rPr>
-                  <m:t>→</m:t>
-                </m:r>
-                <m:r>
-                  <m:rPr>
                     <m:sty m:val="bi"/>
                   </m:rPr>
                   <w:rPr>
@@ -8158,7 +8263,7 @@
                     <w:sz w:val="16"/>
                     <w:szCs w:val="16"/>
                   </w:rPr>
-                  <m:t>500</m:t>
+                  <m:t>532</m:t>
                 </m:r>
                 <m:sSub>
                   <m:sSubPr>
@@ -8208,7 +8313,7 @@
           <w:tcPr>
             <w:tcW w:w="0" w:type="auto"/>
             <w:tcBorders>
-              <w:bottom w:val="single" w:sz="12" w:space="0" w:color="auto"/>
+              <w:top w:val="single" w:sz="12" w:space="0" w:color="auto"/>
             </w:tcBorders>
           </w:tcPr>
           <w:p>
@@ -8221,8 +8326,53 @@
                 <w:szCs w:val="16"/>
               </w:rPr>
             </w:pPr>
-          </w:p>
-        </w:tc>
+            <w:r>
+              <w:rPr>
+                <w:bCs/>
+                <w:sz w:val="16"/>
+                <w:szCs w:val="16"/>
+              </w:rPr>
+              <w:t>Acceptable with tolerance</w:t>
+            </w:r>
+            <w:r>
+              <w:rPr>
+                <w:bCs/>
+                <w:sz w:val="16"/>
+                <w:szCs w:val="16"/>
+              </w:rPr>
+              <w:t xml:space="preserve"> →</w:t>
+            </w:r>
+            <w:r>
+              <w:rPr>
+                <w:b/>
+                <w:sz w:val="16"/>
+                <w:szCs w:val="16"/>
+              </w:rPr>
+              <w:t xml:space="preserve"> passed</w:t>
+            </w:r>
+          </w:p>
+        </w:tc>
+        <w:tc>
+          <w:tcPr>
+            <w:tcW w:w="1835" w:type="dxa"/>
+            <w:tcBorders>
+              <w:top w:val="single" w:sz="12" w:space="0" w:color="auto"/>
+            </w:tcBorders>
+          </w:tcPr>
+          <w:p>
+            <w:pPr>
+              <w:spacing w:before="0"/>
+              <w:jc w:val="left"/>
+              <w:rPr>
+                <w:bCs/>
+                <w:sz w:val="16"/>
+                <w:szCs w:val="16"/>
+              </w:rPr>
+            </w:pPr>
+          </w:p>
+        </w:tc>
+      </w:tr>
+      <w:tr>
         <w:tc>
           <w:tcPr>
             <w:tcW w:w="0" w:type="auto"/>
@@ -8240,6 +8390,286 @@
                 <w:szCs w:val="16"/>
               </w:rPr>
             </w:pPr>
+            <w:r>
+              <w:rPr>
+                <w:b/>
+                <w:sz w:val="16"/>
+                <w:szCs w:val="16"/>
+              </w:rPr>
+              <w:t>Line in signal after Anti-Aliasing filter, right channel</w:t>
+            </w:r>
+          </w:p>
+        </w:tc>
+        <w:tc>
+          <w:tcPr>
+            <w:tcW w:w="2183" w:type="dxa"/>
+            <w:tcBorders>
+              <w:bottom w:val="single" w:sz="12" w:space="0" w:color="auto"/>
+            </w:tcBorders>
+          </w:tcPr>
+          <w:p>
+            <w:pPr>
+              <w:spacing w:before="0"/>
+              <w:jc w:val="left"/>
+              <w:rPr>
+                <w:bCs/>
+                <w:sz w:val="16"/>
+                <w:szCs w:val="16"/>
+              </w:rPr>
+            </w:pPr>
+            <w:r>
+              <w:rPr>
+                <w:bCs/>
+                <w:sz w:val="16"/>
+                <w:szCs w:val="16"/>
+              </w:rPr>
+              <w:t xml:space="preserve">Input signal: </w:t>
+            </w:r>
+            <w:r>
+              <w:rPr>
+                <w:bCs/>
+                <w:sz w:val="16"/>
+              </w:rPr>
+              <w:t>500</w:t>
+            </w:r>
+            <w:r>
+              <w:rPr>
+                <w:sz w:val="16"/>
+              </w:rPr>
+              <w:t>mVpp 1kHz sine</w:t>
+            </w:r>
+          </w:p>
+        </w:tc>
+        <w:tc>
+          <w:tcPr>
+            <w:tcW w:w="0" w:type="auto"/>
+            <w:tcBorders>
+              <w:bottom w:val="single" w:sz="12" w:space="0" w:color="auto"/>
+            </w:tcBorders>
+            <w:noWrap/>
+          </w:tcPr>
+          <w:p>
+            <w:pPr>
+              <w:spacing w:before="0"/>
+              <w:jc w:val="center"/>
+              <w:rPr>
+                <w:b/>
+                <w:sz w:val="16"/>
+                <w:szCs w:val="16"/>
+              </w:rPr>
+            </w:pPr>
+            <m:oMathPara>
+              <m:oMath>
+                <m:r>
+                  <m:rPr>
+                    <m:nor/>
+                  </m:rPr>
+                  <w:rPr>
+                    <w:rFonts w:ascii="Cambria Math" w:hAnsi="Cambria Math"/>
+                    <w:bCs/>
+                    <w:sz w:val="16"/>
+                    <w:szCs w:val="16"/>
+                  </w:rPr>
+                  <m:t>No attenuation @</m:t>
+                </m:r>
+                <m:r>
+                  <w:rPr>
+                    <w:rFonts w:ascii="Cambria Math" w:hAnsi="Cambria Math"/>
+                    <w:sz w:val="16"/>
+                    <w:szCs w:val="16"/>
+                  </w:rPr>
+                  <m:t xml:space="preserve"> 1</m:t>
+                </m:r>
+                <m:r>
+                  <m:rPr>
+                    <m:nor/>
+                  </m:rPr>
+                  <w:rPr>
+                    <w:rFonts w:ascii="Cambria Math" w:hAnsi="Cambria Math"/>
+                    <w:bCs/>
+                    <w:sz w:val="16"/>
+                    <w:szCs w:val="16"/>
+                  </w:rPr>
+                  <m:t>kHz</m:t>
+                </m:r>
+                <m:r>
+                  <w:rPr>
+                    <w:rFonts w:ascii="Cambria Math" w:hAnsi="Cambria Math"/>
+                    <w:sz w:val="16"/>
+                    <w:szCs w:val="16"/>
+                  </w:rPr>
+                  <m:t>→</m:t>
+                </m:r>
+                <m:r>
+                  <m:rPr>
+                    <m:sty m:val="bi"/>
+                  </m:rPr>
+                  <w:rPr>
+                    <w:rFonts w:ascii="Cambria Math" w:hAnsi="Cambria Math"/>
+                    <w:sz w:val="16"/>
+                    <w:szCs w:val="16"/>
+                  </w:rPr>
+                  <m:t>500</m:t>
+                </m:r>
+                <m:sSub>
+                  <m:sSubPr>
+                    <m:ctrlPr>
+                      <w:rPr>
+                        <w:rFonts w:ascii="Cambria Math" w:hAnsi="Cambria Math"/>
+                        <w:b/>
+                        <w:sz w:val="16"/>
+                        <w:szCs w:val="16"/>
+                      </w:rPr>
+                    </m:ctrlPr>
+                  </m:sSubPr>
+                  <m:e>
+                    <m:r>
+                      <m:rPr>
+                        <m:nor/>
+                      </m:rPr>
+                      <w:rPr>
+                        <w:rFonts w:ascii="Cambria Math" w:hAnsi="Cambria Math"/>
+                        <w:b/>
+                        <w:sz w:val="16"/>
+                        <w:szCs w:val="16"/>
+                      </w:rPr>
+                      <m:t>mV</m:t>
+                    </m:r>
+                  </m:e>
+                  <m:sub>
+                    <m:r>
+                      <m:rPr>
+                        <m:nor/>
+                      </m:rPr>
+                      <w:rPr>
+                        <w:rFonts w:ascii="Cambria Math" w:hAnsi="Cambria Math"/>
+                        <w:b/>
+                        <w:sz w:val="16"/>
+                        <w:szCs w:val="16"/>
+                      </w:rPr>
+                      <m:t>PP</m:t>
+                    </m:r>
+                  </m:sub>
+                </m:sSub>
+              </m:oMath>
+            </m:oMathPara>
+          </w:p>
+        </w:tc>
+        <w:tc>
+          <w:tcPr>
+            <w:tcW w:w="0" w:type="auto"/>
+            <w:tcBorders>
+              <w:bottom w:val="single" w:sz="12" w:space="0" w:color="auto"/>
+            </w:tcBorders>
+          </w:tcPr>
+          <w:p>
+            <w:pPr>
+              <w:spacing w:before="0"/>
+              <w:jc w:val="left"/>
+              <w:rPr>
+                <w:b/>
+                <w:sz w:val="16"/>
+                <w:szCs w:val="16"/>
+              </w:rPr>
+            </w:pPr>
+            <m:oMathPara>
+              <m:oMath>
+                <m:r>
+                  <m:rPr>
+                    <m:sty m:val="bi"/>
+                  </m:rPr>
+                  <w:rPr>
+                    <w:rFonts w:ascii="Cambria Math" w:hAnsi="Cambria Math"/>
+                    <w:sz w:val="16"/>
+                    <w:szCs w:val="16"/>
+                  </w:rPr>
+                  <m:t>532</m:t>
+                </m:r>
+                <m:sSub>
+                  <m:sSubPr>
+                    <m:ctrlPr>
+                      <w:rPr>
+                        <w:rFonts w:ascii="Cambria Math" w:hAnsi="Cambria Math"/>
+                        <w:b/>
+                        <w:sz w:val="16"/>
+                        <w:szCs w:val="16"/>
+                      </w:rPr>
+                    </m:ctrlPr>
+                  </m:sSubPr>
+                  <m:e>
+                    <m:r>
+                      <m:rPr>
+                        <m:nor/>
+                      </m:rPr>
+                      <w:rPr>
+                        <w:rFonts w:ascii="Cambria Math" w:hAnsi="Cambria Math"/>
+                        <w:b/>
+                        <w:sz w:val="16"/>
+                        <w:szCs w:val="16"/>
+                      </w:rPr>
+                      <m:t>mV</m:t>
+                    </m:r>
+                  </m:e>
+                  <m:sub>
+                    <m:r>
+                      <m:rPr>
+                        <m:nor/>
+                      </m:rPr>
+                      <w:rPr>
+                        <w:rFonts w:ascii="Cambria Math" w:hAnsi="Cambria Math"/>
+                        <w:b/>
+                        <w:sz w:val="16"/>
+                        <w:szCs w:val="16"/>
+                      </w:rPr>
+                      <m:t>PP</m:t>
+                    </m:r>
+                  </m:sub>
+                </m:sSub>
+              </m:oMath>
+            </m:oMathPara>
+          </w:p>
+        </w:tc>
+        <w:tc>
+          <w:tcPr>
+            <w:tcW w:w="0" w:type="auto"/>
+            <w:tcBorders>
+              <w:bottom w:val="single" w:sz="12" w:space="0" w:color="auto"/>
+            </w:tcBorders>
+          </w:tcPr>
+          <w:p>
+            <w:pPr>
+              <w:spacing w:before="0"/>
+              <w:jc w:val="left"/>
+              <w:rPr>
+                <w:b/>
+                <w:sz w:val="16"/>
+                <w:szCs w:val="16"/>
+              </w:rPr>
+            </w:pPr>
+            <w:r>
+              <w:rPr>
+                <w:bCs/>
+                <w:sz w:val="16"/>
+                <w:szCs w:val="16"/>
+              </w:rPr>
+              <w:t>Acceptable with tolerance</w:t>
+            </w:r>
+            <w:r>
+              <w:rPr>
+                <w:bCs/>
+                <w:sz w:val="16"/>
+                <w:szCs w:val="16"/>
+              </w:rPr>
+              <w:t xml:space="preserve"> →</w:t>
+            </w:r>
+            <w:r>
+              <w:rPr>
+                <w:b/>
+                <w:sz w:val="16"/>
+                <w:szCs w:val="16"/>
+              </w:rPr>
+              <w:t xml:space="preserve"> passed</w:t>
+            </w:r>
           </w:p>
         </w:tc>
         <w:tc>
@@ -8293,7 +8723,7 @@
         </w:tc>
         <w:tc>
           <w:tcPr>
-            <w:tcW w:w="2378" w:type="dxa"/>
+            <w:tcW w:w="2183" w:type="dxa"/>
             <w:tcBorders>
               <w:top w:val="single" w:sz="12" w:space="0" w:color="auto"/>
               <w:bottom w:val="single" w:sz="4" w:space="0" w:color="auto"/>
@@ -8333,7 +8763,7 @@
               <w:spacing w:before="0"/>
               <w:jc w:val="center"/>
               <w:rPr>
-                <w:b/>
+                <w:bCs/>
                 <w:sz w:val="16"/>
                 <w:szCs w:val="16"/>
               </w:rPr>
@@ -8341,6 +8771,88 @@
             <m:oMathPara>
               <m:oMath>
                 <m:r>
+                  <w:rPr>
+                    <w:rFonts w:ascii="Cambria Math" w:hAnsi="Cambria Math"/>
+                    <w:sz w:val="16"/>
+                    <w:szCs w:val="16"/>
+                  </w:rPr>
+                  <m:t>3</m:t>
+                </m:r>
+                <m:r>
+                  <m:rPr>
+                    <m:nor/>
+                  </m:rPr>
+                  <w:rPr>
+                    <w:rFonts w:ascii="Cambria Math" w:hAnsi="Cambria Math"/>
+                    <w:bCs/>
+                    <w:sz w:val="16"/>
+                    <w:szCs w:val="16"/>
+                  </w:rPr>
+                  <m:t>V</m:t>
+                </m:r>
+                <m:r>
+                  <w:rPr>
+                    <w:rFonts w:ascii="Cambria Math" w:hAnsi="Cambria Math"/>
+                    <w:sz w:val="16"/>
+                    <w:szCs w:val="16"/>
+                  </w:rPr>
+                  <m:t>+</m:t>
+                </m:r>
+                <m:f>
+                  <m:fPr>
+                    <m:type m:val="lin"/>
+                    <m:ctrlPr>
+                      <w:rPr>
+                        <w:rFonts w:ascii="Cambria Math" w:hAnsi="Cambria Math"/>
+                        <w:bCs/>
+                        <w:i/>
+                        <w:sz w:val="16"/>
+                        <w:szCs w:val="16"/>
+                      </w:rPr>
+                    </m:ctrlPr>
+                  </m:fPr>
+                  <m:num>
+                    <m:r>
+                      <w:rPr>
+                        <w:rFonts w:ascii="Cambria Math" w:hAnsi="Cambria Math"/>
+                        <w:sz w:val="16"/>
+                        <w:szCs w:val="16"/>
+                      </w:rPr>
+                      <m:t>5</m:t>
+                    </m:r>
+                    <m:r>
+                      <m:rPr>
+                        <m:nor/>
+                      </m:rPr>
+                      <w:rPr>
+                        <w:rFonts w:ascii="Cambria Math" w:hAnsi="Cambria Math"/>
+                        <w:bCs/>
+                        <w:sz w:val="16"/>
+                        <w:szCs w:val="16"/>
+                      </w:rPr>
+                      <m:t>V</m:t>
+                    </m:r>
+                  </m:num>
+                  <m:den>
+                    <m:r>
+                      <w:rPr>
+                        <w:rFonts w:ascii="Cambria Math" w:hAnsi="Cambria Math"/>
+                        <w:sz w:val="16"/>
+                        <w:szCs w:val="16"/>
+                      </w:rPr>
+                      <m:t>2</m:t>
+                    </m:r>
+                  </m:den>
+                </m:f>
+                <m:r>
+                  <w:rPr>
+                    <w:rFonts w:ascii="Cambria Math" w:hAnsi="Cambria Math"/>
+                    <w:sz w:val="16"/>
+                    <w:szCs w:val="16"/>
+                  </w:rPr>
+                  <m:t>=</m:t>
+                </m:r>
+                <m:r>
                   <m:rPr>
                     <m:sty m:val="bi"/>
                   </m:rPr>
@@ -8348,9 +8860,21 @@
                     <w:rFonts w:ascii="Cambria Math" w:hAnsi="Cambria Math"/>
                     <w:sz w:val="16"/>
                     <w:szCs w:val="16"/>
-                    <w:highlight w:val="yellow"/>
-                  </w:rPr>
-                  <m:t>…</m:t>
+                  </w:rPr>
+                  <m:t>5.5</m:t>
+                </m:r>
+                <m:r>
+                  <m:rPr>
+                    <m:nor/>
+                  </m:rPr>
+                  <w:rPr>
+                    <w:rFonts w:ascii="Cambria Math" w:hAnsi="Cambria Math"/>
+                    <w:b/>
+                    <w:bCs/>
+                    <w:sz w:val="16"/>
+                    <w:szCs w:val="16"/>
+                  </w:rPr>
+                  <m:t>V</m:t>
                 </m:r>
               </m:oMath>
             </m:oMathPara>
@@ -8416,19 +8940,52 @@
               <w:spacing w:before="0"/>
               <w:jc w:val="left"/>
               <w:rPr>
-                <w:b/>
-                <w:sz w:val="16"/>
-                <w:szCs w:val="16"/>
-              </w:rPr>
-            </w:pPr>
+                <w:bCs/>
+                <w:sz w:val="16"/>
+                <w:szCs w:val="16"/>
+              </w:rPr>
+            </w:pPr>
+            <w:r>
+              <w:rPr>
+                <w:bCs/>
+                <w:sz w:val="16"/>
+                <w:szCs w:val="16"/>
+              </w:rPr>
+              <w:t>Not as expected, considered acceptable</w:t>
+            </w:r>
+            <w:r>
+              <w:rPr>
+                <w:bCs/>
+                <w:sz w:val="16"/>
+                <w:szCs w:val="16"/>
+                <w:vertAlign w:val="superscript"/>
+              </w:rPr>
+              <w:t>*)</w:t>
+            </w:r>
+            <w:r>
+              <w:rPr>
+                <w:bCs/>
+                <w:sz w:val="16"/>
+                <w:szCs w:val="16"/>
+              </w:rPr>
+              <w:t xml:space="preserve"> → </w:t>
+            </w:r>
+            <w:r>
+              <w:rPr>
+                <w:b/>
+                <w:sz w:val="16"/>
+                <w:szCs w:val="16"/>
+              </w:rPr>
+              <w:t>passed</w:t>
+            </w:r>
           </w:p>
         </w:tc>
         <w:tc>
           <w:tcPr>
             <w:tcW w:w="1835" w:type="dxa"/>
+            <w:vMerge w:val="restart"/>
             <w:tcBorders>
               <w:top w:val="single" w:sz="12" w:space="0" w:color="auto"/>
-              <w:bottom w:val="single" w:sz="4" w:space="0" w:color="auto"/>
             </w:tcBorders>
           </w:tcPr>
           <w:p>
@@ -8441,6 +8998,128 @@
                 <w:szCs w:val="16"/>
               </w:rPr>
             </w:pPr>
+            <w:r>
+              <w:rPr>
+                <w:bCs/>
+                <w:sz w:val="16"/>
+                <w:szCs w:val="16"/>
+              </w:rPr>
+              <w:t>*) C</w:t>
+            </w:r>
+            <w:r>
+              <w:rPr>
+                <w:bCs/>
+                <w:sz w:val="16"/>
+                <w:szCs w:val="16"/>
+              </w:rPr>
+              <w:t xml:space="preserve">alculated with </w:t>
+            </w:r>
+            <w:r>
+              <w:rPr>
+                <w:bCs/>
+                <w:sz w:val="16"/>
+                <w:szCs w:val="16"/>
+              </w:rPr>
+              <w:t>max</w:t>
+            </w:r>
+            <w:r>
+              <w:rPr>
+                <w:bCs/>
+                <w:sz w:val="16"/>
+                <w:szCs w:val="16"/>
+              </w:rPr>
+              <w:t xml:space="preserve"> values from the datasheet</w:t>
+            </w:r>
+            <w:r>
+              <w:rPr>
+                <w:bCs/>
+                <w:sz w:val="16"/>
+                <w:szCs w:val="16"/>
+              </w:rPr>
+              <w:t xml:space="preserve">, </w:t>
+            </w:r>
+            <w:r>
+              <w:rPr>
+                <w:bCs/>
+                <w:sz w:val="16"/>
+                <w:szCs w:val="16"/>
+              </w:rPr>
+              <w:t xml:space="preserve">is in range for </w:t>
+            </w:r>
+            <m:oMath>
+              <m:sSub>
+                <m:sSubPr>
+                  <m:ctrlPr>
+                    <w:rPr>
+                      <w:rFonts w:ascii="Cambria Math" w:hAnsi="Cambria Math"/>
+                      <w:bCs/>
+                      <w:i/>
+                      <w:sz w:val="16"/>
+                      <w:szCs w:val="16"/>
+                    </w:rPr>
+                  </m:ctrlPr>
+                </m:sSubPr>
+                <m:e>
+                  <m:r>
+                    <w:rPr>
+                      <w:rFonts w:ascii="Cambria Math" w:hAnsi="Cambria Math"/>
+                      <w:sz w:val="16"/>
+                      <w:szCs w:val="16"/>
+                    </w:rPr>
+                    <m:t>V</m:t>
+                  </m:r>
+                </m:e>
+                <m:sub>
+                  <m:r>
+                    <w:rPr>
+                      <w:rFonts w:ascii="Cambria Math" w:hAnsi="Cambria Math"/>
+                      <w:sz w:val="16"/>
+                      <w:szCs w:val="16"/>
+                    </w:rPr>
+                    <m:t>OD</m:t>
+                  </m:r>
+                  <m:r>
+                    <w:rPr>
+                      <w:rFonts w:ascii="Cambria Math" w:hAnsi="Cambria Math"/>
+                      <w:sz w:val="16"/>
+                      <w:szCs w:val="16"/>
+                    </w:rPr>
+                    <m:t xml:space="preserve">, </m:t>
+                  </m:r>
+                  <m:r>
+                    <m:rPr>
+                      <m:sty m:val="bi"/>
+                    </m:rPr>
+                    <w:rPr>
+                      <w:rFonts w:ascii="Cambria Math" w:hAnsi="Cambria Math"/>
+                      <w:sz w:val="16"/>
+                      <w:szCs w:val="16"/>
+                    </w:rPr>
+                    <m:t>min</m:t>
+                  </m:r>
+                </m:sub>
+              </m:sSub>
+              <m:r>
+                <w:rPr>
+                  <w:rFonts w:ascii="Cambria Math" w:hAnsi="Cambria Math"/>
+                  <w:sz w:val="16"/>
+                  <w:szCs w:val="16"/>
+                </w:rPr>
+                <m:t>=1.5</m:t>
+              </m:r>
+              <m:r>
+                <m:rPr>
+                  <m:nor/>
+                </m:rPr>
+                <w:rPr>
+                  <w:rFonts w:ascii="Cambria Math" w:hAnsi="Cambria Math"/>
+                  <w:bCs/>
+                  <w:sz w:val="16"/>
+                  <w:szCs w:val="16"/>
+                </w:rPr>
+                <m:t>V</m:t>
+              </m:r>
+            </m:oMath>
           </w:p>
         </w:tc>
       </w:tr>
@@ -8474,7 +9153,7 @@
         </w:tc>
         <w:tc>
           <w:tcPr>
-            <w:tcW w:w="2378" w:type="dxa"/>
+            <w:tcW w:w="2183" w:type="dxa"/>
             <w:tcBorders>
               <w:bottom w:val="single" w:sz="12" w:space="0" w:color="auto"/>
             </w:tcBorders>
@@ -8520,6 +9199,88 @@
             <m:oMathPara>
               <m:oMath>
                 <m:r>
+                  <w:rPr>
+                    <w:rFonts w:ascii="Cambria Math" w:hAnsi="Cambria Math"/>
+                    <w:sz w:val="16"/>
+                    <w:szCs w:val="16"/>
+                  </w:rPr>
+                  <m:t>3</m:t>
+                </m:r>
+                <m:r>
+                  <m:rPr>
+                    <m:nor/>
+                  </m:rPr>
+                  <w:rPr>
+                    <w:rFonts w:ascii="Cambria Math" w:hAnsi="Cambria Math"/>
+                    <w:bCs/>
+                    <w:sz w:val="16"/>
+                    <w:szCs w:val="16"/>
+                  </w:rPr>
+                  <m:t>V</m:t>
+                </m:r>
+                <m:r>
+                  <w:rPr>
+                    <w:rFonts w:ascii="Cambria Math" w:hAnsi="Cambria Math"/>
+                    <w:sz w:val="16"/>
+                    <w:szCs w:val="16"/>
+                  </w:rPr>
+                  <m:t>-</m:t>
+                </m:r>
+                <m:f>
+                  <m:fPr>
+                    <m:type m:val="lin"/>
+                    <m:ctrlPr>
+                      <w:rPr>
+                        <w:rFonts w:ascii="Cambria Math" w:hAnsi="Cambria Math"/>
+                        <w:bCs/>
+                        <w:i/>
+                        <w:sz w:val="16"/>
+                        <w:szCs w:val="16"/>
+                      </w:rPr>
+                    </m:ctrlPr>
+                  </m:fPr>
+                  <m:num>
+                    <m:r>
+                      <w:rPr>
+                        <w:rFonts w:ascii="Cambria Math" w:hAnsi="Cambria Math"/>
+                        <w:sz w:val="16"/>
+                        <w:szCs w:val="16"/>
+                      </w:rPr>
+                      <m:t>5</m:t>
+                    </m:r>
+                    <m:r>
+                      <m:rPr>
+                        <m:nor/>
+                      </m:rPr>
+                      <w:rPr>
+                        <w:rFonts w:ascii="Cambria Math" w:hAnsi="Cambria Math"/>
+                        <w:bCs/>
+                        <w:sz w:val="16"/>
+                        <w:szCs w:val="16"/>
+                      </w:rPr>
+                      <m:t>V</m:t>
+                    </m:r>
+                  </m:num>
+                  <m:den>
+                    <m:r>
+                      <w:rPr>
+                        <w:rFonts w:ascii="Cambria Math" w:hAnsi="Cambria Math"/>
+                        <w:sz w:val="16"/>
+                        <w:szCs w:val="16"/>
+                      </w:rPr>
+                      <m:t>2</m:t>
+                    </m:r>
+                  </m:den>
+                </m:f>
+                <m:r>
+                  <w:rPr>
+                    <w:rFonts w:ascii="Cambria Math" w:hAnsi="Cambria Math"/>
+                    <w:sz w:val="16"/>
+                    <w:szCs w:val="16"/>
+                  </w:rPr>
+                  <m:t>=</m:t>
+                </m:r>
+                <m:r>
                   <m:rPr>
                     <m:sty m:val="bi"/>
                   </m:rPr>
@@ -8527,9 +9288,21 @@
                     <w:rFonts w:ascii="Cambria Math" w:hAnsi="Cambria Math"/>
                     <w:sz w:val="16"/>
                     <w:szCs w:val="16"/>
-                    <w:highlight w:val="yellow"/>
-                  </w:rPr>
-                  <m:t>…</m:t>
+                  </w:rPr>
+                  <m:t>0.5</m:t>
+                </m:r>
+                <m:r>
+                  <m:rPr>
+                    <m:nor/>
+                  </m:rPr>
+                  <w:rPr>
+                    <w:rFonts w:ascii="Cambria Math" w:hAnsi="Cambria Math"/>
+                    <w:b/>
+                    <w:bCs/>
+                    <w:sz w:val="16"/>
+                    <w:szCs w:val="16"/>
+                  </w:rPr>
+                  <m:t>V</m:t>
                 </m:r>
               </m:oMath>
             </m:oMathPara>
@@ -8598,11 +9371,45 @@
                 <w:szCs w:val="16"/>
               </w:rPr>
             </w:pPr>
+            <w:r>
+              <w:rPr>
+                <w:bCs/>
+                <w:sz w:val="16"/>
+                <w:szCs w:val="16"/>
+              </w:rPr>
+              <w:t>Not as expected, considered acceptable</w:t>
+            </w:r>
+            <w:r>
+              <w:rPr>
+                <w:bCs/>
+                <w:sz w:val="16"/>
+                <w:szCs w:val="16"/>
+                <w:vertAlign w:val="superscript"/>
+              </w:rPr>
+              <w:t>*)</w:t>
+            </w:r>
+            <w:r>
+              <w:rPr>
+                <w:bCs/>
+                <w:sz w:val="16"/>
+                <w:szCs w:val="16"/>
+              </w:rPr>
+              <w:t xml:space="preserve"> → </w:t>
+            </w:r>
+            <w:r>
+              <w:rPr>
+                <w:b/>
+                <w:sz w:val="16"/>
+                <w:szCs w:val="16"/>
+              </w:rPr>
+              <w:t>passed</w:t>
+            </w:r>
           </w:p>
         </w:tc>
         <w:tc>
           <w:tcPr>
             <w:tcW w:w="1835" w:type="dxa"/>
+            <w:vMerge/>
             <w:tcBorders>
               <w:bottom w:val="single" w:sz="12" w:space="0" w:color="auto"/>
             </w:tcBorders>
@@ -8623,7 +9430,7 @@
       <w:tr>
         <w:tc>
           <w:tcPr>
-            <w:tcW w:w="0" w:type="auto"/>
+            <w:tcW w:w="2183" w:type="dxa"/>
             <w:gridSpan w:val="6"/>
             <w:tcBorders>
               <w:top w:val="single" w:sz="12" w:space="0" w:color="auto"/>
@@ -8778,7 +9585,7 @@
         </w:tc>
         <w:tc>
           <w:tcPr>
-            <w:tcW w:w="0" w:type="auto"/>
+            <w:tcW w:w="2183" w:type="dxa"/>
             <w:tcBorders>
               <w:top w:val="single" w:sz="12" w:space="0" w:color="auto"/>
             </w:tcBorders>
@@ -8890,6 +9697,33 @@
                 <w:szCs w:val="16"/>
               </w:rPr>
             </w:pPr>
+            <m:oMathPara>
+              <m:oMath>
+                <m:r>
+                  <m:rPr>
+                    <m:sty m:val="bi"/>
+                  </m:rPr>
+                  <w:rPr>
+                    <w:rFonts w:ascii="Cambria Math" w:hAnsi="Cambria Math"/>
+                    <w:sz w:val="16"/>
+                    <w:szCs w:val="16"/>
+                  </w:rPr>
+                  <m:t>24.88</m:t>
+                </m:r>
+                <m:r>
+                  <m:rPr>
+                    <m:nor/>
+                  </m:rPr>
+                  <w:rPr>
+                    <w:rFonts w:ascii="Cambria Math" w:hAnsi="Cambria Math"/>
+                    <w:b/>
+                    <w:sz w:val="16"/>
+                    <w:szCs w:val="16"/>
+                  </w:rPr>
+                  <m:t>MHz</m:t>
+                </m:r>
+              </m:oMath>
+            </m:oMathPara>
           </w:p>
         </w:tc>
         <w:tc>
@@ -8909,6 +9743,22 @@
                 <w:szCs w:val="16"/>
               </w:rPr>
             </w:pPr>
+            <w:r>
+              <w:rPr>
+                <w:bCs/>
+                <w:sz w:val="16"/>
+                <w:szCs w:val="16"/>
+              </w:rPr>
+              <w:t>In range →</w:t>
+            </w:r>
+            <w:r>
+              <w:rPr>
+                <w:b/>
+                <w:sz w:val="16"/>
+                <w:szCs w:val="16"/>
+              </w:rPr>
+              <w:t xml:space="preserve"> passed</w:t>
+            </w:r>
           </w:p>
         </w:tc>
         <w:tc>
@@ -8958,7 +9808,7 @@
         </w:tc>
         <w:tc>
           <w:tcPr>
-            <w:tcW w:w="0" w:type="auto"/>
+            <w:tcW w:w="2183" w:type="dxa"/>
           </w:tcPr>
           <w:p>
             <w:pPr>
@@ -9166,7 +10016,7 @@
         </w:tc>
         <w:tc>
           <w:tcPr>
-            <w:tcW w:w="0" w:type="auto"/>
+            <w:tcW w:w="2183" w:type="dxa"/>
           </w:tcPr>
           <w:p>
             <w:pPr>
@@ -9348,6 +10198,9 @@
         </w:tc>
       </w:tr>
       <w:tr>
+        <w:trPr>
+          <w:trHeight w:val="152"/>
+        </w:trPr>
         <w:tc>
           <w:tcPr>
             <w:tcW w:w="0" w:type="auto"/>
@@ -9371,13 +10224,29 @@
                 <w:sz w:val="16"/>
                 <w:szCs w:val="16"/>
               </w:rPr>
-              <w:t>SCL Frequency</w:t>
-            </w:r>
-          </w:p>
-        </w:tc>
-        <w:tc>
-          <w:tcPr>
-            <w:tcW w:w="0" w:type="auto"/>
+              <w:t>SCL</w:t>
+            </w:r>
+            <w:r>
+              <w:rPr>
+                <w:b/>
+                <w:sz w:val="16"/>
+                <w:szCs w:val="16"/>
+              </w:rPr>
+              <w:t>K</w:t>
+            </w:r>
+            <w:r>
+              <w:rPr>
+                <w:b/>
+                <w:sz w:val="16"/>
+                <w:szCs w:val="16"/>
+              </w:rPr>
+              <w:t xml:space="preserve"> Frequency</w:t>
+            </w:r>
+          </w:p>
+        </w:tc>
+        <w:tc>
+          <w:tcPr>
+            <w:tcW w:w="2183" w:type="dxa"/>
             <w:tcBorders>
               <w:bottom w:val="single" w:sz="4" w:space="0" w:color="auto"/>
             </w:tcBorders>
@@ -9418,12 +10287,52 @@
                 <w:b/>
                 <w:sz w:val="16"/>
                 <w:szCs w:val="16"/>
+                <w:lang w:val="de-CH"/>
               </w:rPr>
             </w:pPr>
             <m:oMathPara>
               <m:oMath>
                 <m:r>
                   <m:rPr>
+                    <m:nor/>
+                  </m:rPr>
+                  <w:rPr>
+                    <w:rFonts w:ascii="Cambria Math" w:hAnsi="Cambria Math"/>
+                    <w:bCs/>
+                    <w:sz w:val="16"/>
+                    <w:szCs w:val="16"/>
+                    <w:lang w:val="de-CH"/>
+                  </w:rPr>
+                  <m:t>LRCLK</m:t>
+                </m:r>
+                <m:r>
+                  <w:rPr>
+                    <w:rFonts w:ascii="Cambria Math" w:hAnsi="Cambria Math"/>
+                    <w:sz w:val="16"/>
+                    <w:szCs w:val="16"/>
+                    <w:lang w:val="de-CH"/>
+                  </w:rPr>
+                  <m:t>×</m:t>
+                </m:r>
+                <m:r>
+                  <w:rPr>
+                    <w:rFonts w:ascii="Cambria Math" w:hAnsi="Cambria Math"/>
+                    <w:sz w:val="16"/>
+                    <w:szCs w:val="16"/>
+                  </w:rPr>
+                  <m:t>64</m:t>
+                </m:r>
+                <m:r>
+                  <w:rPr>
+                    <w:rFonts w:ascii="Cambria Math" w:hAnsi="Cambria Math"/>
+                    <w:sz w:val="16"/>
+                    <w:szCs w:val="16"/>
+                    <w:lang w:val="de-CH"/>
+                  </w:rPr>
+                  <m:t>=</m:t>
+                </m:r>
+                <m:r>
+                  <m:rPr>
                     <m:sty m:val="bi"/>
                   </m:rPr>
                   <w:rPr>
@@ -9431,7 +10340,7 @@
                     <w:sz w:val="16"/>
                     <w:szCs w:val="16"/>
                   </w:rPr>
-                  <m:t>&lt;100</m:t>
+                  <m:t>256</m:t>
                 </m:r>
                 <m:r>
                   <m:rPr>
@@ -9442,8 +10351,68 @@
                     <w:b/>
                     <w:sz w:val="16"/>
                     <w:szCs w:val="16"/>
+                    <w:lang w:val="de-CH"/>
                   </w:rPr>
                   <m:t>kHz</m:t>
+                </m:r>
+                <m:r>
+                  <m:rPr>
+                    <m:sty m:val="bi"/>
+                  </m:rPr>
+                  <w:rPr>
+                    <w:rFonts w:ascii="Cambria Math" w:hAnsi="Cambria Math"/>
+                    <w:sz w:val="16"/>
+                    <w:szCs w:val="16"/>
+                    <w:lang w:val="de-CH"/>
+                  </w:rPr>
+                  <m:t>…</m:t>
+                </m:r>
+                <m:r>
+                  <m:rPr>
+                    <m:sty m:val="bi"/>
+                  </m:rPr>
+                  <w:rPr>
+                    <w:rFonts w:ascii="Cambria Math" w:hAnsi="Cambria Math"/>
+                    <w:sz w:val="16"/>
+                    <w:szCs w:val="16"/>
+                  </w:rPr>
+                  <m:t>3</m:t>
+                </m:r>
+                <m:r>
+                  <m:rPr>
+                    <m:sty m:val="bi"/>
+                  </m:rPr>
+                  <w:rPr>
+                    <w:rFonts w:ascii="Cambria Math" w:hAnsi="Cambria Math"/>
+                    <w:sz w:val="16"/>
+                    <w:szCs w:val="16"/>
+                    <w:lang w:val="de-CH"/>
+                  </w:rPr>
+                  <m:t>.</m:t>
+                </m:r>
+                <m:r>
+                  <m:rPr>
+                    <m:sty m:val="bi"/>
+                  </m:rPr>
+                  <w:rPr>
+                    <w:rFonts w:ascii="Cambria Math" w:hAnsi="Cambria Math"/>
+                    <w:sz w:val="16"/>
+                    <w:szCs w:val="16"/>
+                  </w:rPr>
+                  <m:t>2</m:t>
+                </m:r>
+                <m:r>
+                  <m:rPr>
+                    <m:nor/>
+                  </m:rPr>
+                  <w:rPr>
+                    <w:rFonts w:ascii="Cambria Math" w:hAnsi="Cambria Math"/>
+                    <w:b/>
+                    <w:sz w:val="16"/>
+                    <w:szCs w:val="16"/>
+                    <w:lang w:val="de-CH"/>
+                  </w:rPr>
+                  <m:t>MHz</m:t>
                 </m:r>
               </m:oMath>
             </m:oMathPara>
@@ -9464,8 +10433,38 @@
                 <w:b/>
                 <w:sz w:val="16"/>
                 <w:szCs w:val="16"/>
-              </w:rPr>
-            </w:pPr>
+                <w:lang w:val="de-CH"/>
+              </w:rPr>
+            </w:pPr>
+            <m:oMathPara>
+              <m:oMath>
+                <m:r>
+                  <m:rPr>
+                    <m:sty m:val="bi"/>
+                  </m:rPr>
+                  <w:rPr>
+                    <w:rFonts w:ascii="Cambria Math" w:hAnsi="Cambria Math"/>
+                    <w:sz w:val="16"/>
+                    <w:szCs w:val="16"/>
+                    <w:lang w:val="de-CH"/>
+                  </w:rPr>
+                  <m:t>3.07</m:t>
+                </m:r>
+                <m:r>
+                  <m:rPr>
+                    <m:nor/>
+                  </m:rPr>
+                  <w:rPr>
+                    <w:rFonts w:ascii="Cambria Math" w:hAnsi="Cambria Math"/>
+                    <w:b/>
+                    <w:sz w:val="16"/>
+                    <w:szCs w:val="16"/>
+                    <w:lang w:val="de-CH"/>
+                  </w:rPr>
+                  <m:t>MHz</m:t>
+                </m:r>
+              </m:oMath>
+            </m:oMathPara>
           </w:p>
         </w:tc>
         <w:tc>
@@ -9483,8 +10482,25 @@
                 <w:b/>
                 <w:sz w:val="16"/>
                 <w:szCs w:val="16"/>
-              </w:rPr>
-            </w:pPr>
+                <w:lang w:val="de-CH"/>
+              </w:rPr>
+            </w:pPr>
+            <w:r>
+              <w:rPr>
+                <w:bCs/>
+                <w:sz w:val="16"/>
+                <w:szCs w:val="16"/>
+              </w:rPr>
+              <w:t>In range →</w:t>
+            </w:r>
+            <w:r>
+              <w:rPr>
+                <w:b/>
+                <w:sz w:val="16"/>
+                <w:szCs w:val="16"/>
+              </w:rPr>
+              <w:t xml:space="preserve"> passed</w:t>
+            </w:r>
           </w:p>
         </w:tc>
         <w:tc>
@@ -9502,6 +10518,7 @@
                 <w:b/>
                 <w:sz w:val="16"/>
                 <w:szCs w:val="16"/>
+                <w:lang w:val="de-CH"/>
               </w:rPr>
             </w:pPr>
           </w:p>
@@ -9537,7 +10554,7 @@
         </w:tc>
         <w:tc>
           <w:tcPr>
-            <w:tcW w:w="0" w:type="auto"/>
+            <w:tcW w:w="2183" w:type="dxa"/>
             <w:tcBorders>
               <w:bottom w:val="single" w:sz="12" w:space="0" w:color="auto"/>
             </w:tcBorders>
@@ -9615,6 +10632,22 @@
                 <w:szCs w:val="16"/>
               </w:rPr>
             </w:pPr>
+            <m:oMathPara>
+              <m:oMath>
+                <m:r>
+                  <m:rPr>
+                    <m:nor/>
+                  </m:rPr>
+                  <w:rPr>
+                    <w:rFonts w:ascii="Cambria Math" w:hAnsi="Cambria Math"/>
+                    <w:b/>
+                    <w:sz w:val="16"/>
+                    <w:szCs w:val="16"/>
+                  </w:rPr>
+                  <m:t>Yes</m:t>
+                </m:r>
+              </m:oMath>
+            </m:oMathPara>
           </w:p>
         </w:tc>
         <w:tc>
@@ -9634,6 +10667,30 @@
                 <w:szCs w:val="16"/>
               </w:rPr>
             </w:pPr>
+            <w:r>
+              <w:rPr>
+                <w:bCs/>
+                <w:sz w:val="16"/>
+                <w:szCs w:val="16"/>
+              </w:rPr>
+              <w:t>As expected →</w:t>
+            </w:r>
+            <w:r>
+              <w:rPr>
+                <w:b/>
+                <w:sz w:val="16"/>
+                <w:szCs w:val="16"/>
+              </w:rPr>
+              <w:t xml:space="preserve"> p</w:t>
+            </w:r>
+            <w:r>
+              <w:rPr>
+                <w:b/>
+                <w:sz w:val="16"/>
+                <w:szCs w:val="16"/>
+              </w:rPr>
+              <w:t>assed</w:t>
+            </w:r>
           </w:p>
         </w:tc>
         <w:tc>
@@ -9686,7 +10743,7 @@
         </w:tc>
         <w:tc>
           <w:tcPr>
-            <w:tcW w:w="0" w:type="auto"/>
+            <w:tcW w:w="2183" w:type="dxa"/>
             <w:tcBorders>
               <w:top w:val="single" w:sz="12" w:space="0" w:color="auto"/>
             </w:tcBorders>
@@ -9739,16 +10796,95 @@
               <m:oMath>
                 <m:r>
                   <m:rPr>
+                    <m:nor/>
+                  </m:rPr>
+                  <w:rPr>
+                    <w:rFonts w:ascii="Cambria Math" w:hAnsi="Cambria Math"/>
+                    <w:bCs/>
+                    <w:sz w:val="16"/>
+                    <w:szCs w:val="16"/>
+                  </w:rPr>
+                  <m:t>No attenuation @</m:t>
+                </m:r>
+                <m:r>
+                  <w:rPr>
+                    <w:rFonts w:ascii="Cambria Math" w:hAnsi="Cambria Math"/>
+                    <w:sz w:val="16"/>
+                    <w:szCs w:val="16"/>
+                  </w:rPr>
+                  <m:t xml:space="preserve"> 1</m:t>
+                </m:r>
+                <m:r>
+                  <m:rPr>
+                    <m:nor/>
+                  </m:rPr>
+                  <w:rPr>
+                    <w:rFonts w:ascii="Cambria Math" w:hAnsi="Cambria Math"/>
+                    <w:bCs/>
+                    <w:sz w:val="16"/>
+                    <w:szCs w:val="16"/>
+                  </w:rPr>
+                  <m:t>kHz</m:t>
+                </m:r>
+                <m:r>
+                  <w:rPr>
+                    <w:rFonts w:ascii="Cambria Math" w:hAnsi="Cambria Math"/>
+                    <w:sz w:val="16"/>
+                    <w:szCs w:val="16"/>
+                  </w:rPr>
+                  <m:t>→</m:t>
+                </m:r>
+                <m:r>
+                  <m:rPr>
                     <m:sty m:val="bi"/>
                   </m:rPr>
                   <w:rPr>
                     <w:rFonts w:ascii="Cambria Math" w:hAnsi="Cambria Math"/>
                     <w:sz w:val="16"/>
                     <w:szCs w:val="16"/>
-                    <w:highlight w:val="yellow"/>
-                  </w:rPr>
-                  <m:t>…</m:t>
-                </m:r>
+                  </w:rPr>
+                  <m:t>500</m:t>
+                </m:r>
+                <m:sSub>
+                  <m:sSubPr>
+                    <m:ctrlPr>
+                      <w:rPr>
+                        <w:rFonts w:ascii="Cambria Math" w:hAnsi="Cambria Math"/>
+                        <w:b/>
+                        <w:sz w:val="16"/>
+                        <w:szCs w:val="16"/>
+                      </w:rPr>
+                    </m:ctrlPr>
+                  </m:sSubPr>
+                  <m:e>
+                    <m:r>
+                      <m:rPr>
+                        <m:nor/>
+                      </m:rPr>
+                      <w:rPr>
+                        <w:rFonts w:ascii="Cambria Math" w:hAnsi="Cambria Math"/>
+                        <w:b/>
+                        <w:sz w:val="16"/>
+                        <w:szCs w:val="16"/>
+                      </w:rPr>
+                      <m:t>mV</m:t>
+                    </m:r>
+                  </m:e>
+                  <m:sub>
+                    <m:r>
+                      <m:rPr>
+                        <m:nor/>
+                      </m:rPr>
+                      <w:rPr>
+                        <w:rFonts w:ascii="Cambria Math" w:hAnsi="Cambria Math"/>
+                        <w:b/>
+                        <w:sz w:val="16"/>
+                        <w:szCs w:val="16"/>
+                      </w:rPr>
+                      <m:t>PP</m:t>
+                    </m:r>
+                  </m:sub>
+                </m:sSub>
               </m:oMath>
             </m:oMathPara>
           </w:p>
@@ -9770,6 +10906,61 @@
                 <w:szCs w:val="16"/>
               </w:rPr>
             </w:pPr>
+            <m:oMathPara>
+              <m:oMath>
+                <m:r>
+                  <m:rPr>
+                    <m:sty m:val="bi"/>
+                  </m:rPr>
+                  <w:rPr>
+                    <w:rFonts w:ascii="Cambria Math" w:hAnsi="Cambria Math"/>
+                    <w:sz w:val="16"/>
+                    <w:szCs w:val="16"/>
+                  </w:rPr>
+                  <m:t>533</m:t>
+                </m:r>
+                <m:sSub>
+                  <m:sSubPr>
+                    <m:ctrlPr>
+                      <w:rPr>
+                        <w:rFonts w:ascii="Cambria Math" w:hAnsi="Cambria Math"/>
+                        <w:b/>
+                        <w:sz w:val="16"/>
+                        <w:szCs w:val="16"/>
+                      </w:rPr>
+                    </m:ctrlPr>
+                  </m:sSubPr>
+                  <m:e>
+                    <m:r>
+                      <m:rPr>
+                        <m:nor/>
+                      </m:rPr>
+                      <w:rPr>
+                        <w:rFonts w:ascii="Cambria Math" w:hAnsi="Cambria Math"/>
+                        <w:b/>
+                        <w:sz w:val="16"/>
+                        <w:szCs w:val="16"/>
+                      </w:rPr>
+                      <m:t>mV</m:t>
+                    </m:r>
+                  </m:e>
+                  <m:sub>
+                    <m:r>
+                      <m:rPr>
+                        <m:nor/>
+                      </m:rPr>
+                      <w:rPr>
+                        <w:rFonts w:ascii="Cambria Math" w:hAnsi="Cambria Math"/>
+                        <w:b/>
+                        <w:sz w:val="16"/>
+                        <w:szCs w:val="16"/>
+                      </w:rPr>
+                      <m:t>PP</m:t>
+                    </m:r>
+                  </m:sub>
+                </m:sSub>
+              </m:oMath>
+            </m:oMathPara>
           </w:p>
         </w:tc>
         <w:tc>
@@ -9789,11 +10980,35 @@
                 <w:szCs w:val="16"/>
               </w:rPr>
             </w:pPr>
-          </w:p>
-        </w:tc>
-        <w:tc>
-          <w:tcPr>
-            <w:tcW w:w="0" w:type="auto"/>
+            <w:r>
+              <w:rPr>
+                <w:bCs/>
+                <w:sz w:val="16"/>
+                <w:szCs w:val="16"/>
+              </w:rPr>
+              <w:t>Acceptable with tolerance</w:t>
+            </w:r>
+            <w:r>
+              <w:rPr>
+                <w:bCs/>
+                <w:sz w:val="16"/>
+                <w:szCs w:val="16"/>
+              </w:rPr>
+              <w:t xml:space="preserve"> →</w:t>
+            </w:r>
+            <w:r>
+              <w:rPr>
+                <w:b/>
+                <w:sz w:val="16"/>
+                <w:szCs w:val="16"/>
+              </w:rPr>
+              <w:t xml:space="preserve"> passed</w:t>
+            </w:r>
+          </w:p>
+        </w:tc>
+        <w:tc>
+          <w:tcPr>
+            <w:tcW w:w="1835" w:type="dxa"/>
             <w:tcBorders>
               <w:top w:val="single" w:sz="12" w:space="0" w:color="auto"/>
             </w:tcBorders>
@@ -9803,7 +11018,7 @@
               <w:spacing w:before="0"/>
               <w:jc w:val="left"/>
               <w:rPr>
-                <w:b/>
+                <w:bCs/>
                 <w:sz w:val="16"/>
                 <w:szCs w:val="16"/>
               </w:rPr>
@@ -9838,7 +11053,7 @@
         </w:tc>
         <w:tc>
           <w:tcPr>
-            <w:tcW w:w="0" w:type="auto"/>
+            <w:tcW w:w="2183" w:type="dxa"/>
           </w:tcPr>
           <w:p>
             <w:pPr>
@@ -9885,16 +11100,74 @@
               <m:oMath>
                 <m:r>
                   <m:rPr>
+                    <m:nor/>
+                  </m:rPr>
+                  <w:rPr>
+                    <w:rFonts w:ascii="Cambria Math" w:hAnsi="Cambria Math"/>
+                    <w:sz w:val="16"/>
+                    <w:szCs w:val="16"/>
+                  </w:rPr>
+                  <m:t>Amplification  factor</m:t>
+                </m:r>
+                <m:r>
+                  <w:rPr>
+                    <w:rFonts w:ascii="Cambria Math" w:hAnsi="Cambria Math"/>
+                    <w:sz w:val="16"/>
+                    <w:szCs w:val="16"/>
+                  </w:rPr>
+                  <m:t>=5→</m:t>
+                </m:r>
+                <m:r>
+                  <m:rPr>
                     <m:sty m:val="bi"/>
                   </m:rPr>
                   <w:rPr>
                     <w:rFonts w:ascii="Cambria Math" w:hAnsi="Cambria Math"/>
                     <w:sz w:val="16"/>
                     <w:szCs w:val="16"/>
-                    <w:highlight w:val="yellow"/>
-                  </w:rPr>
-                  <m:t>…</m:t>
-                </m:r>
+                  </w:rPr>
+                  <m:t>2.5</m:t>
+                </m:r>
+                <m:sSub>
+                  <m:sSubPr>
+                    <m:ctrlPr>
+                      <w:rPr>
+                        <w:rFonts w:ascii="Cambria Math" w:hAnsi="Cambria Math"/>
+                        <w:b/>
+                        <w:sz w:val="16"/>
+                        <w:szCs w:val="16"/>
+                      </w:rPr>
+                    </m:ctrlPr>
+                  </m:sSubPr>
+                  <m:e>
+                    <m:r>
+                      <m:rPr>
+                        <m:nor/>
+                      </m:rPr>
+                      <w:rPr>
+                        <w:rFonts w:ascii="Cambria Math" w:hAnsi="Cambria Math"/>
+                        <w:b/>
+                        <w:sz w:val="16"/>
+                        <w:szCs w:val="16"/>
+                      </w:rPr>
+                      <m:t>V</m:t>
+                    </m:r>
+                  </m:e>
+                  <m:sub>
+                    <m:r>
+                      <m:rPr>
+                        <m:nor/>
+                      </m:rPr>
+                      <w:rPr>
+                        <w:rFonts w:ascii="Cambria Math" w:hAnsi="Cambria Math"/>
+                        <w:b/>
+                        <w:sz w:val="16"/>
+                        <w:szCs w:val="16"/>
+                      </w:rPr>
+                      <m:t>PP</m:t>
+                    </m:r>
+                  </m:sub>
+                </m:sSub>
               </m:oMath>
             </m:oMathPara>
           </w:p>
@@ -9913,27 +11186,106 @@
                 <w:szCs w:val="16"/>
               </w:rPr>
             </w:pPr>
-          </w:p>
-        </w:tc>
-        <w:tc>
-          <w:tcPr>
-            <w:tcW w:w="0" w:type="auto"/>
-          </w:tcPr>
-          <w:p>
-            <w:pPr>
-              <w:spacing w:before="0"/>
-              <w:jc w:val="left"/>
-              <w:rPr>
-                <w:b/>
-                <w:sz w:val="16"/>
-                <w:szCs w:val="16"/>
-              </w:rPr>
-            </w:pPr>
-          </w:p>
-        </w:tc>
-        <w:tc>
-          <w:tcPr>
-            <w:tcW w:w="0" w:type="auto"/>
+            <m:oMathPara>
+              <m:oMath>
+                <m:r>
+                  <m:rPr>
+                    <m:sty m:val="bi"/>
+                  </m:rPr>
+                  <w:rPr>
+                    <w:rFonts w:ascii="Cambria Math" w:hAnsi="Cambria Math"/>
+                    <w:sz w:val="16"/>
+                    <w:szCs w:val="16"/>
+                  </w:rPr>
+                  <m:t>2.62</m:t>
+                </m:r>
+                <m:sSub>
+                  <m:sSubPr>
+                    <m:ctrlPr>
+                      <w:rPr>
+                        <w:rFonts w:ascii="Cambria Math" w:hAnsi="Cambria Math"/>
+                        <w:b/>
+                        <w:sz w:val="16"/>
+                        <w:szCs w:val="16"/>
+                      </w:rPr>
+                    </m:ctrlPr>
+                  </m:sSubPr>
+                  <m:e>
+                    <m:r>
+                      <m:rPr>
+                        <m:nor/>
+                      </m:rPr>
+                      <w:rPr>
+                        <w:rFonts w:ascii="Cambria Math" w:hAnsi="Cambria Math"/>
+                        <w:b/>
+                        <w:sz w:val="16"/>
+                        <w:szCs w:val="16"/>
+                      </w:rPr>
+                      <m:t>V</m:t>
+                    </m:r>
+                  </m:e>
+                  <m:sub>
+                    <m:r>
+                      <m:rPr>
+                        <m:nor/>
+                      </m:rPr>
+                      <w:rPr>
+                        <w:rFonts w:ascii="Cambria Math" w:hAnsi="Cambria Math"/>
+                        <w:b/>
+                        <w:sz w:val="16"/>
+                        <w:szCs w:val="16"/>
+                      </w:rPr>
+                      <m:t>PP</m:t>
+                    </m:r>
+                  </m:sub>
+                </m:sSub>
+              </m:oMath>
+            </m:oMathPara>
+          </w:p>
+        </w:tc>
+        <w:tc>
+          <w:tcPr>
+            <w:tcW w:w="0" w:type="auto"/>
+          </w:tcPr>
+          <w:p>
+            <w:pPr>
+              <w:spacing w:before="0"/>
+              <w:jc w:val="left"/>
+              <w:rPr>
+                <w:b/>
+                <w:sz w:val="16"/>
+                <w:szCs w:val="16"/>
+              </w:rPr>
+            </w:pPr>
+            <w:r>
+              <w:rPr>
+                <w:bCs/>
+                <w:sz w:val="16"/>
+                <w:szCs w:val="16"/>
+              </w:rPr>
+              <w:t>Acceptable with tolerance</w:t>
+            </w:r>
+            <w:r>
+              <w:rPr>
+                <w:bCs/>
+                <w:sz w:val="16"/>
+                <w:szCs w:val="16"/>
+              </w:rPr>
+              <w:t xml:space="preserve"> →</w:t>
+            </w:r>
+            <w:r>
+              <w:rPr>
+                <w:b/>
+                <w:sz w:val="16"/>
+                <w:szCs w:val="16"/>
+              </w:rPr>
+              <w:t xml:space="preserve"> passed</w:t>
+            </w:r>
+          </w:p>
+        </w:tc>
+        <w:tc>
+          <w:tcPr>
+            <w:tcW w:w="1835" w:type="dxa"/>
           </w:tcPr>
           <w:p>
             <w:pPr>
@@ -9975,7 +11327,7 @@
         </w:tc>
         <w:tc>
           <w:tcPr>
-            <w:tcW w:w="0" w:type="auto"/>
+            <w:tcW w:w="2183" w:type="dxa"/>
           </w:tcPr>
           <w:p>
             <w:pPr>
@@ -10022,16 +11374,95 @@
               <m:oMath>
                 <m:r>
                   <m:rPr>
+                    <m:nor/>
+                  </m:rPr>
+                  <w:rPr>
+                    <w:rFonts w:ascii="Cambria Math" w:hAnsi="Cambria Math"/>
+                    <w:bCs/>
+                    <w:sz w:val="16"/>
+                    <w:szCs w:val="16"/>
+                  </w:rPr>
+                  <m:t>No attenuation @</m:t>
+                </m:r>
+                <m:r>
+                  <w:rPr>
+                    <w:rFonts w:ascii="Cambria Math" w:hAnsi="Cambria Math"/>
+                    <w:sz w:val="16"/>
+                    <w:szCs w:val="16"/>
+                  </w:rPr>
+                  <m:t xml:space="preserve"> 1</m:t>
+                </m:r>
+                <m:r>
+                  <m:rPr>
+                    <m:nor/>
+                  </m:rPr>
+                  <w:rPr>
+                    <w:rFonts w:ascii="Cambria Math" w:hAnsi="Cambria Math"/>
+                    <w:bCs/>
+                    <w:sz w:val="16"/>
+                    <w:szCs w:val="16"/>
+                  </w:rPr>
+                  <m:t>kHz</m:t>
+                </m:r>
+                <m:r>
+                  <w:rPr>
+                    <w:rFonts w:ascii="Cambria Math" w:hAnsi="Cambria Math"/>
+                    <w:sz w:val="16"/>
+                    <w:szCs w:val="16"/>
+                  </w:rPr>
+                  <m:t>→</m:t>
+                </m:r>
+                <m:r>
+                  <m:rPr>
                     <m:sty m:val="bi"/>
                   </m:rPr>
                   <w:rPr>
                     <w:rFonts w:ascii="Cambria Math" w:hAnsi="Cambria Math"/>
                     <w:sz w:val="16"/>
                     <w:szCs w:val="16"/>
-                    <w:highlight w:val="yellow"/>
-                  </w:rPr>
-                  <m:t>…</m:t>
-                </m:r>
+                  </w:rPr>
+                  <m:t>500</m:t>
+                </m:r>
+                <m:sSub>
+                  <m:sSubPr>
+                    <m:ctrlPr>
+                      <w:rPr>
+                        <w:rFonts w:ascii="Cambria Math" w:hAnsi="Cambria Math"/>
+                        <w:b/>
+                        <w:sz w:val="16"/>
+                        <w:szCs w:val="16"/>
+                      </w:rPr>
+                    </m:ctrlPr>
+                  </m:sSubPr>
+                  <m:e>
+                    <m:r>
+                      <m:rPr>
+                        <m:nor/>
+                      </m:rPr>
+                      <w:rPr>
+                        <w:rFonts w:ascii="Cambria Math" w:hAnsi="Cambria Math"/>
+                        <w:b/>
+                        <w:sz w:val="16"/>
+                        <w:szCs w:val="16"/>
+                      </w:rPr>
+                      <m:t>mV</m:t>
+                    </m:r>
+                  </m:e>
+                  <m:sub>
+                    <m:r>
+                      <m:rPr>
+                        <m:nor/>
+                      </m:rPr>
+                      <w:rPr>
+                        <w:rFonts w:ascii="Cambria Math" w:hAnsi="Cambria Math"/>
+                        <w:b/>
+                        <w:sz w:val="16"/>
+                        <w:szCs w:val="16"/>
+                      </w:rPr>
+                      <m:t>PP</m:t>
+                    </m:r>
+                  </m:sub>
+                </m:sSub>
               </m:oMath>
             </m:oMathPara>
           </w:p>
@@ -10050,27 +11481,106 @@
                 <w:szCs w:val="16"/>
               </w:rPr>
             </w:pPr>
-          </w:p>
-        </w:tc>
-        <w:tc>
-          <w:tcPr>
-            <w:tcW w:w="0" w:type="auto"/>
-          </w:tcPr>
-          <w:p>
-            <w:pPr>
-              <w:spacing w:before="0"/>
-              <w:jc w:val="left"/>
-              <w:rPr>
-                <w:b/>
-                <w:sz w:val="16"/>
-                <w:szCs w:val="16"/>
-              </w:rPr>
-            </w:pPr>
-          </w:p>
-        </w:tc>
-        <w:tc>
-          <w:tcPr>
-            <w:tcW w:w="0" w:type="auto"/>
+            <m:oMathPara>
+              <m:oMath>
+                <m:r>
+                  <m:rPr>
+                    <m:sty m:val="bi"/>
+                  </m:rPr>
+                  <w:rPr>
+                    <w:rFonts w:ascii="Cambria Math" w:hAnsi="Cambria Math"/>
+                    <w:sz w:val="16"/>
+                    <w:szCs w:val="16"/>
+                  </w:rPr>
+                  <m:t>536</m:t>
+                </m:r>
+                <m:sSub>
+                  <m:sSubPr>
+                    <m:ctrlPr>
+                      <w:rPr>
+                        <w:rFonts w:ascii="Cambria Math" w:hAnsi="Cambria Math"/>
+                        <w:b/>
+                        <w:sz w:val="16"/>
+                        <w:szCs w:val="16"/>
+                      </w:rPr>
+                    </m:ctrlPr>
+                  </m:sSubPr>
+                  <m:e>
+                    <m:r>
+                      <m:rPr>
+                        <m:nor/>
+                      </m:rPr>
+                      <w:rPr>
+                        <w:rFonts w:ascii="Cambria Math" w:hAnsi="Cambria Math"/>
+                        <w:b/>
+                        <w:sz w:val="16"/>
+                        <w:szCs w:val="16"/>
+                      </w:rPr>
+                      <m:t>mV</m:t>
+                    </m:r>
+                  </m:e>
+                  <m:sub>
+                    <m:r>
+                      <m:rPr>
+                        <m:nor/>
+                      </m:rPr>
+                      <w:rPr>
+                        <w:rFonts w:ascii="Cambria Math" w:hAnsi="Cambria Math"/>
+                        <w:b/>
+                        <w:sz w:val="16"/>
+                        <w:szCs w:val="16"/>
+                      </w:rPr>
+                      <m:t>PP</m:t>
+                    </m:r>
+                  </m:sub>
+                </m:sSub>
+              </m:oMath>
+            </m:oMathPara>
+          </w:p>
+        </w:tc>
+        <w:tc>
+          <w:tcPr>
+            <w:tcW w:w="0" w:type="auto"/>
+          </w:tcPr>
+          <w:p>
+            <w:pPr>
+              <w:spacing w:before="0"/>
+              <w:jc w:val="left"/>
+              <w:rPr>
+                <w:b/>
+                <w:sz w:val="16"/>
+                <w:szCs w:val="16"/>
+              </w:rPr>
+            </w:pPr>
+            <w:r>
+              <w:rPr>
+                <w:bCs/>
+                <w:sz w:val="16"/>
+                <w:szCs w:val="16"/>
+              </w:rPr>
+              <w:t>Acceptable with tolerance</w:t>
+            </w:r>
+            <w:r>
+              <w:rPr>
+                <w:bCs/>
+                <w:sz w:val="16"/>
+                <w:szCs w:val="16"/>
+              </w:rPr>
+              <w:t xml:space="preserve"> →</w:t>
+            </w:r>
+            <w:r>
+              <w:rPr>
+                <w:b/>
+                <w:sz w:val="16"/>
+                <w:szCs w:val="16"/>
+              </w:rPr>
+              <w:t xml:space="preserve"> passed</w:t>
+            </w:r>
+          </w:p>
+        </w:tc>
+        <w:tc>
+          <w:tcPr>
+            <w:tcW w:w="1835" w:type="dxa"/>
           </w:tcPr>
           <w:p>
             <w:pPr>
@@ -10089,6 +11599,9 @@
         <w:tc>
           <w:tcPr>
             <w:tcW w:w="0" w:type="auto"/>
+            <w:tcBorders>
+              <w:bottom w:val="single" w:sz="12" w:space="0" w:color="auto"/>
+            </w:tcBorders>
           </w:tcPr>
           <w:p>
             <w:pPr>
@@ -10112,7 +11625,10 @@
         </w:tc>
         <w:tc>
           <w:tcPr>
-            <w:tcW w:w="0" w:type="auto"/>
+            <w:tcW w:w="2183" w:type="dxa"/>
+            <w:tcBorders>
+              <w:bottom w:val="single" w:sz="12" w:space="0" w:color="auto"/>
+            </w:tcBorders>
           </w:tcPr>
           <w:p>
             <w:pPr>
@@ -10143,6 +11659,9 @@
         <w:tc>
           <w:tcPr>
             <w:tcW w:w="0" w:type="auto"/>
+            <w:tcBorders>
+              <w:bottom w:val="single" w:sz="12" w:space="0" w:color="auto"/>
+            </w:tcBorders>
             <w:noWrap/>
           </w:tcPr>
           <w:p>
@@ -10159,16 +11678,74 @@
               <m:oMath>
                 <m:r>
                   <m:rPr>
+                    <m:nor/>
+                  </m:rPr>
+                  <w:rPr>
+                    <w:rFonts w:ascii="Cambria Math" w:hAnsi="Cambria Math"/>
+                    <w:sz w:val="16"/>
+                    <w:szCs w:val="16"/>
+                  </w:rPr>
+                  <m:t>Amplification  factor</m:t>
+                </m:r>
+                <m:r>
+                  <w:rPr>
+                    <w:rFonts w:ascii="Cambria Math" w:hAnsi="Cambria Math"/>
+                    <w:sz w:val="16"/>
+                    <w:szCs w:val="16"/>
+                  </w:rPr>
+                  <m:t>=5→</m:t>
+                </m:r>
+                <m:r>
+                  <m:rPr>
                     <m:sty m:val="bi"/>
                   </m:rPr>
                   <w:rPr>
                     <w:rFonts w:ascii="Cambria Math" w:hAnsi="Cambria Math"/>
                     <w:sz w:val="16"/>
                     <w:szCs w:val="16"/>
-                    <w:highlight w:val="yellow"/>
-                  </w:rPr>
-                  <m:t>…</m:t>
-                </m:r>
+                  </w:rPr>
+                  <m:t>2.5</m:t>
+                </m:r>
+                <m:sSub>
+                  <m:sSubPr>
+                    <m:ctrlPr>
+                      <w:rPr>
+                        <w:rFonts w:ascii="Cambria Math" w:hAnsi="Cambria Math"/>
+                        <w:b/>
+                        <w:sz w:val="16"/>
+                        <w:szCs w:val="16"/>
+                      </w:rPr>
+                    </m:ctrlPr>
+                  </m:sSubPr>
+                  <m:e>
+                    <m:r>
+                      <m:rPr>
+                        <m:nor/>
+                      </m:rPr>
+                      <w:rPr>
+                        <w:rFonts w:ascii="Cambria Math" w:hAnsi="Cambria Math"/>
+                        <w:b/>
+                        <w:sz w:val="16"/>
+                        <w:szCs w:val="16"/>
+                      </w:rPr>
+                      <m:t>V</m:t>
+                    </m:r>
+                  </m:e>
+                  <m:sub>
+                    <m:r>
+                      <m:rPr>
+                        <m:nor/>
+                      </m:rPr>
+                      <w:rPr>
+                        <w:rFonts w:ascii="Cambria Math" w:hAnsi="Cambria Math"/>
+                        <w:b/>
+                        <w:sz w:val="16"/>
+                        <w:szCs w:val="16"/>
+                      </w:rPr>
+                      <m:t>PP</m:t>
+                    </m:r>
+                  </m:sub>
+                </m:sSub>
               </m:oMath>
             </m:oMathPara>
           </w:p>
@@ -10176,45 +11753,331 @@
         <w:tc>
           <w:tcPr>
             <w:tcW w:w="0" w:type="auto"/>
-          </w:tcPr>
-          <w:p>
-            <w:pPr>
-              <w:spacing w:before="0"/>
-              <w:jc w:val="left"/>
-              <w:rPr>
-                <w:b/>
-                <w:sz w:val="16"/>
-                <w:szCs w:val="16"/>
-              </w:rPr>
-            </w:pPr>
-          </w:p>
-        </w:tc>
-        <w:tc>
-          <w:tcPr>
-            <w:tcW w:w="0" w:type="auto"/>
-          </w:tcPr>
-          <w:p>
-            <w:pPr>
-              <w:spacing w:before="0"/>
-              <w:jc w:val="left"/>
-              <w:rPr>
-                <w:b/>
-                <w:sz w:val="16"/>
-                <w:szCs w:val="16"/>
-              </w:rPr>
-            </w:pPr>
-          </w:p>
-        </w:tc>
-        <w:tc>
-          <w:tcPr>
-            <w:tcW w:w="0" w:type="auto"/>
-          </w:tcPr>
-          <w:p>
-            <w:pPr>
-              <w:spacing w:before="0"/>
-              <w:jc w:val="left"/>
-              <w:rPr>
-                <w:b/>
+            <w:tcBorders>
+              <w:bottom w:val="single" w:sz="12" w:space="0" w:color="auto"/>
+            </w:tcBorders>
+          </w:tcPr>
+          <w:p>
+            <w:pPr>
+              <w:spacing w:before="0"/>
+              <w:jc w:val="left"/>
+              <w:rPr>
+                <w:b/>
+                <w:sz w:val="16"/>
+                <w:szCs w:val="16"/>
+              </w:rPr>
+            </w:pPr>
+            <m:oMathPara>
+              <m:oMath>
+                <m:r>
+                  <m:rPr>
+                    <m:sty m:val="bi"/>
+                  </m:rPr>
+                  <w:rPr>
+                    <w:rFonts w:ascii="Cambria Math" w:hAnsi="Cambria Math"/>
+                    <w:sz w:val="16"/>
+                    <w:szCs w:val="16"/>
+                  </w:rPr>
+                  <m:t>2.60</m:t>
+                </m:r>
+                <m:sSub>
+                  <m:sSubPr>
+                    <m:ctrlPr>
+                      <w:rPr>
+                        <w:rFonts w:ascii="Cambria Math" w:hAnsi="Cambria Math"/>
+                        <w:b/>
+                        <w:sz w:val="16"/>
+                        <w:szCs w:val="16"/>
+                      </w:rPr>
+                    </m:ctrlPr>
+                  </m:sSubPr>
+                  <m:e>
+                    <m:r>
+                      <m:rPr>
+                        <m:nor/>
+                      </m:rPr>
+                      <w:rPr>
+                        <w:rFonts w:ascii="Cambria Math" w:hAnsi="Cambria Math"/>
+                        <w:b/>
+                        <w:sz w:val="16"/>
+                        <w:szCs w:val="16"/>
+                      </w:rPr>
+                      <m:t>V</m:t>
+                    </m:r>
+                  </m:e>
+                  <m:sub>
+                    <m:r>
+                      <m:rPr>
+                        <m:nor/>
+                      </m:rPr>
+                      <w:rPr>
+                        <w:rFonts w:ascii="Cambria Math" w:hAnsi="Cambria Math"/>
+                        <w:b/>
+                        <w:sz w:val="16"/>
+                        <w:szCs w:val="16"/>
+                      </w:rPr>
+                      <m:t>PP</m:t>
+                    </m:r>
+                  </m:sub>
+                </m:sSub>
+              </m:oMath>
+            </m:oMathPara>
+          </w:p>
+        </w:tc>
+        <w:tc>
+          <w:tcPr>
+            <w:tcW w:w="0" w:type="auto"/>
+            <w:tcBorders>
+              <w:bottom w:val="single" w:sz="12" w:space="0" w:color="auto"/>
+            </w:tcBorders>
+          </w:tcPr>
+          <w:p>
+            <w:pPr>
+              <w:spacing w:before="0"/>
+              <w:jc w:val="left"/>
+              <w:rPr>
+                <w:b/>
+                <w:sz w:val="16"/>
+                <w:szCs w:val="16"/>
+              </w:rPr>
+            </w:pPr>
+            <w:r>
+              <w:rPr>
+                <w:bCs/>
+                <w:sz w:val="16"/>
+                <w:szCs w:val="16"/>
+              </w:rPr>
+              <w:t>Acceptable with tolerance</w:t>
+            </w:r>
+            <w:r>
+              <w:rPr>
+                <w:bCs/>
+                <w:sz w:val="16"/>
+                <w:szCs w:val="16"/>
+              </w:rPr>
+              <w:t xml:space="preserve"> →</w:t>
+            </w:r>
+            <w:r>
+              <w:rPr>
+                <w:b/>
+                <w:sz w:val="16"/>
+                <w:szCs w:val="16"/>
+              </w:rPr>
+              <w:t xml:space="preserve"> passed</w:t>
+            </w:r>
+          </w:p>
+        </w:tc>
+        <w:tc>
+          <w:tcPr>
+            <w:tcW w:w="1835" w:type="dxa"/>
+            <w:tcBorders>
+              <w:bottom w:val="single" w:sz="12" w:space="0" w:color="auto"/>
+            </w:tcBorders>
+          </w:tcPr>
+          <w:p>
+            <w:pPr>
+              <w:spacing w:before="0"/>
+              <w:jc w:val="left"/>
+              <w:rPr>
+                <w:b/>
+                <w:sz w:val="16"/>
+                <w:szCs w:val="16"/>
+              </w:rPr>
+            </w:pPr>
+          </w:p>
+        </w:tc>
+      </w:tr>
+      <w:tr>
+        <w:tc>
+          <w:tcPr>
+            <w:tcW w:w="0" w:type="auto"/>
+            <w:tcBorders>
+              <w:top w:val="single" w:sz="12" w:space="0" w:color="auto"/>
+            </w:tcBorders>
+          </w:tcPr>
+          <w:p>
+            <w:pPr>
+              <w:spacing w:before="0"/>
+              <w:jc w:val="left"/>
+              <w:rPr>
+                <w:b/>
+                <w:sz w:val="16"/>
+                <w:szCs w:val="16"/>
+              </w:rPr>
+            </w:pPr>
+            <w:r>
+              <w:rPr>
+                <w:b/>
+                <w:sz w:val="16"/>
+                <w:szCs w:val="16"/>
+              </w:rPr>
+              <w:t>Frequency sweep</w:t>
+            </w:r>
+          </w:p>
+        </w:tc>
+        <w:tc>
+          <w:tcPr>
+            <w:tcW w:w="2183" w:type="dxa"/>
+            <w:tcBorders>
+              <w:top w:val="single" w:sz="12" w:space="0" w:color="auto"/>
+            </w:tcBorders>
+          </w:tcPr>
+          <w:p>
+            <w:pPr>
+              <w:spacing w:before="0"/>
+              <w:jc w:val="left"/>
+              <w:rPr>
+                <w:bCs/>
+                <w:sz w:val="16"/>
+                <w:szCs w:val="16"/>
+              </w:rPr>
+            </w:pPr>
+            <w:r>
+              <w:rPr>
+                <w:bCs/>
+                <w:sz w:val="16"/>
+                <w:szCs w:val="16"/>
+              </w:rPr>
+              <w:t xml:space="preserve">Input signal: </w:t>
+            </w:r>
+            <w:r>
+              <w:rPr>
+                <w:sz w:val="16"/>
+              </w:rPr>
+              <w:t>Frequency sweep 400Hz … 20kHz</w:t>
+            </w:r>
+          </w:p>
+        </w:tc>
+        <w:tc>
+          <w:tcPr>
+            <w:tcW w:w="0" w:type="auto"/>
+            <w:tcBorders>
+              <w:top w:val="single" w:sz="12" w:space="0" w:color="auto"/>
+            </w:tcBorders>
+            <w:noWrap/>
+          </w:tcPr>
+          <w:p>
+            <w:pPr>
+              <w:spacing w:before="0"/>
+              <w:jc w:val="center"/>
+              <w:rPr>
+                <w:sz w:val="16"/>
+                <w:szCs w:val="16"/>
+              </w:rPr>
+            </w:pPr>
+            <m:oMathPara>
+              <m:oMath>
+                <m:r>
+                  <m:rPr>
+                    <m:nor/>
+                  </m:rPr>
+                  <w:rPr>
+                    <w:rFonts w:ascii="Cambria Math" w:hAnsi="Cambria Math"/>
+                    <w:b/>
+                    <w:sz w:val="16"/>
+                    <w:szCs w:val="16"/>
+                  </w:rPr>
+                  <m:t xml:space="preserve">No attenuation </m:t>
+                </m:r>
+                <m:r>
+                  <m:rPr>
+                    <m:nor/>
+                  </m:rPr>
+                  <w:rPr>
+                    <w:rFonts w:ascii="Cambria Math" w:hAnsi="Cambria Math"/>
+                    <w:bCs/>
+                    <w:sz w:val="16"/>
+                    <w:szCs w:val="16"/>
+                  </w:rPr>
+                  <m:t>in FFT spectrum</m:t>
+                </m:r>
+              </m:oMath>
+            </m:oMathPara>
+          </w:p>
+        </w:tc>
+        <w:tc>
+          <w:tcPr>
+            <w:tcW w:w="0" w:type="auto"/>
+            <w:tcBorders>
+              <w:top w:val="single" w:sz="12" w:space="0" w:color="auto"/>
+            </w:tcBorders>
+          </w:tcPr>
+          <w:p>
+            <w:pPr>
+              <w:spacing w:before="0"/>
+              <w:jc w:val="left"/>
+              <w:rPr>
+                <w:b/>
+                <w:sz w:val="16"/>
+                <w:szCs w:val="16"/>
+              </w:rPr>
+            </w:pPr>
+            <m:oMathPara>
+              <m:oMath>
+                <m:r>
+                  <m:rPr>
+                    <m:nor/>
+                  </m:rPr>
+                  <w:rPr>
+                    <w:rFonts w:ascii="Cambria Math" w:hAnsi="Cambria Math"/>
+                    <w:b/>
+                    <w:sz w:val="16"/>
+                    <w:szCs w:val="16"/>
+                  </w:rPr>
+                  <m:t>Yes</m:t>
+                </m:r>
+              </m:oMath>
+            </m:oMathPara>
+          </w:p>
+        </w:tc>
+        <w:tc>
+          <w:tcPr>
+            <w:tcW w:w="0" w:type="auto"/>
+            <w:tcBorders>
+              <w:top w:val="single" w:sz="12" w:space="0" w:color="auto"/>
+            </w:tcBorders>
+          </w:tcPr>
+          <w:p>
+            <w:pPr>
+              <w:spacing w:before="0"/>
+              <w:jc w:val="left"/>
+              <w:rPr>
+                <w:b/>
+                <w:sz w:val="16"/>
+                <w:szCs w:val="16"/>
+              </w:rPr>
+            </w:pPr>
+            <w:r>
+              <w:rPr>
+                <w:bCs/>
+                <w:sz w:val="16"/>
+                <w:szCs w:val="16"/>
+              </w:rPr>
+              <w:t>As expected →</w:t>
+            </w:r>
+            <w:r>
+              <w:rPr>
+                <w:b/>
+                <w:sz w:val="16"/>
+                <w:szCs w:val="16"/>
+              </w:rPr>
+              <w:t xml:space="preserve"> passed</w:t>
+            </w:r>
+          </w:p>
+        </w:tc>
+        <w:tc>
+          <w:tcPr>
+            <w:tcW w:w="1835" w:type="dxa"/>
+            <w:tcBorders>
+              <w:top w:val="single" w:sz="12" w:space="0" w:color="auto"/>
+            </w:tcBorders>
+          </w:tcPr>
+          <w:p>
+            <w:pPr>
+              <w:spacing w:before="0"/>
+              <w:jc w:val="left"/>
+              <w:rPr>
+                <w:bCs/>
                 <w:sz w:val="16"/>
                 <w:szCs w:val="16"/>
               </w:rPr>
@@ -10223,15 +12086,232 @@
         </w:tc>
       </w:tr>
     </w:tbl>
-    <w:p/>
     <w:p>
-      <w:r>
+      <w:pPr>
+        <w:spacing w:before="0"/>
+        <w:jc w:val="left"/>
         <w:rPr>
-          <w:highlight w:val="yellow"/>
+          <w:sz w:val="10"/>
+          <w:szCs w:val="12"/>
         </w:rPr>
-        <w:t>**********************************</w:t>
-      </w:r>
+      </w:pPr>
     </w:p>
+    <w:tbl>
+      <w:tblPr>
+        <w:tblStyle w:val="TableGrid"/>
+        <w:tblW w:w="0" w:type="auto"/>
+        <w:tblBorders>
+          <w:top w:val="none" w:sz="0" w:space="0" w:color="auto"/>
+          <w:left w:val="none" w:sz="0" w:space="0" w:color="auto"/>
+          <w:bottom w:val="none" w:sz="0" w:space="0" w:color="auto"/>
+          <w:right w:val="none" w:sz="0" w:space="0" w:color="auto"/>
+          <w:insideH w:val="none" w:sz="0" w:space="0" w:color="auto"/>
+          <w:insideV w:val="none" w:sz="0" w:space="0" w:color="auto"/>
+        </w:tblBorders>
+        <w:tblLook w:val="04A0" w:firstRow="1" w:lastRow="0" w:firstColumn="1" w:lastColumn="0" w:noHBand="0" w:noVBand="1"/>
+      </w:tblPr>
+      <w:tblGrid>
+        <w:gridCol w:w="5597"/>
+        <w:gridCol w:w="7405"/>
+      </w:tblGrid>
+      <w:tr>
+        <w:tc>
+          <w:tcPr>
+            <w:tcW w:w="0" w:type="auto"/>
+          </w:tcPr>
+          <w:p>
+            <w:pPr>
+              <w:spacing w:before="0"/>
+              <w:jc w:val="left"/>
+            </w:pPr>
+            <w:r>
+              <w:t>Information on the conducted tests</w:t>
+            </w:r>
+            <w:r>
+              <w:t>:</w:t>
+            </w:r>
+          </w:p>
+        </w:tc>
+        <w:tc>
+          <w:tcPr>
+            <w:tcW w:w="0" w:type="auto"/>
+          </w:tcPr>
+          <w:p>
+            <w:pPr>
+              <w:spacing w:before="0"/>
+              <w:jc w:val="left"/>
+              <w:rPr>
+                <w:b/>
+                <w:bCs/>
+              </w:rPr>
+            </w:pPr>
+          </w:p>
+        </w:tc>
+      </w:tr>
+      <w:tr>
+        <w:tc>
+          <w:tcPr>
+            <w:tcW w:w="0" w:type="auto"/>
+          </w:tcPr>
+          <w:p>
+            <w:pPr>
+              <w:spacing w:before="0"/>
+              <w:jc w:val="left"/>
+            </w:pPr>
+            <w:r>
+              <w:rPr>
+                <w:b/>
+                <w:bCs/>
+              </w:rPr>
+              <w:t>Date</w:t>
+            </w:r>
+            <w:r>
+              <w:t>: 31.10.2025, 07.11.2025 and 14.11.2025</w:t>
+            </w:r>
+          </w:p>
+        </w:tc>
+        <w:tc>
+          <w:tcPr>
+            <w:tcW w:w="0" w:type="auto"/>
+          </w:tcPr>
+          <w:p>
+            <w:pPr>
+              <w:spacing w:before="0"/>
+              <w:jc w:val="left"/>
+            </w:pPr>
+            <w:r>
+              <w:rPr>
+                <w:b/>
+                <w:bCs/>
+              </w:rPr>
+              <w:t>Location</w:t>
+            </w:r>
+            <w:r>
+              <w:t xml:space="preserve">: ZHAW, </w:t>
+            </w:r>
+            <w:proofErr w:type="spellStart"/>
+            <w:r>
+              <w:t>Technikumstrasse</w:t>
+            </w:r>
+            <w:proofErr w:type="spellEnd"/>
+            <w:r>
+              <w:t xml:space="preserve"> 71, 8400 Winterthur</w:t>
+            </w:r>
+            <w:r>
+              <w:t>, Room TS04.11</w:t>
+            </w:r>
+          </w:p>
+        </w:tc>
+      </w:tr>
+      <w:tr>
+        <w:tc>
+          <w:tcPr>
+            <w:tcW w:w="0" w:type="auto"/>
+          </w:tcPr>
+          <w:p>
+            <w:pPr>
+              <w:spacing w:before="0"/>
+              <w:jc w:val="left"/>
+            </w:pPr>
+            <w:r>
+              <w:rPr>
+                <w:b/>
+                <w:bCs/>
+              </w:rPr>
+              <w:t>Test personnel</w:t>
+            </w:r>
+            <w:r>
+              <w:t xml:space="preserve">: </w:t>
+            </w:r>
+            <w:r>
+              <w:t>Thomas Perri</w:t>
+            </w:r>
+            <w:r>
+              <w:t xml:space="preserve"> and Bogdans Grebnevs</w:t>
+            </w:r>
+          </w:p>
+        </w:tc>
+        <w:tc>
+          <w:tcPr>
+            <w:tcW w:w="0" w:type="auto"/>
+          </w:tcPr>
+          <w:p>
+            <w:pPr>
+              <w:spacing w:before="0"/>
+              <w:jc w:val="left"/>
+            </w:pPr>
+          </w:p>
+        </w:tc>
+      </w:tr>
+      <w:tr>
+        <w:tc>
+          <w:tcPr>
+            <w:tcW w:w="0" w:type="auto"/>
+            <w:gridSpan w:val="2"/>
+          </w:tcPr>
+          <w:p>
+            <w:pPr>
+              <w:spacing w:before="0"/>
+              <w:jc w:val="left"/>
+            </w:pPr>
+            <w:r>
+              <w:rPr>
+                <w:b/>
+                <w:bCs/>
+              </w:rPr>
+              <w:t>Equipment</w:t>
+            </w:r>
+            <w:r>
+              <w:t xml:space="preserve">: </w:t>
+            </w:r>
+            <w:r>
+              <w:t xml:space="preserve">Keysight U3402A digital multimeter, Tektronix TDS 2012C oscilloscope, </w:t>
+            </w:r>
+            <w:proofErr w:type="spellStart"/>
+            <w:r>
+              <w:t>TTi</w:t>
+            </w:r>
+            <w:proofErr w:type="spellEnd"/>
+            <w:r>
+              <w:t xml:space="preserve"> EL302RT</w:t>
+            </w:r>
+            <w:r>
+              <w:t xml:space="preserve"> </w:t>
+            </w:r>
+            <w:r>
+              <w:t>l</w:t>
+            </w:r>
+            <w:r>
+              <w:t>aboratory power supply</w:t>
+            </w:r>
+          </w:p>
+        </w:tc>
+      </w:tr>
+      <w:tr>
+        <w:tc>
+          <w:tcPr>
+            <w:tcW w:w="0" w:type="auto"/>
+            <w:gridSpan w:val="2"/>
+          </w:tcPr>
+          <w:p>
+            <w:pPr>
+              <w:jc w:val="left"/>
+              <w:rPr>
+                <w:i/>
+                <w:iCs/>
+              </w:rPr>
+            </w:pPr>
+            <w:r>
+              <w:rPr>
+                <w:i/>
+                <w:iCs/>
+              </w:rPr>
+              <w:t>For further detailed information see the accompanying Excel table.</w:t>
+            </w:r>
+          </w:p>
+        </w:tc>
+      </w:tr>
+    </w:tbl>
     <w:p>
       <w:pPr>
         <w:sectPr>
@@ -10246,295 +12326,123 @@
       <w:pPr>
         <w:pStyle w:val="Heading1"/>
       </w:pPr>
-      <w:bookmarkStart w:id="4" w:name="_Toc213915670"/>
+      <w:bookmarkStart w:id="4" w:name="_Toc213998208"/>
       <w:r>
         <w:lastRenderedPageBreak/>
-        <w:t>Run</w:t>
-      </w:r>
-      <w:r>
-        <w:t xml:space="preserve"> the T</w:t>
-      </w:r>
-      <w:r>
-        <w:t>est</w:t>
-      </w:r>
-      <w:r>
-        <w:t>s</w:t>
+        <w:t>Test Analysis</w:t>
       </w:r>
       <w:bookmarkEnd w:id="4"/>
     </w:p>
     <w:p>
+      <w:pPr>
+        <w:jc w:val="left"/>
+      </w:pPr>
       <w:r>
-        <w:t>Execute the tests as define</w:t>
-      </w:r>
-      <w:r>
-        <w:t xml:space="preserve">d in the test plan. </w:t>
-      </w:r>
-      <w:r>
-        <w:t>It should therefore always be clear what results you would expect.</w:t>
-      </w:r>
-    </w:p>
-    <w:p>
-      <w:r>
-        <w:t>Write a test protocol while doing the tests. It should include:</w:t>
+        <w:t>During testing, several issues related to missing or incorrect electrical connections were identified and subsequently corrected.</w:t>
       </w:r>
     </w:p>
     <w:p>
       <w:pPr>
-        <w:pStyle w:val="ListParagraph"/>
-        <w:numPr>
-          <w:ilvl w:val="0"/>
-          <w:numId w:val="15"/>
-        </w:numPr>
+        <w:jc w:val="left"/>
       </w:pPr>
       <w:r>
-        <w:t xml:space="preserve">All information about the conditions and results of the measurement. </w:t>
+        <w:rPr>
+          <w:b/>
+          <w:bCs/>
+        </w:rPr>
+        <w:t>Problem 1: Incorrect power-supply flag naming</w:t>
       </w:r>
       <w:r>
         <w:br/>
-        <w:t>E.g. tables with raw data, generat</w:t>
+        <w:t>During schematic design, some power-supply flags were inconsistently named across different sheets. As a result, the corresponding nets were not connected in the PCB layout.</w:t>
       </w:r>
       <w:r>
-        <w:t>ed log files or graphs</w:t>
+        <w:br/>
+      </w:r>
+      <w:r>
+        <w:rPr>
+          <w:b/>
+          <w:bCs/>
+        </w:rPr>
+        <w:t>Solution:</w:t>
+      </w:r>
+      <w:r>
+        <w:t xml:space="preserve"> Two patch wires were added: one from the 3.3 V </w:t>
+      </w:r>
+      <w:r>
+        <w:t>line</w:t>
+      </w:r>
+      <w:r>
+        <w:t xml:space="preserve"> to C29 and another from JP5 to R27.</w:t>
+      </w:r>
+      <w:r>
+        <w:br/>
+        <w:t>After applying these modifications, the power-supply functioned correctly throughout the entire device.</w:t>
       </w:r>
     </w:p>
     <w:p>
       <w:pPr>
-        <w:pStyle w:val="ListParagraph"/>
-        <w:numPr>
-          <w:ilvl w:val="0"/>
-          <w:numId w:val="15"/>
-        </w:numPr>
+        <w:jc w:val="left"/>
       </w:pPr>
       <w:r>
-        <w:t>Comments on any noteworthy observations: unexpected results, special insights, instabilities …</w:t>
+        <w:rPr>
+          <w:b/>
+          <w:bCs/>
+        </w:rPr>
+        <w:t>Problem 2: Reference-voltage (VCOM) buffer of the input filter</w:t>
+      </w:r>
+      <w:r>
+        <w:br/>
+        <w:t>Similar to Problem 1, the signal flags for the VCOM reference voltage were mixed up. This caused an unintended bridging of the buffer stage and led to a short between the codec and filter VCOM pins.</w:t>
+      </w:r>
+      <w:r>
+        <w:br/>
+      </w:r>
+      <w:r>
+        <w:rPr>
+          <w:b/>
+          <w:bCs/>
+        </w:rPr>
+        <w:t>Solution:</w:t>
+      </w:r>
+      <w:r>
+        <w:t xml:space="preserve"> The affected PCB traces were cut in three locations, and two patch wires were added: one from the codec’s VCOM output (via) to the input pin of the buffer op-amp, and another from R37 to C37.</w:t>
+      </w:r>
+      <w:r>
+        <w:br/>
+        <w:t>After implementing these changes, both the codec VCOM output and the buffer output showed correct levels, restoring proper operation of the input filter.</w:t>
       </w:r>
     </w:p>
     <w:p>
       <w:pPr>
-        <w:pStyle w:val="ListParagraph"/>
-        <w:numPr>
-          <w:ilvl w:val="0"/>
-          <w:numId w:val="15"/>
-        </w:numPr>
+        <w:jc w:val="left"/>
       </w:pPr>
       <w:r>
-        <w:t>Formal information: who did the test, date, time, location, identification of equipment used</w:t>
-      </w:r>
-    </w:p>
-    <w:p>
-      <w:r>
-        <w:t>With the</w:t>
+        <w:t xml:space="preserve">After implementing these </w:t>
       </w:r>
       <w:r>
-        <w:t xml:space="preserve"> t</w:t>
+        <w:t>corrections</w:t>
       </w:r>
       <w:r>
-        <w:t>est plan and the test protocol, it</w:t>
+        <w:t xml:space="preserve">, all tests </w:t>
       </w:r>
       <w:r>
-        <w:t xml:space="preserve"> should be possible to redo a measurement and reproduce the results.</w:t>
-      </w:r>
-    </w:p>
-    <w:p>
-      <w:r>
-        <w:t xml:space="preserve">When a test case has been finished, it </w:t>
+        <w:t xml:space="preserve">were </w:t>
       </w:r>
       <w:r>
-        <w:t>must</w:t>
+        <w:t xml:space="preserve">completed successfully, with only minor deviations that </w:t>
       </w:r>
       <w:r>
-        <w:t xml:space="preserve"> be clear whether the test </w:t>
+        <w:t>stayed</w:t>
       </w:r>
       <w:r>
-        <w:t>has</w:t>
+        <w:t xml:space="preserve"> </w:t>
       </w:r>
       <w:r>
-        <w:t xml:space="preserve"> passed or failed.</w:t>
-      </w:r>
-    </w:p>
-    <w:p>
-      <w:r>
-        <w:t xml:space="preserve">When a test </w:t>
+        <w:t xml:space="preserve">within acceptable limits. In summary, the DUT has passed the hardware validation and is ready </w:t>
       </w:r>
       <w:r>
-        <w:t>has</w:t>
-      </w:r>
-      <w:r>
-        <w:t xml:space="preserve"> failed, decide whether the test session can be continued or whether </w:t>
-      </w:r>
-      <w:r>
-        <w:t>it</w:t>
-      </w:r>
-      <w:r>
-        <w:t xml:space="preserve"> has to be aborted.</w:t>
-      </w:r>
-    </w:p>
-    <w:p>
-      <w:r>
-        <w:t>After correcting an error, all the tests depending on the affected part, must be redone and the tests documented again.</w:t>
-      </w:r>
-    </w:p>
-    <w:p>
-      <w:pPr>
-        <w:pStyle w:val="Heading1"/>
-      </w:pPr>
-      <w:bookmarkStart w:id="5" w:name="_Toc213915671"/>
-      <w:r>
-        <w:t>Test Analysis</w:t>
-      </w:r>
-      <w:bookmarkEnd w:id="5"/>
-    </w:p>
-    <w:p>
-      <w:r>
-        <w:t xml:space="preserve">Test analysis after the </w:t>
-      </w:r>
-      <w:r>
-        <w:t>test session</w:t>
-      </w:r>
-      <w:r>
-        <w:t xml:space="preserve"> may</w:t>
-      </w:r>
-      <w:r>
-        <w:t xml:space="preserve"> include:</w:t>
-      </w:r>
-    </w:p>
-    <w:p>
-      <w:pPr>
-        <w:pStyle w:val="ListParagraph"/>
-        <w:numPr>
-          <w:ilvl w:val="0"/>
-          <w:numId w:val="16"/>
-        </w:numPr>
-      </w:pPr>
-      <w:r>
-        <w:t>Post processing of the test results</w:t>
-      </w:r>
-    </w:p>
-    <w:p>
-      <w:pPr>
-        <w:pStyle w:val="ListParagraph"/>
-        <w:numPr>
-          <w:ilvl w:val="0"/>
-          <w:numId w:val="16"/>
-        </w:numPr>
-      </w:pPr>
-      <w:r>
-        <w:t>Presentation of the r</w:t>
-      </w:r>
-      <w:r>
-        <w:t>esults e.g. as graphs, tables, ...</w:t>
-      </w:r>
-    </w:p>
-    <w:p>
-      <w:pPr>
-        <w:pStyle w:val="ListParagraph"/>
-        <w:numPr>
-          <w:ilvl w:val="0"/>
-          <w:numId w:val="16"/>
-        </w:numPr>
-      </w:pPr>
-      <w:r>
-        <w:t>Detailed comparison against the expect</w:t>
-      </w:r>
-      <w:r>
-        <w:t xml:space="preserve">ations, simulations, datasheets, </w:t>
-      </w:r>
-      <w:r>
-        <w:t>…</w:t>
-      </w:r>
-    </w:p>
-    <w:p>
-      <w:pPr>
-        <w:pStyle w:val="ListParagraph"/>
-        <w:numPr>
-          <w:ilvl w:val="0"/>
-          <w:numId w:val="16"/>
-        </w:numPr>
-      </w:pPr>
-      <w:r>
-        <w:t>Finding  reasons for deviations and errors</w:t>
-      </w:r>
-    </w:p>
-    <w:p>
-      <w:pPr>
-        <w:pStyle w:val="ListParagraph"/>
-        <w:numPr>
-          <w:ilvl w:val="0"/>
-          <w:numId w:val="16"/>
-        </w:numPr>
-      </w:pPr>
-      <w:r>
-        <w:t xml:space="preserve">Commenting </w:t>
-      </w:r>
-      <w:r>
-        <w:t>and</w:t>
-      </w:r>
-      <w:r>
-        <w:t xml:space="preserve"> discussing the results</w:t>
-      </w:r>
-    </w:p>
-    <w:p>
-      <w:pPr>
-        <w:pStyle w:val="ListParagraph"/>
-        <w:numPr>
-          <w:ilvl w:val="0"/>
-          <w:numId w:val="16"/>
-        </w:numPr>
-      </w:pPr>
-      <w:r>
-        <w:t>Make a f</w:t>
-      </w:r>
-      <w:r>
-        <w:t xml:space="preserve">inal verdict: </w:t>
-      </w:r>
-      <w:r>
-        <w:t>p</w:t>
-      </w:r>
-      <w:r>
-        <w:t xml:space="preserve">assed or </w:t>
-      </w:r>
-      <w:r>
-        <w:t>f</w:t>
-      </w:r>
-      <w:r>
-        <w:t>ailed</w:t>
-      </w:r>
-    </w:p>
-    <w:p>
-      <w:pPr>
-        <w:pStyle w:val="Heading1"/>
-      </w:pPr>
-      <w:bookmarkStart w:id="6" w:name="_Toc213915672"/>
-      <w:r>
-        <w:t>Test Documentation</w:t>
-      </w:r>
-      <w:bookmarkEnd w:id="6"/>
-    </w:p>
-    <w:p>
-      <w:r>
-        <w:t>Add a chapter in the HW report covering the main aspects and results of the tests.</w:t>
-      </w:r>
-    </w:p>
-    <w:p>
-      <w:pPr>
-        <w:rPr>
-          <w:lang w:val="en-GB"/>
-        </w:rPr>
-      </w:pPr>
-      <w:r>
-        <w:t>The detailed t</w:t>
-      </w:r>
-      <w:r>
-        <w:t>est protocol</w:t>
-      </w:r>
-      <w:r>
-        <w:t>s and the</w:t>
-      </w:r>
-      <w:r>
-        <w:t xml:space="preserve"> r</w:t>
-      </w:r>
-      <w:r>
-        <w:t>aw test data go to the appendix (and, if sensible, to a digital data carrier).</w:t>
+        <w:t>to proceed to the next phase of firmware development.</w:t>
       </w:r>
     </w:p>
     <w:sectPr>
@@ -12852,7 +14760,7 @@
   <w:style w:type="paragraph" w:default="1" w:styleId="Normal">
     <w:name w:val="Normal"/>
     <w:qFormat/>
-    <w:rsid w:val="007F3EE4"/>
+    <w:rsid w:val="00106AD9"/>
     <w:pPr>
       <w:spacing w:before="120" w:after="0" w:line="312" w:lineRule="auto"/>
       <w:jc w:val="both"/>
@@ -12962,6 +14870,7 @@
   <w:style w:type="character" w:default="1" w:styleId="DefaultParagraphFont">
     <w:name w:val="Default Paragraph Font"/>
     <w:uiPriority w:val="1"/>
+    <w:semiHidden/>
     <w:unhideWhenUsed/>
   </w:style>
   <w:style w:type="table" w:default="1" w:styleId="TableNormal">

</xml_diff>

<commit_message>
added frequency sweep description and also pictures for the modifications carried out to pcb
</commit_message>
<xml_diff>
--- a/3_Technical_Documents/PCB/HW_Testing.docx
+++ b/3_Technical_Documents/PCB/HW_Testing.docx
@@ -144,7 +144,7 @@
     <w:p/>
     <w:p>
       <w:pPr>
-        <w:pStyle w:val="Title"/>
+        <w:pStyle w:val="Titel"/>
       </w:pPr>
       <w:r>
         <w:t>HW</w:t>
@@ -155,7 +155,7 @@
     </w:p>
     <w:p>
       <w:pPr>
-        <w:pStyle w:val="Subtitle"/>
+        <w:pStyle w:val="Untertitel"/>
       </w:pPr>
       <w:r>
         <w:t xml:space="preserve">Electronics </w:t>
@@ -173,7 +173,7 @@
     <w:p/>
     <w:p>
       <w:pPr>
-        <w:pStyle w:val="TOCHeading"/>
+        <w:pStyle w:val="Inhaltsverzeichnisberschrift"/>
         <w:rPr>
           <w:lang w:val="en-US"/>
         </w:rPr>
@@ -212,7 +212,7 @@
       <w:sdtContent>
         <w:p>
           <w:pPr>
-            <w:pStyle w:val="TOCHeading"/>
+            <w:pStyle w:val="Inhaltsverzeichnisberschrift"/>
             <w:rPr>
               <w:lang w:val="en-US"/>
             </w:rPr>
@@ -238,7 +238,7 @@
         </w:p>
         <w:p>
           <w:pPr>
-            <w:pStyle w:val="TOC1"/>
+            <w:pStyle w:val="Verzeichnis1"/>
             <w:rPr>
               <w:rFonts w:asciiTheme="minorHAnsi" w:eastAsiaTheme="minorEastAsia" w:hAnsiTheme="minorHAnsi" w:cstheme="minorBidi"/>
               <w:noProof/>
@@ -335,7 +335,7 @@
         </w:p>
         <w:p>
           <w:pPr>
-            <w:pStyle w:val="TOC1"/>
+            <w:pStyle w:val="Verzeichnis1"/>
             <w:rPr>
               <w:rFonts w:asciiTheme="minorHAnsi" w:eastAsiaTheme="minorEastAsia" w:hAnsiTheme="minorHAnsi" w:cstheme="minorBidi"/>
               <w:noProof/>
@@ -423,7 +423,7 @@
         </w:p>
         <w:p>
           <w:pPr>
-            <w:pStyle w:val="TOC1"/>
+            <w:pStyle w:val="Verzeichnis1"/>
             <w:rPr>
               <w:rFonts w:asciiTheme="minorHAnsi" w:eastAsiaTheme="minorEastAsia" w:hAnsiTheme="minorHAnsi" w:cstheme="minorBidi"/>
               <w:noProof/>
@@ -511,7 +511,7 @@
         </w:p>
         <w:p>
           <w:pPr>
-            <w:pStyle w:val="TOC1"/>
+            <w:pStyle w:val="Verzeichnis1"/>
             <w:rPr>
               <w:rFonts w:asciiTheme="minorHAnsi" w:eastAsiaTheme="minorEastAsia" w:hAnsiTheme="minorHAnsi" w:cstheme="minorBidi"/>
               <w:noProof/>
@@ -625,7 +625,7 @@
     </w:p>
     <w:p>
       <w:pPr>
-        <w:pStyle w:val="Heading1"/>
+        <w:pStyle w:val="berschrift1"/>
       </w:pPr>
       <w:bookmarkStart w:id="1" w:name="_Toc213998205"/>
       <w:r>
@@ -654,10 +654,18 @@
       <w:r>
         <w:t>groups. It follows a systematic approach, starting from the audio input connectors, through the analog input circuitry, codec, analog output circuitry, and ending at the output connectors.</w:t>
       </w:r>
+      <w:r>
+        <w:t xml:space="preserve"> </w:t>
+      </w:r>
     </w:p>
     <w:p>
-      <w:pPr>
-        <w:pStyle w:val="Heading1"/>
+      <w:r>
+        <w:t>After verifying the basic hardware functionality, an additional test will be performed to determine the corner frequency of the board’s input/output filter. A frequency sweep across the human-audible spectrum will be applied to the board’s input, and a Fourier transform of the output signal will be used to generate an amplitude response plot.</w:t>
+      </w:r>
+    </w:p>
+    <w:p>
+      <w:pPr>
+        <w:pStyle w:val="berschrift1"/>
       </w:pPr>
       <w:bookmarkStart w:id="2" w:name="_Toc213998206"/>
       <w:r>
@@ -699,7 +707,7 @@
     </w:p>
     <w:p>
       <w:pPr>
-        <w:pStyle w:val="Heading1"/>
+        <w:pStyle w:val="berschrift1"/>
         <w:spacing w:before="0"/>
         <w:ind w:left="624" w:hanging="624"/>
       </w:pPr>
@@ -712,7 +720,7 @@
     </w:p>
     <w:tbl>
       <w:tblPr>
-        <w:tblStyle w:val="TableGrid"/>
+        <w:tblStyle w:val="Tabellenraster"/>
         <w:tblW w:w="0" w:type="auto"/>
         <w:tblLook w:val="04A0" w:firstRow="1" w:lastRow="0" w:firstColumn="1" w:lastColumn="0" w:noHBand="0" w:noVBand="1"/>
       </w:tblPr>
@@ -1022,7 +1030,7 @@
           </w:p>
           <w:p>
             <w:pPr>
-              <w:pStyle w:val="ListParagraph"/>
+              <w:pStyle w:val="Listenabsatz"/>
               <w:numPr>
                 <w:ilvl w:val="0"/>
                 <w:numId w:val="18"/>
@@ -1046,7 +1054,7 @@
           </w:p>
           <w:p>
             <w:pPr>
-              <w:pStyle w:val="ListParagraph"/>
+              <w:pStyle w:val="Listenabsatz"/>
               <w:numPr>
                 <w:ilvl w:val="0"/>
                 <w:numId w:val="18"/>
@@ -9378,7 +9386,7 @@
           </w:p>
           <w:p>
             <w:pPr>
-              <w:pStyle w:val="ListParagraph"/>
+              <w:pStyle w:val="Listenabsatz"/>
               <w:numPr>
                 <w:ilvl w:val="0"/>
                 <w:numId w:val="18"/>
@@ -9402,7 +9410,7 @@
           </w:p>
           <w:p>
             <w:pPr>
-              <w:pStyle w:val="ListParagraph"/>
+              <w:pStyle w:val="Listenabsatz"/>
               <w:numPr>
                 <w:ilvl w:val="0"/>
                 <w:numId w:val="18"/>
@@ -9426,7 +9434,7 @@
           </w:p>
           <w:p>
             <w:pPr>
-              <w:pStyle w:val="ListParagraph"/>
+              <w:pStyle w:val="Listenabsatz"/>
               <w:numPr>
                 <w:ilvl w:val="0"/>
                 <w:numId w:val="18"/>
@@ -9450,7 +9458,7 @@
           </w:p>
           <w:p>
             <w:pPr>
-              <w:pStyle w:val="ListParagraph"/>
+              <w:pStyle w:val="Listenabsatz"/>
               <w:numPr>
                 <w:ilvl w:val="0"/>
                 <w:numId w:val="18"/>
@@ -12017,7 +12025,7 @@
     </w:p>
     <w:tbl>
       <w:tblPr>
-        <w:tblStyle w:val="TableGrid"/>
+        <w:tblStyle w:val="Tabellenraster"/>
         <w:tblW w:w="0" w:type="auto"/>
         <w:tblBorders>
           <w:top w:val="none" w:sz="0" w:space="0" w:color="auto"/>
@@ -12108,13 +12116,8 @@
             <w:r>
               <w:t xml:space="preserve">: ZHAW, </w:t>
             </w:r>
-            <w:proofErr w:type="spellStart"/>
-            <w:r>
-              <w:t>Technikumstrasse</w:t>
-            </w:r>
-            <w:proofErr w:type="spellEnd"/>
-            <w:r>
-              <w:t xml:space="preserve"> 71, 8400 Winterthur</w:t>
+            <w:r>
+              <w:t>Technikumstrasse 71, 8400 Winterthur</w:t>
             </w:r>
             <w:r>
               <w:t>, Room TS04.11</w:t>
@@ -12186,13 +12189,8 @@
             <w:r>
               <w:t xml:space="preserve">Keysight U3402A digital multimeter, Tektronix TDS 2012C oscilloscope, </w:t>
             </w:r>
-            <w:proofErr w:type="spellStart"/>
-            <w:r>
-              <w:t>TTi</w:t>
-            </w:r>
-            <w:proofErr w:type="spellEnd"/>
-            <w:r>
-              <w:t xml:space="preserve"> EL302RT</w:t>
+            <w:r>
+              <w:t>TTi EL302RT</w:t>
             </w:r>
             <w:r>
               <w:t xml:space="preserve"> </w:t>
@@ -12243,7 +12241,7 @@
     </w:p>
     <w:p>
       <w:pPr>
-        <w:pStyle w:val="Heading1"/>
+        <w:pStyle w:val="berschrift1"/>
       </w:pPr>
       <w:bookmarkStart w:id="4" w:name="_Toc213998208"/>
       <w:r>
@@ -12364,6 +12362,237 @@
         <w:t>to proceed to the next phase of firmware development.</w:t>
       </w:r>
     </w:p>
+    <w:p>
+      <w:pPr>
+        <w:spacing w:before="0" w:after="160" w:line="259" w:lineRule="auto"/>
+        <w:jc w:val="left"/>
+      </w:pPr>
+      <w:r>
+        <w:br w:type="page"/>
+      </w:r>
+    </w:p>
+    <w:tbl>
+      <w:tblPr>
+        <w:tblStyle w:val="Tabellenraster"/>
+        <w:tblW w:w="0" w:type="auto"/>
+        <w:tblLook w:val="04A0" w:firstRow="1" w:lastRow="0" w:firstColumn="1" w:lastColumn="0" w:noHBand="0" w:noVBand="1"/>
+      </w:tblPr>
+      <w:tblGrid>
+        <w:gridCol w:w="9062"/>
+      </w:tblGrid>
+      <w:tr>
+        <w:tc>
+          <w:tcPr>
+            <w:tcW w:w="9062" w:type="dxa"/>
+            <w:shd w:val="clear" w:color="auto" w:fill="BDD6EE" w:themeFill="accent1" w:themeFillTint="66"/>
+          </w:tcPr>
+          <w:p>
+            <w:pPr>
+              <w:jc w:val="left"/>
+            </w:pPr>
+            <w:r>
+              <w:lastRenderedPageBreak/>
+              <w:t xml:space="preserve">Modifications </w:t>
+            </w:r>
+            <w:r>
+              <w:t>for the VCOM</w:t>
+            </w:r>
+            <w:r>
+              <w:t xml:space="preserve"> (cuts drawn in </w:t>
+            </w:r>
+            <w:r>
+              <w:rPr>
+                <w:b/>
+                <w:bCs/>
+              </w:rPr>
+              <w:t>black</w:t>
+            </w:r>
+            <w:r>
+              <w:t xml:space="preserve"> and connections made in </w:t>
+            </w:r>
+            <w:r>
+              <w:rPr>
+                <w:b/>
+                <w:bCs/>
+                <w:color w:val="FFC000"/>
+              </w:rPr>
+              <w:t>orange</w:t>
+            </w:r>
+            <w:r>
+              <w:t>)</w:t>
+            </w:r>
+          </w:p>
+        </w:tc>
+      </w:tr>
+      <w:tr>
+        <w:tc>
+          <w:tcPr>
+            <w:tcW w:w="9062" w:type="dxa"/>
+          </w:tcPr>
+          <w:p>
+            <w:pPr>
+              <w:jc w:val="left"/>
+              <w:rPr>
+                <w:lang w:val="de-CH"/>
+              </w:rPr>
+            </w:pPr>
+            <w:r>
+              <w:rPr>
+                <w:noProof/>
+                <w:lang w:val="de-CH"/>
+              </w:rPr>
+              <w:drawing>
+                <wp:inline distT="0" distB="0" distL="0" distR="0" wp14:anchorId="34FDE0F2" wp14:editId="759BD329">
+                  <wp:extent cx="3691207" cy="5436141"/>
+                  <wp:effectExtent l="3810" t="0" r="8890" b="8890"/>
+                  <wp:docPr id="1997181204" name="Grafik 2"/>
+                  <wp:cNvGraphicFramePr>
+                    <a:graphicFrameLocks xmlns:a="http://schemas.openxmlformats.org/drawingml/2006/main" noChangeAspect="1"/>
+                  </wp:cNvGraphicFramePr>
+                  <a:graphic xmlns:a="http://schemas.openxmlformats.org/drawingml/2006/main">
+                    <a:graphicData uri="http://schemas.openxmlformats.org/drawingml/2006/picture">
+                      <pic:pic xmlns:pic="http://schemas.openxmlformats.org/drawingml/2006/picture">
+                        <pic:nvPicPr>
+                          <pic:cNvPr id="0" name="Picture 6"/>
+                          <pic:cNvPicPr>
+                            <a:picLocks noChangeAspect="1" noChangeArrowheads="1"/>
+                          </pic:cNvPicPr>
+                        </pic:nvPicPr>
+                        <pic:blipFill>
+                          <a:blip r:embed="rId11">
+                            <a:extLst>
+                              <a:ext uri="{28A0092B-C50C-407E-A947-70E740481C1C}">
+                                <a14:useLocalDpi xmlns:a14="http://schemas.microsoft.com/office/drawing/2010/main" val="0"/>
+                              </a:ext>
+                            </a:extLst>
+                          </a:blip>
+                          <a:srcRect/>
+                          <a:stretch>
+                            <a:fillRect/>
+                          </a:stretch>
+                        </pic:blipFill>
+                        <pic:spPr bwMode="auto">
+                          <a:xfrm rot="16200000">
+                            <a:off x="0" y="0"/>
+                            <a:ext cx="3702067" cy="5452134"/>
+                          </a:xfrm>
+                          <a:prstGeom prst="rect">
+                            <a:avLst/>
+                          </a:prstGeom>
+                          <a:noFill/>
+                          <a:ln>
+                            <a:noFill/>
+                          </a:ln>
+                        </pic:spPr>
+                      </pic:pic>
+                    </a:graphicData>
+                  </a:graphic>
+                </wp:inline>
+              </w:drawing>
+            </w:r>
+          </w:p>
+          <w:p>
+            <w:pPr>
+              <w:jc w:val="left"/>
+            </w:pPr>
+            <w:r>
+              <w:t>&lt;</w:t>
+            </w:r>
+          </w:p>
+        </w:tc>
+      </w:tr>
+      <w:tr>
+        <w:tc>
+          <w:tcPr>
+            <w:tcW w:w="9062" w:type="dxa"/>
+            <w:shd w:val="clear" w:color="auto" w:fill="BDD6EE" w:themeFill="accent1" w:themeFillTint="66"/>
+          </w:tcPr>
+          <w:p>
+            <w:pPr>
+              <w:jc w:val="left"/>
+            </w:pPr>
+            <w:r>
+              <w:t>Modifications</w:t>
+            </w:r>
+            <w:r>
+              <w:t xml:space="preserve"> for the missing power flags (connections made in </w:t>
+            </w:r>
+            <w:r>
+              <w:rPr>
+                <w:b/>
+                <w:bCs/>
+                <w:color w:val="EE0000"/>
+              </w:rPr>
+              <w:t>red</w:t>
+            </w:r>
+            <w:r>
+              <w:t>)</w:t>
+            </w:r>
+          </w:p>
+        </w:tc>
+      </w:tr>
+      <w:tr>
+        <w:tc>
+          <w:tcPr>
+            <w:tcW w:w="9062" w:type="dxa"/>
+          </w:tcPr>
+          <w:p>
+            <w:pPr>
+              <w:jc w:val="left"/>
+              <w:rPr>
+                <w:lang w:val="de-CH"/>
+              </w:rPr>
+            </w:pPr>
+            <w:r>
+              <w:rPr>
+                <w:noProof/>
+                <w:lang w:val="de-CH"/>
+              </w:rPr>
+              <w:drawing>
+                <wp:inline distT="0" distB="0" distL="0" distR="0" wp14:anchorId="4EC9CE67" wp14:editId="2F001631">
+                  <wp:extent cx="5760720" cy="3090545"/>
+                  <wp:effectExtent l="0" t="0" r="0" b="0"/>
+                  <wp:docPr id="1773833688" name="Grafik 1"/>
+                  <wp:cNvGraphicFramePr>
+                    <a:graphicFrameLocks xmlns:a="http://schemas.openxmlformats.org/drawingml/2006/main" noChangeAspect="1"/>
+                  </wp:cNvGraphicFramePr>
+                  <a:graphic xmlns:a="http://schemas.openxmlformats.org/drawingml/2006/main">
+                    <a:graphicData uri="http://schemas.openxmlformats.org/drawingml/2006/picture">
+                      <pic:pic xmlns:pic="http://schemas.openxmlformats.org/drawingml/2006/picture">
+                        <pic:nvPicPr>
+                          <pic:cNvPr id="1773833688" name=""/>
+                          <pic:cNvPicPr/>
+                        </pic:nvPicPr>
+                        <pic:blipFill>
+                          <a:blip r:embed="rId12"/>
+                          <a:stretch>
+                            <a:fillRect/>
+                          </a:stretch>
+                        </pic:blipFill>
+                        <pic:spPr>
+                          <a:xfrm>
+                            <a:off x="0" y="0"/>
+                            <a:ext cx="5760720" cy="3090545"/>
+                          </a:xfrm>
+                          <a:prstGeom prst="rect">
+                            <a:avLst/>
+                          </a:prstGeom>
+                        </pic:spPr>
+                      </pic:pic>
+                    </a:graphicData>
+                  </a:graphic>
+                </wp:inline>
+              </w:drawing>
+            </w:r>
+          </w:p>
+        </w:tc>
+      </w:tr>
+    </w:tbl>
+    <w:p>
+      <w:pPr>
+        <w:jc w:val="left"/>
+      </w:pPr>
+    </w:p>
     <w:sectPr>
       <w:pgSz w:w="11906" w:h="16838"/>
       <w:pgMar w:top="1417" w:right="1417" w:bottom="1134" w:left="1417" w:header="708" w:footer="708" w:gutter="0"/>
@@ -12403,33 +12632,20 @@
 <w:ftr xmlns:wpc="http://schemas.microsoft.com/office/word/2010/wordprocessingCanvas" xmlns:cx="http://schemas.microsoft.com/office/drawing/2014/chartex" xmlns:cx1="http://schemas.microsoft.com/office/drawing/2015/9/8/chartex" xmlns:cx2="http://schemas.microsoft.com/office/drawing/2015/10/21/chartex" xmlns:cx3="http://schemas.microsoft.com/office/drawing/2016/5/9/chartex" xmlns:cx4="http://schemas.microsoft.com/office/drawing/2016/5/10/chartex" xmlns:cx5="http://schemas.microsoft.com/office/drawing/2016/5/11/chartex" xmlns:cx6="http://schemas.microsoft.com/office/drawing/2016/5/12/chartex" xmlns:cx7="http://schemas.microsoft.com/office/drawing/2016/5/13/chartex" xmlns:cx8="http://schemas.microsoft.com/office/drawing/2016/5/14/chartex" xmlns:mc="http://schemas.openxmlformats.org/markup-compatibility/2006" xmlns:aink="http://schemas.microsoft.com/office/drawing/2016/ink" xmlns:am3d="http://schemas.microsoft.com/office/drawing/2017/model3d" xmlns:o="urn:schemas-microsoft-com:office:office" xmlns:oel="http://schemas.microsoft.com/office/2019/extlst" xmlns:r="http://schemas.openxmlformats.org/officeDocument/2006/relationships" xmlns:m="http://schemas.openxmlformats.org/officeDocument/2006/math" xmlns:v="urn:schemas-microsoft-com:vml" xmlns:wp14="http://schemas.microsoft.com/office/word/2010/wordprocessingDrawing" xmlns:wp="http://schemas.openxmlformats.org/drawingml/2006/wordprocessingDrawing" xmlns:w10="urn:schemas-microsoft-com:office:word" xmlns:w="http://schemas.openxmlformats.org/wordprocessingml/2006/main" xmlns:w14="http://schemas.microsoft.com/office/word/2010/wordml" xmlns:w15="http://schemas.microsoft.com/office/word/2012/wordml" xmlns:w16cex="http://schemas.microsoft.com/office/word/2018/wordml/cex" xmlns:w16cid="http://schemas.microsoft.com/office/word/2016/wordml/cid" xmlns:w16="http://schemas.microsoft.com/office/word/2018/wordml" xmlns:w16du="http://schemas.microsoft.com/office/word/2023/wordml/word16du" xmlns:w16sdtdh="http://schemas.microsoft.com/office/word/2020/wordml/sdtdatahash" xmlns:w16sdtfl="http://schemas.microsoft.com/office/word/2024/wordml/sdtformatlock" xmlns:w16se="http://schemas.microsoft.com/office/word/2015/wordml/symex" xmlns:wpg="http://schemas.microsoft.com/office/word/2010/wordprocessingGroup" xmlns:wpi="http://schemas.microsoft.com/office/word/2010/wordprocessingInk" xmlns:wne="http://schemas.microsoft.com/office/word/2006/wordml" xmlns:wps="http://schemas.microsoft.com/office/word/2010/wordprocessingShape" mc:Ignorable="w14 w15 w16se w16cid w16 w16cex w16sdtdh w16sdtfl w16du wp14">
   <w:p>
     <w:pPr>
-      <w:pStyle w:val="Footer"/>
+      <w:pStyle w:val="Fuzeile"/>
       <w:tabs>
         <w:tab w:val="clear" w:pos="4536"/>
         <w:tab w:val="clear" w:pos="9072"/>
       </w:tabs>
     </w:pPr>
-    <w:r>
-      <w:fldChar w:fldCharType="begin"/>
-    </w:r>
-    <w:r>
-      <w:instrText xml:space="preserve"> FILENAME \* MERGEFORMAT </w:instrText>
-    </w:r>
-    <w:r>
-      <w:fldChar w:fldCharType="separate"/>
-    </w:r>
-    <w:r>
-      <w:rPr>
-        <w:noProof/>
-      </w:rPr>
-      <w:t>HW_Testing.docx</w:t>
-    </w:r>
-    <w:r>
-      <w:rPr>
-        <w:noProof/>
-      </w:rPr>
-      <w:fldChar w:fldCharType="end"/>
-    </w:r>
+    <w:fldSimple w:instr=" FILENAME \* MERGEFORMAT ">
+      <w:r>
+        <w:rPr>
+          <w:noProof/>
+        </w:rPr>
+        <w:t>HW_Testing</w:t>
+      </w:r>
+    </w:fldSimple>
     <w:r>
       <w:ptab w:relativeTo="margin" w:alignment="center" w:leader="none"/>
     </w:r>
@@ -12463,15 +12679,7 @@
       <w:ptab w:relativeTo="margin" w:alignment="right" w:leader="none"/>
     </w:r>
     <w:r>
-      <w:t>Thomas Perri (</w:t>
-    </w:r>
-    <w:proofErr w:type="spellStart"/>
-    <w:r>
-      <w:t>perritho</w:t>
-    </w:r>
-    <w:proofErr w:type="spellEnd"/>
-    <w:r>
-      <w:t>)</w:t>
+      <w:t>Thomas Perri (perritho)</w:t>
     </w:r>
     <w:r>
       <w:br/>
@@ -13769,7 +13977,7 @@
     <w:lvl w:ilvl="0">
       <w:start w:val="1"/>
       <w:numFmt w:val="decimal"/>
-      <w:pStyle w:val="Heading1"/>
+      <w:pStyle w:val="berschrift1"/>
       <w:isLgl/>
       <w:lvlText w:val="%1."/>
       <w:lvlJc w:val="left"/>
@@ -13786,7 +13994,7 @@
     <w:lvl w:ilvl="1">
       <w:start w:val="1"/>
       <w:numFmt w:val="decimal"/>
-      <w:pStyle w:val="Heading2"/>
+      <w:pStyle w:val="berschrift2"/>
       <w:isLgl/>
       <w:lvlText w:val="%1.%2."/>
       <w:lvlJc w:val="left"/>
@@ -13803,7 +14011,7 @@
     <w:lvl w:ilvl="2">
       <w:start w:val="1"/>
       <w:numFmt w:val="decimal"/>
-      <w:pStyle w:val="Heading3"/>
+      <w:pStyle w:val="berschrift3"/>
       <w:isLgl/>
       <w:lvlText w:val="%1.%2.%3."/>
       <w:lvlJc w:val="left"/>
@@ -13820,7 +14028,7 @@
     <w:lvl w:ilvl="3">
       <w:start w:val="1"/>
       <w:numFmt w:val="decimal"/>
-      <w:pStyle w:val="Heading4"/>
+      <w:pStyle w:val="berschrift4"/>
       <w:isLgl/>
       <w:lvlText w:val="%1.%2.%3.%4."/>
       <w:lvlJc w:val="left"/>
@@ -14676,7 +14884,7 @@
     <w:lsdException w:name="Unresolved Mention" w:semiHidden="1" w:unhideWhenUsed="1"/>
     <w:lsdException w:name="Smart Link" w:semiHidden="1" w:unhideWhenUsed="1"/>
   </w:latentStyles>
-  <w:style w:type="paragraph" w:default="1" w:styleId="Normal">
+  <w:style w:type="paragraph" w:default="1" w:styleId="Standard">
     <w:name w:val="Normal"/>
     <w:qFormat/>
     <w:rsid w:val="00106AD9"/>
@@ -14690,11 +14898,11 @@
       <w:lang w:val="en-US" w:eastAsia="de-DE"/>
     </w:rPr>
   </w:style>
-  <w:style w:type="paragraph" w:styleId="Heading1">
+  <w:style w:type="paragraph" w:styleId="berschrift1">
     <w:name w:val="heading 1"/>
-    <w:basedOn w:val="Normal"/>
-    <w:next w:val="Normal"/>
-    <w:link w:val="Heading1Char"/>
+    <w:basedOn w:val="Standard"/>
+    <w:next w:val="Standard"/>
+    <w:link w:val="berschrift1Zchn"/>
     <w:qFormat/>
     <w:rsid w:val="0066609C"/>
     <w:pPr>
@@ -14714,11 +14922,11 @@
       <w:szCs w:val="32"/>
     </w:rPr>
   </w:style>
-  <w:style w:type="paragraph" w:styleId="Heading2">
+  <w:style w:type="paragraph" w:styleId="berschrift2">
     <w:name w:val="heading 2"/>
-    <w:basedOn w:val="Normal"/>
-    <w:next w:val="Normal"/>
-    <w:link w:val="Heading2Char"/>
+    <w:basedOn w:val="Standard"/>
+    <w:next w:val="Standard"/>
+    <w:link w:val="berschrift2Zchn"/>
     <w:qFormat/>
     <w:rsid w:val="0066609C"/>
     <w:pPr>
@@ -14739,11 +14947,11 @@
       <w:szCs w:val="28"/>
     </w:rPr>
   </w:style>
-  <w:style w:type="paragraph" w:styleId="Heading3">
+  <w:style w:type="paragraph" w:styleId="berschrift3">
     <w:name w:val="heading 3"/>
-    <w:basedOn w:val="Normal"/>
-    <w:next w:val="Normal"/>
-    <w:link w:val="Heading3Char"/>
+    <w:basedOn w:val="Standard"/>
+    <w:next w:val="Standard"/>
+    <w:link w:val="berschrift3Zchn"/>
     <w:qFormat/>
     <w:rsid w:val="0066609C"/>
     <w:pPr>
@@ -14763,11 +14971,11 @@
       <w:szCs w:val="26"/>
     </w:rPr>
   </w:style>
-  <w:style w:type="paragraph" w:styleId="Heading4">
+  <w:style w:type="paragraph" w:styleId="berschrift4">
     <w:name w:val="heading 4"/>
-    <w:basedOn w:val="Normal"/>
-    <w:next w:val="Normal"/>
-    <w:link w:val="Heading4Char"/>
+    <w:basedOn w:val="Standard"/>
+    <w:next w:val="Standard"/>
+    <w:link w:val="berschrift4Zchn"/>
     <w:qFormat/>
     <w:rsid w:val="0066609C"/>
     <w:pPr>
@@ -14786,13 +14994,13 @@
       <w:szCs w:val="28"/>
     </w:rPr>
   </w:style>
-  <w:style w:type="character" w:default="1" w:styleId="DefaultParagraphFont">
+  <w:style w:type="character" w:default="1" w:styleId="Absatz-Standardschriftart">
     <w:name w:val="Default Paragraph Font"/>
     <w:uiPriority w:val="1"/>
     <w:semiHidden/>
     <w:unhideWhenUsed/>
   </w:style>
-  <w:style w:type="table" w:default="1" w:styleId="TableNormal">
+  <w:style w:type="table" w:default="1" w:styleId="NormaleTabelle">
     <w:name w:val="Normal Table"/>
     <w:uiPriority w:val="99"/>
     <w:semiHidden/>
@@ -14807,16 +15015,16 @@
       </w:tblCellMar>
     </w:tblPr>
   </w:style>
-  <w:style w:type="numbering" w:default="1" w:styleId="NoList">
+  <w:style w:type="numbering" w:default="1" w:styleId="KeineListe">
     <w:name w:val="No List"/>
     <w:uiPriority w:val="99"/>
     <w:semiHidden/>
     <w:unhideWhenUsed/>
   </w:style>
-  <w:style w:type="character" w:customStyle="1" w:styleId="Heading1Char">
-    <w:name w:val="Heading 1 Char"/>
-    <w:basedOn w:val="DefaultParagraphFont"/>
-    <w:link w:val="Heading1"/>
+  <w:style w:type="character" w:customStyle="1" w:styleId="berschrift1Zchn">
+    <w:name w:val="Überschrift 1 Zchn"/>
+    <w:basedOn w:val="Absatz-Standardschriftart"/>
+    <w:link w:val="berschrift1"/>
     <w:rsid w:val="0066609C"/>
     <w:rPr>
       <w:rFonts w:ascii="Arial" w:eastAsia="Times New Roman" w:hAnsi="Arial" w:cs="Arial"/>
@@ -14828,10 +15036,10 @@
       <w:lang w:eastAsia="de-DE"/>
     </w:rPr>
   </w:style>
-  <w:style w:type="character" w:customStyle="1" w:styleId="Heading2Char">
-    <w:name w:val="Heading 2 Char"/>
-    <w:basedOn w:val="DefaultParagraphFont"/>
-    <w:link w:val="Heading2"/>
+  <w:style w:type="character" w:customStyle="1" w:styleId="berschrift2Zchn">
+    <w:name w:val="Überschrift 2 Zchn"/>
+    <w:basedOn w:val="Absatz-Standardschriftart"/>
+    <w:link w:val="berschrift2"/>
     <w:rsid w:val="0066609C"/>
     <w:rPr>
       <w:rFonts w:ascii="Arial" w:eastAsia="Times New Roman" w:hAnsi="Arial" w:cs="Arial"/>
@@ -14843,10 +15051,10 @@
       <w:lang w:eastAsia="de-DE"/>
     </w:rPr>
   </w:style>
-  <w:style w:type="character" w:customStyle="1" w:styleId="Heading3Char">
-    <w:name w:val="Heading 3 Char"/>
-    <w:basedOn w:val="DefaultParagraphFont"/>
-    <w:link w:val="Heading3"/>
+  <w:style w:type="character" w:customStyle="1" w:styleId="berschrift3Zchn">
+    <w:name w:val="Überschrift 3 Zchn"/>
+    <w:basedOn w:val="Absatz-Standardschriftart"/>
+    <w:link w:val="berschrift3"/>
     <w:rsid w:val="0066609C"/>
     <w:rPr>
       <w:rFonts w:ascii="Arial" w:eastAsia="Times New Roman" w:hAnsi="Arial" w:cs="Arial"/>
@@ -14857,10 +15065,10 @@
       <w:lang w:eastAsia="de-DE"/>
     </w:rPr>
   </w:style>
-  <w:style w:type="character" w:customStyle="1" w:styleId="Heading4Char">
-    <w:name w:val="Heading 4 Char"/>
-    <w:basedOn w:val="DefaultParagraphFont"/>
-    <w:link w:val="Heading4"/>
+  <w:style w:type="character" w:customStyle="1" w:styleId="berschrift4Zchn">
+    <w:name w:val="Überschrift 4 Zchn"/>
+    <w:basedOn w:val="Absatz-Standardschriftart"/>
+    <w:link w:val="berschrift4"/>
     <w:rsid w:val="0066609C"/>
     <w:rPr>
       <w:rFonts w:ascii="Arial" w:eastAsia="Times New Roman" w:hAnsi="Arial" w:cs="Times New Roman"/>
@@ -14871,10 +15079,10 @@
       <w:lang w:eastAsia="de-DE"/>
     </w:rPr>
   </w:style>
-  <w:style w:type="paragraph" w:styleId="TOC1">
+  <w:style w:type="paragraph" w:styleId="Verzeichnis1">
     <w:name w:val="toc 1"/>
-    <w:basedOn w:val="Normal"/>
-    <w:next w:val="Normal"/>
+    <w:basedOn w:val="Standard"/>
+    <w:next w:val="Standard"/>
     <w:autoRedefine/>
     <w:uiPriority w:val="39"/>
     <w:rsid w:val="0066609C"/>
@@ -14885,10 +15093,10 @@
       </w:tabs>
     </w:pPr>
   </w:style>
-  <w:style w:type="paragraph" w:styleId="TOC2">
+  <w:style w:type="paragraph" w:styleId="Verzeichnis2">
     <w:name w:val="toc 2"/>
-    <w:basedOn w:val="Normal"/>
-    <w:next w:val="Normal"/>
+    <w:basedOn w:val="Standard"/>
+    <w:next w:val="Standard"/>
     <w:autoRedefine/>
     <w:uiPriority w:val="39"/>
     <w:rsid w:val="0066609C"/>
@@ -14896,10 +15104,10 @@
       <w:ind w:left="227"/>
     </w:pPr>
   </w:style>
-  <w:style w:type="paragraph" w:styleId="TOC3">
+  <w:style w:type="paragraph" w:styleId="Verzeichnis3">
     <w:name w:val="toc 3"/>
-    <w:basedOn w:val="Normal"/>
-    <w:next w:val="Normal"/>
+    <w:basedOn w:val="Standard"/>
+    <w:next w:val="Standard"/>
     <w:autoRedefine/>
     <w:uiPriority w:val="39"/>
     <w:rsid w:val="0066609C"/>
@@ -14907,10 +15115,10 @@
       <w:ind w:left="454"/>
     </w:pPr>
   </w:style>
-  <w:style w:type="paragraph" w:styleId="TOC4">
+  <w:style w:type="paragraph" w:styleId="Verzeichnis4">
     <w:name w:val="toc 4"/>
-    <w:basedOn w:val="Normal"/>
-    <w:next w:val="Normal"/>
+    <w:basedOn w:val="Standard"/>
+    <w:next w:val="Standard"/>
     <w:autoRedefine/>
     <w:semiHidden/>
     <w:rsid w:val="0066609C"/>
@@ -14918,11 +15126,11 @@
       <w:ind w:left="680"/>
     </w:pPr>
   </w:style>
-  <w:style w:type="paragraph" w:styleId="Title">
+  <w:style w:type="paragraph" w:styleId="Titel">
     <w:name w:val="Title"/>
-    <w:basedOn w:val="Normal"/>
-    <w:next w:val="Normal"/>
-    <w:link w:val="TitleChar"/>
+    <w:basedOn w:val="Standard"/>
+    <w:next w:val="Standard"/>
+    <w:link w:val="TitelZchn"/>
     <w:uiPriority w:val="10"/>
     <w:qFormat/>
     <w:rsid w:val="00B803B2"/>
@@ -14939,10 +15147,10 @@
       <w:szCs w:val="56"/>
     </w:rPr>
   </w:style>
-  <w:style w:type="character" w:customStyle="1" w:styleId="TitleChar">
-    <w:name w:val="Title Char"/>
-    <w:basedOn w:val="DefaultParagraphFont"/>
-    <w:link w:val="Title"/>
+  <w:style w:type="character" w:customStyle="1" w:styleId="TitelZchn">
+    <w:name w:val="Titel Zchn"/>
+    <w:basedOn w:val="Absatz-Standardschriftart"/>
+    <w:link w:val="Titel"/>
     <w:uiPriority w:val="10"/>
     <w:rsid w:val="00B803B2"/>
     <w:rPr>
@@ -14955,11 +15163,11 @@
       <w:lang w:eastAsia="de-DE"/>
     </w:rPr>
   </w:style>
-  <w:style w:type="paragraph" w:styleId="Subtitle">
+  <w:style w:type="paragraph" w:styleId="Untertitel">
     <w:name w:val="Subtitle"/>
-    <w:basedOn w:val="Normal"/>
-    <w:next w:val="Normal"/>
-    <w:link w:val="SubtitleChar"/>
+    <w:basedOn w:val="Standard"/>
+    <w:next w:val="Standard"/>
+    <w:link w:val="UntertitelZchn"/>
     <w:uiPriority w:val="11"/>
     <w:qFormat/>
     <w:rsid w:val="00B803B2"/>
@@ -14977,10 +15185,10 @@
       <w:szCs w:val="22"/>
     </w:rPr>
   </w:style>
-  <w:style w:type="character" w:customStyle="1" w:styleId="SubtitleChar">
-    <w:name w:val="Subtitle Char"/>
-    <w:basedOn w:val="DefaultParagraphFont"/>
-    <w:link w:val="Subtitle"/>
+  <w:style w:type="character" w:customStyle="1" w:styleId="UntertitelZchn">
+    <w:name w:val="Untertitel Zchn"/>
+    <w:basedOn w:val="Absatz-Standardschriftart"/>
+    <w:link w:val="Untertitel"/>
     <w:uiPriority w:val="11"/>
     <w:rsid w:val="00B803B2"/>
     <w:rPr>
@@ -14991,10 +15199,10 @@
       <w:lang w:eastAsia="de-DE"/>
     </w:rPr>
   </w:style>
-  <w:style w:type="paragraph" w:styleId="TOCHeading">
+  <w:style w:type="paragraph" w:styleId="Inhaltsverzeichnisberschrift">
     <w:name w:val="TOC Heading"/>
-    <w:basedOn w:val="Normal"/>
-    <w:next w:val="Normal"/>
+    <w:basedOn w:val="Standard"/>
+    <w:next w:val="Standard"/>
     <w:uiPriority w:val="39"/>
     <w:unhideWhenUsed/>
     <w:qFormat/>
@@ -15012,7 +15220,7 @@
   </w:style>
   <w:style w:type="character" w:styleId="Hyperlink">
     <w:name w:val="Hyperlink"/>
-    <w:basedOn w:val="DefaultParagraphFont"/>
+    <w:basedOn w:val="Absatz-Standardschriftart"/>
     <w:uiPriority w:val="99"/>
     <w:unhideWhenUsed/>
     <w:rsid w:val="001F2BA2"/>
@@ -15021,10 +15229,10 @@
       <w:u w:val="single"/>
     </w:rPr>
   </w:style>
-  <w:style w:type="paragraph" w:styleId="Header">
+  <w:style w:type="paragraph" w:styleId="Kopfzeile">
     <w:name w:val="header"/>
-    <w:basedOn w:val="Normal"/>
-    <w:link w:val="HeaderChar"/>
+    <w:basedOn w:val="Standard"/>
+    <w:link w:val="KopfzeileZchn"/>
     <w:uiPriority w:val="99"/>
     <w:unhideWhenUsed/>
     <w:rsid w:val="00800B97"/>
@@ -15036,10 +15244,10 @@
       <w:spacing w:before="0"/>
     </w:pPr>
   </w:style>
-  <w:style w:type="character" w:customStyle="1" w:styleId="HeaderChar">
-    <w:name w:val="Header Char"/>
-    <w:basedOn w:val="DefaultParagraphFont"/>
-    <w:link w:val="Header"/>
+  <w:style w:type="character" w:customStyle="1" w:styleId="KopfzeileZchn">
+    <w:name w:val="Kopfzeile Zchn"/>
+    <w:basedOn w:val="Absatz-Standardschriftart"/>
+    <w:link w:val="Kopfzeile"/>
     <w:uiPriority w:val="99"/>
     <w:rsid w:val="00800B97"/>
     <w:rPr>
@@ -15048,10 +15256,10 @@
       <w:lang w:eastAsia="de-DE"/>
     </w:rPr>
   </w:style>
-  <w:style w:type="paragraph" w:styleId="Footer">
+  <w:style w:type="paragraph" w:styleId="Fuzeile">
     <w:name w:val="footer"/>
-    <w:basedOn w:val="Normal"/>
-    <w:link w:val="FooterChar"/>
+    <w:basedOn w:val="Standard"/>
+    <w:link w:val="FuzeileZchn"/>
     <w:uiPriority w:val="99"/>
     <w:unhideWhenUsed/>
     <w:rsid w:val="00800B97"/>
@@ -15063,10 +15271,10 @@
       <w:spacing w:before="0"/>
     </w:pPr>
   </w:style>
-  <w:style w:type="character" w:customStyle="1" w:styleId="FooterChar">
-    <w:name w:val="Footer Char"/>
-    <w:basedOn w:val="DefaultParagraphFont"/>
-    <w:link w:val="Footer"/>
+  <w:style w:type="character" w:customStyle="1" w:styleId="FuzeileZchn">
+    <w:name w:val="Fußzeile Zchn"/>
+    <w:basedOn w:val="Absatz-Standardschriftart"/>
+    <w:link w:val="Fuzeile"/>
     <w:uiPriority w:val="99"/>
     <w:qFormat/>
     <w:rsid w:val="00800B97"/>
@@ -15076,9 +15284,9 @@
       <w:lang w:eastAsia="de-DE"/>
     </w:rPr>
   </w:style>
-  <w:style w:type="character" w:styleId="PlaceholderText">
+  <w:style w:type="character" w:styleId="Platzhaltertext">
     <w:name w:val="Placeholder Text"/>
-    <w:basedOn w:val="DefaultParagraphFont"/>
+    <w:basedOn w:val="Absatz-Standardschriftart"/>
     <w:uiPriority w:val="99"/>
     <w:semiHidden/>
     <w:rsid w:val="00800B97"/>
@@ -15086,9 +15294,9 @@
       <w:color w:val="808080"/>
     </w:rPr>
   </w:style>
-  <w:style w:type="character" w:styleId="Strong">
+  <w:style w:type="character" w:styleId="Fett">
     <w:name w:val="Strong"/>
-    <w:basedOn w:val="DefaultParagraphFont"/>
+    <w:basedOn w:val="Absatz-Standardschriftart"/>
     <w:uiPriority w:val="22"/>
     <w:qFormat/>
     <w:rsid w:val="00962A8B"/>
@@ -15097,9 +15305,9 @@
       <w:bCs/>
     </w:rPr>
   </w:style>
-  <w:style w:type="character" w:styleId="FollowedHyperlink">
+  <w:style w:type="character" w:styleId="BesuchterLink">
     <w:name w:val="FollowedHyperlink"/>
-    <w:basedOn w:val="DefaultParagraphFont"/>
+    <w:basedOn w:val="Absatz-Standardschriftart"/>
     <w:uiPriority w:val="99"/>
     <w:semiHidden/>
     <w:unhideWhenUsed/>
@@ -15111,7 +15319,7 @@
   </w:style>
   <w:style w:type="character" w:customStyle="1" w:styleId="NichtaufgelsteErwhnung1">
     <w:name w:val="Nicht aufgelöste Erwähnung1"/>
-    <w:basedOn w:val="DefaultParagraphFont"/>
+    <w:basedOn w:val="Absatz-Standardschriftart"/>
     <w:uiPriority w:val="99"/>
     <w:semiHidden/>
     <w:unhideWhenUsed/>
@@ -15121,10 +15329,10 @@
       <w:shd w:val="clear" w:color="auto" w:fill="E1DFDD"/>
     </w:rPr>
   </w:style>
-  <w:style w:type="paragraph" w:styleId="Caption">
+  <w:style w:type="paragraph" w:styleId="Beschriftung">
     <w:name w:val="caption"/>
-    <w:basedOn w:val="Normal"/>
-    <w:next w:val="Normal"/>
+    <w:basedOn w:val="Standard"/>
+    <w:next w:val="Standard"/>
     <w:uiPriority w:val="35"/>
     <w:unhideWhenUsed/>
     <w:qFormat/>
@@ -15140,9 +15348,9 @@
       <w:szCs w:val="18"/>
     </w:rPr>
   </w:style>
-  <w:style w:type="paragraph" w:styleId="ListParagraph">
+  <w:style w:type="paragraph" w:styleId="Listenabsatz">
     <w:name w:val="List Paragraph"/>
-    <w:basedOn w:val="Normal"/>
+    <w:basedOn w:val="Standard"/>
     <w:uiPriority w:val="34"/>
     <w:qFormat/>
     <w:rsid w:val="00B07153"/>
@@ -15151,9 +15359,9 @@
       <w:contextualSpacing/>
     </w:pPr>
   </w:style>
-  <w:style w:type="paragraph" w:styleId="NormalWeb">
+  <w:style w:type="paragraph" w:styleId="StandardWeb">
     <w:name w:val="Normal (Web)"/>
-    <w:basedOn w:val="Normal"/>
+    <w:basedOn w:val="Standard"/>
     <w:uiPriority w:val="99"/>
     <w:semiHidden/>
     <w:unhideWhenUsed/>
@@ -15168,9 +15376,9 @@
       <w:lang w:eastAsia="de-CH"/>
     </w:rPr>
   </w:style>
-  <w:style w:type="table" w:styleId="TableGrid">
+  <w:style w:type="table" w:styleId="Tabellenraster">
     <w:name w:val="Table Grid"/>
-    <w:basedOn w:val="TableNormal"/>
+    <w:basedOn w:val="NormaleTabelle"/>
     <w:uiPriority w:val="39"/>
     <w:rsid w:val="00DF4670"/>
     <w:pPr>

</xml_diff>